<commit_message>
Draft: section 15.4 upward gradient, data-path loop detection and escape
Section 15.4 now separates the directions: upward traffic follows a
hop-count gradient to the border router (RPL Rank; OF0) and has no
voids; downward geographic forwarding is where packets get trapped.
Two new items: loop detection by digests over the non-mutable fields,
so the Hop Limit does not hide a repeat (RFC 6621 H-DPD; Hengartner et
al., IMW 2002), with RPL's tolerate-one, drop-at-second rule; and
escape onto a next hop outside the loop (RPL Forwarding-Error,
US 5,115,433). Section 18.4's void row names the new sources.

References: RFC 6552, RFC 6553, RFC 6621, Hengartner et al. 2002.
</commit_message>
<xml_diff>
--- a/draft/draft-hanley-rsdggs-01.docx
+++ b/draft/draft-hanley-rsdggs-01.docx
@@ -39203,6 +39203,45 @@
       <w:bookmarkEnd w:id="707"/>
       <w:r>
         <w:rPr/>
+        <w:t>Voids matter in one direction of a utility-style mesh. Traffic upward, from a node to a border router (the mesh's take-out point to the wider network), follows a hop-count gradient: the nodes within radio range of the border router know they are one hop from it, their neighbors learn from them that they are two hops away, and so on outward, so every node knows one or more border routers and its distance in hops to each, and forwards to a neighbor one layer closer. This is the RPL Rank, propagated outward from the DODAG root in DIO messages [</w:t>
+      </w:r>
+      <w:hyperlink w:anchor="RFC6550">
+        <w:r>
+          <w:rPr>
+            <w:rStyle w:val="Hyperlink"/>
+          </w:rPr>
+          <w:t>RFC6550</w:t>
+        </w:r>
+      </w:hyperlink>
+      <w:r>
+        <w:rPr/>
+        <w:t>]; with Objective Function Zero and its default parameters [</w:t>
+      </w:r>
+      <w:hyperlink w:anchor="RFC6552">
+        <w:r>
+          <w:rPr>
+            <w:rStyle w:val="Hyperlink"/>
+          </w:rPr>
+          <w:t>RFC6552</w:t>
+        </w:r>
+      </w:hyperlink>
+      <w:r>
+        <w:rPr/>
+        <w:t>], Rank grows by the same step at every hop. A gradient built from neighbors actually heard has no voids. Traffic downward, from a border router to a node in a given cell, is where geographic forwarding replaces per-destination routing state, and where packets can be trapped.</w:t>
+      </w:r>
+    </w:p>
+    <w:p>
+      <w:pPr>
+        <w:pStyle w:val="BodyText"/>
+        <w:bidi w:val="0"/>
+        <w:ind w:hanging="0" w:left="0" w:right="0"/>
+        <w:jc w:val="left"/>
+        <w:rPr/>
+      </w:pPr>
+      <w:bookmarkStart w:id="708" w:name="section-15.4-3"/>
+      <w:bookmarkEnd w:id="708"/>
+      <w:r>
+        <w:rPr/>
         <w:t>Recovery from local minima is well studied, and the established techniques are unencumbered:</w:t>
       </w:r>
     </w:p>
@@ -39223,8 +39262,8 @@
         <w:jc w:val="left"/>
         <w:rPr/>
       </w:pPr>
-      <w:bookmarkStart w:id="708" w:name="section-15.4-3.1"/>
-      <w:bookmarkEnd w:id="708"/>
+      <w:bookmarkStart w:id="709" w:name="section-15.4-4.1"/>
+      <w:bookmarkEnd w:id="709"/>
       <w:r>
         <w:rPr/>
         <w:t>Greedy-Face-Greedy (GFG) [</w:t>
@@ -39259,8 +39298,8 @@
         <w:jc w:val="left"/>
         <w:rPr/>
       </w:pPr>
-      <w:bookmarkStart w:id="709" w:name="section-15.4-3.2"/>
-      <w:bookmarkEnd w:id="709"/>
+      <w:bookmarkStart w:id="710" w:name="section-15.4-4.2"/>
+      <w:bookmarkEnd w:id="710"/>
       <w:r>
         <w:rPr/>
         <w:t>GPSR [</w:t>
@@ -39295,8 +39334,8 @@
         <w:jc w:val="left"/>
         <w:rPr/>
       </w:pPr>
-      <w:bookmarkStart w:id="710" w:name="section-15.4-3.3"/>
-      <w:bookmarkEnd w:id="710"/>
+      <w:bookmarkStart w:id="711" w:name="section-15.4-4.3"/>
+      <w:bookmarkEnd w:id="711"/>
       <w:r>
         <w:rPr/>
         <w:t>Cross-Link Detection Protocol (CLDP) [</w:t>
@@ -39326,12 +39365,13 @@
           <w:tab w:val="left" w:pos="709" w:leader="none"/>
         </w:tabs>
         <w:bidi w:val="0"/>
+        <w:spacing w:before="0" w:after="0"/>
         <w:ind w:hanging="283" w:left="709" w:right="0"/>
         <w:jc w:val="left"/>
         <w:rPr/>
       </w:pPr>
-      <w:bookmarkStart w:id="711" w:name="section-15.4-3.4"/>
-      <w:bookmarkEnd w:id="711"/>
+      <w:bookmarkStart w:id="712" w:name="section-15.4-4.4"/>
+      <w:bookmarkEnd w:id="712"/>
       <w:r>
         <w:rPr/>
         <w:t>Metricom's expired patents US 4,939,726 and US 5,115,433 (</w:t>
@@ -39352,13 +39392,120 @@
     <w:p>
       <w:pPr>
         <w:pStyle w:val="BodyText"/>
+        <w:numPr>
+          <w:ilvl w:val="0"/>
+          <w:numId w:val="9"/>
+        </w:numPr>
+        <w:tabs>
+          <w:tab w:val="clear" w:pos="709"/>
+          <w:tab w:val="left" w:pos="709" w:leader="none"/>
+        </w:tabs>
+        <w:bidi w:val="0"/>
+        <w:spacing w:before="0" w:after="0"/>
+        <w:ind w:hanging="283" w:left="709" w:right="0"/>
+        <w:jc w:val="left"/>
+        <w:rPr/>
+      </w:pPr>
+      <w:bookmarkStart w:id="713" w:name="section-15.4-4.5"/>
+      <w:bookmarkEnd w:id="713"/>
+      <w:r>
+        <w:rPr/>
+        <w:t>Loop detection in the data path. Planarization errors, stale neighbor positions and asymmetric links can still trap a packet in a loop of nodes. A forwarder detects this by recognizing the packet when it comes back. It keeps a short-lived table of digests of the packets it has forwarded, computed over the fields no forwarder changes, so that the Hop Limit, which every hop decrements, does not make each lap look like a new packet. Simplified Multicast Forwarding hashes the same non-mutable fields for duplicate detection, and keeps the history for the maximum lifetime of a packet [</w:t>
+      </w:r>
+      <w:hyperlink w:anchor="RFC6621">
+        <w:r>
+          <w:rPr>
+            <w:rStyle w:val="Hyperlink"/>
+          </w:rPr>
+          <w:t>RFC6621</w:t>
+        </w:r>
+      </w:hyperlink>
+      <w:r>
+        <w:rPr/>
+        <w:t>]. Measurement studies identify looping packets the same way, as packets identical except for TTL and checksum [</w:t>
+      </w:r>
+      <w:hyperlink w:anchor="LOOPS">
+        <w:r>
+          <w:rPr>
+            <w:rStyle w:val="Hyperlink"/>
+          </w:rPr>
+          <w:t>LOOPS</w:t>
+        </w:r>
+      </w:hyperlink>
+      <w:r>
+        <w:rPr/>
+        <w:t>]. Duplicates the link layer has already suppressed, such as a retransmission after a lost acknowledgment, are not counted. A packet seen more than a small number of times is in a loop; RPL tolerates one Rank inconsistency on a packet's path and discards the packet at the second [</w:t>
+      </w:r>
+      <w:hyperlink w:anchor="RFC6550">
+        <w:r>
+          <w:rPr>
+            <w:rStyle w:val="Hyperlink"/>
+          </w:rPr>
+          <w:t>RFC6550</w:t>
+        </w:r>
+      </w:hyperlink>
+      <w:r>
+        <w:rPr/>
+        <w:t>] [</w:t>
+      </w:r>
+      <w:hyperlink w:anchor="RFC6553">
+        <w:r>
+          <w:rPr>
+            <w:rStyle w:val="Hyperlink"/>
+          </w:rPr>
+          <w:t>RFC6553</w:t>
+        </w:r>
+      </w:hyperlink>
+      <w:r>
+        <w:rPr/>
+        <w:t xml:space="preserve">]. </w:t>
+      </w:r>
+    </w:p>
+    <w:p>
+      <w:pPr>
+        <w:pStyle w:val="BodyText"/>
+        <w:numPr>
+          <w:ilvl w:val="0"/>
+          <w:numId w:val="9"/>
+        </w:numPr>
+        <w:tabs>
+          <w:tab w:val="clear" w:pos="709"/>
+          <w:tab w:val="left" w:pos="709" w:leader="none"/>
+        </w:tabs>
+        <w:bidi w:val="0"/>
+        <w:ind w:hanging="283" w:left="709" w:right="0"/>
+        <w:jc w:val="left"/>
+        <w:rPr/>
+      </w:pPr>
+      <w:bookmarkStart w:id="714" w:name="section-15.4-4.6"/>
+      <w:bookmarkEnd w:id="714"/>
+      <w:r>
+        <w:rPr/>
+        <w:t>Escape from a loop. A forwarder that detects a loop pushes the packet out of it, onto a next hop the loop does not include, rather than only dropping it. RPL does this for stale downward routes: the router returns the packet to the parent that passed it with the Forwarding-Error flag set, and the parent removes the routing state that caused the error and sends the packet again, possibly to an alternate neighbor [</w:t>
+      </w:r>
+      <w:hyperlink w:anchor="RFC6550">
+        <w:r>
+          <w:rPr>
+            <w:rStyle w:val="Hyperlink"/>
+          </w:rPr>
+          <w:t>RFC6550</w:t>
+        </w:r>
+      </w:hyperlink>
+      <w:r>
+        <w:rPr/>
+        <w:t xml:space="preserve">]. US 5,115,433 likewise has the previous node resend through another neighbor. For geographic forwarding, the forwarder excludes the neighbor it last used for that packet, or the whole loop, and chooses among the remaining neighbors, entering face routing if none makes progress. </w:t>
+      </w:r>
+    </w:p>
+    <w:p>
+      <w:pPr>
+        <w:pStyle w:val="BodyText"/>
         <w:bidi w:val="0"/>
         <w:ind w:hanging="0" w:left="0" w:right="0"/>
         <w:jc w:val="left"/>
         <w:rPr/>
       </w:pPr>
-      <w:bookmarkStart w:id="712" w:name="section-15.4-4"/>
-      <w:bookmarkEnd w:id="712"/>
+      <w:bookmarkStart w:id="715" w:name="section-15.4-5"/>
+      <w:bookmarkEnd w:id="715"/>
       <w:r>
         <w:rPr/>
         <w:t>Face routing needs positions, not only cells. An RSDGGS forwarder would planarize its neighbor graph from its neighbors' cell centers, at a resolution fine enough to separate them (</w:t>
@@ -39385,7 +39532,7 @@
       </w:hyperlink>
       <w:r>
         <w:rPr/>
-        <w:t>). The IPv6 Hop Limit [</w:t>
+        <w:t>). Whatever the detection and escape mechanism, the IPv6 Hop Limit [</w:t>
       </w:r>
       <w:hyperlink w:anchor="RFC8200">
         <w:r>
@@ -39397,7 +39544,7 @@
       </w:hyperlink>
       <w:r>
         <w:rPr/>
-        <w:t>] bounds the lifetime of a packet caught in a loop in every case. A specification of geographic forwarding would choose the recovery mechanism and state the radio model it assumes.</w:t>
+        <w:t>] bounds the lifetime of a packet caught in a loop. A specification of geographic forwarding would choose the recovery mechanism and state the radio model it assumes.</w:t>
       </w:r>
     </w:p>
     <w:p>
@@ -39420,8 +39567,8 @@
         <w:rPr/>
       </w:pPr>
       <w:hyperlink w:anchor="section-15.5">
-        <w:bookmarkStart w:id="713" w:name="name-regulatory-aware-channel-se"/>
-        <w:bookmarkEnd w:id="713"/>
+        <w:bookmarkStart w:id="716" w:name="name-regulatory-aware-channel-se"/>
+        <w:bookmarkEnd w:id="716"/>
         <w:r>
           <w:rPr>
             <w:rStyle w:val="Hyperlink"/>
@@ -39450,8 +39597,8 @@
         <w:jc w:val="left"/>
         <w:rPr/>
       </w:pPr>
-      <w:bookmarkStart w:id="714" w:name="section-15.5-1"/>
-      <w:bookmarkEnd w:id="714"/>
+      <w:bookmarkStart w:id="717" w:name="section-15.5-1"/>
+      <w:bookmarkEnd w:id="717"/>
       <w:r>
         <w:rPr/>
         <w:t>The geographic address carries implicit regulatory information through the face byte of the IID. A forwarder can extract the face byte of the destination address to determine the ITU Region of the destination, and therefore the ISM band availability at the destination.</w:t>
@@ -39465,8 +39612,8 @@
         <w:jc w:val="left"/>
         <w:rPr/>
       </w:pPr>
-      <w:bookmarkStart w:id="715" w:name="section-15.5-2"/>
-      <w:bookmarkEnd w:id="715"/>
+      <w:bookmarkStart w:id="718" w:name="section-15.5-2"/>
+      <w:bookmarkEnd w:id="718"/>
       <w:r>
         <w:rPr/>
         <w:t>When a packet is forwarded toward a destination in a different regulatory cell, the forwarding node would select a transmission channel that is legal in both its own regulatory cell and the next hop's regulatory cell. If no such channel exists (for example, forwarding from an EU 868 MHz network toward a US 915 MHz network), the forwarder cannot transmit on a channel that is illegal in either jurisdiction.</w:t>
@@ -39480,8 +39627,8 @@
         <w:jc w:val="left"/>
         <w:rPr/>
       </w:pPr>
-      <w:bookmarkStart w:id="716" w:name="section-15.5-3"/>
-      <w:bookmarkEnd w:id="716"/>
+      <w:bookmarkStart w:id="719" w:name="section-15.5-3"/>
+      <w:bookmarkEnd w:id="719"/>
       <w:r>
         <w:rPr/>
         <w:t>In practice, cross-regulatory-region forwarding at the ISM layer requires either a gateway device provisioned for both regulatory environments, or an application-layer relay. The geographic address structure makes this boundary explicit and machine-readable: a mismatch in the face byte of the IID between source and destination indicates a cross-regulatory-region path that requires special handling.</w:t>
@@ -39681,8 +39828,8 @@
         <w:rPr/>
       </w:pPr>
       <w:hyperlink w:anchor="section-15.6">
-        <w:bookmarkStart w:id="717" w:name="name-relationship-to-existing-st"/>
-        <w:bookmarkEnd w:id="717"/>
+        <w:bookmarkStart w:id="720" w:name="name-relationship-to-existing-st"/>
+        <w:bookmarkEnd w:id="720"/>
         <w:r>
           <w:rPr>
             <w:rStyle w:val="Hyperlink"/>
@@ -39711,8 +39858,8 @@
         <w:jc w:val="left"/>
         <w:rPr/>
       </w:pPr>
-      <w:bookmarkStart w:id="718" w:name="section-15.6-1"/>
-      <w:bookmarkEnd w:id="718"/>
+      <w:bookmarkStart w:id="721" w:name="section-15.6-1"/>
+      <w:bookmarkEnd w:id="721"/>
       <w:r>
         <w:rPr/>
         <w:t>The outline intersects with the following existing standards and efforts:</w:t>
@@ -39726,8 +39873,8 @@
         <w:jc w:val="left"/>
         <w:rPr/>
       </w:pPr>
-      <w:bookmarkStart w:id="719" w:name="section-15.6-2"/>
-      <w:bookmarkEnd w:id="719"/>
+      <w:bookmarkStart w:id="722" w:name="section-15.6-2"/>
+      <w:bookmarkEnd w:id="722"/>
       <w:r>
         <w:rPr/>
         <w:t>6LoWPAN [</w:t>
@@ -39777,8 +39924,8 @@
         <w:jc w:val="left"/>
         <w:rPr/>
       </w:pPr>
-      <w:bookmarkStart w:id="720" w:name="section-15.6-3"/>
-      <w:bookmarkEnd w:id="720"/>
+      <w:bookmarkStart w:id="723" w:name="section-15.6-3"/>
+      <w:bookmarkEnd w:id="723"/>
       <w:r>
         <w:rPr/>
         <w:t>6LoWPAN Neighbor Discovery [</w:t>
@@ -39828,8 +39975,8 @@
         <w:jc w:val="left"/>
         <w:rPr/>
       </w:pPr>
-      <w:bookmarkStart w:id="721" w:name="section-15.6-4"/>
-      <w:bookmarkEnd w:id="721"/>
+      <w:bookmarkStart w:id="724" w:name="section-15.6-4"/>
+      <w:bookmarkEnd w:id="724"/>
       <w:r>
         <w:rPr/>
         <w:t xml:space="preserve">RFC 9854 (AODV-RPL): Geographic greedy forwarding as described in </w:t>
@@ -39855,8 +40002,8 @@
         <w:jc w:val="left"/>
         <w:rPr/>
       </w:pPr>
-      <w:bookmarkStart w:id="722" w:name="section-15.6-5"/>
-      <w:bookmarkEnd w:id="722"/>
+      <w:bookmarkStart w:id="725" w:name="section-15.6-5"/>
+      <w:bookmarkEnd w:id="725"/>
       <w:r>
         <w:rPr/>
         <w:t>ETSI EN 302 931 (GeoNetworking): The European ITS GeoNetworking standard defines geographic addressing over 802.11p and LTE for vehicular networks. RSDGGS geographic IPv6 addressing is an alternative approach for low-power ISM-band IoT networks rather than vehicular ITS, with the additional property of encoding regulatory jurisdiction within the address structure.</w:t>
@@ -39870,8 +40017,8 @@
         <w:jc w:val="left"/>
         <w:rPr/>
       </w:pPr>
-      <w:bookmarkStart w:id="723" w:name="section-15.6-6"/>
-      <w:bookmarkEnd w:id="723"/>
+      <w:bookmarkStart w:id="726" w:name="section-15.6-6"/>
+      <w:bookmarkEnd w:id="726"/>
       <w:r>
         <w:rPr/>
         <w:t xml:space="preserve">IEEE 802.15.4 SUN: The MAC-layer integration defined in </w:t>
@@ -39909,8 +40056,8 @@
         <w:rPr/>
       </w:pPr>
       <w:hyperlink w:anchor="section-15.7">
-        <w:bookmarkStart w:id="724" w:name="name-open-issues"/>
-        <w:bookmarkEnd w:id="724"/>
+        <w:bookmarkStart w:id="727" w:name="name-open-issues"/>
+        <w:bookmarkEnd w:id="727"/>
         <w:r>
           <w:rPr>
             <w:rStyle w:val="Hyperlink"/>
@@ -39939,8 +40086,8 @@
         <w:jc w:val="left"/>
         <w:rPr/>
       </w:pPr>
-      <w:bookmarkStart w:id="725" w:name="section-15.7-1"/>
-      <w:bookmarkEnd w:id="725"/>
+      <w:bookmarkStart w:id="728" w:name="section-15.7-1"/>
+      <w:bookmarkEnd w:id="728"/>
       <w:r>
         <w:rPr/>
         <w:t>A specification of RSDGGS geographic IPv6 addressing would have to resolve at least the following issues. Its IPv6 addressing aspects would be within the scope of the 6man working group, and its 6LoWPAN aspects within that of the 6lo working group.</w:t>
@@ -39963,10 +40110,10 @@
         <w:jc w:val="left"/>
         <w:rPr/>
       </w:pPr>
-      <w:bookmarkStart w:id="726" w:name="section-15.7-2"/>
-      <w:bookmarkStart w:id="727" w:name="section-15.7-2.1"/>
-      <w:bookmarkEnd w:id="726"/>
-      <w:bookmarkEnd w:id="727"/>
+      <w:bookmarkStart w:id="729" w:name="section-15.7-2"/>
+      <w:bookmarkStart w:id="730" w:name="section-15.7-2.1"/>
+      <w:bookmarkEnd w:id="729"/>
+      <w:bookmarkEnd w:id="730"/>
       <w:r>
         <w:rPr/>
         <w:t>Privacy. An IID carrying the full 8-octet index discloses the device's location, to within centimeters (</w:t>
@@ -40049,8 +40196,8 @@
         <w:jc w:val="left"/>
         <w:rPr/>
       </w:pPr>
-      <w:bookmarkStart w:id="728" w:name="section-15.7-2.2"/>
-      <w:bookmarkEnd w:id="728"/>
+      <w:bookmarkStart w:id="731" w:name="section-15.7-2.2"/>
+      <w:bookmarkEnd w:id="731"/>
       <w:r>
         <w:rPr/>
         <w:t>Uniqueness. Devices in the same cell at the chosen resolution would derive the same IID. Addresses must be unique, and duplicate address detection [</w:t>
@@ -40109,8 +40256,8 @@
         <w:jc w:val="left"/>
         <w:rPr/>
       </w:pPr>
-      <w:bookmarkStart w:id="729" w:name="section-15.7-2.3"/>
-      <w:bookmarkEnd w:id="729"/>
+      <w:bookmarkStart w:id="732" w:name="section-15.7-2.3"/>
+      <w:bookmarkEnd w:id="732"/>
       <w:r>
         <w:rPr/>
         <w:t>Prefix. A dedicated geographic prefix needs an IETF-stream document and IETF Review (</w:t>
@@ -40157,8 +40304,8 @@
         <w:jc w:val="left"/>
         <w:rPr/>
       </w:pPr>
-      <w:bookmarkStart w:id="730" w:name="section-15.7-2.4"/>
-      <w:bookmarkEnd w:id="730"/>
+      <w:bookmarkStart w:id="733" w:name="section-15.7-2.4"/>
+      <w:bookmarkEnd w:id="733"/>
       <w:r>
         <w:rPr/>
         <w:t xml:space="preserve">Mobility. A device that moves to another cell changes its address, with the consequences of renumbering for its neighbors' caches, its registrations, and its transport connections. </w:t>
@@ -40180,8 +40327,8 @@
         <w:jc w:val="left"/>
         <w:rPr/>
       </w:pPr>
-      <w:bookmarkStart w:id="731" w:name="section-15.7-2.5"/>
-      <w:bookmarkEnd w:id="731"/>
+      <w:bookmarkStart w:id="734" w:name="section-15.7-2.5"/>
+      <w:bookmarkEnd w:id="734"/>
       <w:r>
         <w:rPr/>
         <w:t>Header overhead. Geographic IIDs cannot be compressed from link-layer addresses (</w:t>
@@ -40219,8 +40366,8 @@
         <w:rPr/>
       </w:pPr>
       <w:hyperlink w:anchor="section-16">
-        <w:bookmarkStart w:id="732" w:name="name-relationship-to-prior-geogr"/>
-        <w:bookmarkEnd w:id="732"/>
+        <w:bookmarkStart w:id="735" w:name="name-relationship-to-prior-geogr"/>
+        <w:bookmarkEnd w:id="735"/>
         <w:r>
           <w:rPr>
             <w:rStyle w:val="Hyperlink"/>
@@ -40249,8 +40396,8 @@
         <w:jc w:val="left"/>
         <w:rPr/>
       </w:pPr>
-      <w:bookmarkStart w:id="733" w:name="section-16-1"/>
-      <w:bookmarkEnd w:id="733"/>
+      <w:bookmarkStart w:id="736" w:name="section-16-1"/>
+      <w:bookmarkEnd w:id="736"/>
       <w:r>
         <w:rPr/>
         <w:t>Several IETF documents address geographic location representation, conveyance, and routing. This section compares each to RSDGGS, identifying the gaps that RSDGGS addresses and the areas where these prior works remain authoritative and complementary.</w:t>
@@ -40264,8 +40411,8 @@
         <w:jc w:val="left"/>
         <w:rPr/>
       </w:pPr>
-      <w:bookmarkStart w:id="734" w:name="section-16-2"/>
-      <w:bookmarkEnd w:id="734"/>
+      <w:bookmarkStart w:id="737" w:name="section-16-2"/>
+      <w:bookmarkEnd w:id="737"/>
       <w:r>
         <w:rPr/>
         <w:t>The fundamental distinction between RSDGGS and all prior work is axis of design: the existing RFCs treat geographic location as a property to be conveyed alongside an application or network protocol, using coordinate systems (WGS-84 latitude/longitude) designed for human-readable precision. RSDGGS treats geographic location as a self-describing, hierarchical index whose structure directly encodes regulatory jurisdiction, enables address-arithmetic routing, and is optimized for constrained IoT devices operating without floating-point arithmetic or external infrastructure.</w:t>
@@ -40291,8 +40438,8 @@
         <w:rPr/>
       </w:pPr>
       <w:hyperlink w:anchor="section-16.1">
-        <w:bookmarkStart w:id="735" w:name="name-rfc-2009-gps-based-addressi"/>
-        <w:bookmarkEnd w:id="735"/>
+        <w:bookmarkStart w:id="738" w:name="name-rfc-2009-gps-based-addressi"/>
+        <w:bookmarkEnd w:id="738"/>
         <w:r>
           <w:rPr>
             <w:rStyle w:val="Hyperlink"/>
@@ -40321,8 +40468,8 @@
         <w:jc w:val="left"/>
         <w:rPr/>
       </w:pPr>
-      <w:bookmarkStart w:id="736" w:name="section-16.1-1"/>
-      <w:bookmarkEnd w:id="736"/>
+      <w:bookmarkStart w:id="739" w:name="section-16.1-1"/>
+      <w:bookmarkEnd w:id="739"/>
       <w:r>
         <w:rPr/>
         <w:t>RFC 2009 [</w:t>
@@ -40360,8 +40507,8 @@
         <w:rPr/>
       </w:pPr>
       <w:hyperlink w:anchor="section-16.1.1">
-        <w:bookmarkStart w:id="737" w:name="name-rfc-2009-technical-approach"/>
-        <w:bookmarkEnd w:id="737"/>
+        <w:bookmarkStart w:id="740" w:name="name-rfc-2009-technical-approach"/>
+        <w:bookmarkEnd w:id="740"/>
         <w:r>
           <w:rPr>
             <w:rStyle w:val="Hyperlink"/>
@@ -40390,8 +40537,8 @@
         <w:jc w:val="left"/>
         <w:rPr/>
       </w:pPr>
-      <w:bookmarkStart w:id="738" w:name="section-16.1.1-1"/>
-      <w:bookmarkEnd w:id="738"/>
+      <w:bookmarkStart w:id="741" w:name="section-16.1.1-1"/>
+      <w:bookmarkEnd w:id="741"/>
       <w:r>
         <w:rPr/>
         <w:t>RFC 2009 proposes extending IP routing to support geographic destination addressing using GPS coordinates. The core concept is the Geographic Service Area: each router is assigned a bounding polygon defined in GPS coordinates (latitude/longitude pairs) representing the geographic region it serves. A new protocol, IGPSMP (Internet GPS Management Protocol), allows routers to exchange service area descriptions using six message types: set-service-area, confirm-service-area, geographic-service-area-query, service-area-report, and related management primitives.</w:t>
@@ -40405,8 +40552,8 @@
         <w:jc w:val="left"/>
         <w:rPr/>
       </w:pPr>
-      <w:bookmarkStart w:id="739" w:name="section-16.1.1-2"/>
-      <w:bookmarkEnd w:id="739"/>
+      <w:bookmarkStart w:id="742" w:name="section-16.1.1-2"/>
+      <w:bookmarkEnd w:id="742"/>
       <w:r>
         <w:rPr/>
         <w:t xml:space="preserve">For indoor environments where GPS is unavailable, RFC 2009 proposes weak radio beacons that broadcast a GPS address, allowing mobile devices to adopt the beacon's address as their own. This is structurally analogous to the peer-assisted discovery mechanism defined in </w:t>
@@ -40432,8 +40579,8 @@
         <w:jc w:val="left"/>
         <w:rPr/>
       </w:pPr>
-      <w:bookmarkStart w:id="740" w:name="section-16.1.1-3"/>
-      <w:bookmarkEnd w:id="740"/>
+      <w:bookmarkStart w:id="743" w:name="section-16.1.1-3"/>
+      <w:bookmarkEnd w:id="743"/>
       <w:r>
         <w:rPr/>
         <w:t>RFC 2009 also proposes a DNS-based application-layer solution, adding a geographic first-level domain with hierarchical sub-domains for states, counties, and polygons of interest. Routing to a geographic address involves translating the destination polygon into a sequence of router hops based on IGPSMP service area tables.</w:t>
@@ -40459,8 +40606,8 @@
         <w:rPr/>
       </w:pPr>
       <w:hyperlink w:anchor="section-16.1.2">
-        <w:bookmarkStart w:id="741" w:name="name-gaps-addressed-by-rsdggs"/>
-        <w:bookmarkEnd w:id="741"/>
+        <w:bookmarkStart w:id="744" w:name="name-gaps-addressed-by-rsdggs"/>
+        <w:bookmarkEnd w:id="744"/>
         <w:r>
           <w:rPr>
             <w:rStyle w:val="Hyperlink"/>
@@ -40653,8 +40800,8 @@
         <w:jc w:val="left"/>
         <w:rPr/>
       </w:pPr>
-      <w:bookmarkStart w:id="742" w:name="section-16.1.2-2"/>
-      <w:bookmarkEnd w:id="742"/>
+      <w:bookmarkStart w:id="745" w:name="section-16.1.2-2"/>
+      <w:bookmarkEnd w:id="745"/>
       <w:r>
         <w:rPr/>
         <w:t>RFC 2009's polygon-based service areas require floating-point computation for containment tests and polygon intersection, making them unsuitable for the Cortex-M0 class devices that constitute the majority of 802.15.4 IoT deployments. The IGPSMP protocol requires routers to maintain geographic routing tables that grow with network size, whereas RSDGGS geographic addressing enables stateless forwarding decisions from address arithmetic alone.</w:t>
@@ -40668,8 +40815,8 @@
         <w:jc w:val="left"/>
         <w:rPr/>
       </w:pPr>
-      <w:bookmarkStart w:id="743" w:name="section-16.1.2-3"/>
-      <w:bookmarkEnd w:id="743"/>
+      <w:bookmarkStart w:id="746" w:name="section-16.1.2-3"/>
+      <w:bookmarkEnd w:id="746"/>
       <w:r>
         <w:rPr/>
         <w:t>RFC 2009 does not address regulatory spectrum management, band availability, or the use of geographic addressing to encode regulatory jurisdiction. RSDGGS is the first specification to treat these as primary design goals of a geographic addressing system.</w:t>
@@ -40695,8 +40842,8 @@
         <w:rPr/>
       </w:pPr>
       <w:hyperlink w:anchor="section-16.2">
-        <w:bookmarkStart w:id="744" w:name="name-rfc-5870-the-geo-uri-scheme"/>
-        <w:bookmarkEnd w:id="744"/>
+        <w:bookmarkStart w:id="747" w:name="name-rfc-5870-the-geo-uri-scheme"/>
+        <w:bookmarkEnd w:id="747"/>
         <w:r>
           <w:rPr>
             <w:rStyle w:val="Hyperlink"/>
@@ -40725,8 +40872,8 @@
         <w:jc w:val="left"/>
         <w:rPr/>
       </w:pPr>
-      <w:bookmarkStart w:id="745" w:name="section-16.2-1"/>
-      <w:bookmarkEnd w:id="745"/>
+      <w:bookmarkStart w:id="748" w:name="section-16.2-1"/>
+      <w:bookmarkEnd w:id="748"/>
       <w:r>
         <w:rPr/>
         <w:t>RFC 5870 [</w:t>
@@ -40764,8 +40911,8 @@
         <w:rPr/>
       </w:pPr>
       <w:hyperlink w:anchor="section-16.2.1">
-        <w:bookmarkStart w:id="746" w:name="name-rfc-5870-technical-approach"/>
-        <w:bookmarkEnd w:id="746"/>
+        <w:bookmarkStart w:id="749" w:name="name-rfc-5870-technical-approach"/>
+        <w:bookmarkEnd w:id="749"/>
         <w:r>
           <w:rPr>
             <w:rStyle w:val="Hyperlink"/>
@@ -40794,8 +40941,8 @@
         <w:jc w:val="left"/>
         <w:rPr/>
       </w:pPr>
-      <w:bookmarkStart w:id="747" w:name="section-16.2.1-1"/>
-      <w:bookmarkEnd w:id="747"/>
+      <w:bookmarkStart w:id="750" w:name="section-16.2.1-1"/>
+      <w:bookmarkEnd w:id="750"/>
       <w:r>
         <w:rPr/>
         <w:t>A 'geo' URI encodes a point location in WGS-84 (default) or an alternative CRS using the syntax geo:lat,lon[,alt][;crs=...][;u=uncertainty]. The coordinate values are decimal degrees (latitude and longitude) with optional altitude in meters. An optional uncertainty parameter u= specifies the radius of the location in meters. The number of decimal digits in the coordinate values MUST NOT be interpreted as an indication of accuracy; uncertainty is carried only in the explicit u= parameter.</w:t>
@@ -40809,8 +40956,8 @@
         <w:jc w:val="left"/>
         <w:rPr/>
       </w:pPr>
-      <w:bookmarkStart w:id="748" w:name="section-16.2.1-2"/>
-      <w:bookmarkEnd w:id="748"/>
+      <w:bookmarkStart w:id="751" w:name="section-16.2.1-2"/>
+      <w:bookmarkEnd w:id="751"/>
       <w:r>
         <w:rPr/>
         <w:t>The scheme is CRS-agnostic: while WGS-84 is the default, alternative coordinate reference systems may be specified using the crs= parameter. The scheme is protocol-independent and may appear in any context supporting arbitrary URIs.</w:t>
@@ -40836,8 +40983,8 @@
         <w:rPr/>
       </w:pPr>
       <w:hyperlink w:anchor="section-16.2.2">
-        <w:bookmarkStart w:id="749" w:name="name-gaps-addressed-by-rsdggs-2"/>
-        <w:bookmarkEnd w:id="749"/>
+        <w:bookmarkStart w:id="752" w:name="name-gaps-addressed-by-rsdggs-2"/>
+        <w:bookmarkEnd w:id="752"/>
         <w:r>
           <w:rPr>
             <w:rStyle w:val="Hyperlink"/>
@@ -41030,8 +41177,8 @@
         <w:jc w:val="left"/>
         <w:rPr/>
       </w:pPr>
-      <w:bookmarkStart w:id="750" w:name="section-16.2.2-2"/>
-      <w:bookmarkEnd w:id="750"/>
+      <w:bookmarkStart w:id="753" w:name="section-16.2.2-2"/>
+      <w:bookmarkEnd w:id="753"/>
       <w:r>
         <w:rPr/>
         <w:t>RFC 5870 explicitly states that the number of decimal digits in coordinate values MUST NOT be interpreted as an indication of accuracy. RSDGGS takes the opposite position: the number of bytes in the index IS the precision indicator, by design. This makes the RSDGGS encoding self-describing in a way that 'geo' URIs are not.</w:t>
@@ -41045,8 +41192,8 @@
         <w:jc w:val="left"/>
         <w:rPr/>
       </w:pPr>
-      <w:bookmarkStart w:id="751" w:name="section-16.2.2-3"/>
-      <w:bookmarkEnd w:id="751"/>
+      <w:bookmarkStart w:id="754" w:name="section-16.2.2-3"/>
+      <w:bookmarkEnd w:id="754"/>
       <w:r>
         <w:rPr/>
         <w:t>The 'geo' URI text encoding (typically 20-30 bytes for a full coordinate) is impractical for 802.15.4 MAC frames and CBOR-encoded IoT messages where wire efficiency is critical. The RSDGGS 1-8 byte binary encoding is 4-30 times more compact for equivalent precision.</w:t>
@@ -41060,8 +41207,8 @@
         <w:jc w:val="left"/>
         <w:rPr/>
       </w:pPr>
-      <w:bookmarkStart w:id="752" w:name="section-16.2.2-4"/>
-      <w:bookmarkEnd w:id="752"/>
+      <w:bookmarkStart w:id="755" w:name="section-16.2.2-4"/>
+      <w:bookmarkEnd w:id="755"/>
       <w:r>
         <w:rPr/>
         <w:t>RSDGGS MAY expose a 'geo' URI mapping for interoperability: an RSDGGS cell center can be expressed as a 'geo' URI with the u= parameter set to the cell radius. This mapping is lossy (the 'geo' URI does not encode the cell boundary shape) but suitable for human-readable display and web interoperability contexts. Implementations SHOULD provide this mapping for diagnostic and display purposes.</w:t>
@@ -41087,8 +41234,8 @@
         <w:rPr/>
       </w:pPr>
       <w:hyperlink w:anchor="section-16.3">
-        <w:bookmarkStart w:id="753" w:name="name-rfc-6442-location-conveyanc"/>
-        <w:bookmarkEnd w:id="753"/>
+        <w:bookmarkStart w:id="756" w:name="name-rfc-6442-location-conveyanc"/>
+        <w:bookmarkEnd w:id="756"/>
         <w:r>
           <w:rPr>
             <w:rStyle w:val="Hyperlink"/>
@@ -41117,8 +41264,8 @@
         <w:jc w:val="left"/>
         <w:rPr/>
       </w:pPr>
-      <w:bookmarkStart w:id="754" w:name="section-16.3-1"/>
-      <w:bookmarkEnd w:id="754"/>
+      <w:bookmarkStart w:id="757" w:name="section-16.3-1"/>
+      <w:bookmarkEnd w:id="757"/>
       <w:r>
         <w:rPr/>
         <w:t>RFC 6442 [</w:t>
@@ -41156,8 +41303,8 @@
         <w:rPr/>
       </w:pPr>
       <w:hyperlink w:anchor="section-16.3.1">
-        <w:bookmarkStart w:id="755" w:name="name-rfc-6442-technical-approach"/>
-        <w:bookmarkEnd w:id="755"/>
+        <w:bookmarkStart w:id="758" w:name="name-rfc-6442-technical-approach"/>
+        <w:bookmarkEnd w:id="758"/>
         <w:r>
           <w:rPr>
             <w:rStyle w:val="Hyperlink"/>
@@ -41186,8 +41333,8 @@
         <w:jc w:val="left"/>
         <w:rPr/>
       </w:pPr>
-      <w:bookmarkStart w:id="756" w:name="section-16.3.1-1"/>
-      <w:bookmarkEnd w:id="756"/>
+      <w:bookmarkStart w:id="759" w:name="section-16.3.1-1"/>
+      <w:bookmarkEnd w:id="759"/>
       <w:r>
         <w:rPr/>
         <w:t>RFC 6442 introduces a Geolocation SIP header field that carries either a location-by-value (a PIDF-LO object embedded in the SIP message body) or a location-by-reference (a URI from which a PIDF-LO can be retrieved, typically via HTTP or SIP SUBSCRIBE/NOTIFY). A new 424 (Bad Location Information) SIP response code is defined for cases where the location cannot be processed by the recipient.</w:t>
@@ -41201,8 +41348,8 @@
         <w:jc w:val="left"/>
         <w:rPr/>
       </w:pPr>
-      <w:bookmarkStart w:id="757" w:name="section-16.3.1-2"/>
-      <w:bookmarkEnd w:id="757"/>
+      <w:bookmarkStart w:id="760" w:name="section-16.3.1-2"/>
+      <w:bookmarkEnd w:id="760"/>
       <w:r>
         <w:rPr/>
         <w:t>PIDF-LO is an XML format carrying WGS-84 coordinates (point, circle, ellipse, polygon, or civic address). It includes uncertainty representation, confidence levels, and method-of-determination metadata (GPS, manual, cell-tower, etc.). SIP intermediaries are prohibited from modifying or deleting location data in transit. User consent is required before a UAC may include location in a SIP request.</w:t>
@@ -41228,8 +41375,8 @@
         <w:rPr/>
       </w:pPr>
       <w:hyperlink w:anchor="section-16.3.2">
-        <w:bookmarkStart w:id="758" w:name="name-gaps-addressed-by-rsdggs-3"/>
-        <w:bookmarkEnd w:id="758"/>
+        <w:bookmarkStart w:id="761" w:name="name-gaps-addressed-by-rsdggs-3"/>
+        <w:bookmarkEnd w:id="761"/>
         <w:r>
           <w:rPr>
             <w:rStyle w:val="Hyperlink"/>
@@ -41422,8 +41569,8 @@
         <w:jc w:val="left"/>
         <w:rPr/>
       </w:pPr>
-      <w:bookmarkStart w:id="759" w:name="section-16.3.2-2"/>
-      <w:bookmarkEnd w:id="759"/>
+      <w:bookmarkStart w:id="762" w:name="section-16.3.2-2"/>
+      <w:bookmarkEnd w:id="762"/>
       <w:r>
         <w:rPr/>
         <w:t>RFC 6442's PIDF-LO XML representation is orders of magnitude larger than RSDGGS and requires XML parsing infrastructure wholly impractical on constrained IoT devices. The consent model defined in RFC 6442, requiring user authorization before location disclosure, addresses a real privacy concern. RSDGGS addresses the same concern through the truncation model: devices share only the resolution necessary for the purpose, with no infrastructure required to enforce the policy.</w:t>
@@ -41437,8 +41584,8 @@
         <w:jc w:val="left"/>
         <w:rPr/>
       </w:pPr>
-      <w:bookmarkStart w:id="760" w:name="section-16.3.2-3"/>
-      <w:bookmarkEnd w:id="760"/>
+      <w:bookmarkStart w:id="763" w:name="section-16.3.2-3"/>
+      <w:bookmarkEnd w:id="763"/>
       <w:r>
         <w:rPr/>
         <w:t>RFC 6442's Geolocation-Routing header enables SIP routing based on location. This is a routing hint at the application layer, not an address-arithmetic property of the network address itself. RSDGGS geographic IPv6 addressing (</w:t>
@@ -41464,8 +41611,8 @@
         <w:jc w:val="left"/>
         <w:rPr/>
       </w:pPr>
-      <w:bookmarkStart w:id="761" w:name="section-16.3.2-4"/>
-      <w:bookmarkEnd w:id="761"/>
+      <w:bookmarkStart w:id="764" w:name="section-16.3.2-4"/>
+      <w:bookmarkEnd w:id="764"/>
       <w:r>
         <w:rPr/>
         <w:t>The two specifications are complementary: a SIP-capable IoT gateway MAY translate an RSDGGS cell to a PIDF-LO for interfaces toward SIP-based emergency services infrastructure, and vice versa. The translation is defined by the cell-center-to-lat/lon mapping with uncertainty equal to the cell radius.</w:t>
@@ -41491,8 +41638,8 @@
         <w:rPr/>
       </w:pPr>
       <w:hyperlink w:anchor="section-16.4">
-        <w:bookmarkStart w:id="762" w:name="name-rfc-9179-a-yang-grouping-fo"/>
-        <w:bookmarkEnd w:id="762"/>
+        <w:bookmarkStart w:id="765" w:name="name-rfc-9179-a-yang-grouping-fo"/>
+        <w:bookmarkEnd w:id="765"/>
         <w:r>
           <w:rPr>
             <w:rStyle w:val="Hyperlink"/>
@@ -41521,8 +41668,8 @@
         <w:jc w:val="left"/>
         <w:rPr/>
       </w:pPr>
-      <w:bookmarkStart w:id="763" w:name="section-16.4-1"/>
-      <w:bookmarkEnd w:id="763"/>
+      <w:bookmarkStart w:id="766" w:name="section-16.4-1"/>
+      <w:bookmarkEnd w:id="766"/>
       <w:r>
         <w:rPr/>
         <w:t>RFC 9179 [</w:t>
@@ -41560,8 +41707,8 @@
         <w:rPr/>
       </w:pPr>
       <w:hyperlink w:anchor="section-16.4.1">
-        <w:bookmarkStart w:id="764" w:name="name-rfc-9179-technical-approach"/>
-        <w:bookmarkEnd w:id="764"/>
+        <w:bookmarkStart w:id="767" w:name="name-rfc-9179-technical-approach"/>
+        <w:bookmarkEnd w:id="767"/>
         <w:r>
           <w:rPr>
             <w:rStyle w:val="Hyperlink"/>
@@ -41590,8 +41737,8 @@
         <w:jc w:val="left"/>
         <w:rPr/>
       </w:pPr>
-      <w:bookmarkStart w:id="765" w:name="section-16.4.1-1"/>
-      <w:bookmarkEnd w:id="765"/>
+      <w:bookmarkStart w:id="768" w:name="section-16.4.1-1"/>
+      <w:bookmarkEnd w:id="768"/>
       <w:r>
         <w:rPr/>
         <w:t>The geo-location YANG grouping includes: a reference-frame specifying the astronomical body and geodetic datum (defaulting to WGS-84 Earth); a location choice between ellipsoidal coordinates (latitude as decimal64 with 16 fraction-digits, longitude as decimal64 with 16 fraction-digits, optional height in meters) or Cartesian coordinates (x, y, z in meters); a velocity vector (v-north, v-east, v-up in meters per second with 12 fraction-digits); and timestamp and valid-until fields. Coordinate accuracy is carried as a separate decimal64 field in meters.</w:t>
@@ -41605,8 +41752,8 @@
         <w:jc w:val="left"/>
         <w:rPr/>
       </w:pPr>
-      <w:bookmarkStart w:id="766" w:name="section-16.4.1-2"/>
-      <w:bookmarkEnd w:id="766"/>
+      <w:bookmarkStart w:id="769" w:name="section-16.4.1-2"/>
+      <w:bookmarkEnd w:id="769"/>
       <w:r>
         <w:rPr/>
         <w:t>The design is notable for its explicit support for non-Earth astronomical bodies (Mars, the Moon, etc.) through the reference-frame mechanism, and for velocity as a first-class field. It is intended as a reusable module embedded in other YANG models, not as a standalone protocol.</w:t>
@@ -41632,8 +41779,8 @@
         <w:rPr/>
       </w:pPr>
       <w:hyperlink w:anchor="section-16.4.2">
-        <w:bookmarkStart w:id="767" w:name="name-gaps-addressed-by-rsdggs-4"/>
-        <w:bookmarkEnd w:id="767"/>
+        <w:bookmarkStart w:id="770" w:name="name-gaps-addressed-by-rsdggs-4"/>
+        <w:bookmarkEnd w:id="770"/>
         <w:r>
           <w:rPr>
             <w:rStyle w:val="Hyperlink"/>
@@ -41826,8 +41973,8 @@
         <w:jc w:val="left"/>
         <w:rPr/>
       </w:pPr>
-      <w:bookmarkStart w:id="768" w:name="section-16.4.2-2"/>
-      <w:bookmarkEnd w:id="768"/>
+      <w:bookmarkStart w:id="771" w:name="section-16.4.2-2"/>
+      <w:bookmarkEnd w:id="771"/>
       <w:r>
         <w:rPr/>
         <w:t>RFC 9179's decimal64 latitude and longitude fields (16 fraction-digits) provide sub-nanometer theoretical precision, far exceeding GPS capability. RSDGGS at 8 bytes provides 6 cm precision, which matches or exceeds operational GPS accuracy for IoT applications. The YANG encoding overhead (XML or JSON field names plus decimal values) is typically 60-100 bytes per location fix versus 1-8 bytes for RSDGGS.</w:t>
@@ -41841,8 +41988,8 @@
         <w:jc w:val="left"/>
         <w:rPr/>
       </w:pPr>
-      <w:bookmarkStart w:id="769" w:name="section-16.4.2-3"/>
-      <w:bookmarkEnd w:id="769"/>
+      <w:bookmarkStart w:id="772" w:name="section-16.4.2-3"/>
+      <w:bookmarkEnd w:id="772"/>
       <w:r>
         <w:rPr/>
         <w:t>RFC 9179 does not define a hierarchical structure for location data and provides no support for location-based routing. The RSDGGS cell index has no analog in the RFC 9179 model. An RSDGGS extension to the RFC 9179 grouping is a potential future work item, adding an optional rsdggs-cell leaf of type binary with length constraint 1..8 to the geo-location grouping, enabling network elements to carry RSDGGS regulatory context alongside their WGS-84 coordinates in YANG data models.</w:t>
@@ -41868,8 +42015,8 @@
         <w:rPr/>
       </w:pPr>
       <w:hyperlink w:anchor="section-16.5">
-        <w:bookmarkStart w:id="770" w:name="name-rfc-9632-finding-and-using-"/>
-        <w:bookmarkEnd w:id="770"/>
+        <w:bookmarkStart w:id="773" w:name="name-rfc-9632-finding-and-using-"/>
+        <w:bookmarkEnd w:id="773"/>
         <w:r>
           <w:rPr>
             <w:rStyle w:val="Hyperlink"/>
@@ -41898,8 +42045,8 @@
         <w:jc w:val="left"/>
         <w:rPr/>
       </w:pPr>
-      <w:bookmarkStart w:id="771" w:name="section-16.5-1"/>
-      <w:bookmarkEnd w:id="771"/>
+      <w:bookmarkStart w:id="774" w:name="section-16.5-1"/>
+      <w:bookmarkEnd w:id="774"/>
       <w:r>
         <w:rPr/>
         <w:t>RFC 9632 [</w:t>
@@ -41937,8 +42084,8 @@
         <w:rPr/>
       </w:pPr>
       <w:hyperlink w:anchor="section-16.5.1">
-        <w:bookmarkStart w:id="772" w:name="name-rfc-9632-technical-approach"/>
-        <w:bookmarkEnd w:id="772"/>
+        <w:bookmarkStart w:id="775" w:name="name-rfc-9632-technical-approach"/>
+        <w:bookmarkEnd w:id="775"/>
         <w:r>
           <w:rPr>
             <w:rStyle w:val="Hyperlink"/>
@@ -41967,8 +42114,8 @@
         <w:jc w:val="left"/>
         <w:rPr/>
       </w:pPr>
-      <w:bookmarkStart w:id="773" w:name="section-16.5.1-1"/>
-      <w:bookmarkEnd w:id="773"/>
+      <w:bookmarkStart w:id="776" w:name="section-16.5.1-1"/>
+      <w:bookmarkEnd w:id="776"/>
       <w:r>
         <w:rPr/>
         <w:t>A geofeed file is a CSV document published at a stable HTTPS URL, containing rows of the form: IP-prefix, country-code, region-code, city-name, postal-code (deprecated). The file maps IP address prefixes to political-administrative geographic designators (ISO 3166-1 country codes, ISO 3166-2 region codes). Discovery is via a geofeed: attribute in the RPSL inetnum: object for the relevant address range. Authentication uses RPKI Resource Certificates with CMS signatures; a new EE certificate is generated for each file version.</w:t>
@@ -41982,8 +42129,8 @@
         <w:jc w:val="left"/>
         <w:rPr/>
       </w:pPr>
-      <w:bookmarkStart w:id="774" w:name="section-16.5.1-2"/>
-      <w:bookmarkEnd w:id="774"/>
+      <w:bookmarkStart w:id="777" w:name="section-16.5.1-2"/>
+      <w:bookmarkEnd w:id="777"/>
       <w:r>
         <w:rPr/>
         <w:t>Geofeed granularity is at the IP prefix level: a /24 prefix may be mapped to a city, a /16 to a country. The most specific inetnum: object with a geofeed reference governs, and geofeed data may have finer granularity than the inetnum: block itself. The format intentionally omits precise coordinate data: the mapping is to political-administrative units, not WGS-84 coordinates.</w:t>
@@ -42009,8 +42156,8 @@
         <w:rPr/>
       </w:pPr>
       <w:hyperlink w:anchor="section-16.5.2">
-        <w:bookmarkStart w:id="775" w:name="name-gaps-addressed-by-rsdggs-5"/>
-        <w:bookmarkEnd w:id="775"/>
+        <w:bookmarkStart w:id="778" w:name="name-gaps-addressed-by-rsdggs-5"/>
+        <w:bookmarkEnd w:id="778"/>
         <w:r>
           <w:rPr>
             <w:rStyle w:val="Hyperlink"/>
@@ -42203,8 +42350,8 @@
         <w:jc w:val="left"/>
         <w:rPr/>
       </w:pPr>
-      <w:bookmarkStart w:id="776" w:name="section-16.5.2-2"/>
-      <w:bookmarkEnd w:id="776"/>
+      <w:bookmarkStart w:id="779" w:name="section-16.5.2-2"/>
+      <w:bookmarkEnd w:id="779"/>
       <w:r>
         <w:rPr/>
         <w:t>RFC 9632 and RSDGGS address fundamentally different layers of the same problem. RFC 9632 maps IP address blocks -- which are administratively assigned and may not correspond to the physical location of the device using them -- to geographic designators, for the purpose of correcting commercial geolocation database errors. RSDGGS encodes the physical location of an IoT device directly in a binary index that travels with every message the device sends, for the purpose of regulatory compliance determination at the MAC layer.</w:t>
@@ -42218,8 +42365,8 @@
         <w:jc w:val="left"/>
         <w:rPr/>
       </w:pPr>
-      <w:bookmarkStart w:id="777" w:name="section-16.5.2-3"/>
-      <w:bookmarkEnd w:id="777"/>
+      <w:bookmarkStart w:id="780" w:name="section-16.5.2-3"/>
+      <w:bookmarkEnd w:id="780"/>
       <w:r>
         <w:rPr/>
         <w:t>A meaningful integration point exists: RSDGGS-IPv6 geographic addresses (</w:t>
@@ -42257,8 +42404,8 @@
         <w:rPr/>
       </w:pPr>
       <w:hyperlink w:anchor="section-16.6">
-        <w:bookmarkStart w:id="778" w:name="name-rfc-8805-a-format-for-self-"/>
-        <w:bookmarkEnd w:id="778"/>
+        <w:bookmarkStart w:id="781" w:name="name-rfc-8805-a-format-for-self-"/>
+        <w:bookmarkEnd w:id="781"/>
         <w:r>
           <w:rPr>
             <w:rStyle w:val="Hyperlink"/>
@@ -42287,8 +42434,8 @@
         <w:jc w:val="left"/>
         <w:rPr/>
       </w:pPr>
-      <w:bookmarkStart w:id="779" w:name="section-16.6-1"/>
-      <w:bookmarkEnd w:id="779"/>
+      <w:bookmarkStart w:id="782" w:name="section-16.6-1"/>
+      <w:bookmarkEnd w:id="782"/>
       <w:r>
         <w:rPr/>
         <w:t>RFC 8805 [</w:t>
@@ -42326,8 +42473,8 @@
         <w:rPr/>
       </w:pPr>
       <w:hyperlink w:anchor="section-16.6.1">
-        <w:bookmarkStart w:id="780" w:name="name-rfc-8805-technical-approach"/>
-        <w:bookmarkEnd w:id="780"/>
+        <w:bookmarkStart w:id="783" w:name="name-rfc-8805-technical-approach"/>
+        <w:bookmarkEnd w:id="783"/>
         <w:r>
           <w:rPr>
             <w:rStyle w:val="Hyperlink"/>
@@ -42356,8 +42503,8 @@
         <w:jc w:val="left"/>
         <w:rPr/>
       </w:pPr>
-      <w:bookmarkStart w:id="781" w:name="section-16.6.1-1"/>
-      <w:bookmarkEnd w:id="781"/>
+      <w:bookmarkStart w:id="784" w:name="section-16.6.1-1"/>
+      <w:bookmarkEnd w:id="784"/>
       <w:r>
         <w:rPr/>
         <w:t>A geofeed file is a UTF-8 CSV text file published at a stable HTTPS URL. Each non-comment line has the form: ip_prefix, alpha2code, region, city, postal_code. The IP prefix field is required; all others are optional. The format intentionally only allows coarse-level location -- political-administrative designators (ISO 3166-1 country code, ISO 3166-2 region code, city name) rather than precise coordinates. Postal code is included for backward compatibility but its use is deprecated. The file is self-published by the IP address holder and consumed by geolocation data pipeline operators on a polling schedule.</w:t>
@@ -42371,8 +42518,8 @@
         <w:jc w:val="left"/>
         <w:rPr/>
       </w:pPr>
-      <w:bookmarkStart w:id="782" w:name="section-16.6.1-2"/>
-      <w:bookmarkEnd w:id="782"/>
+      <w:bookmarkStart w:id="785" w:name="section-16.6.1-2"/>
+      <w:bookmarkEnd w:id="785"/>
       <w:r>
         <w:rPr/>
         <w:t>RFC 8805 is the predecessor to RFC 9632 and directly defines the data format that RFC 9632 provides discovery mechanisms for. The two documents form a coupled pair: RFC 8805 is the format specification; RFC 9632 is the discovery and authentication specification.</w:t>
@@ -42398,8 +42545,8 @@
         <w:rPr/>
       </w:pPr>
       <w:hyperlink w:anchor="section-16.6.2">
-        <w:bookmarkStart w:id="783" w:name="name-gaps-addressed-by-rsdggs-6"/>
-        <w:bookmarkEnd w:id="783"/>
+        <w:bookmarkStart w:id="786" w:name="name-gaps-addressed-by-rsdggs-6"/>
+        <w:bookmarkEnd w:id="786"/>
         <w:r>
           <w:rPr>
             <w:rStyle w:val="Hyperlink"/>
@@ -42580,8 +42727,8 @@
         <w:jc w:val="left"/>
         <w:rPr/>
       </w:pPr>
-      <w:bookmarkStart w:id="784" w:name="section-16.6.2-2"/>
-      <w:bookmarkEnd w:id="784"/>
+      <w:bookmarkStart w:id="787" w:name="section-16.6.2-2"/>
+      <w:bookmarkEnd w:id="787"/>
       <w:r>
         <w:rPr/>
         <w:t xml:space="preserve">RFC 8805 and RSDGGS share the property of being self-published: an IP address holder publishes a geofeed file asserting the location of their prefix, and an IoT device encodes its RSDGGS cell asserting its own location. The trust models differ significantly: geofeed authenticity in RFC 8805 relies on RPKI (via RFC 9632) binding the file to the address holder's certificate; RSDGGS cell authenticity in peer-assisted scenarios relies on the MAC-layer STS authentication defined in </w:t>
@@ -42619,8 +42766,8 @@
         <w:jc w:val="left"/>
         <w:rPr/>
       </w:pPr>
-      <w:bookmarkStart w:id="785" w:name="section-16.6.2-3"/>
-      <w:bookmarkEnd w:id="785"/>
+      <w:bookmarkStart w:id="788" w:name="section-16.6.2-3"/>
+      <w:bookmarkEnd w:id="788"/>
       <w:r>
         <w:rPr/>
         <w:t xml:space="preserve">As noted in </w:t>
@@ -42658,8 +42805,8 @@
         <w:rPr/>
       </w:pPr>
       <w:hyperlink w:anchor="section-16.7">
-        <w:bookmarkStart w:id="786" w:name="name-rfc-5808-requirements-for-a"/>
-        <w:bookmarkEnd w:id="786"/>
+        <w:bookmarkStart w:id="789" w:name="name-rfc-5808-requirements-for-a"/>
+        <w:bookmarkEnd w:id="789"/>
         <w:r>
           <w:rPr>
             <w:rStyle w:val="Hyperlink"/>
@@ -42688,8 +42835,8 @@
         <w:jc w:val="left"/>
         <w:rPr/>
       </w:pPr>
-      <w:bookmarkStart w:id="787" w:name="section-16.7-1"/>
-      <w:bookmarkEnd w:id="787"/>
+      <w:bookmarkStart w:id="790" w:name="section-16.7-1"/>
+      <w:bookmarkEnd w:id="790"/>
       <w:r>
         <w:rPr/>
         <w:t>RFC 5808 [</w:t>
@@ -42727,8 +42874,8 @@
         <w:rPr/>
       </w:pPr>
       <w:hyperlink w:anchor="section-16.7.1">
-        <w:bookmarkStart w:id="788" w:name="name-rfc-5808-technical-approach"/>
-        <w:bookmarkEnd w:id="788"/>
+        <w:bookmarkStart w:id="791" w:name="name-rfc-5808-technical-approach"/>
+        <w:bookmarkEnd w:id="791"/>
         <w:r>
           <w:rPr>
             <w:rStyle w:val="Hyperlink"/>
@@ -42757,8 +42904,8 @@
         <w:jc w:val="left"/>
         <w:rPr/>
       </w:pPr>
-      <w:bookmarkStart w:id="789" w:name="section-16.7.1-1"/>
-      <w:bookmarkEnd w:id="789"/>
+      <w:bookmarkStart w:id="792" w:name="section-16.7.1-1"/>
+      <w:bookmarkEnd w:id="792"/>
       <w:r>
         <w:rPr/>
         <w:t>RFC 5808 defines the LbyR lifecycle as comprising four stages: Location URI Creation (at a Location Information Server, LIS); Location URI Distribution (via a Location Configuration Protocol, LCP, from LIS to Target); Location URI Conveyance (from Target to Location Recipient via a signaling protocol such as SIP); and Location URI Dereferencing (Location Recipient resolves the URI to obtain a PIDF-LO). The dereference protocol must support URI-form location references, must authenticate both client and server, and must return a well-formed PIDF-LO document.</w:t>
@@ -42772,8 +42919,8 @@
         <w:jc w:val="left"/>
         <w:rPr/>
       </w:pPr>
-      <w:bookmarkStart w:id="790" w:name="section-16.7.1-2"/>
-      <w:bookmarkEnd w:id="790"/>
+      <w:bookmarkStart w:id="793" w:name="section-16.7.1-2"/>
+      <w:bookmarkEnd w:id="793"/>
       <w:r>
         <w:rPr/>
         <w:t>The motivation for LbyR is that in mobile networks it is not efficient for an end host to periodically query a LIS for up-to-date location. Instead, the LIS holds the current location and the Target carries only a URI reference, which can be dereferenced by authorized recipients to obtain the current location at the time of dereference.</w:t>
@@ -42799,8 +42946,8 @@
         <w:rPr/>
       </w:pPr>
       <w:hyperlink w:anchor="section-16.7.2">
-        <w:bookmarkStart w:id="791" w:name="name-gaps-addressed-by-rsdggs-7"/>
-        <w:bookmarkEnd w:id="791"/>
+        <w:bookmarkStart w:id="794" w:name="name-gaps-addressed-by-rsdggs-7"/>
+        <w:bookmarkEnd w:id="794"/>
         <w:r>
           <w:rPr>
             <w:rStyle w:val="Hyperlink"/>
@@ -42981,8 +43128,8 @@
         <w:jc w:val="left"/>
         <w:rPr/>
       </w:pPr>
-      <w:bookmarkStart w:id="792" w:name="section-16.7.2-2"/>
-      <w:bookmarkEnd w:id="792"/>
+      <w:bookmarkStart w:id="795" w:name="section-16.7.2-2"/>
+      <w:bookmarkEnd w:id="795"/>
       <w:r>
         <w:rPr/>
         <w:t>The LbyR architecture requires persistent network connectivity to a Location Information Server for location dereferencing. This is fundamentally incompatible with the operational model of 802.15.4 IoT devices, which may operate in disconnected or intermittently connected environments, cannot carry TCP/TLS stacks required for HTTPS dereferencing, and must determine regulatory context before establishing any network connection at all.</w:t>
@@ -42996,8 +43143,8 @@
         <w:jc w:val="left"/>
         <w:rPr/>
       </w:pPr>
-      <w:bookmarkStart w:id="793" w:name="section-16.7.2-3"/>
-      <w:bookmarkEnd w:id="793"/>
+      <w:bookmarkStart w:id="796" w:name="section-16.7.2-3"/>
+      <w:bookmarkEnd w:id="796"/>
       <w:r>
         <w:rPr/>
         <w:t>RSDGGS takes the Location-by-Value position for IoT: the location index is carried directly in the MAC frame or IPv6 address. The RSDGGS cooperative localization mechanism (</w:t>
@@ -43035,8 +43182,8 @@
         <w:rPr/>
       </w:pPr>
       <w:hyperlink w:anchor="section-16.8">
-        <w:bookmarkStart w:id="794" w:name="name-rfc-5491-geopriv-pidf-lo-us"/>
-        <w:bookmarkEnd w:id="794"/>
+        <w:bookmarkStart w:id="797" w:name="name-rfc-5491-geopriv-pidf-lo-us"/>
+        <w:bookmarkEnd w:id="797"/>
         <w:r>
           <w:rPr>
             <w:rStyle w:val="Hyperlink"/>
@@ -43065,8 +43212,8 @@
         <w:jc w:val="left"/>
         <w:rPr/>
       </w:pPr>
-      <w:bookmarkStart w:id="795" w:name="section-16.8-1"/>
-      <w:bookmarkEnd w:id="795"/>
+      <w:bookmarkStart w:id="798" w:name="section-16.8-1"/>
+      <w:bookmarkEnd w:id="798"/>
       <w:r>
         <w:rPr/>
         <w:t>RFC 5491 [</w:t>
@@ -43104,8 +43251,8 @@
         <w:rPr/>
       </w:pPr>
       <w:hyperlink w:anchor="section-16.8.1">
-        <w:bookmarkStart w:id="796" w:name="name-rfc-5491-technical-approach"/>
-        <w:bookmarkEnd w:id="796"/>
+        <w:bookmarkStart w:id="799" w:name="name-rfc-5491-technical-approach"/>
+        <w:bookmarkEnd w:id="799"/>
         <w:r>
           <w:rPr>
             <w:rStyle w:val="Hyperlink"/>
@@ -43134,8 +43281,8 @@
         <w:jc w:val="left"/>
         <w:rPr/>
       </w:pPr>
-      <w:bookmarkStart w:id="797" w:name="section-16.8.1-1"/>
-      <w:bookmarkEnd w:id="797"/>
+      <w:bookmarkStart w:id="800" w:name="section-16.8.1-1"/>
+      <w:bookmarkEnd w:id="800"/>
       <w:r>
         <w:rPr/>
         <w:t>RFC 5491 defines seven rules for constructing PIDF-LO documents. The key rules relevant to RSDGGS comparison are: Rule 4 specifies that providing more than one location chunk in a single location-info element should be avoided; Rules 5 and 6 govern when compound location is permitted, requiring that multiple chunks come from the same source at the same time by the same determination method; Rule 7 requires that coarse location be provided before fine location in compound representations.</w:t>
@@ -43149,8 +43296,8 @@
         <w:jc w:val="left"/>
         <w:rPr/>
       </w:pPr>
-      <w:bookmarkStart w:id="798" w:name="section-16.8.1-2"/>
-      <w:bookmarkEnd w:id="798"/>
+      <w:bookmarkStart w:id="801" w:name="section-16.8.1-2"/>
+      <w:bookmarkEnd w:id="801"/>
       <w:r>
         <w:rPr/>
         <w:t>RFC 5491 defines two location representation types within PIDF-LO: geodetic location (WGS-84 coordinates, GML geometry shapes including Point, Circle, Ellipse, ArcBand, Polygon) and civic location (structured address: country, administrative regions A1-A6, street, floor, room). The GML subset defined for geodetic location requires mandatory implementation for location-based routing applications.</w:t>
@@ -43176,8 +43323,8 @@
         <w:rPr/>
       </w:pPr>
       <w:hyperlink w:anchor="section-16.8.2">
-        <w:bookmarkStart w:id="799" w:name="name-gaps-addressed-by-rsdggs-8"/>
-        <w:bookmarkEnd w:id="799"/>
+        <w:bookmarkStart w:id="802" w:name="name-gaps-addressed-by-rsdggs-8"/>
+        <w:bookmarkEnd w:id="802"/>
         <w:r>
           <w:rPr>
             <w:rStyle w:val="Hyperlink"/>
@@ -43370,8 +43517,8 @@
         <w:jc w:val="left"/>
         <w:rPr/>
       </w:pPr>
-      <w:bookmarkStart w:id="800" w:name="section-16.8.2-2"/>
-      <w:bookmarkEnd w:id="800"/>
+      <w:bookmarkStart w:id="803" w:name="section-16.8.2-2"/>
+      <w:bookmarkEnd w:id="803"/>
       <w:r>
         <w:rPr/>
         <w:t>RFC 5491's Rule 7 -- coarse location MUST precede fine location in compound PIDF-LO -- is structurally expressed in RSDGGS by the bit layout itself: Byte 0 (coarsest) precedes Byte 7 (finest), and truncation from the right always yields the coarser representation. RSDGGS embodies Rule 7 as an invariant property of the encoding rather than an application-layer behavioral requirement.</w:t>
@@ -43385,8 +43532,8 @@
         <w:jc w:val="left"/>
         <w:rPr/>
       </w:pPr>
-      <w:bookmarkStart w:id="801" w:name="section-16.8.2-3"/>
-      <w:bookmarkEnd w:id="801"/>
+      <w:bookmarkStart w:id="804" w:name="section-16.8.2-3"/>
+      <w:bookmarkEnd w:id="804"/>
       <w:r>
         <w:rPr/>
         <w:t>RFC 5491 supports civic location (floor number, room identifier) as a compound element alongside geodetic coordinates. RSDGGS does not encode civic location. For indoor deployments requiring floor-level regulatory distinction (which is uncommon for ISM band rules but relevant for UWB power limits in some jurisdictions), a civic layer MAY be carried as a separate CBOR field alongside the RSDGGS cell, using the PIDF-LO civic format or a simplified representation.</w:t>
@@ -43412,8 +43559,8 @@
         <w:rPr/>
       </w:pPr>
       <w:hyperlink w:anchor="section-16.9">
-        <w:bookmarkStart w:id="802" w:name="name-rfc-6280-an-architecture-fo"/>
-        <w:bookmarkEnd w:id="802"/>
+        <w:bookmarkStart w:id="805" w:name="name-rfc-6280-an-architecture-fo"/>
+        <w:bookmarkEnd w:id="805"/>
         <w:r>
           <w:rPr>
             <w:rStyle w:val="Hyperlink"/>
@@ -43442,8 +43589,8 @@
         <w:jc w:val="left"/>
         <w:rPr/>
       </w:pPr>
-      <w:bookmarkStart w:id="803" w:name="section-16.9-1"/>
-      <w:bookmarkEnd w:id="803"/>
+      <w:bookmarkStart w:id="806" w:name="section-16.9-1"/>
+      <w:bookmarkEnd w:id="806"/>
       <w:r>
         <w:rPr/>
         <w:t>RFC 6280 [</w:t>
@@ -43481,8 +43628,8 @@
         <w:rPr/>
       </w:pPr>
       <w:hyperlink w:anchor="section-16.9.1">
-        <w:bookmarkStart w:id="804" w:name="name-rfc-6280-technical-approach"/>
-        <w:bookmarkEnd w:id="804"/>
+        <w:bookmarkStart w:id="807" w:name="name-rfc-6280-technical-approach"/>
+        <w:bookmarkEnd w:id="807"/>
         <w:r>
           <w:rPr>
             <w:rStyle w:val="Hyperlink"/>
@@ -43511,8 +43658,8 @@
         <w:jc w:val="left"/>
         <w:rPr/>
       </w:pPr>
-      <w:bookmarkStart w:id="805" w:name="section-16.9.1-1"/>
-      <w:bookmarkEnd w:id="805"/>
+      <w:bookmarkStart w:id="808" w:name="section-16.9.1-1"/>
+      <w:bookmarkEnd w:id="808"/>
       <w:r>
         <w:rPr/>
         <w:t>The central component of the GEOPRIV architecture is the Location Object (LO), which binds location information to user-specified privacy rules. The architecture defines five roles: Location Generator (LG), which produces raw location measurements; Location Server (LS), which stores location objects and enforces privacy rules; Rule Maker (RM), which is the user or device owner who specifies privacy preferences; Target, the entity whose location is being described; and Location Recipient (LR), which consumes location information.</w:t>
@@ -43526,8 +43673,8 @@
         <w:jc w:val="left"/>
         <w:rPr/>
       </w:pPr>
-      <w:bookmarkStart w:id="806" w:name="section-16.9.1-2"/>
-      <w:bookmarkEnd w:id="806"/>
+      <w:bookmarkStart w:id="809" w:name="section-16.9.1-2"/>
+      <w:bookmarkEnd w:id="809"/>
       <w:r>
         <w:rPr/>
         <w:t>A central feature of the GEOPRIV architecture is that location information is always bound to privacy rules. These rules govern who may receive the location, how precisely, and under what conditions. The privacy protections rely on recipients honoring the rules they receive alongside the location data; RFC 6280 acknowledges that technical enforcement is inherently limited and relies on legal and contractual mechanisms for compliance assurance.</w:t>
@@ -43553,8 +43700,8 @@
         <w:rPr/>
       </w:pPr>
       <w:hyperlink w:anchor="section-16.9.2">
-        <w:bookmarkStart w:id="807" w:name="name-gaps-addressed-by-rsdggs-9"/>
-        <w:bookmarkEnd w:id="807"/>
+        <w:bookmarkStart w:id="810" w:name="name-gaps-addressed-by-rsdggs-9"/>
+        <w:bookmarkEnd w:id="810"/>
         <w:r>
           <w:rPr>
             <w:rStyle w:val="Hyperlink"/>
@@ -43747,8 +43894,8 @@
         <w:jc w:val="left"/>
         <w:rPr/>
       </w:pPr>
-      <w:bookmarkStart w:id="808" w:name="section-16.9.2-2"/>
-      <w:bookmarkEnd w:id="808"/>
+      <w:bookmarkStart w:id="811" w:name="section-16.9.2-2"/>
+      <w:bookmarkEnd w:id="811"/>
       <w:r>
         <w:rPr/>
         <w:t>The GEOPRIV architecture's privacy model requires that the Rule Maker express privacy preferences, that the Location Server enforce them, and that Location Recipients honor them. This three-party trust model requires persistent infrastructure that is unavailable to constrained IoT devices operating in disconnected environments.</w:t>
@@ -43762,8 +43909,8 @@
         <w:jc w:val="left"/>
         <w:rPr/>
       </w:pPr>
-      <w:bookmarkStart w:id="809" w:name="section-16.9.2-3"/>
-      <w:bookmarkEnd w:id="809"/>
+      <w:bookmarkStart w:id="812" w:name="section-16.9.2-3"/>
+      <w:bookmarkEnd w:id="812"/>
       <w:r>
         <w:rPr/>
         <w:t>RSDGGS replaces the GEOPRIV rule-based privacy model with structural privacy: a device that shares a 3-byte RSDGGS cell is physically incapable of disclosing more than country-level location, regardless of recipient behavior. No rules, servers, or trust relationships are required to enforce this property. The privacy level is determined by the sender's choice of index length, not by the recipient's compliance with transmitted rules.</w:t>
@@ -43777,8 +43924,8 @@
         <w:jc w:val="left"/>
         <w:rPr/>
       </w:pPr>
-      <w:bookmarkStart w:id="810" w:name="section-16.9.2-4"/>
-      <w:bookmarkEnd w:id="810"/>
+      <w:bookmarkStart w:id="813" w:name="section-16.9.2-4"/>
+      <w:bookmarkEnd w:id="813"/>
       <w:r>
         <w:rPr/>
         <w:t>This structural approach is both stronger (cannot be violated by a non-compliant recipient) and weaker (cannot express nuanced rules like 'share with spouse but not employer') than the GEOPRIV model. For ISM regulatory compliance, where the only required disclosure is 'am I in ITU Region 2?', the structural model is entirely sufficient. RSDGGS implementations that require nuanced privacy rules for non-regulatory purposes MAY layer a RFC 6772 geolocation policy document alongside the RSDGGS cell in application-layer CBOR messages.</w:t>
@@ -43804,8 +43951,8 @@
         <w:rPr/>
       </w:pPr>
       <w:hyperlink w:anchor="section-16.10">
-        <w:bookmarkStart w:id="811" w:name="name-rfc-6772-geolocation-policy"/>
-        <w:bookmarkEnd w:id="811"/>
+        <w:bookmarkStart w:id="814" w:name="name-rfc-6772-geolocation-policy"/>
+        <w:bookmarkEnd w:id="814"/>
         <w:r>
           <w:rPr>
             <w:rStyle w:val="Hyperlink"/>
@@ -43834,8 +43981,8 @@
         <w:jc w:val="left"/>
         <w:rPr/>
       </w:pPr>
-      <w:bookmarkStart w:id="812" w:name="section-16.10-1"/>
-      <w:bookmarkEnd w:id="812"/>
+      <w:bookmarkStart w:id="815" w:name="section-16.10-1"/>
+      <w:bookmarkEnd w:id="815"/>
       <w:r>
         <w:rPr/>
         <w:t>RFC 6772 [</w:t>
@@ -43873,8 +44020,8 @@
         <w:rPr/>
       </w:pPr>
       <w:hyperlink w:anchor="section-16.10.1">
-        <w:bookmarkStart w:id="813" w:name="name-rfc-6772-technical-approach"/>
-        <w:bookmarkEnd w:id="813"/>
+        <w:bookmarkStart w:id="816" w:name="name-rfc-6772-technical-approach"/>
+        <w:bookmarkEnd w:id="816"/>
         <w:r>
           <w:rPr>
             <w:rStyle w:val="Hyperlink"/>
@@ -43903,8 +44050,8 @@
         <w:jc w:val="left"/>
         <w:rPr/>
       </w:pPr>
-      <w:bookmarkStart w:id="814" w:name="section-16.10.1-1"/>
-      <w:bookmarkEnd w:id="814"/>
+      <w:bookmarkStart w:id="817" w:name="section-16.10.1-1"/>
+      <w:bookmarkEnd w:id="817"/>
       <w:r>
         <w:rPr/>
         <w:t>A geolocation authorization document is an XML document with MIME type application/auth-policy+xml, using the namespace urn:ietf:params:xml:ns:geolocation-policy. Documents are structured as sets of rules, each containing a condition, an action, and a transformation component. Conditions may include identity-based conditions (who is requesting) and location-based conditions (where the target is). Transformations specify how the location information should be modified before delivery -- for example, reducing precision by replacing a precise geodetic coordinate with a less precise one, or replacing geodetic coordinates with a civic address.</w:t>
@@ -43918,8 +44065,8 @@
         <w:jc w:val="left"/>
         <w:rPr/>
       </w:pPr>
-      <w:bookmarkStart w:id="815" w:name="section-16.10.1-2"/>
-      <w:bookmarkEnd w:id="815"/>
+      <w:bookmarkStart w:id="818" w:name="section-16.10.1-2"/>
+      <w:bookmarkEnd w:id="818"/>
       <w:r>
         <w:rPr/>
         <w:t>Documents are stored and managed using XCAP (XML Configuration Access Protocol, RFC 4825) at a Location Server or Presence Server. The Rule Maker uses XCAP to create, modify, and delete authorization policies. Location-based conditions allow policies such as 'when I am at work, share my location with my employer at city-level precision; when I am at home, share with family at room-level precision.'</w:t>
@@ -43945,8 +44092,8 @@
         <w:rPr/>
       </w:pPr>
       <w:hyperlink w:anchor="section-16.10.2">
-        <w:bookmarkStart w:id="816" w:name="name-gaps-addressed-by-rsdggs-10"/>
-        <w:bookmarkEnd w:id="816"/>
+        <w:bookmarkStart w:id="819" w:name="name-gaps-addressed-by-rsdggs-10"/>
+        <w:bookmarkEnd w:id="819"/>
         <w:r>
           <w:rPr>
             <w:rStyle w:val="Hyperlink"/>
@@ -44139,8 +44286,8 @@
         <w:jc w:val="left"/>
         <w:rPr/>
       </w:pPr>
-      <w:bookmarkStart w:id="817" w:name="section-16.10.2-2"/>
-      <w:bookmarkEnd w:id="817"/>
+      <w:bookmarkStart w:id="820" w:name="section-16.10.2-2"/>
+      <w:bookmarkEnd w:id="820"/>
       <w:r>
         <w:rPr/>
         <w:t>RFC 6772's location obfuscation mechanism -- reducing precision in the transformation element of a policy rule -- is conceptually identical to RSDGGS truncation, but implemented through a server-side XML transformation rather than a structural property of the encoding. The RFC 6772 approach requires a Location Server to apply the transformation rule; the RSDGGS approach requires the transmitting device to select an index length. The RSDGGS approach is implementable on a 32-byte RAM microcontroller with no server dependency.</w:t>
@@ -44154,8 +44301,8 @@
         <w:jc w:val="left"/>
         <w:rPr/>
       </w:pPr>
-      <w:bookmarkStart w:id="818" w:name="section-16.10.2-3"/>
-      <w:bookmarkEnd w:id="818"/>
+      <w:bookmarkStart w:id="821" w:name="section-16.10.2-3"/>
+      <w:bookmarkEnd w:id="821"/>
       <w:r>
         <w:rPr/>
         <w:t>RFC 6772's location-based conditions -- rules that apply differently depending on where the Target is -- have a direct analogy in RSDGGS: the RSL (Resolution Sufficiency Level) table defines location-dependent disclosure requirements for regulatory purposes. A device in Face 2 (North America) needs to disclose only 1 byte to establish 902 MHz legality; a device in Face 3 (East Asia) needs 3 bytes to distinguish Japan from China. The RSDGGS RSL table is a regulatory-specific, infrastructure-free analog to RFC 6772's location-based policy conditions.</w:t>
@@ -44169,8 +44316,8 @@
         <w:jc w:val="left"/>
         <w:rPr/>
       </w:pPr>
-      <w:bookmarkStart w:id="819" w:name="section-16.10.2-4"/>
-      <w:bookmarkEnd w:id="819"/>
+      <w:bookmarkStart w:id="822" w:name="section-16.10.2-4"/>
+      <w:bookmarkEnd w:id="822"/>
       <w:r>
         <w:rPr/>
         <w:t>The two mechanisms are composable for deployments requiring both regulatory compliance and user privacy management: RSDGGS provides the minimum regulatory disclosure at the MAC layer; a separate RFC 6772 geolocation policy governs higher-precision disclosure for application-layer services requiring richer location context.</w:t>
@@ -44196,8 +44343,8 @@
         <w:rPr/>
       </w:pPr>
       <w:hyperlink w:anchor="section-16.11">
-        <w:bookmarkStart w:id="820" w:name="name-gap-analysis-summary"/>
-        <w:bookmarkEnd w:id="820"/>
+        <w:bookmarkStart w:id="823" w:name="name-gap-analysis-summary"/>
+        <w:bookmarkEnd w:id="823"/>
         <w:r>
           <w:rPr>
             <w:rStyle w:val="Hyperlink"/>
@@ -44226,8 +44373,8 @@
         <w:jc w:val="left"/>
         <w:rPr/>
       </w:pPr>
-      <w:bookmarkStart w:id="821" w:name="section-16.11-1"/>
-      <w:bookmarkEnd w:id="821"/>
+      <w:bookmarkStart w:id="824" w:name="section-16.11-1"/>
+      <w:bookmarkEnd w:id="824"/>
       <w:r>
         <w:rPr/>
         <w:t>The following table summarizes the key gaps across all ten reviewed specifications and the RSDGGS response to each. Each entry corresponds to the detailed comparison in the preceding subsections (16.1 through 16.10):</w:t>
@@ -44262,9 +44409,9 @@
           <w:szCs w:val="4"/>
         </w:rPr>
       </w:r>
-      <w:bookmarkStart w:id="822" w:name="table-18"/>
-      <w:bookmarkStart w:id="823" w:name="table-18"/>
-      <w:bookmarkEnd w:id="823"/>
+      <w:bookmarkStart w:id="825" w:name="table-18"/>
+      <w:bookmarkStart w:id="826" w:name="table-18"/>
+      <w:bookmarkEnd w:id="826"/>
     </w:p>
     <w:p>
       <w:pPr>
@@ -45079,8 +45226,8 @@
         <w:jc w:val="left"/>
         <w:rPr/>
       </w:pPr>
-      <w:bookmarkStart w:id="824" w:name="section-16.11-3"/>
-      <w:bookmarkEnd w:id="824"/>
+      <w:bookmarkStart w:id="827" w:name="section-16.11-3"/>
+      <w:bookmarkEnd w:id="827"/>
       <w:r>
         <w:rPr/>
         <w:t>RSDGGS does not supersede any of the five referenced specifications. Each addresses a distinct protocol layer or use case for which it remains the appropriate standard. RSDGGS fills the gap at the intersection of geographic addressing, regulatory compliance encoding, constrained IoT communication, and MAC-layer integration -- a combination not addressed by any prior IETF work.</w:t>
@@ -45094,8 +45241,8 @@
         <w:jc w:val="left"/>
         <w:rPr/>
       </w:pPr>
-      <w:bookmarkStart w:id="825" w:name="section-16.11-4"/>
-      <w:bookmarkEnd w:id="825"/>
+      <w:bookmarkStart w:id="828" w:name="section-16.11-4"/>
+      <w:bookmarkEnd w:id="828"/>
       <w:r>
         <w:rPr/>
         <w:t>Implementations are encouraged to support translation between RSDGGS cells and the formats defined in RFC 5870 ('geo' URI) and RFC 9179 (YANG grouping) for interoperability with infrastructure-side systems. The RSDGGS cell center coordinates provide the lat/lon values for these translations; the cell radius provides the uncertainty parameter.</w:t>
@@ -45121,8 +45268,8 @@
         <w:rPr/>
       </w:pPr>
       <w:hyperlink w:anchor="section-17">
-        <w:bookmarkStart w:id="826" w:name="name-backward-citations-relevant"/>
-        <w:bookmarkEnd w:id="826"/>
+        <w:bookmarkStart w:id="829" w:name="name-backward-citations-relevant"/>
+        <w:bookmarkEnd w:id="829"/>
         <w:r>
           <w:rPr>
             <w:rStyle w:val="Hyperlink"/>
@@ -45151,8 +45298,8 @@
         <w:jc w:val="left"/>
         <w:rPr/>
       </w:pPr>
-      <w:bookmarkStart w:id="827" w:name="section-17-1"/>
-      <w:bookmarkEnd w:id="827"/>
+      <w:bookmarkStart w:id="830" w:name="section-17-1"/>
+      <w:bookmarkEnd w:id="830"/>
       <w:r>
         <w:rPr/>
         <w:t xml:space="preserve">Each patent and RFC examined in </w:t>
@@ -45190,8 +45337,8 @@
         <w:rPr/>
       </w:pPr>
       <w:hyperlink w:anchor="section-17.1">
-        <w:bookmarkStart w:id="828" w:name="name-gpsr-greedy-perimeter-state"/>
-        <w:bookmarkEnd w:id="828"/>
+        <w:bookmarkStart w:id="831" w:name="name-gpsr-greedy-perimeter-state"/>
+        <w:bookmarkEnd w:id="831"/>
         <w:r>
           <w:rPr>
             <w:rStyle w:val="Hyperlink"/>
@@ -45220,8 +45367,8 @@
         <w:jc w:val="left"/>
         <w:rPr/>
       </w:pPr>
-      <w:bookmarkStart w:id="829" w:name="section-17.1-1"/>
-      <w:bookmarkEnd w:id="829"/>
+      <w:bookmarkStart w:id="832" w:name="section-17.1-1"/>
+      <w:bookmarkEnd w:id="832"/>
       <w:r>
         <w:rPr/>
         <w:t>Karp, B. and H.T. Kung, 'GPSR: Greedy Perimeter Stateless Routing for Wireless Networks', MobiCom 2000. Cited as primary prior art in US 10,812,365 (geohyperbolic routing patent).</w:t>
@@ -45235,8 +45382,8 @@
         <w:jc w:val="left"/>
         <w:rPr/>
       </w:pPr>
-      <w:bookmarkStart w:id="830" w:name="section-17.1-2"/>
-      <w:bookmarkEnd w:id="830"/>
+      <w:bookmarkStart w:id="833" w:name="section-17.1-2"/>
+      <w:bookmarkEnd w:id="833"/>
       <w:r>
         <w:rPr/>
         <w:t xml:space="preserve">Relevance to RSDGGS: GPSR is the canonical geographic greedy forwarding algorithm for wireless networks. It defines two components: greedy forwarding (advance toward destination by geographic distance) and perimeter routing (traverse face of a planar graph when greedy forwarding is stuck at a void). RSDGGS </w:t>
@@ -45298,8 +45445,8 @@
         <w:rPr/>
       </w:pPr>
       <w:hyperlink w:anchor="section-17.2">
-        <w:bookmarkStart w:id="831" w:name="name-ieee-80211d-country-informa"/>
-        <w:bookmarkEnd w:id="831"/>
+        <w:bookmarkStart w:id="834" w:name="name-ieee-80211d-country-informa"/>
+        <w:bookmarkEnd w:id="834"/>
         <w:r>
           <w:rPr>
             <w:rStyle w:val="Hyperlink"/>
@@ -45328,8 +45475,8 @@
         <w:jc w:val="left"/>
         <w:rPr/>
       </w:pPr>
-      <w:bookmarkStart w:id="832" w:name="section-17.2-1"/>
-      <w:bookmarkEnd w:id="832"/>
+      <w:bookmarkStart w:id="835" w:name="section-17.2-1"/>
+      <w:bookmarkEnd w:id="835"/>
       <w:r>
         <w:rPr/>
         <w:t>IEEE 802.11d-2001, 'Amendment: Specifications for Operation in Additional Regulatory Domains'. Surfaced through the wireless regulatory compliance patent family (US 10,306,400, US 9,654,965).</w:t>
@@ -45343,8 +45490,8 @@
         <w:jc w:val="left"/>
         <w:rPr/>
       </w:pPr>
-      <w:bookmarkStart w:id="833" w:name="section-17.2-2"/>
-      <w:bookmarkEnd w:id="833"/>
+      <w:bookmarkStart w:id="836" w:name="section-17.2-2"/>
+      <w:bookmarkEnd w:id="836"/>
       <w:r>
         <w:rPr/>
         <w:t xml:space="preserve">Relevance to RSDGGS: IEEE 802.11d defines country information elements (Country IE) in Wi-Fi beacon frames. Each Country IE contains a 3-character country string and per-channel maximum transmit power tables. This is the direct 802.11 predecessor of the RSDGGS 802.15.4 Location Sub-IE defined in </w:t>
@@ -45382,8 +45529,8 @@
         <w:rPr/>
       </w:pPr>
       <w:hyperlink w:anchor="section-17.3">
-        <w:bookmarkStart w:id="834" w:name="name-ieee-80211h-dfs-and-tpc-fro"/>
-        <w:bookmarkEnd w:id="834"/>
+        <w:bookmarkStart w:id="837" w:name="name-ieee-80211h-dfs-and-tpc-fro"/>
+        <w:bookmarkEnd w:id="837"/>
         <w:r>
           <w:rPr>
             <w:rStyle w:val="Hyperlink"/>
@@ -45412,8 +45559,8 @@
         <w:jc w:val="left"/>
         <w:rPr/>
       </w:pPr>
-      <w:bookmarkStart w:id="835" w:name="section-17.3-1"/>
-      <w:bookmarkEnd w:id="835"/>
+      <w:bookmarkStart w:id="838" w:name="section-17.3-1"/>
+      <w:bookmarkEnd w:id="838"/>
       <w:r>
         <w:rPr/>
         <w:t>IEEE 802.11h-2003, 'Spectrum and Transmit Power Management Extensions'. Also surfaced through the wireless regulatory compliance patent family.</w:t>
@@ -45427,8 +45574,8 @@
         <w:jc w:val="left"/>
         <w:rPr/>
       </w:pPr>
-      <w:bookmarkStart w:id="836" w:name="section-17.3-2"/>
-      <w:bookmarkEnd w:id="836"/>
+      <w:bookmarkStart w:id="839" w:name="section-17.3-2"/>
+      <w:bookmarkEnd w:id="839"/>
       <w:r>
         <w:rPr/>
         <w:t xml:space="preserve">Relevance to RSDGGS: IEEE 802.11h defines Dynamic Frequency Selection (DFS) for radar avoidance and Transmit Power Control (TPC) for regulatory compliance in the 5 GHz band. TPC specifically defines a negotiated reduction of transmit power between stations based on measured path loss, with the goal of keeping transmit power at the minimum needed for link quality. This is the direct 802.11 predecessor of RSDGGS </w:t>
@@ -45466,8 +45613,8 @@
         <w:rPr/>
       </w:pPr>
       <w:hyperlink w:anchor="section-17.4">
-        <w:bookmarkStart w:id="837" w:name="name-rfc-3693-geopriv-requiremen"/>
-        <w:bookmarkEnd w:id="837"/>
+        <w:bookmarkStart w:id="840" w:name="name-rfc-3693-geopriv-requiremen"/>
+        <w:bookmarkEnd w:id="840"/>
         <w:r>
           <w:rPr>
             <w:rStyle w:val="Hyperlink"/>
@@ -45496,8 +45643,8 @@
         <w:jc w:val="left"/>
         <w:rPr/>
       </w:pPr>
-      <w:bookmarkStart w:id="838" w:name="section-17.4-1"/>
-      <w:bookmarkEnd w:id="838"/>
+      <w:bookmarkStart w:id="841" w:name="section-17.4-1"/>
+      <w:bookmarkEnd w:id="841"/>
       <w:r>
         <w:rPr/>
         <w:t>Cuellar, J., Morris, J., Mulligan, D., Peterson, J., and J. Polk, 'Geopriv Requirements', RFC 3693, February 2004. Cited as the foundational requirements document by both RFC 6442 and RFC 6280.</w:t>
@@ -45511,8 +45658,8 @@
         <w:jc w:val="left"/>
         <w:rPr/>
       </w:pPr>
-      <w:bookmarkStart w:id="839" w:name="section-17.4-2"/>
-      <w:bookmarkEnd w:id="839"/>
+      <w:bookmarkStart w:id="842" w:name="section-17.4-2"/>
+      <w:bookmarkEnd w:id="842"/>
       <w:r>
         <w:rPr/>
         <w:t>Relevance to RSDGGS: RFC 3693 defines the concept of a 'using protocol': any protocol that transmits or acts on location information must satisfy GEOPRIV's authorization, integrity, and privacy requirements. RSDGGS's 802.15.4 MAC bootstrap (</w:t>
@@ -45574,8 +45721,8 @@
         <w:rPr/>
       </w:pPr>
       <w:hyperlink w:anchor="section-17.5">
-        <w:bookmarkStart w:id="840" w:name="name-rfc-3825-dhcp-geodetic-loca"/>
-        <w:bookmarkEnd w:id="840"/>
+        <w:bookmarkStart w:id="843" w:name="name-rfc-3825-dhcp-geodetic-loca"/>
+        <w:bookmarkEnd w:id="843"/>
         <w:r>
           <w:rPr>
             <w:rStyle w:val="Hyperlink"/>
@@ -45604,8 +45751,8 @@
         <w:jc w:val="left"/>
         <w:rPr/>
       </w:pPr>
-      <w:bookmarkStart w:id="841" w:name="section-17.5-1"/>
-      <w:bookmarkEnd w:id="841"/>
+      <w:bookmarkStart w:id="844" w:name="section-17.5-1"/>
+      <w:bookmarkEnd w:id="844"/>
       <w:r>
         <w:rPr/>
         <w:t>Polk, J., Schnizlein, J., and M. Linsner, 'Dynamic Host Configuration Protocol Option for Coordinate-based Location Configuration Information', RFC 3825, July 2004. Cited as a location provisioning mechanism in RFC 5870 and RFC 5808.</w:t>
@@ -45619,8 +45766,8 @@
         <w:jc w:val="left"/>
         <w:rPr/>
       </w:pPr>
-      <w:bookmarkStart w:id="842" w:name="section-17.5-2"/>
-      <w:bookmarkEnd w:id="842"/>
+      <w:bookmarkStart w:id="845" w:name="section-17.5-2"/>
+      <w:bookmarkEnd w:id="845"/>
       <w:r>
         <w:rPr/>
         <w:t>Relevance and limitation: RFC 3825 defines a DHCP option carrying WGS-84 latitude and longitude for device location provisioning. A DHCPv6 analog carrying an RSDGGS cell index would provide a convenient provisioning path for fixed-infrastructure deployments where DHCP already runs. However, RFC 3825 and any DHCPv6 RSDGGS extension are explicitly excluded from serving as a required provisioning mechanism by design goal G8.</w:t>
@@ -45634,8 +45781,8 @@
         <w:jc w:val="left"/>
         <w:rPr/>
       </w:pPr>
-      <w:bookmarkStart w:id="843" w:name="section-17.5-3"/>
-      <w:bookmarkEnd w:id="843"/>
+      <w:bookmarkStart w:id="846" w:name="section-17.5-3"/>
+      <w:bookmarkEnd w:id="846"/>
       <w:r>
         <w:rPr/>
         <w:t>The reason is structural: DHCP is a client-server protocol with a centralized server as a single point of failure. If the DHCPv6 server is unavailable -- due to server failure, network partition, or initial bootstrap before any infrastructure is established -- onboarding devices cannot acquire their regulatory configuration. This violates G8's requirement for complete independence from any centralized server. IPv6 Stateless Address Autoconfiguration (SLAAC, RFC 4862) and Neighbor Discovery (RFC 4861) demonstrate the correct architectural model: a device derives its IPv6 address from its MAC address and the subnet prefix advertised by neighboring routers, with no server dependency. RSDGGS follows the same model: a device derives its regulatory cell from the RSDGGS cells of neighboring devices (</w:t>
@@ -45661,8 +45808,8 @@
         <w:jc w:val="left"/>
         <w:rPr/>
       </w:pPr>
-      <w:bookmarkStart w:id="844" w:name="section-17.5-4"/>
-      <w:bookmarkEnd w:id="844"/>
+      <w:bookmarkStart w:id="847" w:name="section-17.5-4"/>
+      <w:bookmarkEnd w:id="847"/>
       <w:r>
         <w:rPr/>
         <w:t xml:space="preserve">RFC 3825 / DHCPv6 RSDGGS options MAY be implemented as optional accelerators in managed infrastructure deployments where the DHCP server is always available before devices are deployed. They MUST NOT be implemented as the sole or primary regulatory provisioning path. Any RSDGGS implementation that supports DHCPv6 provisioning MUST also implement the peer-assisted bootstrap of </w:t>
@@ -45700,8 +45847,8 @@
         <w:rPr/>
       </w:pPr>
       <w:hyperlink w:anchor="section-17.6">
-        <w:bookmarkStart w:id="845" w:name="name-rfc-4632-cidr-classless-int"/>
-        <w:bookmarkEnd w:id="845"/>
+        <w:bookmarkStart w:id="848" w:name="name-rfc-4632-cidr-classless-int"/>
+        <w:bookmarkEnd w:id="848"/>
         <w:r>
           <w:rPr>
             <w:rStyle w:val="Hyperlink"/>
@@ -45730,8 +45877,8 @@
         <w:jc w:val="left"/>
         <w:rPr/>
       </w:pPr>
-      <w:bookmarkStart w:id="846" w:name="section-17.6-1"/>
-      <w:bookmarkEnd w:id="846"/>
+      <w:bookmarkStart w:id="849" w:name="section-17.6-1"/>
+      <w:bookmarkEnd w:id="849"/>
       <w:r>
         <w:rPr/>
         <w:t>Fuller, V. and T. Li, 'Classless Inter-domain Routing (CIDR): The Internet Address Assignment and Aggregation Plan', BCP 122, RFC 4632, August 2006. Cited as background in RFC 9632's geofeed discovery context.</w:t>
@@ -45745,8 +45892,8 @@
         <w:jc w:val="left"/>
         <w:rPr/>
       </w:pPr>
-      <w:bookmarkStart w:id="847" w:name="section-17.6-2"/>
-      <w:bookmarkEnd w:id="847"/>
+      <w:bookmarkStart w:id="850" w:name="section-17.6-2"/>
+      <w:bookmarkEnd w:id="850"/>
       <w:r>
         <w:rPr/>
         <w:t>Relevance to RSDGGS: CIDR defines prefix-based aggregation of IPv4 address space into routing hierarchies, where a /16 prefix aggregates 65,536 /32 host addresses into a single routing entry. RSDGGS-IPv6 geographic addressing (</w:t>
@@ -45796,8 +45943,8 @@
         <w:rPr/>
       </w:pPr>
       <w:hyperlink w:anchor="section-17.7">
-        <w:bookmarkStart w:id="848" w:name="name-rfc-6269-issues-with-ip-add"/>
-        <w:bookmarkEnd w:id="848"/>
+        <w:bookmarkStart w:id="851" w:name="name-rfc-6269-issues-with-ip-add"/>
+        <w:bookmarkEnd w:id="851"/>
         <w:r>
           <w:rPr>
             <w:rStyle w:val="Hyperlink"/>
@@ -45826,8 +45973,8 @@
         <w:jc w:val="left"/>
         <w:rPr/>
       </w:pPr>
-      <w:bookmarkStart w:id="849" w:name="section-17.7-1"/>
-      <w:bookmarkEnd w:id="849"/>
+      <w:bookmarkStart w:id="852" w:name="section-17.7-1"/>
+      <w:bookmarkEnd w:id="852"/>
       <w:r>
         <w:rPr/>
         <w:t>Ford, M., Boucadair, M., Durand, A., Levis, P., and P. Roberts, 'Issues with IP Address Sharing', RFC 6269, June 2011. Cited in RFC 9632's introduction as motivation for geofeed.</w:t>
@@ -45841,8 +45988,8 @@
         <w:jc w:val="left"/>
         <w:rPr/>
       </w:pPr>
-      <w:bookmarkStart w:id="850" w:name="section-17.7-2"/>
-      <w:bookmarkEnd w:id="850"/>
+      <w:bookmarkStart w:id="853" w:name="section-17.7-2"/>
+      <w:bookmarkEnd w:id="853"/>
       <w:r>
         <w:rPr/>
         <w:t xml:space="preserve">Relevance to RSDGGS: RFC 6269 documents the problem that commercial IP geolocation databases are unreliable when IP addresses are shared (NAT, CGN, mobile carrier address pools) because a shared address maps to many physical locations. RFC 9632 geofeed was designed as a partial solution -- operators can publish authoritative location for their IP prefix. RSDGGS-IPv6 geographic addressing solves this problem categorically for devices using RSDGGS addresses: the lower 64 bits of the IPv6 address encode the device's geographic cell, making location-by-address exact by construction rather than inferred. This should be noted in </w:t>
@@ -45880,8 +46027,8 @@
         <w:rPr/>
       </w:pPr>
       <w:hyperlink w:anchor="section-17.8">
-        <w:bookmarkStart w:id="851" w:name="name-geocast-geographic-addressi"/>
-        <w:bookmarkEnd w:id="851"/>
+        <w:bookmarkStart w:id="854" w:name="name-geocast-geographic-addressi"/>
+        <w:bookmarkEnd w:id="854"/>
         <w:r>
           <w:rPr>
             <w:rStyle w:val="Hyperlink"/>
@@ -45910,8 +46057,8 @@
         <w:jc w:val="left"/>
         <w:rPr/>
       </w:pPr>
-      <w:bookmarkStart w:id="852" w:name="section-17.8-1"/>
-      <w:bookmarkEnd w:id="852"/>
+      <w:bookmarkStart w:id="855" w:name="section-17.8-1"/>
+      <w:bookmarkEnd w:id="855"/>
       <w:r>
         <w:rPr/>
         <w:t>Navas, J.C. and T. Imielinski, 'GeoCast: Geographic Addressing and Routing', MobiCom 1997. Cited in RFC 2009 as the companion paper describing geographic multicast.</w:t>
@@ -45925,8 +46072,8 @@
         <w:jc w:val="left"/>
         <w:rPr/>
       </w:pPr>
-      <w:bookmarkStart w:id="853" w:name="section-17.8-2"/>
-      <w:bookmarkEnd w:id="853"/>
+      <w:bookmarkStart w:id="856" w:name="section-17.8-2"/>
+      <w:bookmarkEnd w:id="856"/>
       <w:r>
         <w:rPr/>
         <w:t xml:space="preserve">Relevance to RSDGGS: GeoCast defines geographic multicast: delivering a packet to all nodes currently within a specified geographic polygon. RSDGGS-IPv6 prefix aggregation enables a direct implementation of GeoCast: a packet addressed to a /72 RSDGGS-IPv6 prefix is a GeoCast to all devices in a single ITU Region; a packet addressed to a /88 prefix is a GeoCast to a country-scale cell. This is lossless GeoCast -- the cell boundary is exact, not approximated by a polygon. GeoCast should be cited as an informative reference in </w:t>
@@ -45964,8 +46111,8 @@
         <w:rPr/>
       </w:pPr>
       <w:hyperlink w:anchor="section-17.9">
-        <w:bookmarkStart w:id="854" w:name="name-summary-of-newly-identified"/>
-        <w:bookmarkEnd w:id="854"/>
+        <w:bookmarkStart w:id="857" w:name="name-summary-of-newly-identified"/>
+        <w:bookmarkEnd w:id="857"/>
         <w:r>
           <w:rPr>
             <w:rStyle w:val="Hyperlink"/>
@@ -45994,8 +46141,8 @@
         <w:jc w:val="left"/>
         <w:rPr/>
       </w:pPr>
-      <w:bookmarkStart w:id="855" w:name="section-17.9-1"/>
-      <w:bookmarkEnd w:id="855"/>
+      <w:bookmarkStart w:id="858" w:name="section-17.9-1"/>
+      <w:bookmarkEnd w:id="858"/>
       <w:r>
         <w:rPr/>
         <w:t>The following references, surfaced from the backward citation chains of documents already examined, should be added to the references of this draft (</w:t>
@@ -46054,9 +46201,9 @@
           <w:szCs w:val="4"/>
         </w:rPr>
       </w:r>
-      <w:bookmarkStart w:id="856" w:name="table-19"/>
-      <w:bookmarkStart w:id="857" w:name="table-19"/>
-      <w:bookmarkEnd w:id="857"/>
+      <w:bookmarkStart w:id="859" w:name="table-19"/>
+      <w:bookmarkStart w:id="860" w:name="table-19"/>
+      <w:bookmarkEnd w:id="860"/>
     </w:p>
     <w:p>
       <w:pPr>
@@ -47198,8 +47345,8 @@
         <w:jc w:val="left"/>
         <w:rPr/>
       </w:pPr>
-      <w:bookmarkStart w:id="858" w:name="section-17.9-3"/>
-      <w:bookmarkEnd w:id="858"/>
+      <w:bookmarkStart w:id="861" w:name="section-17.9-3"/>
+      <w:bookmarkEnd w:id="861"/>
       <w:r>
         <w:rPr/>
         <w:t xml:space="preserve">Of these, RFC 3825 with its DHCP single-point-of-failure limitation, IEEE 802.11d as the direct predecessor of the RSDGGS 802.15.4 Sub-IE, and RFC 4862/4861 as the SLAAC/ND model that G8 follows are the highest-priority additions. The GPSR void-handling gap, the most significant technical limitation of the forwarding outline, is documented in </w:t>
@@ -47237,8 +47384,8 @@
         <w:rPr/>
       </w:pPr>
       <w:hyperlink w:anchor="section-18">
-        <w:bookmarkStart w:id="859" w:name="name-freedom-to-operate-and-prio"/>
-        <w:bookmarkEnd w:id="859"/>
+        <w:bookmarkStart w:id="862" w:name="name-freedom-to-operate-and-prio"/>
+        <w:bookmarkEnd w:id="862"/>
         <w:r>
           <w:rPr>
             <w:rStyle w:val="Hyperlink"/>
@@ -47267,8 +47414,8 @@
         <w:jc w:val="left"/>
         <w:rPr/>
       </w:pPr>
-      <w:bookmarkStart w:id="860" w:name="section-18-1"/>
-      <w:bookmarkEnd w:id="860"/>
+      <w:bookmarkStart w:id="863" w:name="section-18-1"/>
+      <w:bookmarkEnd w:id="863"/>
       <w:r>
         <w:rPr/>
         <w:t>This section provides a comprehensive analysis of all patents and RFC standards examined during the development of RSDGGS. For each, it identifies the technical relationship to RSDGGS, evaluates freedom to operate, and identifies any improvement opportunity that the prior work suggests for RSDGGS. Improvement opportunities are RSDGGS-applicable enhancements that are either enabled by, or would have been blocked by, the referenced work. All patent analyses are informational only and do not constitute legal advice.</w:t>
@@ -47294,8 +47441,8 @@
         <w:rPr/>
       </w:pPr>
       <w:hyperlink w:anchor="section-18.1">
-        <w:bookmarkStart w:id="861" w:name="name-expired-patents-public-doma"/>
-        <w:bookmarkEnd w:id="861"/>
+        <w:bookmarkStart w:id="864" w:name="name-expired-patents-public-doma"/>
+        <w:bookmarkEnd w:id="864"/>
         <w:r>
           <w:rPr>
             <w:rStyle w:val="Hyperlink"/>
@@ -47324,8 +47471,8 @@
         <w:jc w:val="left"/>
         <w:rPr/>
       </w:pPr>
-      <w:bookmarkStart w:id="862" w:name="section-18.1-1"/>
-      <w:bookmarkEnd w:id="862"/>
+      <w:bookmarkStart w:id="865" w:name="section-18.1-1"/>
+      <w:bookmarkEnd w:id="865"/>
       <w:r>
         <w:rPr/>
         <w:t>The following patents are expired, and the following published application was abandoned without being granted, so no one holds enforceable rights in them. Their full technical disclosures are public. They constitute prior art against any third-party attempt to patent the techniques they disclose, and RSDGGS implementations may freely use these techniques without license.</w:t>
@@ -47351,8 +47498,8 @@
         <w:rPr/>
       </w:pPr>
       <w:hyperlink w:anchor="section-18.1.1">
-        <w:bookmarkStart w:id="863" w:name="name-us-patent-4939726-metricom-"/>
-        <w:bookmarkEnd w:id="863"/>
+        <w:bookmarkStart w:id="866" w:name="name-us-patent-4939726-metricom-"/>
+        <w:bookmarkEnd w:id="866"/>
         <w:r>
           <w:rPr>
             <w:rStyle w:val="Hyperlink"/>
@@ -47381,8 +47528,8 @@
         <w:jc w:val="left"/>
         <w:rPr/>
       </w:pPr>
-      <w:bookmarkStart w:id="864" w:name="section-18.1.1-1"/>
-      <w:bookmarkEnd w:id="864"/>
+      <w:bookmarkStart w:id="867" w:name="section-18.1.1-1"/>
+      <w:bookmarkEnd w:id="867"/>
       <w:r>
         <w:rPr/>
         <w:t>Title: Method for Routing Packets in a Packet Communication Network. Inventors: Flammer, Kalkwarf. Assignee: Metricom, Inc. (later Proxim Wireless Corp.). Filed 1989, granted July 3, 1990, expired 2007. Companion patent US 5,115,433 (Baran, Flammer, Kalkwarf -- Metricom, 1992) is also expired.</w:t>
@@ -47635,8 +47782,8 @@
         <w:jc w:val="left"/>
         <w:rPr/>
       </w:pPr>
-      <w:bookmarkStart w:id="865" w:name="section-18.1.1-3"/>
-      <w:bookmarkEnd w:id="865"/>
+      <w:bookmarkStart w:id="868" w:name="section-18.1.1-3"/>
+      <w:bookmarkEnd w:id="868"/>
       <w:r>
         <w:rPr/>
         <w:t xml:space="preserve">RSDGGS improvement opportunity -- Link Quality Weighted Forwarding: US 4,939,726 Claim 3 and US 5,115,433 define a link quality (LQ) factor incorporating distance, power, retry history, throughput, and delay. RSDGGS </w:t>
@@ -47662,8 +47809,8 @@
         <w:jc w:val="left"/>
         <w:rPr/>
       </w:pPr>
-      <w:bookmarkStart w:id="866" w:name="section-18.1.1-4"/>
-      <w:bookmarkEnd w:id="866"/>
+      <w:bookmarkStart w:id="869" w:name="section-18.1.1-4"/>
+      <w:bookmarkEnd w:id="869"/>
       <w:r>
         <w:rPr/>
         <w:t>RSDGGS improvement opportunity -- Loop and Dead-End Mitigation: US 5,115,433 also bounds the life of every packet with a one-octet field that each repeater decrements, records dead-end neighbors in the local table so they stop being chosen, and, when no forward progress is possible, has the previous node resend through another neighbor or returns the packet to its source for rerouting. These mitigations are freely implementable and complement face routing for RSDGGS forwarding (</w:t>
@@ -47701,8 +47848,8 @@
         <w:rPr/>
       </w:pPr>
       <w:hyperlink w:anchor="section-18.1.2">
-        <w:bookmarkStart w:id="867" w:name="name-us-application-2010-0002700"/>
-        <w:bookmarkEnd w:id="867"/>
+        <w:bookmarkStart w:id="870" w:name="name-us-application-2010-0002700"/>
+        <w:bookmarkEnd w:id="870"/>
         <w:r>
           <w:rPr>
             <w:rStyle w:val="Hyperlink"/>
@@ -47731,8 +47878,8 @@
         <w:jc w:val="left"/>
         <w:rPr/>
       </w:pPr>
-      <w:bookmarkStart w:id="868" w:name="section-18.1.2-1"/>
-      <w:bookmarkEnd w:id="868"/>
+      <w:bookmarkStart w:id="871" w:name="section-18.1.2-1"/>
+      <w:bookmarkEnd w:id="871"/>
       <w:r>
         <w:rPr/>
         <w:t>Title: Methods and Systems for Network Packet Routing Using Embedded Geographic Routing Information. Inventor: Charles Robert Simpson, Jr. Applicant: Cellnet Innovations, Inc. (later Landis+Gyr Innovations, Inc.). Filed July 2, 2008, published January 7, 2010; PCT counterpart WO 2010/002782. Abandoned for failure to respond to an Office action, 2011. Never granted.</w:t>
@@ -47985,8 +48132,8 @@
         <w:jc w:val="left"/>
         <w:rPr/>
       </w:pPr>
-      <w:bookmarkStart w:id="869" w:name="section-18.1.2-3"/>
-      <w:bookmarkEnd w:id="869"/>
+      <w:bookmarkStart w:id="872" w:name="section-18.1.2-3"/>
+      <w:bookmarkEnd w:id="872"/>
       <w:r>
         <w:rPr/>
         <w:t>Relevance to RSDGGS: This is the closest prior art found to RSDGGS geographic IPv6 addressing (</w:t>
@@ -48036,8 +48183,8 @@
         <w:rPr/>
       </w:pPr>
       <w:hyperlink w:anchor="section-18.1.3">
-        <w:bookmarkStart w:id="870" w:name="name-us-patent-6982966-status-un"/>
-        <w:bookmarkEnd w:id="870"/>
+        <w:bookmarkStart w:id="873" w:name="name-us-patent-6982966-status-un"/>
+        <w:bookmarkEnd w:id="873"/>
         <w:r>
           <w:rPr>
             <w:rStyle w:val="Hyperlink"/>
@@ -48066,8 +48213,8 @@
         <w:jc w:val="left"/>
         <w:rPr/>
       </w:pPr>
-      <w:bookmarkStart w:id="871" w:name="section-18.1.3-1"/>
-      <w:bookmarkEnd w:id="871"/>
+      <w:bookmarkStart w:id="874" w:name="section-18.1.3-1"/>
+      <w:bookmarkEnd w:id="874"/>
       <w:r>
         <w:rPr/>
         <w:t>This number was not definitively identified in patent database searches. If this patent was cited in relation to geographic routing or MANET protocols, the Metricom prior art (4,939,726 and 5,115,433, both expired 2007 and 2009 respectively) predates any 2006-era geographic routing patent by 15+ years and establishes the core concepts as public domain. Independent verification at the USPTO patent database (https://patents.uspto.gov) is still recommended.</w:t>
@@ -48093,8 +48240,8 @@
         <w:rPr/>
       </w:pPr>
       <w:hyperlink w:anchor="section-18.2">
-        <w:bookmarkStart w:id="872" w:name="name-active-patents-detailed-ana"/>
-        <w:bookmarkEnd w:id="872"/>
+        <w:bookmarkStart w:id="875" w:name="name-active-patents-detailed-ana"/>
+        <w:bookmarkEnd w:id="875"/>
         <w:r>
           <w:rPr>
             <w:rStyle w:val="Hyperlink"/>
@@ -48135,8 +48282,8 @@
         <w:rPr/>
       </w:pPr>
       <w:hyperlink w:anchor="section-18.2.1">
-        <w:bookmarkStart w:id="873" w:name="name-us-patent-10306400-applicat"/>
-        <w:bookmarkEnd w:id="873"/>
+        <w:bookmarkStart w:id="876" w:name="name-us-patent-10306400-applicat"/>
+        <w:bookmarkEnd w:id="876"/>
         <w:r>
           <w:rPr>
             <w:rStyle w:val="Hyperlink"/>
@@ -48165,8 +48312,8 @@
         <w:jc w:val="left"/>
         <w:rPr/>
       </w:pPr>
-      <w:bookmarkStart w:id="874" w:name="section-18.2.1-1"/>
-      <w:bookmarkEnd w:id="874"/>
+      <w:bookmarkStart w:id="877" w:name="section-18.2.1-1"/>
+      <w:bookmarkEnd w:id="877"/>
       <w:r>
         <w:rPr/>
         <w:t>Title: Systems and Methods for Enforcing Wireless Regulatory Compliance. Assignee not publicly confirmed from application number alone; the issued patent US 10,306,400 covers a thermostat and home network device context. Filed as US Application 20140162692 approximately 2013-2014. The issued patent family includes related grants US 9,794,738 and US 9,654,965. Active.</w:t>
@@ -48419,8 +48566,8 @@
         <w:jc w:val="left"/>
         <w:rPr/>
       </w:pPr>
-      <w:bookmarkStart w:id="875" w:name="section-18.2.1-3"/>
-      <w:bookmarkEnd w:id="875"/>
+      <w:bookmarkStart w:id="878" w:name="section-18.2.1-3"/>
+      <w:bookmarkEnd w:id="878"/>
       <w:r>
         <w:rPr/>
         <w:t>RSDGGS freedom to operate: RSDGGS does not use power line frequency as a location verification mechanism. The core novelty of this patent family is the AC frequency verification step, which is absent from RSDGGS entirely. RSDGGS derives location from: pre-provisioned cell index (</w:t>
@@ -48470,8 +48617,8 @@
         <w:jc w:val="left"/>
         <w:rPr/>
       </w:pPr>
-      <w:bookmarkStart w:id="876" w:name="section-18.2.1-4"/>
-      <w:bookmarkEnd w:id="876"/>
+      <w:bookmarkStart w:id="879" w:name="section-18.2.1-4"/>
+      <w:bookmarkEnd w:id="879"/>
       <w:r>
         <w:rPr/>
         <w:t xml:space="preserve">RSDGGS improvement opportunity -- Lookup Table Architecture: US 9,654,965 explicitly discloses the architecture of a location-to-regulations lookup table stored locally on the device, optionally small enough to fit in embedded memory, potentially updated from network. This is directly analogous to the RSDGGS regulatory database architecture defined in </w:t>
@@ -48509,8 +48656,8 @@
         <w:rPr/>
       </w:pPr>
       <w:hyperlink w:anchor="section-18.2.2">
-        <w:bookmarkStart w:id="877" w:name="name-us-patent-10812365-geohyper"/>
-        <w:bookmarkEnd w:id="877"/>
+        <w:bookmarkStart w:id="880" w:name="name-us-patent-10812365-geohyper"/>
+        <w:bookmarkEnd w:id="880"/>
         <w:r>
           <w:rPr>
             <w:rStyle w:val="Hyperlink"/>
@@ -48539,8 +48686,8 @@
         <w:jc w:val="left"/>
         <w:rPr/>
       </w:pPr>
-      <w:bookmarkStart w:id="878" w:name="section-18.2.2-1"/>
-      <w:bookmarkEnd w:id="878"/>
+      <w:bookmarkStart w:id="881" w:name="section-18.2.2-1"/>
+      <w:bookmarkEnd w:id="881"/>
       <w:r>
         <w:rPr/>
         <w:t>Title: Geohyperbolic Routing and Addressing Schemes for Networks. Inventors: Dmitri Krioukov, Ivan Voitalov. Assignee: Northeastern University, Boston. Filed November 16, 2017. Granted October 20, 2020. Active, expires December 25, 2037.</w:t>
@@ -48873,8 +49020,8 @@
         <w:jc w:val="left"/>
         <w:rPr/>
       </w:pPr>
-      <w:bookmarkStart w:id="879" w:name="section-18.2.2-3"/>
-      <w:bookmarkEnd w:id="879"/>
+      <w:bookmarkStart w:id="882" w:name="section-18.2.2-3"/>
+      <w:bookmarkEnd w:id="882"/>
       <w:r>
         <w:rPr/>
         <w:t>RSDGGS improvement opportunity -- None applicable: The geohyperbolic model is specifically optimized for large-scale Internet backbone topology reproduction, using population-density centrality to reproduce power-law degree distributions. RSDGGS targets constrained 802.15.4 IoT mesh networks with no backbone topology requirements and no population-density data available at compile time on embedded devices. The mathematical approaches are incompatible at a fundamental level: hyperbolic geometry requires floating-point (r, theta, phi) arithmetic, whereas RSDGGS's design goal G4 requires no-FPU integer arithmetic. No improvement opportunity from this patent is applicable to RSDGGS.</w:t>
@@ -48888,8 +49035,8 @@
         <w:jc w:val="left"/>
         <w:rPr/>
       </w:pPr>
-      <w:bookmarkStart w:id="880" w:name="section-18.2.2-4"/>
-      <w:bookmarkEnd w:id="880"/>
+      <w:bookmarkStart w:id="883" w:name="section-18.2.2-4"/>
+      <w:bookmarkEnd w:id="883"/>
       <w:r>
         <w:rPr/>
         <w:t>Backward citations of interest: US 10,812,365 cites US 8,284,788 (Krioukov et al., hyperbolic network embedding, 2012) as a predecessor. The academic paper by Krioukov et al. 'Hyperbolic Geometry of Complex Networks' (Physical Review E, 2010) is the underlying research. Both establish that hyperbolic geometry for Internet-scale routing is a well-developed research area distinct from RSDGGS's approach.</w:t>
@@ -48915,8 +49062,8 @@
         <w:rPr/>
       </w:pPr>
       <w:hyperlink w:anchor="section-18.2.3">
-        <w:bookmarkStart w:id="881" w:name="name-us-patent-11652742-ghost-ro"/>
-        <w:bookmarkEnd w:id="881"/>
+        <w:bookmarkStart w:id="884" w:name="name-us-patent-11652742-ghost-ro"/>
+        <w:bookmarkEnd w:id="884"/>
         <w:r>
           <w:rPr>
             <w:rStyle w:val="Hyperlink"/>
@@ -48945,8 +49092,8 @@
         <w:jc w:val="left"/>
         <w:rPr/>
       </w:pPr>
-      <w:bookmarkStart w:id="882" w:name="section-18.2.3-1"/>
-      <w:bookmarkEnd w:id="882"/>
+      <w:bookmarkStart w:id="885" w:name="section-18.2.3-1"/>
+      <w:bookmarkEnd w:id="885"/>
       <w:r>
         <w:rPr/>
         <w:t>Title: Ghost Routing. Assignee: Microsoft Technology Licensing LLC. Inventors: Padhye, Jayaraman, Bai, Singh, Beckett, et al. Filed October 16, 2020. Granted May 16, 2023. Active, expires January 1, 2041.</w:t>
@@ -49231,8 +49378,8 @@
         <w:jc w:val="left"/>
         <w:rPr/>
       </w:pPr>
-      <w:bookmarkStart w:id="883" w:name="section-18.2.3-3"/>
-      <w:bookmarkEnd w:id="883"/>
+      <w:bookmarkStart w:id="886" w:name="section-18.2.3-3"/>
+      <w:bookmarkEnd w:id="886"/>
       <w:r>
         <w:rPr/>
         <w:t>RSDGGS improvement opportunity -- None: Ghost routing addresses verification of network configuration changes in cloud datacenter switching infrastructure. It has no technical concepts, no claim elements, and no CPC classifications that overlap with RSDGGS. The name superficially resembles geographic routing but the technical subject matter is entirely unrelated. No improvement opportunity exists.</w:t>
@@ -49258,8 +49405,8 @@
         <w:rPr/>
       </w:pPr>
       <w:hyperlink w:anchor="section-18.2.4">
-        <w:bookmarkStart w:id="884" w:name="name-cn101923801b-method-for-gen"/>
-        <w:bookmarkEnd w:id="884"/>
+        <w:bookmarkStart w:id="887" w:name="name-cn101923801b-method-for-gen"/>
+        <w:bookmarkEnd w:id="887"/>
         <w:r>
           <w:rPr>
             <w:rStyle w:val="Hyperlink"/>
@@ -49288,8 +49435,8 @@
         <w:jc w:val="left"/>
         <w:rPr/>
       </w:pPr>
-      <w:bookmarkStart w:id="885" w:name="section-18.2.4-1"/>
-      <w:bookmarkEnd w:id="885"/>
+      <w:bookmarkStart w:id="888" w:name="section-18.2.4-1"/>
+      <w:bookmarkEnd w:id="888"/>
       <w:r>
         <w:rPr/>
         <w:t>Assignee: Wuhan University (WHU), Wuhan, China. Inventors: Hu Peng, Li Yunxiang, Zhu Fuli. Application number: CN2009100626550A. Filing and priority date: 10 June 2009. Grant date: 29 February 2012. Jurisdiction: China only (no PCT application, no US, EP, or other national-phase equivalents identified). Legal status: Expired -- Fee Related. Anticipated statutory expiration: 10 June 2029 (20-year term from filing). Actual status: lapsed prior to statutory expiration due to non-payment of annual maintenance fees.</w:t>
@@ -49574,8 +49721,8 @@
         <w:jc w:val="left"/>
         <w:rPr/>
       </w:pPr>
-      <w:bookmarkStart w:id="886" w:name="section-18.2.4-3"/>
-      <w:bookmarkEnd w:id="886"/>
+      <w:bookmarkStart w:id="889" w:name="section-18.2.4-3"/>
+      <w:bookmarkEnd w:id="889"/>
       <w:r>
         <w:rPr/>
         <w:t>The method disclosed in CN101923801B describes a cartographic rendering pipeline for producing physical dodecahedron map products. The claimed method orients the dodecahedron so that one vertex coincides with the Earth's geographic North Pole and the antipodal vertex with the South Pole, selects a user-defined region of interest to determine each face's central meridian, applies a gnomonic projection per face to transform geographic vector data, clips the result to each pentagonal boundary, and outputs twelve pentagonal paper maps for assembly into a physical dodecahedron. The implementation is explicitly tied to ArcGIS and ESRI Shapefile data formats as the required geographic data pipeline.</w:t>
@@ -50115,8 +50262,8 @@
         <w:jc w:val="left"/>
         <w:rPr/>
       </w:pPr>
-      <w:bookmarkStart w:id="887" w:name="section-18.2.4-5"/>
-      <w:bookmarkEnd w:id="887"/>
+      <w:bookmarkStart w:id="890" w:name="section-18.2.4-5"/>
+      <w:bookmarkEnd w:id="890"/>
       <w:r>
         <w:rPr/>
         <w:t>Freedom to operate conclusion: CN101923801B presents no freedom-to-operate concern for RSDGGS on three independent grounds, each sufficient alone. First, the patent is expired due to fee non-payment and its claims are in the public domain -- no enforcement is possible regardless of claim scope. Second, the patent is China-jurisdiction only with no international equivalents, so even if active it could not be enforced in the United States, European Union, Japan, or any other IETF-process jurisdiction. Third, no claim element of CN101923801B reads on RSDGGS: the patent covers a cartographic rendering pipeline for producing visual map products from geographic vector data using ArcGIS tooling, whereas RSDGGS is a binary integer encoding scheme for IoT device regulatory context with no map output, no GIS pipeline, and no physical artifact. The shared concept of using a dodecahedron as an Earth reference surface is established prior art predating CN101923801B by decades, with the gnomonic polyhedral map projection appearing in academic cartography literature since at least the 1940s (Fuller, 1944, US Patent 2,393,676, expired 1963) and in peer-reviewed cartographic literature through the 1990s.</w:t>
@@ -50130,8 +50277,8 @@
         <w:jc w:val="left"/>
         <w:rPr/>
       </w:pPr>
-      <w:bookmarkStart w:id="888" w:name="section-18.2.4-6"/>
-      <w:bookmarkEnd w:id="888"/>
+      <w:bookmarkStart w:id="891" w:name="section-18.2.4-6"/>
+      <w:bookmarkEnd w:id="891"/>
       <w:r>
         <w:rPr/>
         <w:t>Prior art note: CN101923801B itself acknowledges that dodecahedron map projection is a known concept by framing its contribution as 'breaking through the limitation that the previous projection surface is a plane and a developable surface.' The gnomonic projection of the Earth onto a regular dodecahedron is explicitly not novel to CN101923801B -- the claimed novelty is the specific ArcGIS-based rendering workflow and the face-by-face data extraction pipeline. RSDGGS's use of the dodecahedron as a hierarchical geographic index is therefore independently supported by prior art that predates CN101923801B, in addition to the non-infringement analysis above.</w:t>
@@ -50157,8 +50304,8 @@
         <w:rPr/>
       </w:pPr>
       <w:hyperlink w:anchor="section-18.3">
-        <w:bookmarkStart w:id="889" w:name="name-rfc-citation-improvement-op"/>
-        <w:bookmarkEnd w:id="889"/>
+        <w:bookmarkStart w:id="892" w:name="name-rfc-citation-improvement-op"/>
+        <w:bookmarkEnd w:id="892"/>
         <w:r>
           <w:rPr>
             <w:rStyle w:val="Hyperlink"/>
@@ -50187,8 +50334,8 @@
         <w:jc w:val="left"/>
         <w:rPr/>
       </w:pPr>
-      <w:bookmarkStart w:id="890" w:name="section-18.3-1"/>
-      <w:bookmarkEnd w:id="890"/>
+      <w:bookmarkStart w:id="893" w:name="section-18.3-1"/>
+      <w:bookmarkEnd w:id="893"/>
       <w:r>
         <w:rPr/>
         <w:t xml:space="preserve">The following analysis reviews each RFC cited in </w:t>
@@ -50250,8 +50397,8 @@
         <w:rPr/>
       </w:pPr>
       <w:hyperlink w:anchor="section-18.3.1">
-        <w:bookmarkStart w:id="891" w:name="name-rfc-2009-gps-based-addressin"/>
-        <w:bookmarkEnd w:id="891"/>
+        <w:bookmarkStart w:id="894" w:name="name-rfc-2009-gps-based-addressin"/>
+        <w:bookmarkEnd w:id="894"/>
         <w:r>
           <w:rPr>
             <w:rStyle w:val="Hyperlink"/>
@@ -50280,8 +50427,8 @@
         <w:jc w:val="left"/>
         <w:rPr/>
       </w:pPr>
-      <w:bookmarkStart w:id="892" w:name="section-18.3.1-1"/>
-      <w:bookmarkEnd w:id="892"/>
+      <w:bookmarkStart w:id="895" w:name="section-18.3.1-1"/>
+      <w:bookmarkEnd w:id="895"/>
       <w:r>
         <w:rPr/>
         <w:t xml:space="preserve">Improvement opportunity -- Weak beacon concept: RFC 2009 Section 5.2 defines 'weak radio beacons' that broadcast a GPS address enabling indoor devices without GPS to adopt the beacon's address. This is structurally identical to RSDGGS </w:t>
@@ -50319,8 +50466,8 @@
         <w:jc w:val="left"/>
         <w:rPr/>
       </w:pPr>
-      <w:bookmarkStart w:id="893" w:name="section-18.3.1-2"/>
-      <w:bookmarkEnd w:id="893"/>
+      <w:bookmarkStart w:id="896" w:name="section-18.3.1-2"/>
+      <w:bookmarkEnd w:id="896"/>
       <w:r>
         <w:rPr/>
         <w:t>Improvement opportunity -- IGPSMP protocol gap: RFC 2009 proposes IGPSMP (Internet GPS Management Protocol) for router-to-router geographic service area exchange, with a polygon boundary representation. RSDGGS explicitly avoids polygon boundaries in favor of cell prefix hierarchy. Noting that RSDGGS's approach eliminates IGPSMP entirely (routing decisions from address arithmetic, no management protocol needed) more precisely characterizes RSDGGS's architectural simplification relative to RFC 2009.</w:t>
@@ -50346,8 +50493,8 @@
         <w:rPr/>
       </w:pPr>
       <w:hyperlink w:anchor="section-18.3.2">
-        <w:bookmarkStart w:id="894" w:name="name-rfc-5870-geo-uri-scheme-201"/>
-        <w:bookmarkEnd w:id="894"/>
+        <w:bookmarkStart w:id="897" w:name="name-rfc-5870-geo-uri-scheme-201"/>
+        <w:bookmarkEnd w:id="897"/>
         <w:r>
           <w:rPr>
             <w:rStyle w:val="Hyperlink"/>
@@ -50376,8 +50523,8 @@
         <w:jc w:val="left"/>
         <w:rPr/>
       </w:pPr>
-      <w:bookmarkStart w:id="895" w:name="section-18.3.2-1"/>
-      <w:bookmarkEnd w:id="895"/>
+      <w:bookmarkStart w:id="898" w:name="section-18.3.2-1"/>
+      <w:bookmarkEnd w:id="898"/>
       <w:r>
         <w:rPr/>
         <w:t xml:space="preserve">Improvement opportunity -- Uncertainty parameter alignment: RFC 5870 Section 3.4 defines the u= parameter as the uncertainty radius in meters, explicitly stating that it represents the uncertainty of the location rather than a desired precision. RSDGGS's truncation model produces cells with a defined radius (cell diameter / 2), which is conceptually equivalent to u= but is structural rather than declared. The RSDGGS-to-geo-URI translation proposed in </w:t>
@@ -50403,8 +50550,8 @@
         <w:jc w:val="left"/>
         <w:rPr/>
       </w:pPr>
-      <w:bookmarkStart w:id="896" w:name="section-18.3.2-2"/>
-      <w:bookmarkEnd w:id="896"/>
+      <w:bookmarkStart w:id="899" w:name="section-18.3.2-2"/>
+      <w:bookmarkEnd w:id="899"/>
       <w:r>
         <w:rPr/>
         <w:t>Improvement opportunity -- CRS extensibility: RFC 5870 Section 3.5 defines a crs= parameter for alternative coordinate reference systems (default WGS-84). A future RSDGGS-aware geo URI extension could define crs=rsdggs as a CRS identifier, with the URI carrying the RSDGGS cell hex string as the coordinate value. This would enable geo URI interoperability for RSDGGS cell references in web and messaging contexts without loss of the RSDGGS hierarchical structure. This is a concrete future work item.</w:t>
@@ -50430,8 +50577,8 @@
         <w:rPr/>
       </w:pPr>
       <w:hyperlink w:anchor="section-18.3.3">
-        <w:bookmarkStart w:id="897" w:name="name-rfc-6442-location-conveyance"/>
-        <w:bookmarkEnd w:id="897"/>
+        <w:bookmarkStart w:id="900" w:name="name-rfc-6442-location-conveyance"/>
+        <w:bookmarkEnd w:id="900"/>
         <w:r>
           <w:rPr>
             <w:rStyle w:val="Hyperlink"/>
@@ -50460,8 +50607,8 @@
         <w:jc w:val="left"/>
         <w:rPr/>
       </w:pPr>
-      <w:bookmarkStart w:id="898" w:name="section-18.3.3-1"/>
-      <w:bookmarkEnd w:id="898"/>
+      <w:bookmarkStart w:id="901" w:name="section-18.3.3-1"/>
+      <w:bookmarkEnd w:id="901"/>
       <w:r>
         <w:rPr/>
         <w:t>Improvement opportunity -- 424 error code applicability: RFC 6442 Section 6 defines the 424 (Bad Location Information) SIP response code for cases where location cannot be processed. For RSDGGS-SIP integration (a gateway translating RSDGGS cells to PIDF-LO for emergency services), this error code should be returned when the RSDGGS cell's resolution is insufficient for the requested service (e.g., a 1-byte cell when the SIP application requires country-level precision). Defining an RSDGGS-specific error sub-code for 'insufficient cell resolution' would improve SIP gateway interoperability.</w:t>
@@ -50475,8 +50622,8 @@
         <w:jc w:val="left"/>
         <w:rPr/>
       </w:pPr>
-      <w:bookmarkStart w:id="899" w:name="section-18.3.3-2"/>
-      <w:bookmarkEnd w:id="899"/>
+      <w:bookmarkStart w:id="902" w:name="section-18.3.3-2"/>
+      <w:bookmarkEnd w:id="902"/>
       <w:r>
         <w:rPr/>
         <w:t>Improvement opportunity -- Geolocation-Routing header: RFC 6442 Section 8 defines a Geolocation-Routing SIP header that can be set to 'yes' to indicate that the location should influence routing. RSDGGS geographic IPv6 addresses (</w:t>
@@ -50514,8 +50661,8 @@
         <w:rPr/>
       </w:pPr>
       <w:hyperlink w:anchor="section-18.3.4">
-        <w:bookmarkStart w:id="900" w:name="name-rfc-9179-yang-grouping-for-"/>
-        <w:bookmarkEnd w:id="900"/>
+        <w:bookmarkStart w:id="903" w:name="name-rfc-9179-yang-grouping-for-"/>
+        <w:bookmarkEnd w:id="903"/>
         <w:r>
           <w:rPr>
             <w:rStyle w:val="Hyperlink"/>
@@ -50544,8 +50691,8 @@
         <w:jc w:val="left"/>
         <w:rPr/>
       </w:pPr>
-      <w:bookmarkStart w:id="901" w:name="section-18.3.4-1"/>
-      <w:bookmarkEnd w:id="901"/>
+      <w:bookmarkStart w:id="904" w:name="section-18.3.4-1"/>
+      <w:bookmarkEnd w:id="904"/>
       <w:r>
         <w:rPr/>
         <w:t xml:space="preserve">Improvement opportunity -- Velocity field: RFC 9179 Section 5 defines velocity as a first-class field in the geo-location grouping: v-north, v-east, and v-up in meters/second with 12 fraction-digits precision. RSDGGS </w:t>
@@ -50583,8 +50730,8 @@
         <w:jc w:val="left"/>
         <w:rPr/>
       </w:pPr>
-      <w:bookmarkStart w:id="902" w:name="section-18.3.4-2"/>
-      <w:bookmarkEnd w:id="902"/>
+      <w:bookmarkStart w:id="905" w:name="section-18.3.4-2"/>
+      <w:bookmarkEnd w:id="905"/>
       <w:r>
         <w:rPr/>
         <w:t xml:space="preserve">Improvement opportunity -- Altitude encoding: RFC 9179 defines height above WGS-84 ellipsoid in meters as a decimal64 field. RSDGGS </w:t>
@@ -50622,8 +50769,8 @@
         <w:rPr/>
       </w:pPr>
       <w:hyperlink w:anchor="section-18.3.5">
-        <w:bookmarkStart w:id="903" w:name="name-rfc-9632-rfc-8805-geofeed-d"/>
-        <w:bookmarkEnd w:id="903"/>
+        <w:bookmarkStart w:id="906" w:name="name-rfc-9632-rfc-8805-geofeed-d"/>
+        <w:bookmarkEnd w:id="906"/>
         <w:r>
           <w:rPr>
             <w:rStyle w:val="Hyperlink"/>
@@ -50652,8 +50799,8 @@
         <w:jc w:val="left"/>
         <w:rPr/>
       </w:pPr>
-      <w:bookmarkStart w:id="904" w:name="section-18.3.5-1"/>
-      <w:bookmarkEnd w:id="904"/>
+      <w:bookmarkStart w:id="907" w:name="section-18.3.5-1"/>
+      <w:bookmarkEnd w:id="907"/>
       <w:r>
         <w:rPr/>
         <w:t xml:space="preserve">Improvement opportunity -- RSDGGS-IPv6 geofeed compliance: RFC 8805 Section 2.1 defines the geofeed CSV format with fields: ip_prefix, alpha2code, region, city, postal_code. RFC 9632 Section 4 defines how geofeed files are discovered via RPSL inetnum objects. RSDGGS-IPv6 addresses are inherently geofeed-compatible, as noted in </w:t>
@@ -50691,8 +50838,8 @@
         <w:rPr/>
       </w:pPr>
       <w:hyperlink w:anchor="section-18.3.6">
-        <w:bookmarkStart w:id="905" w:name="name-rfc-5808-location-by-refere"/>
-        <w:bookmarkEnd w:id="905"/>
+        <w:bookmarkStart w:id="908" w:name="name-rfc-5808-location-by-refere"/>
+        <w:bookmarkEnd w:id="908"/>
         <w:r>
           <w:rPr>
             <w:rStyle w:val="Hyperlink"/>
@@ -50721,8 +50868,8 @@
         <w:jc w:val="left"/>
         <w:rPr/>
       </w:pPr>
-      <w:bookmarkStart w:id="906" w:name="section-18.3.6-1"/>
-      <w:bookmarkEnd w:id="906"/>
+      <w:bookmarkStart w:id="909" w:name="section-18.3.6-1"/>
+      <w:bookmarkEnd w:id="909"/>
       <w:r>
         <w:rPr/>
         <w:t>Improvement opportunity -- Dereference latency requirement: RFC 5808 Section 4.3 requires that a location URI dereference return the current location at the time of dereference, not the location at the time the URI was created. This requirement is irrelevant to RSDGGS LbyV (Location-by-Value) encoding, but it highlights a gap: RSDGGS does not define a staleness indicator for the cell index. A device that provisioned its cell at manufacturing time (</w:t>
@@ -50760,8 +50907,8 @@
         <w:rPr/>
       </w:pPr>
       <w:hyperlink w:anchor="section-18.3.7">
-        <w:bookmarkStart w:id="907" w:name="name-rfc-5491-pidf-lo-usage-2009"/>
-        <w:bookmarkEnd w:id="907"/>
+        <w:bookmarkStart w:id="910" w:name="name-rfc-5491-pidf-lo-usage-2009"/>
+        <w:bookmarkEnd w:id="910"/>
         <w:r>
           <w:rPr>
             <w:rStyle w:val="Hyperlink"/>
@@ -50790,8 +50937,8 @@
         <w:jc w:val="left"/>
         <w:rPr/>
       </w:pPr>
-      <w:bookmarkStart w:id="908" w:name="section-18.3.7-1"/>
-      <w:bookmarkEnd w:id="908"/>
+      <w:bookmarkStart w:id="911" w:name="section-18.3.7-1"/>
+      <w:bookmarkEnd w:id="911"/>
       <w:r>
         <w:rPr/>
         <w:t>Improvement opportunity -- Confidence level encoding: RFC 5491 Section 5.5 defines a confidence attribute in PIDF-LO location shapes, expressing the probability (as a percentage) that the described region contains the true location. RSDGGS implicitly expresses 100% confidence that the true location is within the stated cell (by construction of the encoding: the cell is computed from the true coordinate, so it always contains that coordinate). However, for RSDGGS cells derived from peer-assisted localization (</w:t>
@@ -50841,8 +50988,8 @@
         <w:rPr/>
       </w:pPr>
       <w:hyperlink w:anchor="section-18.3.8">
-        <w:bookmarkStart w:id="909" w:name="name-rfc-6280-geopriv-architectu"/>
-        <w:bookmarkEnd w:id="909"/>
+        <w:bookmarkStart w:id="912" w:name="name-rfc-6280-geopriv-architectu"/>
+        <w:bookmarkEnd w:id="912"/>
         <w:r>
           <w:rPr>
             <w:rStyle w:val="Hyperlink"/>
@@ -50871,8 +51018,8 @@
         <w:jc w:val="left"/>
         <w:rPr/>
       </w:pPr>
-      <w:bookmarkStart w:id="910" w:name="section-18.3.8-1"/>
-      <w:bookmarkEnd w:id="910"/>
+      <w:bookmarkStart w:id="913" w:name="section-18.3.8-1"/>
+      <w:bookmarkEnd w:id="913"/>
       <w:r>
         <w:rPr/>
         <w:t>Improvement opportunity -- Rule Maker analog: RFC 6280 Section 5 defines the Rule Maker role: the entity (typically the device owner) who specifies what location information may be disclosed to whom. RSDGGS's structural privacy model (byte truncation) does not support rule-based disclosure. For deployments where different recipients should receive different resolution (e.g., a regulatory compliance server receives 3 bytes, a fleet tracking application receives 7 bytes), an application-layer resolution selection mechanism is needed. Defining a CBOR map structure that carries multiple truncated cells at different resolutions, labeled by intended recipient type, would provide a RSDGGS-native analog to RFC 6280's Rule Maker mechanism without requiring XCAP or a Location Server.</w:t>
@@ -50898,8 +51045,8 @@
         <w:rPr/>
       </w:pPr>
       <w:hyperlink w:anchor="section-18.3.9">
-        <w:bookmarkStart w:id="911" w:name="name-rfc-6772-geolocation-policy-"/>
-        <w:bookmarkEnd w:id="911"/>
+        <w:bookmarkStart w:id="914" w:name="name-rfc-6772-geolocation-policy-"/>
+        <w:bookmarkEnd w:id="914"/>
         <w:r>
           <w:rPr>
             <w:rStyle w:val="Hyperlink"/>
@@ -50928,8 +51075,8 @@
         <w:jc w:val="left"/>
         <w:rPr/>
       </w:pPr>
-      <w:bookmarkStart w:id="912" w:name="section-18.3.9-1"/>
-      <w:bookmarkEnd w:id="912"/>
+      <w:bookmarkStart w:id="915" w:name="section-18.3.9-1"/>
+      <w:bookmarkEnd w:id="915"/>
       <w:r>
         <w:rPr/>
         <w:t xml:space="preserve">Improvement opportunity -- Location-based condition analog: RFC 6772 Section 8 defines location-based conditions in policy rules: rules that apply only when the Target is within a specified geographic region. RSDGGS's RSL (Resolution Sufficiency Level) table in </w:t>
@@ -50979,8 +51126,8 @@
         <w:rPr/>
       </w:pPr>
       <w:hyperlink w:anchor="section-18.4">
-        <w:bookmarkStart w:id="913" w:name="name-summary-of-improvement-oppo"/>
-        <w:bookmarkEnd w:id="913"/>
+        <w:bookmarkStart w:id="916" w:name="name-summary-of-improvement-oppo"/>
+        <w:bookmarkEnd w:id="916"/>
         <w:r>
           <w:rPr>
             <w:rStyle w:val="Hyperlink"/>
@@ -51009,8 +51156,8 @@
         <w:jc w:val="left"/>
         <w:rPr/>
       </w:pPr>
-      <w:bookmarkStart w:id="914" w:name="section-18.4-1"/>
-      <w:bookmarkEnd w:id="914"/>
+      <w:bookmarkStart w:id="917" w:name="section-18.4-1"/>
+      <w:bookmarkEnd w:id="917"/>
       <w:r>
         <w:rPr/>
         <w:t>The following table consolidates all actionable improvement opportunities identified from the cited patents and RFCs, categorized by implementation priority.</w:t>
@@ -51045,9 +51192,9 @@
           <w:szCs w:val="4"/>
         </w:rPr>
       </w:r>
-      <w:bookmarkStart w:id="915" w:name="table-20"/>
-      <w:bookmarkStart w:id="916" w:name="table-20"/>
-      <w:bookmarkEnd w:id="916"/>
+      <w:bookmarkStart w:id="918" w:name="table-20"/>
+      <w:bookmarkStart w:id="919" w:name="table-20"/>
+      <w:bookmarkEnd w:id="919"/>
     </w:p>
     <w:p>
       <w:pPr>
@@ -51102,10 +51249,10 @@
         </w:tblCellMar>
       </w:tblPr>
       <w:tblGrid>
-        <w:gridCol w:w="1996"/>
-        <w:gridCol w:w="4105"/>
-        <w:gridCol w:w="1971"/>
-        <w:gridCol w:w="2467"/>
+        <w:gridCol w:w="2293"/>
+        <w:gridCol w:w="4237"/>
+        <w:gridCol w:w="1744"/>
+        <w:gridCol w:w="2265"/>
       </w:tblGrid>
       <w:tr>
         <w:trPr>
@@ -51306,7 +51453,7 @@
             </w:pPr>
             <w:r>
               <w:rPr/>
-              <w:t>GFG, GPSR, CLDP; US 5,115,433</w:t>
+              <w:t>GFG, GPSR, CLDP; US 5,115,433; RFC 6550, RFC 6621</w:t>
             </w:r>
           </w:p>
         </w:tc>
@@ -51327,7 +51474,7 @@
             </w:pPr>
             <w:r>
               <w:rPr/>
-              <w:t>Void recovery (face routing on a planarized graph) and packet lifetime bound</w:t>
+              <w:t>Void recovery (face routing on a planarized graph), data-path loop detection and escape, packet lifetime bound</w:t>
             </w:r>
           </w:p>
         </w:tc>
@@ -52450,8 +52597,8 @@
         <w:jc w:val="left"/>
         <w:rPr/>
       </w:pPr>
-      <w:bookmarkStart w:id="917" w:name="section-18.4-3"/>
-      <w:bookmarkEnd w:id="917"/>
+      <w:bookmarkStart w:id="920" w:name="section-18.4-3"/>
+      <w:bookmarkEnd w:id="920"/>
       <w:r>
         <w:rPr/>
         <w:t>The highest-priority improvements -- link quality weighted forwarding, RSDGGS-IPv6 geofeed profile, and the staleness field -- represent concrete enhancements to the core specification that should be incorporated in a later revision of this document. The medium-priority items are suitable for informational notes or future work statements in this document. The low-priority items are candidates for companion specifications or implementation guidance documents.</w:t>
@@ -52477,8 +52624,8 @@
         <w:rPr/>
       </w:pPr>
       <w:hyperlink w:anchor="section-18.5">
-        <w:bookmarkStart w:id="918" w:name="name-recommended-clearance-actio"/>
-        <w:bookmarkEnd w:id="918"/>
+        <w:bookmarkStart w:id="921" w:name="name-recommended-clearance-actio"/>
+        <w:bookmarkEnd w:id="921"/>
         <w:r>
           <w:rPr>
             <w:rStyle w:val="Hyperlink"/>
@@ -52507,8 +52654,8 @@
         <w:jc w:val="left"/>
         <w:rPr/>
       </w:pPr>
-      <w:bookmarkStart w:id="919" w:name="section-18.5-1"/>
-      <w:bookmarkEnd w:id="919"/>
+      <w:bookmarkStart w:id="922" w:name="section-18.5-1"/>
+      <w:bookmarkEnd w:id="922"/>
       <w:r>
         <w:rPr/>
         <w:t>Prior to commercial deployment or patent prosecution based on RSDGGS, the following actions are recommended:</w:t>
@@ -52531,10 +52678,10 @@
         <w:jc w:val="left"/>
         <w:rPr/>
       </w:pPr>
-      <w:bookmarkStart w:id="920" w:name="section-18.5-2"/>
-      <w:bookmarkStart w:id="921" w:name="section-18.5-2.1"/>
-      <w:bookmarkEnd w:id="920"/>
-      <w:bookmarkEnd w:id="921"/>
+      <w:bookmarkStart w:id="923" w:name="section-18.5-2"/>
+      <w:bookmarkStart w:id="924" w:name="section-18.5-2.1"/>
+      <w:bookmarkEnd w:id="923"/>
+      <w:bookmarkEnd w:id="924"/>
       <w:r>
         <w:rPr/>
         <w:t xml:space="preserve">US 10,812,365 (Northeastern/Krioukov, active until 2037): No infringement risk identified. The hyperbolic geometry, radial centrality, and population-density zone ranking in every claim are completely absent from RSDGGS. No action required beyond documenting the technical distinction in any patent prosecution filings. </w:t>
@@ -52557,8 +52704,8 @@
         <w:jc w:val="left"/>
         <w:rPr/>
       </w:pPr>
-      <w:bookmarkStart w:id="922" w:name="section-18.5-2.2"/>
-      <w:bookmarkEnd w:id="922"/>
+      <w:bookmarkStart w:id="925" w:name="section-18.5-2.2"/>
+      <w:bookmarkEnd w:id="925"/>
       <w:r>
         <w:rPr/>
         <w:t xml:space="preserve">US 11,652,742 (Microsoft, active until 2041): No infringement risk. Ghost routing is a cloud datacenter network verification technique with zero overlap with RSDGGS. No action required. </w:t>
@@ -52581,8 +52728,8 @@
         <w:jc w:val="left"/>
         <w:rPr/>
       </w:pPr>
-      <w:bookmarkStart w:id="923" w:name="section-18.5-2.3"/>
-      <w:bookmarkEnd w:id="923"/>
+      <w:bookmarkStart w:id="926" w:name="section-18.5-2.3"/>
+      <w:bookmarkEnd w:id="926"/>
       <w:r>
         <w:rPr/>
         <w:t xml:space="preserve">US 10,306,400 / application family (active until ~2035): No infringement risk from current RSDGGS specification. RSDGGS MUST NOT add AC power line frequency as a location verification mechanism. Any patent prosecution should distinguish the lookup table architecture using RFC 2009 (1996) as prior art predating US 9,654,965. </w:t>
@@ -52605,8 +52752,8 @@
         <w:jc w:val="left"/>
         <w:rPr/>
       </w:pPr>
-      <w:bookmarkStart w:id="924" w:name="section-18.5-2.4"/>
-      <w:bookmarkEnd w:id="924"/>
+      <w:bookmarkStart w:id="927" w:name="section-18.5-2.4"/>
+      <w:bookmarkEnd w:id="927"/>
       <w:r>
         <w:rPr/>
         <w:t xml:space="preserve">US 4,939,726 and US 5,115,433 (both expired): Freely implementable. The link quality weighted forwarding enhancement described in </w:t>
@@ -52653,8 +52800,8 @@
         <w:jc w:val="left"/>
         <w:rPr/>
       </w:pPr>
-      <w:bookmarkStart w:id="925" w:name="section-18.5-2.5"/>
-      <w:bookmarkEnd w:id="925"/>
+      <w:bookmarkStart w:id="928" w:name="section-18.5-2.5"/>
+      <w:bookmarkEnd w:id="928"/>
       <w:r>
         <w:rPr/>
         <w:t xml:space="preserve">US Application 2010/0002700 (Cellnet, abandoned 2011): No rights in force. Cite it as prior art for geographic routing information carried in network addresses in any patent prosecution based on RSDGGS geographic IPv6 addressing. </w:t>
@@ -52677,8 +52824,8 @@
         <w:jc w:val="left"/>
         <w:rPr/>
       </w:pPr>
-      <w:bookmarkStart w:id="926" w:name="section-18.5-2.6"/>
-      <w:bookmarkEnd w:id="926"/>
+      <w:bookmarkStart w:id="929" w:name="section-18.5-2.6"/>
+      <w:bookmarkEnd w:id="929"/>
       <w:r>
         <w:rPr/>
         <w:t xml:space="preserve">Search CPC class H04W16/14 (channel plan based on geography) and H04B1/3827 (ISM band operation) for active patents not identified here. This search should be conducted by patent counsel before commercial deployment. </w:t>
@@ -52701,8 +52848,8 @@
         <w:jc w:val="left"/>
         <w:rPr/>
       </w:pPr>
-      <w:bookmarkStart w:id="927" w:name="section-18.5-2.7"/>
-      <w:bookmarkEnd w:id="927"/>
+      <w:bookmarkStart w:id="930" w:name="section-18.5-2.7"/>
+      <w:bookmarkEnd w:id="930"/>
       <w:r>
         <w:rPr/>
         <w:t xml:space="preserve">Search for continuation patents based on US Application 2014/0162692 beyond the identified US 10,306,400, US 9,794,738, and US 9,654,965. The application family may have additional continuations with broader claims. </w:t>
@@ -52725,8 +52872,8 @@
         <w:jc w:val="left"/>
         <w:rPr/>
       </w:pPr>
-      <w:bookmarkStart w:id="928" w:name="section-18.5-2.8"/>
-      <w:bookmarkEnd w:id="928"/>
+      <w:bookmarkStart w:id="931" w:name="section-18.5-2.8"/>
+      <w:bookmarkEnd w:id="931"/>
       <w:r>
         <w:rPr/>
         <w:t xml:space="preserve">For the RSDGGS-IPv6 geofeed profile (improvement opportunity from RFC 9632 / 8805): verify that no active patent covers the specific combination of hierarchical geographic grid prefix as an IP geofeed CSV entry. This combination appears novel but has not been searched. </w:t>
@@ -52748,8 +52895,8 @@
         <w:jc w:val="left"/>
         <w:rPr/>
       </w:pPr>
-      <w:bookmarkStart w:id="929" w:name="section-18.5-2.9"/>
-      <w:bookmarkEnd w:id="929"/>
+      <w:bookmarkStart w:id="932" w:name="section-18.5-2.9"/>
+      <w:bookmarkEnd w:id="932"/>
       <w:r>
         <w:rPr/>
         <w:t xml:space="preserve">Posting draft-hanley-rsdggs-00 as an Internet-Draft on 20 October 2026 made the subject matter it discloses, including the improvement opportunities listed in </w:t>
@@ -52787,8 +52934,8 @@
         <w:rPr/>
       </w:pPr>
       <w:hyperlink w:anchor="section-19">
-        <w:bookmarkStart w:id="930" w:name="name-reference-implementation-ru"/>
-        <w:bookmarkEnd w:id="930"/>
+        <w:bookmarkStart w:id="933" w:name="name-reference-implementation-ru"/>
+        <w:bookmarkEnd w:id="933"/>
         <w:r>
           <w:rPr>
             <w:rStyle w:val="Hyperlink"/>
@@ -52817,8 +52964,8 @@
         <w:jc w:val="left"/>
         <w:rPr/>
       </w:pPr>
-      <w:bookmarkStart w:id="931" w:name="section-19-1"/>
-      <w:bookmarkEnd w:id="931"/>
+      <w:bookmarkStart w:id="934" w:name="section-19-1"/>
+      <w:bookmarkEnd w:id="934"/>
       <w:r>
         <w:rPr/>
         <w:t>This section provides a complete reference implementation of the RSDGGS encoder in Rust pseudocode. The implementation is structured as a no_std, no_alloc crate suitable for deployment on constrained 802.15.4 devices. All algorithms are expressed in terms that map directly to the mathematical definitions in the preceding sections. Floating-point arithmetic (f64) is used for the encode path; a fixed-point variant suitable for devices without FPU is noted where applicable.</w:t>
@@ -52832,8 +52979,8 @@
         <w:jc w:val="left"/>
         <w:rPr/>
       </w:pPr>
-      <w:bookmarkStart w:id="932" w:name="section-19-2"/>
-      <w:bookmarkEnd w:id="932"/>
+      <w:bookmarkStart w:id="935" w:name="section-19-2"/>
+      <w:bookmarkEnd w:id="935"/>
       <w:r>
         <w:rPr/>
         <w:t xml:space="preserve">This is pseudocode intended to specify behavior precisely. A production implementation would require additional error handling, const evaluation of intermediate values, and platform-specific optimizations. The worked example in </w:t>
@@ -52871,8 +53018,8 @@
         <w:rPr/>
       </w:pPr>
       <w:hyperlink w:anchor="section-19.1">
-        <w:bookmarkStart w:id="933" w:name="name-crate-structure-and-types"/>
-        <w:bookmarkEnd w:id="933"/>
+        <w:bookmarkStart w:id="936" w:name="name-crate-structure-and-types"/>
+        <w:bookmarkEnd w:id="936"/>
         <w:r>
           <w:rPr>
             <w:rStyle w:val="Hyperlink"/>
@@ -53387,8 +53534,8 @@
         <w:rPr/>
       </w:pPr>
       <w:hyperlink w:anchor="section-19.2">
-        <w:bookmarkStart w:id="934" w:name="name-compile-time-constants"/>
-        <w:bookmarkEnd w:id="934"/>
+        <w:bookmarkStart w:id="937" w:name="name-compile-time-constants"/>
+        <w:bookmarkEnd w:id="937"/>
         <w:r>
           <w:rPr>
             <w:rStyle w:val="Hyperlink"/>
@@ -53417,8 +53564,8 @@
         <w:jc w:val="left"/>
         <w:rPr/>
       </w:pPr>
-      <w:bookmarkStart w:id="935" w:name="section-19.2-1"/>
-      <w:bookmarkEnd w:id="935"/>
+      <w:bookmarkStart w:id="938" w:name="section-19.2-1"/>
+      <w:bookmarkEnd w:id="938"/>
       <w:r>
         <w:rPr/>
         <w:t xml:space="preserve">The twelve face center unit vectors and the sixty pentagon vertex unit vectors are precomputed constants derived from the dodecahedron orientation procedure defined in </w:t>
@@ -55729,8 +55876,8 @@
         <w:rPr/>
       </w:pPr>
       <w:hyperlink w:anchor="section-19.3">
-        <w:bookmarkStart w:id="936" w:name="name-coordinate-conversion-primi"/>
-        <w:bookmarkEnd w:id="936"/>
+        <w:bookmarkStart w:id="939" w:name="name-coordinate-conversion-primi"/>
+        <w:bookmarkEnd w:id="939"/>
         <w:r>
           <w:rPr>
             <w:rStyle w:val="Hyperlink"/>
@@ -56604,8 +56751,8 @@
         <w:rPr/>
       </w:pPr>
       <w:hyperlink w:anchor="section-19.4">
-        <w:bookmarkStart w:id="937" w:name="name-face-assignment-2"/>
-        <w:bookmarkEnd w:id="937"/>
+        <w:bookmarkStart w:id="940" w:name="name-face-assignment-2"/>
+        <w:bookmarkEnd w:id="940"/>
         <w:r>
           <w:rPr>
             <w:rStyle w:val="Hyperlink"/>
@@ -56634,8 +56781,8 @@
         <w:jc w:val="left"/>
         <w:rPr/>
       </w:pPr>
-      <w:bookmarkStart w:id="938" w:name="section-19.4-1"/>
-      <w:bookmarkEnd w:id="938"/>
+      <w:bookmarkStart w:id="941" w:name="section-19.4-1"/>
+      <w:bookmarkEnd w:id="941"/>
       <w:r>
         <w:rPr/>
         <w:t>Face assignment uses a nearest-face-center lookup via dot product. The face whose center unit vector has the maximum dot product with the query point is the face containing the point. This is equivalent to finding the face whose center is closest in angular distance, and requires no table lookup or coordinate transformation beyond the initial Cartesian conversion.</w:t>
@@ -57023,8 +57170,8 @@
         <w:rPr/>
       </w:pPr>
       <w:hyperlink w:anchor="section-19.5">
-        <w:bookmarkStart w:id="939" w:name="name-pentagon-sector-assignment"/>
-        <w:bookmarkEnd w:id="939"/>
+        <w:bookmarkStart w:id="942" w:name="name-pentagon-sector-assignment"/>
+        <w:bookmarkEnd w:id="942"/>
         <w:r>
           <w:rPr>
             <w:rStyle w:val="Hyperlink"/>
@@ -57053,8 +57200,8 @@
         <w:jc w:val="left"/>
         <w:rPr/>
       </w:pPr>
-      <w:bookmarkStart w:id="940" w:name="section-19.5-1"/>
-      <w:bookmarkEnd w:id="940"/>
+      <w:bookmarkStart w:id="943" w:name="section-19.5-1"/>
+      <w:bookmarkEnd w:id="943"/>
       <w:r>
         <w:rPr/>
         <w:t>Each face is divided into 5 golden gnomon triangular sectors by connecting the face center to each of the 5 pentagon vertices. The pentagon vertices are the centroids of the 5 icosahedron triangles surrounding the face's corresponding icosahedron vertex. These vertices are precomputed as constants for each face.</w:t>
@@ -57068,8 +57215,8 @@
         <w:jc w:val="left"/>
         <w:rPr/>
       </w:pPr>
-      <w:bookmarkStart w:id="941" w:name="section-19.5-2"/>
-      <w:bookmarkEnd w:id="941"/>
+      <w:bookmarkStart w:id="944" w:name="section-19.5-2"/>
+      <w:bookmarkEnd w:id="944"/>
       <w:r>
         <w:rPr/>
         <w:t>For the reference implementation, the pentagon vertices are derived from the icosahedron face topology at compile time. The sector is found by testing the query point against each of the 5 spherical triangles (face_center, pv[i], pv[(i+1)%5]).</w:t>
@@ -57673,8 +57820,8 @@
         <w:rPr/>
       </w:pPr>
       <w:hyperlink w:anchor="section-19.6">
-        <w:bookmarkStart w:id="942" w:name="name-recursive-subdivision-2"/>
-        <w:bookmarkEnd w:id="942"/>
+        <w:bookmarkStart w:id="945" w:name="name-recursive-subdivision-2"/>
+        <w:bookmarkEnd w:id="945"/>
         <w:r>
           <w:rPr>
             <w:rStyle w:val="Hyperlink"/>
@@ -57703,8 +57850,8 @@
         <w:jc w:val="left"/>
         <w:rPr/>
       </w:pPr>
-      <w:bookmarkStart w:id="943" w:name="section-19.6-1"/>
-      <w:bookmarkEnd w:id="943"/>
+      <w:bookmarkStart w:id="946" w:name="section-19.6-1"/>
+      <w:bookmarkEnd w:id="946"/>
       <w:r>
         <w:rPr/>
         <w:t>Given the face and sector, the query point is recursively assigned to child triangles. At each level the triangle is split into 4 children by connecting the midpoints of all three sides. The child containing the point is identified by the spherical containment test and its 2-bit index is recorded.</w:t>
@@ -57718,8 +57865,8 @@
         <w:jc w:val="left"/>
         <w:rPr/>
       </w:pPr>
-      <w:bookmarkStart w:id="944" w:name="section-19.6-2"/>
-      <w:bookmarkEnd w:id="944"/>
+      <w:bookmarkStart w:id="947" w:name="section-19.6-2"/>
+      <w:bookmarkEnd w:id="947"/>
       <w:r>
         <w:rPr/>
         <w:t>The tangent-frame projection used in the reference encoder (projecting onto the north/east tangent plane at the face center) is replaced here by exact spherical triangle subdivision. The spherical midpoint function is used to compute child vertices exactly on the sphere, eliminating distortion accumulation across subdivision levels.</w:t>
@@ -58668,8 +58815,8 @@
         <w:rPr/>
       </w:pPr>
       <w:hyperlink w:anchor="section-19.7">
-        <w:bookmarkStart w:id="945" w:name="name-top-level-encode-function"/>
-        <w:bookmarkEnd w:id="945"/>
+        <w:bookmarkStart w:id="948" w:name="name-top-level-encode-function"/>
+        <w:bookmarkEnd w:id="948"/>
         <w:r>
           <w:rPr>
             <w:rStyle w:val="Hyperlink"/>
@@ -58698,8 +58845,8 @@
         <w:jc w:val="left"/>
         <w:rPr/>
       </w:pPr>
-      <w:bookmarkStart w:id="946" w:name="section-19.7-1"/>
-      <w:bookmarkEnd w:id="946"/>
+      <w:bookmarkStart w:id="949" w:name="section-19.7-1"/>
+      <w:bookmarkEnd w:id="949"/>
       <w:r>
         <w:rPr/>
         <w:t>The encode function takes a WGS-84 coordinate and a desired length in bytes (1 to 8) and returns a populated RsdggsCell. The length parameter controls the resolution: 1 byte encodes face only; byte 1 carries the 4-bit sector and 2 subdivision levels, and each additional byte adds 4 subdivision levels (2 bits per level).</w:t>
@@ -59557,8 +59704,8 @@
         <w:rPr/>
       </w:pPr>
       <w:hyperlink w:anchor="section-19.8">
-        <w:bookmarkStart w:id="947" w:name="name-decode-function"/>
-        <w:bookmarkEnd w:id="947"/>
+        <w:bookmarkStart w:id="950" w:name="name-decode-function"/>
+        <w:bookmarkEnd w:id="950"/>
         <w:r>
           <w:rPr>
             <w:rStyle w:val="Hyperlink"/>
@@ -59587,8 +59734,8 @@
         <w:jc w:val="left"/>
         <w:rPr/>
       </w:pPr>
-      <w:bookmarkStart w:id="948" w:name="section-19.8-1"/>
-      <w:bookmarkEnd w:id="948"/>
+      <w:bookmarkStart w:id="951" w:name="section-19.8-1"/>
+      <w:bookmarkEnd w:id="951"/>
       <w:r>
         <w:rPr/>
         <w:t>The decode function extracts the face, sector, and subdivision level sequence from a populated RsdggsCell. It does not reconstruct the precise geographic coordinate -- it returns the cell information sufficient for regulatory database lookup. Geographic coordinate recovery (computing the cell center) is a separate operation not required for regulatory compliance.</w:t>
@@ -60242,8 +60389,8 @@
         <w:rPr/>
       </w:pPr>
       <w:hyperlink w:anchor="section-19.9">
-        <w:bookmarkStart w:id="949" w:name="name-boundary-proximity-helper"/>
-        <w:bookmarkEnd w:id="949"/>
+        <w:bookmarkStart w:id="952" w:name="name-boundary-proximity-helper"/>
+        <w:bookmarkEnd w:id="952"/>
         <w:r>
           <w:rPr>
             <w:rStyle w:val="Hyperlink"/>
@@ -60272,8 +60419,8 @@
         <w:jc w:val="left"/>
         <w:rPr/>
       </w:pPr>
-      <w:bookmarkStart w:id="950" w:name="section-19.9-1"/>
-      <w:bookmarkEnd w:id="950"/>
+      <w:bookmarkStart w:id="953" w:name="section-19.9-1"/>
+      <w:bookmarkEnd w:id="953"/>
       <w:r>
         <w:rPr/>
         <w:t xml:space="preserve">The boundary proximity function B(cell, band) from </w:t>
@@ -60991,8 +61138,8 @@
         <w:rPr/>
       </w:pPr>
       <w:hyperlink w:anchor="section-19.10">
-        <w:bookmarkStart w:id="951" w:name="name-worked-example"/>
-        <w:bookmarkEnd w:id="951"/>
+        <w:bookmarkStart w:id="954" w:name="name-worked-example"/>
+        <w:bookmarkEnd w:id="954"/>
         <w:r>
           <w:rPr>
             <w:rStyle w:val="Hyperlink"/>
@@ -61021,8 +61168,8 @@
         <w:jc w:val="left"/>
         <w:rPr/>
       </w:pPr>
-      <w:bookmarkStart w:id="952" w:name="section-19.10-1"/>
-      <w:bookmarkEnd w:id="952"/>
+      <w:bookmarkStart w:id="955" w:name="section-19.10-1"/>
+      <w:bookmarkEnd w:id="955"/>
       <w:r>
         <w:rPr/>
         <w:t>The following verification vector is derived from the reference implementation. Implementations MUST produce identical byte values for this input to be considered conformant.</w:t>
@@ -61566,8 +61713,8 @@
         <w:jc w:val="left"/>
         <w:rPr/>
       </w:pPr>
-      <w:bookmarkStart w:id="953" w:name="section-19.10-3"/>
-      <w:bookmarkEnd w:id="953"/>
+      <w:bookmarkStart w:id="956" w:name="section-19.10-3"/>
+      <w:bookmarkEnd w:id="956"/>
       <w:r>
         <w:rPr/>
         <w:t xml:space="preserve">The worked example demonstrates the encode path from floating-point coordinate to structured byte sequence. The face-0x02 byte is the ITU Region 2 determination made at single-byte resolution. Truncating to 1 byte is sufficient for ISM band availability determination anywhere in North America, as specified in </w:t>
@@ -61593,8 +61740,8 @@
         <w:jc w:val="left"/>
         <w:rPr/>
       </w:pPr>
-      <w:bookmarkStart w:id="954" w:name="section-19.10-4"/>
-      <w:bookmarkEnd w:id="954"/>
+      <w:bookmarkStart w:id="957" w:name="section-19.10-4"/>
+      <w:bookmarkEnd w:id="957"/>
       <w:r>
         <w:rPr/>
         <w:t>The note on Tokyo illustrates that face assignment is driven by geometry: a jurisdiction near a face boundary can span two faces. The regulatory database is the authoritative source for rule set assignment; the face index is a lookup key, and its two low-order bits give the ITU Region of the face's principal population, not an encoding of administrative boundaries.</w:t>
@@ -61620,8 +61767,8 @@
         <w:rPr/>
       </w:pPr>
       <w:hyperlink w:anchor="section-20">
-        <w:bookmarkStart w:id="955" w:name="name-security-considerations"/>
-        <w:bookmarkEnd w:id="955"/>
+        <w:bookmarkStart w:id="958" w:name="name-security-considerations"/>
+        <w:bookmarkEnd w:id="958"/>
         <w:r>
           <w:rPr>
             <w:rStyle w:val="Hyperlink"/>
@@ -61650,8 +61797,8 @@
         <w:jc w:val="left"/>
         <w:rPr/>
       </w:pPr>
-      <w:bookmarkStart w:id="956" w:name="section-20-1"/>
-      <w:bookmarkEnd w:id="956"/>
+      <w:bookmarkStart w:id="959" w:name="section-20-1"/>
+      <w:bookmarkEnd w:id="959"/>
       <w:r>
         <w:rPr/>
         <w:t>RSDGGS indexes are location-bearing data. Implementers must consider the following security properties:</w:t>
@@ -61665,8 +61812,8 @@
         <w:jc w:val="left"/>
         <w:rPr/>
       </w:pPr>
-      <w:bookmarkStart w:id="957" w:name="section-20-2"/>
-      <w:bookmarkEnd w:id="957"/>
+      <w:bookmarkStart w:id="960" w:name="section-20-2"/>
+      <w:bookmarkEnd w:id="960"/>
       <w:r>
         <w:rPr/>
         <w:t xml:space="preserve">Location Privacy: The variable-length encoding provides a natural privacy gradient. Implementations SHOULD share the minimum resolution necessary for the intended purpose. For regulatory validation purposes, 1 to 3 octets is typically sufficient and reveals no more than country-level location. Full 8-octet indexes SHOULD be treated as sensitive location data. </w:t>
@@ -61692,8 +61839,8 @@
         <w:jc w:val="left"/>
         <w:rPr/>
       </w:pPr>
-      <w:bookmarkStart w:id="958" w:name="section-20-3"/>
-      <w:bookmarkEnd w:id="958"/>
+      <w:bookmarkStart w:id="961" w:name="section-20-3"/>
+      <w:bookmarkEnd w:id="961"/>
       <w:r>
         <w:rPr/>
         <w:t xml:space="preserve">Beacon Authenticity: The peer-assisted discovery mechanism defined in </w:t>
@@ -61719,8 +61866,8 @@
         <w:jc w:val="left"/>
         <w:rPr/>
       </w:pPr>
-      <w:bookmarkStart w:id="959" w:name="section-20-4"/>
-      <w:bookmarkEnd w:id="959"/>
+      <w:bookmarkStart w:id="962" w:name="section-20-4"/>
+      <w:bookmarkEnd w:id="962"/>
       <w:r>
         <w:rPr/>
         <w:t>Database Integrity: The regulatory database is a critical dependency. Database updates SHOULD be authenticated using code-signing mechanisms. Implementations SHOULD validate database integrity at boot using a stored hash.</w:t>
@@ -61734,8 +61881,8 @@
         <w:jc w:val="left"/>
         <w:rPr/>
       </w:pPr>
-      <w:bookmarkStart w:id="960" w:name="section-20-5"/>
-      <w:bookmarkEnd w:id="960"/>
+      <w:bookmarkStart w:id="963" w:name="section-20-5"/>
+      <w:bookmarkEnd w:id="963"/>
       <w:r>
         <w:rPr/>
         <w:t>Regulatory Compliance: RSDGGS is an informational tool to assist devices in determining applicable regulatory parameters. It does not constitute a formal regulatory authorization. Operators remain responsible for ensuring their devices comply with applicable regulations in their jurisdiction of deployment, independent of the RSDGGS-derived rule set.</w:t>
@@ -61749,8 +61896,8 @@
         <w:jc w:val="left"/>
         <w:rPr/>
       </w:pPr>
-      <w:bookmarkStart w:id="961" w:name="section-20-6"/>
-      <w:bookmarkEnd w:id="961"/>
+      <w:bookmarkStart w:id="964" w:name="section-20-6"/>
+      <w:bookmarkEnd w:id="964"/>
       <w:r>
         <w:rPr/>
         <w:t xml:space="preserve">Database Currency: The regulatory database is a snapshot of regulations as of its compilation date. Spectrum regulations change through national legislation, WRC decisions, and bilateral coordination agreements. Implementations MUST NOT treat an embedded database as permanently authoritative. Deployments in jurisdictions undergoing active regulatory change are at elevated risk of non-compliance if database updates are unavailable. See </w:t>
@@ -61776,8 +61923,8 @@
         <w:jc w:val="left"/>
         <w:rPr/>
       </w:pPr>
-      <w:bookmarkStart w:id="962" w:name="section-20-7"/>
-      <w:bookmarkEnd w:id="962"/>
+      <w:bookmarkStart w:id="965" w:name="section-20-7"/>
+      <w:bookmarkEnd w:id="965"/>
       <w:r>
         <w:rPr/>
         <w:t>Legacy and Long-Lived Devices: Devices deployed for extended operational lifetimes, common in industrial IoT and infrastructure monitoring, face growing risk of regulatory non-compliance as their embedded databases age. Operators of long-lived deployments SHOULD establish a database maintenance program and SHOULD prefer implementations that support authenticated over-the-air database updates. Devices that cannot receive updates SHOULD be audited against current regulations at intervals appropriate to the regulatory environment of the deployment region.</w:t>
@@ -61791,8 +61938,8 @@
         <w:jc w:val="left"/>
         <w:rPr/>
       </w:pPr>
-      <w:bookmarkStart w:id="963" w:name="section-20-8"/>
-      <w:bookmarkEnd w:id="963"/>
+      <w:bookmarkStart w:id="966" w:name="section-20-8"/>
+      <w:bookmarkEnd w:id="966"/>
       <w:r>
         <w:rPr/>
         <w:t xml:space="preserve">Storage-Constrained Devices: Highly constrained devices that cannot store a complete regulatory database for all RSDGGS faces MUST implement a defined failure mode for cells with no database entry: either refuse transmission, adopt the most restrictive rule set available, or escalate to a trusted peer for regulatory context via the bootstrap mechanism in </w:t>
@@ -61830,8 +61977,8 @@
         <w:rPr/>
       </w:pPr>
       <w:hyperlink w:anchor="section-21">
-        <w:bookmarkStart w:id="964" w:name="name-iana-considerations"/>
-        <w:bookmarkEnd w:id="964"/>
+        <w:bookmarkStart w:id="967" w:name="name-iana-considerations"/>
+        <w:bookmarkEnd w:id="967"/>
         <w:r>
           <w:rPr>
             <w:rStyle w:val="Hyperlink"/>
@@ -61860,8 +62007,8 @@
         <w:jc w:val="left"/>
         <w:rPr/>
       </w:pPr>
-      <w:bookmarkStart w:id="965" w:name="section-21-1"/>
-      <w:bookmarkEnd w:id="965"/>
+      <w:bookmarkStart w:id="968" w:name="section-21-1"/>
+      <w:bookmarkEnd w:id="968"/>
       <w:r>
         <w:rPr/>
         <w:t>This document requests registration of a CBOR tag for the RSDGGS cell type in the CBOR Tags registry. The requested tag value is in the first-come-first-served range. The tag is used to identify a CBOR byte string as an RSDGGS cell index as defined in this document.</w:t>
@@ -61875,8 +62022,8 @@
         <w:jc w:val="left"/>
         <w:rPr/>
       </w:pPr>
-      <w:bookmarkStart w:id="966" w:name="section-21-2"/>
-      <w:bookmarkEnd w:id="966"/>
+      <w:bookmarkStart w:id="969" w:name="section-21-2"/>
+      <w:bookmarkEnd w:id="969"/>
       <w:r>
         <w:rPr/>
         <w:t>This document requests no IPv6 address allocation (</w:t>
@@ -61935,9 +62082,9 @@
           <w:szCs w:val="4"/>
         </w:rPr>
       </w:r>
-      <w:bookmarkStart w:id="967" w:name="table-21"/>
-      <w:bookmarkStart w:id="968" w:name="table-21"/>
-      <w:bookmarkEnd w:id="968"/>
+      <w:bookmarkStart w:id="970" w:name="table-21"/>
+      <w:bookmarkStart w:id="971" w:name="table-21"/>
+      <w:bookmarkEnd w:id="971"/>
     </w:p>
     <w:p>
       <w:pPr>
@@ -62252,8 +62399,8 @@
         <w:rPr/>
       </w:pPr>
       <w:hyperlink w:anchor="section-22">
-        <w:bookmarkStart w:id="969" w:name="name-normative-references"/>
-        <w:bookmarkEnd w:id="969"/>
+        <w:bookmarkStart w:id="972" w:name="name-normative-references"/>
+        <w:bookmarkEnd w:id="972"/>
         <w:r>
           <w:rPr>
             <w:rStyle w:val="Hyperlink"/>
@@ -62282,8 +62429,8 @@
         <w:jc w:val="left"/>
         <w:rPr/>
       </w:pPr>
-      <w:bookmarkStart w:id="970" w:name="RFC2119"/>
-      <w:bookmarkEnd w:id="970"/>
+      <w:bookmarkStart w:id="973" w:name="RFC2119"/>
+      <w:bookmarkEnd w:id="973"/>
       <w:r>
         <w:rPr/>
         <w:t xml:space="preserve">[RFC2119] </w:t>
@@ -62321,8 +62468,8 @@
         <w:jc w:val="left"/>
         <w:rPr/>
       </w:pPr>
-      <w:bookmarkStart w:id="971" w:name="RFC8174"/>
-      <w:bookmarkEnd w:id="971"/>
+      <w:bookmarkStart w:id="974" w:name="RFC8174"/>
+      <w:bookmarkEnd w:id="974"/>
       <w:r>
         <w:rPr/>
         <w:t xml:space="preserve">[RFC8174] </w:t>
@@ -62360,8 +62507,8 @@
         <w:jc w:val="left"/>
         <w:rPr/>
       </w:pPr>
-      <w:bookmarkStart w:id="972" w:name="RFC8949"/>
-      <w:bookmarkEnd w:id="972"/>
+      <w:bookmarkStart w:id="975" w:name="RFC8949"/>
+      <w:bookmarkEnd w:id="975"/>
       <w:r>
         <w:rPr/>
         <w:t xml:space="preserve">[RFC8949] </w:t>
@@ -62399,8 +62546,8 @@
         <w:jc w:val="left"/>
         <w:rPr/>
       </w:pPr>
-      <w:bookmarkStart w:id="973" w:name="RFC8610"/>
-      <w:bookmarkEnd w:id="973"/>
+      <w:bookmarkStart w:id="976" w:name="RFC8610"/>
+      <w:bookmarkEnd w:id="976"/>
       <w:r>
         <w:rPr/>
         <w:t xml:space="preserve">[RFC8610] </w:t>
@@ -62451,8 +62598,8 @@
         <w:rPr/>
       </w:pPr>
       <w:hyperlink w:anchor="section-23">
-        <w:bookmarkStart w:id="974" w:name="name-informative-references"/>
-        <w:bookmarkEnd w:id="974"/>
+        <w:bookmarkStart w:id="977" w:name="name-informative-references"/>
+        <w:bookmarkEnd w:id="977"/>
         <w:r>
           <w:rPr>
             <w:rStyle w:val="Hyperlink"/>
@@ -62481,8 +62628,8 @@
         <w:jc w:val="left"/>
         <w:rPr/>
       </w:pPr>
-      <w:bookmarkStart w:id="975" w:name="H3"/>
-      <w:bookmarkEnd w:id="975"/>
+      <w:bookmarkStart w:id="978" w:name="H3"/>
+      <w:bookmarkEnd w:id="978"/>
       <w:r>
         <w:rPr/>
         <w:t xml:space="preserve">[H3] </w:t>
@@ -62508,8 +62655,8 @@
         <w:jc w:val="left"/>
         <w:rPr/>
       </w:pPr>
-      <w:bookmarkStart w:id="976" w:name="ITU-RR"/>
-      <w:bookmarkEnd w:id="976"/>
+      <w:bookmarkStart w:id="979" w:name="ITU-RR"/>
+      <w:bookmarkEnd w:id="979"/>
       <w:r>
         <w:rPr/>
         <w:t xml:space="preserve">[ITU-RR] </w:t>
@@ -62535,8 +62682,8 @@
         <w:jc w:val="left"/>
         <w:rPr/>
       </w:pPr>
-      <w:bookmarkStart w:id="977" w:name="RFC5491"/>
-      <w:bookmarkEnd w:id="977"/>
+      <w:bookmarkStart w:id="980" w:name="RFC5491"/>
+      <w:bookmarkEnd w:id="980"/>
       <w:r>
         <w:rPr/>
         <w:t xml:space="preserve">[RFC5491] </w:t>
@@ -62574,8 +62721,8 @@
         <w:jc w:val="left"/>
         <w:rPr/>
       </w:pPr>
-      <w:bookmarkStart w:id="978" w:name="RFC5808"/>
-      <w:bookmarkEnd w:id="978"/>
+      <w:bookmarkStart w:id="981" w:name="RFC5808"/>
+      <w:bookmarkEnd w:id="981"/>
       <w:r>
         <w:rPr/>
         <w:t xml:space="preserve">[RFC5808] </w:t>
@@ -62613,8 +62760,8 @@
         <w:jc w:val="left"/>
         <w:rPr/>
       </w:pPr>
-      <w:bookmarkStart w:id="979" w:name="RFC6280"/>
-      <w:bookmarkEnd w:id="979"/>
+      <w:bookmarkStart w:id="982" w:name="RFC6280"/>
+      <w:bookmarkEnd w:id="982"/>
       <w:r>
         <w:rPr/>
         <w:t xml:space="preserve">[RFC6280] </w:t>
@@ -62652,8 +62799,8 @@
         <w:jc w:val="left"/>
         <w:rPr/>
       </w:pPr>
-      <w:bookmarkStart w:id="980" w:name="RFC6772"/>
-      <w:bookmarkEnd w:id="980"/>
+      <w:bookmarkStart w:id="983" w:name="RFC6772"/>
+      <w:bookmarkEnd w:id="983"/>
       <w:r>
         <w:rPr/>
         <w:t xml:space="preserve">[RFC6772] </w:t>
@@ -62691,8 +62838,8 @@
         <w:jc w:val="left"/>
         <w:rPr/>
       </w:pPr>
-      <w:bookmarkStart w:id="981" w:name="RFC8805"/>
-      <w:bookmarkEnd w:id="981"/>
+      <w:bookmarkStart w:id="984" w:name="RFC8805"/>
+      <w:bookmarkEnd w:id="984"/>
       <w:r>
         <w:rPr/>
         <w:t xml:space="preserve">[RFC8805] </w:t>
@@ -62730,8 +62877,8 @@
         <w:jc w:val="left"/>
         <w:rPr/>
       </w:pPr>
-      <w:bookmarkStart w:id="982" w:name="RFC2009"/>
-      <w:bookmarkEnd w:id="982"/>
+      <w:bookmarkStart w:id="985" w:name="RFC2009"/>
+      <w:bookmarkEnd w:id="985"/>
       <w:r>
         <w:rPr/>
         <w:t xml:space="preserve">[RFC2009] </w:t>
@@ -62769,8 +62916,8 @@
         <w:jc w:val="left"/>
         <w:rPr/>
       </w:pPr>
-      <w:bookmarkStart w:id="983" w:name="RFC5870"/>
-      <w:bookmarkEnd w:id="983"/>
+      <w:bookmarkStart w:id="986" w:name="RFC5870"/>
+      <w:bookmarkEnd w:id="986"/>
       <w:r>
         <w:rPr/>
         <w:t xml:space="preserve">[RFC5870] </w:t>
@@ -62808,8 +62955,8 @@
         <w:jc w:val="left"/>
         <w:rPr/>
       </w:pPr>
-      <w:bookmarkStart w:id="984" w:name="RFC6442"/>
-      <w:bookmarkEnd w:id="984"/>
+      <w:bookmarkStart w:id="987" w:name="RFC6442"/>
+      <w:bookmarkEnd w:id="987"/>
       <w:r>
         <w:rPr/>
         <w:t xml:space="preserve">[RFC6442] </w:t>
@@ -62847,8 +62994,8 @@
         <w:jc w:val="left"/>
         <w:rPr/>
       </w:pPr>
-      <w:bookmarkStart w:id="985" w:name="RFC9179"/>
-      <w:bookmarkEnd w:id="985"/>
+      <w:bookmarkStart w:id="988" w:name="RFC9179"/>
+      <w:bookmarkEnd w:id="988"/>
       <w:r>
         <w:rPr/>
         <w:t xml:space="preserve">[RFC9179] </w:t>
@@ -62886,8 +63033,8 @@
         <w:jc w:val="left"/>
         <w:rPr/>
       </w:pPr>
-      <w:bookmarkStart w:id="986" w:name="RFC9632"/>
-      <w:bookmarkEnd w:id="986"/>
+      <w:bookmarkStart w:id="989" w:name="RFC9632"/>
+      <w:bookmarkEnd w:id="989"/>
       <w:r>
         <w:rPr/>
         <w:t xml:space="preserve">[RFC9632] </w:t>
@@ -62925,8 +63072,8 @@
         <w:jc w:val="left"/>
         <w:rPr/>
       </w:pPr>
-      <w:bookmarkStart w:id="987" w:name="ETSI-220"/>
-      <w:bookmarkEnd w:id="987"/>
+      <w:bookmarkStart w:id="990" w:name="ETSI-220"/>
+      <w:bookmarkEnd w:id="990"/>
       <w:r>
         <w:rPr/>
         <w:t xml:space="preserve">[ETSI-220] </w:t>
@@ -62952,8 +63099,8 @@
         <w:jc w:val="left"/>
         <w:rPr/>
       </w:pPr>
-      <w:bookmarkStart w:id="988" w:name="FCC-15"/>
-      <w:bookmarkEnd w:id="988"/>
+      <w:bookmarkStart w:id="991" w:name="FCC-15"/>
+      <w:bookmarkEnd w:id="991"/>
       <w:r>
         <w:rPr/>
         <w:t xml:space="preserve">[FCC-15] </w:t>
@@ -62979,8 +63126,8 @@
         <w:jc w:val="left"/>
         <w:rPr/>
       </w:pPr>
-      <w:bookmarkStart w:id="989" w:name="ARIB-T108"/>
-      <w:bookmarkEnd w:id="989"/>
+      <w:bookmarkStart w:id="992" w:name="ARIB-T108"/>
+      <w:bookmarkEnd w:id="992"/>
       <w:r>
         <w:rPr/>
         <w:t xml:space="preserve">[ARIB-T108] </w:t>
@@ -63006,8 +63153,8 @@
         <w:jc w:val="left"/>
         <w:rPr/>
       </w:pPr>
-      <w:bookmarkStart w:id="990" w:name="GFG"/>
-      <w:bookmarkEnd w:id="990"/>
+      <w:bookmarkStart w:id="993" w:name="GFG"/>
+      <w:bookmarkEnd w:id="993"/>
       <w:r>
         <w:rPr/>
         <w:t xml:space="preserve">[GFG] </w:t>
@@ -63045,8 +63192,8 @@
         <w:jc w:val="left"/>
         <w:rPr/>
       </w:pPr>
-      <w:bookmarkStart w:id="991" w:name="CLDP"/>
-      <w:bookmarkEnd w:id="991"/>
+      <w:bookmarkStart w:id="994" w:name="CLDP"/>
+      <w:bookmarkEnd w:id="994"/>
       <w:r>
         <w:rPr/>
         <w:t xml:space="preserve">[CLDP] </w:t>
@@ -63072,8 +63219,8 @@
         <w:jc w:val="left"/>
         <w:rPr/>
       </w:pPr>
-      <w:bookmarkStart w:id="992" w:name="GPSR"/>
-      <w:bookmarkEnd w:id="992"/>
+      <w:bookmarkStart w:id="995" w:name="GPSR"/>
+      <w:bookmarkEnd w:id="995"/>
       <w:r>
         <w:rPr/>
         <w:t xml:space="preserve">[GPSR] </w:t>
@@ -63099,8 +63246,8 @@
         <w:jc w:val="left"/>
         <w:rPr/>
       </w:pPr>
-      <w:bookmarkStart w:id="993" w:name="IEEE802154a"/>
-      <w:bookmarkEnd w:id="993"/>
+      <w:bookmarkStart w:id="996" w:name="IEEE802154a"/>
+      <w:bookmarkEnd w:id="996"/>
       <w:r>
         <w:rPr/>
         <w:t xml:space="preserve">[IEEE802154a] </w:t>
@@ -63126,8 +63273,8 @@
         <w:jc w:val="left"/>
         <w:rPr/>
       </w:pPr>
-      <w:bookmarkStart w:id="994" w:name="IEEE802154z"/>
-      <w:bookmarkEnd w:id="994"/>
+      <w:bookmarkStart w:id="997" w:name="IEEE802154z"/>
+      <w:bookmarkEnd w:id="997"/>
       <w:r>
         <w:rPr/>
         <w:t xml:space="preserve">[IEEE802154z] </w:t>
@@ -63153,8 +63300,8 @@
         <w:jc w:val="left"/>
         <w:rPr/>
       </w:pPr>
-      <w:bookmarkStart w:id="995" w:name="OLC"/>
-      <w:bookmarkEnd w:id="995"/>
+      <w:bookmarkStart w:id="998" w:name="OLC"/>
+      <w:bookmarkEnd w:id="998"/>
       <w:r>
         <w:rPr/>
         <w:t xml:space="preserve">[OLC] </w:t>
@@ -63180,8 +63327,8 @@
         <w:jc w:val="left"/>
         <w:rPr/>
       </w:pPr>
-      <w:bookmarkStart w:id="996" w:name="RFC6890"/>
-      <w:bookmarkEnd w:id="996"/>
+      <w:bookmarkStart w:id="999" w:name="RFC6890"/>
+      <w:bookmarkEnd w:id="999"/>
       <w:r>
         <w:rPr/>
         <w:t xml:space="preserve">[RFC6890] </w:t>
@@ -63219,8 +63366,8 @@
         <w:jc w:val="left"/>
         <w:rPr/>
       </w:pPr>
-      <w:bookmarkStart w:id="997" w:name="S2"/>
-      <w:bookmarkEnd w:id="997"/>
+      <w:bookmarkStart w:id="1000" w:name="S2"/>
+      <w:bookmarkEnd w:id="1000"/>
       <w:r>
         <w:rPr/>
         <w:t xml:space="preserve">[S2] </w:t>
@@ -63246,8 +63393,8 @@
         <w:jc w:val="left"/>
         <w:rPr/>
       </w:pPr>
-      <w:bookmarkStart w:id="998" w:name="RFC8628"/>
-      <w:bookmarkEnd w:id="998"/>
+      <w:bookmarkStart w:id="1001" w:name="RFC8628"/>
+      <w:bookmarkEnd w:id="1001"/>
       <w:r>
         <w:rPr/>
         <w:t xml:space="preserve">[RFC8628] </w:t>
@@ -63285,8 +63432,8 @@
         <w:jc w:val="left"/>
         <w:rPr/>
       </w:pPr>
-      <w:bookmarkStart w:id="999" w:name="RFC3849"/>
-      <w:bookmarkEnd w:id="999"/>
+      <w:bookmarkStart w:id="1002" w:name="RFC3849"/>
+      <w:bookmarkEnd w:id="1002"/>
       <w:r>
         <w:rPr/>
         <w:t xml:space="preserve">[RFC3849] </w:t>
@@ -63324,8 +63471,8 @@
         <w:jc w:val="left"/>
         <w:rPr/>
       </w:pPr>
-      <w:bookmarkStart w:id="1000" w:name="RFC4291"/>
-      <w:bookmarkEnd w:id="1000"/>
+      <w:bookmarkStart w:id="1003" w:name="RFC4291"/>
+      <w:bookmarkEnd w:id="1003"/>
       <w:r>
         <w:rPr/>
         <w:t xml:space="preserve">[RFC4291] </w:t>
@@ -63363,8 +63510,8 @@
         <w:jc w:val="left"/>
         <w:rPr/>
       </w:pPr>
-      <w:bookmarkStart w:id="1001" w:name="RFC4862"/>
-      <w:bookmarkEnd w:id="1001"/>
+      <w:bookmarkStart w:id="1004" w:name="RFC4862"/>
+      <w:bookmarkEnd w:id="1004"/>
       <w:r>
         <w:rPr/>
         <w:t xml:space="preserve">[RFC4862] </w:t>
@@ -63402,8 +63549,8 @@
         <w:jc w:val="left"/>
         <w:rPr/>
       </w:pPr>
-      <w:bookmarkStart w:id="1002" w:name="RFC4944"/>
-      <w:bookmarkEnd w:id="1002"/>
+      <w:bookmarkStart w:id="1005" w:name="RFC4944"/>
+      <w:bookmarkEnd w:id="1005"/>
       <w:r>
         <w:rPr/>
         <w:t xml:space="preserve">[RFC4944] </w:t>
@@ -63441,8 +63588,8 @@
         <w:jc w:val="left"/>
         <w:rPr/>
       </w:pPr>
-      <w:bookmarkStart w:id="1003" w:name="RFC6282"/>
-      <w:bookmarkEnd w:id="1003"/>
+      <w:bookmarkStart w:id="1006" w:name="RFC6282"/>
+      <w:bookmarkEnd w:id="1006"/>
       <w:r>
         <w:rPr/>
         <w:t xml:space="preserve">[RFC6282] </w:t>
@@ -63480,8 +63627,8 @@
         <w:jc w:val="left"/>
         <w:rPr/>
       </w:pPr>
-      <w:bookmarkStart w:id="1004" w:name="RFC6550"/>
-      <w:bookmarkEnd w:id="1004"/>
+      <w:bookmarkStart w:id="1007" w:name="RFC6550"/>
+      <w:bookmarkEnd w:id="1007"/>
       <w:r>
         <w:rPr/>
         <w:t xml:space="preserve">[RFC6550] </w:t>
@@ -63519,8 +63666,8 @@
         <w:jc w:val="left"/>
         <w:rPr/>
       </w:pPr>
-      <w:bookmarkStart w:id="1005" w:name="RFC6775"/>
-      <w:bookmarkEnd w:id="1005"/>
+      <w:bookmarkStart w:id="1008" w:name="RFC6775"/>
+      <w:bookmarkEnd w:id="1008"/>
       <w:r>
         <w:rPr/>
         <w:t xml:space="preserve">[RFC6775] </w:t>
@@ -63558,8 +63705,8 @@
         <w:jc w:val="left"/>
         <w:rPr/>
       </w:pPr>
-      <w:bookmarkStart w:id="1006" w:name="RFC7217"/>
-      <w:bookmarkEnd w:id="1006"/>
+      <w:bookmarkStart w:id="1009" w:name="RFC7217"/>
+      <w:bookmarkEnd w:id="1009"/>
       <w:r>
         <w:rPr/>
         <w:t xml:space="preserve">[RFC7217] </w:t>
@@ -63597,8 +63744,8 @@
         <w:jc w:val="left"/>
         <w:rPr/>
       </w:pPr>
-      <w:bookmarkStart w:id="1007" w:name="RFC7721"/>
-      <w:bookmarkEnd w:id="1007"/>
+      <w:bookmarkStart w:id="1010" w:name="RFC7721"/>
+      <w:bookmarkEnd w:id="1010"/>
       <w:r>
         <w:rPr/>
         <w:t xml:space="preserve">[RFC7721] </w:t>
@@ -63636,8 +63783,8 @@
         <w:jc w:val="left"/>
         <w:rPr/>
       </w:pPr>
-      <w:bookmarkStart w:id="1008" w:name="RFC8064"/>
-      <w:bookmarkEnd w:id="1008"/>
+      <w:bookmarkStart w:id="1011" w:name="RFC8064"/>
+      <w:bookmarkEnd w:id="1011"/>
       <w:r>
         <w:rPr/>
         <w:t xml:space="preserve">[RFC8064] </w:t>
@@ -63675,8 +63822,164 @@
         <w:jc w:val="left"/>
         <w:rPr/>
       </w:pPr>
-      <w:bookmarkStart w:id="1009" w:name="RFC8200"/>
-      <w:bookmarkEnd w:id="1009"/>
+      <w:bookmarkStart w:id="1012" w:name="RFC6552"/>
+      <w:bookmarkEnd w:id="1012"/>
+      <w:r>
+        <w:rPr/>
+        <w:t xml:space="preserve">[RFC6552] </w:t>
+      </w:r>
+    </w:p>
+    <w:p>
+      <w:pPr>
+        <w:pStyle w:val="ListContents"/>
+        <w:bidi w:val="0"/>
+        <w:jc w:val="left"/>
+        <w:rPr/>
+      </w:pPr>
+      <w:r>
+        <w:rPr/>
+        <w:t>Thubert, P., Ed., "Objective Function Zero for the Routing Protocol for Low-Power and Lossy Networks (RPL)", RFC 6552, DOI 10.17487/RFC6552, March 2012, &lt;</w:t>
+      </w:r>
+      <w:hyperlink r:id="rId38">
+        <w:r>
+          <w:rPr>
+            <w:rStyle w:val="Hyperlink"/>
+          </w:rPr>
+          <w:t>https://www.rfc-editor.org/info/rfc6552</w:t>
+        </w:r>
+      </w:hyperlink>
+      <w:r>
+        <w:rPr/>
+        <w:t xml:space="preserve">&gt;. </w:t>
+      </w:r>
+    </w:p>
+    <w:p>
+      <w:pPr>
+        <w:pStyle w:val="ListHeading"/>
+        <w:bidi w:val="0"/>
+        <w:ind w:hanging="0" w:left="0" w:right="0"/>
+        <w:jc w:val="left"/>
+        <w:rPr/>
+      </w:pPr>
+      <w:bookmarkStart w:id="1013" w:name="RFC6553"/>
+      <w:bookmarkEnd w:id="1013"/>
+      <w:r>
+        <w:rPr/>
+        <w:t xml:space="preserve">[RFC6553] </w:t>
+      </w:r>
+    </w:p>
+    <w:p>
+      <w:pPr>
+        <w:pStyle w:val="ListContents"/>
+        <w:bidi w:val="0"/>
+        <w:jc w:val="left"/>
+        <w:rPr/>
+      </w:pPr>
+      <w:r>
+        <w:rPr/>
+        <w:t>Hui, J. and JP. Vasseur, "The Routing Protocol for Low-Power and Lossy Networks (RPL) Option for Carrying RPL Information in Data-Plane Datagrams", RFC 6553, DOI 10.17487/RFC6553, March 2012, &lt;</w:t>
+      </w:r>
+      <w:hyperlink r:id="rId39">
+        <w:r>
+          <w:rPr>
+            <w:rStyle w:val="Hyperlink"/>
+          </w:rPr>
+          <w:t>https://www.rfc-editor.org/info/rfc6553</w:t>
+        </w:r>
+      </w:hyperlink>
+      <w:r>
+        <w:rPr/>
+        <w:t xml:space="preserve">&gt;. </w:t>
+      </w:r>
+    </w:p>
+    <w:p>
+      <w:pPr>
+        <w:pStyle w:val="ListHeading"/>
+        <w:bidi w:val="0"/>
+        <w:ind w:hanging="0" w:left="0" w:right="0"/>
+        <w:jc w:val="left"/>
+        <w:rPr/>
+      </w:pPr>
+      <w:bookmarkStart w:id="1014" w:name="RFC6621"/>
+      <w:bookmarkEnd w:id="1014"/>
+      <w:r>
+        <w:rPr/>
+        <w:t xml:space="preserve">[RFC6621] </w:t>
+      </w:r>
+    </w:p>
+    <w:p>
+      <w:pPr>
+        <w:pStyle w:val="ListContents"/>
+        <w:bidi w:val="0"/>
+        <w:jc w:val="left"/>
+        <w:rPr/>
+      </w:pPr>
+      <w:r>
+        <w:rPr/>
+        <w:t>Macker, J., Ed., "Simplified Multicast Forwarding", RFC 6621, DOI 10.17487/RFC6621, May 2012, &lt;</w:t>
+      </w:r>
+      <w:hyperlink r:id="rId40">
+        <w:r>
+          <w:rPr>
+            <w:rStyle w:val="Hyperlink"/>
+          </w:rPr>
+          <w:t>https://www.rfc-editor.org/info/rfc6621</w:t>
+        </w:r>
+      </w:hyperlink>
+      <w:r>
+        <w:rPr/>
+        <w:t xml:space="preserve">&gt;. </w:t>
+      </w:r>
+    </w:p>
+    <w:p>
+      <w:pPr>
+        <w:pStyle w:val="ListHeading"/>
+        <w:bidi w:val="0"/>
+        <w:ind w:hanging="0" w:left="0" w:right="0"/>
+        <w:jc w:val="left"/>
+        <w:rPr/>
+      </w:pPr>
+      <w:bookmarkStart w:id="1015" w:name="LOOPS"/>
+      <w:bookmarkEnd w:id="1015"/>
+      <w:r>
+        <w:rPr/>
+        <w:t xml:space="preserve">[LOOPS] </w:t>
+      </w:r>
+    </w:p>
+    <w:p>
+      <w:pPr>
+        <w:pStyle w:val="ListContents"/>
+        <w:bidi w:val="0"/>
+        <w:jc w:val="left"/>
+        <w:rPr/>
+      </w:pPr>
+      <w:r>
+        <w:rPr/>
+        <w:t>Hengartner, U., Moon, S., Mortier, R., and C. Diot, "Detection and Analysis of Routing Loops in Packet Traces", See ACM SIGCOMM Internet Measurement Workshop (IMW) 2002, DOI 10.1145/637201.637217, November 2002, &lt;</w:t>
+      </w:r>
+      <w:hyperlink r:id="rId41">
+        <w:r>
+          <w:rPr>
+            <w:rStyle w:val="Hyperlink"/>
+          </w:rPr>
+          <w:t>https://doi.org/10.1145/637201.637217</w:t>
+        </w:r>
+      </w:hyperlink>
+      <w:r>
+        <w:rPr/>
+        <w:t xml:space="preserve">&gt;. </w:t>
+      </w:r>
+    </w:p>
+    <w:p>
+      <w:pPr>
+        <w:pStyle w:val="ListHeading"/>
+        <w:bidi w:val="0"/>
+        <w:ind w:hanging="0" w:left="0" w:right="0"/>
+        <w:jc w:val="left"/>
+        <w:rPr/>
+      </w:pPr>
+      <w:bookmarkStart w:id="1016" w:name="RFC8200"/>
+      <w:bookmarkEnd w:id="1016"/>
       <w:r>
         <w:rPr/>
         <w:t xml:space="preserve">[RFC8200] </w:t>
@@ -63693,7 +63996,7 @@
         <w:rPr/>
         <w:t>Deering, S. and R. Hinden, "Internet Protocol, Version 6 (IPv6) Specification", STD 86, RFC 8200, DOI 10.17487/RFC8200, July 2017, &lt;</w:t>
       </w:r>
-      <w:hyperlink r:id="rId38">
+      <w:hyperlink r:id="rId42">
         <w:r>
           <w:rPr>
             <w:rStyle w:val="Hyperlink"/>
@@ -63714,8 +64017,8 @@
         <w:jc w:val="left"/>
         <w:rPr/>
       </w:pPr>
-      <w:bookmarkStart w:id="1010" w:name="RFC8126"/>
-      <w:bookmarkEnd w:id="1010"/>
+      <w:bookmarkStart w:id="1017" w:name="RFC8126"/>
+      <w:bookmarkEnd w:id="1017"/>
       <w:r>
         <w:rPr/>
         <w:t xml:space="preserve">[RFC8126] </w:t>
@@ -63732,7 +64035,7 @@
         <w:rPr/>
         <w:t>Cotton, M., Leiba, B., and T. Narten, "Guidelines for Writing an IANA Considerations Section in RFCs", BCP 26, RFC 8126, June 2017, &lt;</w:t>
       </w:r>
-      <w:hyperlink r:id="rId39">
+      <w:hyperlink r:id="rId43">
         <w:r>
           <w:rPr>
             <w:rStyle w:val="Hyperlink"/>
@@ -63753,8 +64056,8 @@
         <w:jc w:val="left"/>
         <w:rPr/>
       </w:pPr>
-      <w:bookmarkStart w:id="1011" w:name="RFC8505"/>
-      <w:bookmarkEnd w:id="1011"/>
+      <w:bookmarkStart w:id="1018" w:name="RFC8505"/>
+      <w:bookmarkEnd w:id="1018"/>
       <w:r>
         <w:rPr/>
         <w:t xml:space="preserve">[RFC8505] </w:t>
@@ -63772,7 +64075,7 @@
         <w:rPr/>
         <w:t>Thubert, P., Ed., Nordmark, E., Chakrabarti, S., and C. Perkins, "Registration Extensions for IPv6 over Low-Power Wireless Personal Area Network (6LoWPAN) Neighbor Discovery", RFC 8505, November 2018, &lt;</w:t>
       </w:r>
-      <w:hyperlink r:id="rId40">
+      <w:hyperlink r:id="rId44">
         <w:r>
           <w:rPr>
             <w:rStyle w:val="Hyperlink"/>
@@ -63805,8 +64108,8 @@
         <w:rPr/>
       </w:pPr>
       <w:hyperlink w:anchor="name-authors-address">
-        <w:bookmarkStart w:id="1012" w:name="name-authors-address"/>
-        <w:bookmarkEnd w:id="1012"/>
+        <w:bookmarkStart w:id="1019" w:name="name-authors-address"/>
+        <w:bookmarkEnd w:id="1019"/>
         <w:r>
           <w:rPr>
             <w:rStyle w:val="Hyperlink"/>
@@ -63854,7 +64157,7 @@
         <w:rPr/>
         <w:t xml:space="preserve">Email: </w:t>
       </w:r>
-      <w:hyperlink r:id="rId41">
+      <w:hyperlink r:id="rId45">
         <w:r>
           <w:rPr>
             <w:rStyle w:val="Hyperlink"/>
@@ -63880,49 +64183,49 @@
 
 <file path=word/comments.xml><?xml version="1.0" encoding="utf-8"?>
 <w:comments xmlns:o="urn:schemas-microsoft-com:office:office" xmlns:r="http://schemas.openxmlformats.org/officeDocument/2006/relationships" xmlns:v="urn:schemas-microsoft-com:vml" xmlns:w="http://schemas.openxmlformats.org/wordprocessingml/2006/main" xmlns:w10="urn:schemas-microsoft-com:office:word" xmlns:wp="http://schemas.openxmlformats.org/drawingml/2006/wordprocessingDrawing" xmlns:wps="http://schemas.microsoft.com/office/word/2010/wordprocessingShape" xmlns:wpg="http://schemas.microsoft.com/office/word/2010/wordprocessingGroup" xmlns:mc="http://schemas.openxmlformats.org/markup-compatibility/2006" xmlns:wp14="http://schemas.microsoft.com/office/word/2010/wordprocessingDrawing" xmlns:w14="http://schemas.microsoft.com/office/word/2010/wordml" xmlns:w15="http://schemas.microsoft.com/office/word/2012/wordml" mc:Ignorable="w14 wp14 w15">
-  <w:comment w:id="0" w:author="" w:date="2026-10-22T09:06:46Z" w:initials="">
+  <w:comment w:id="0" w:author="" w:date="2026-10-22T09:18:34Z" w:initials="">
     <w:p>
       <w:r>
         <w:t>HTML: &lt;meta name="keyword" content="spectrum"&gt;</w:t>
       </w:r>
     </w:p>
   </w:comment>
-  <w:comment w:id="1" w:author="" w:date="2026-10-22T09:06:46Z" w:initials="">
+  <w:comment w:id="1" w:author="" w:date="2026-10-22T09:18:34Z" w:initials="">
     <w:p>
       <w:r>
         <w:t>HTML: &lt;meta name="keyword" content="regulatory"&gt;</w:t>
       </w:r>
     </w:p>
   </w:comment>
-  <w:comment w:id="2" w:author="" w:date="2026-10-22T09:06:46Z" w:initials="">
+  <w:comment w:id="2" w:author="" w:date="2026-10-22T09:18:34Z" w:initials="">
     <w:p>
       <w:r>
         <w:t>HTML: &lt;meta name="keyword" content="dodecahedron"&gt;</w:t>
       </w:r>
     </w:p>
   </w:comment>
-  <w:comment w:id="3" w:author="" w:date="2026-10-22T09:06:46Z" w:initials="">
+  <w:comment w:id="3" w:author="" w:date="2026-10-22T09:18:34Z" w:initials="">
     <w:p>
       <w:r>
         <w:t>HTML: &lt;meta name="keyword" content="ISM"&gt;</w:t>
       </w:r>
     </w:p>
   </w:comment>
-  <w:comment w:id="4" w:author="" w:date="2026-10-22T09:06:46Z" w:initials="">
+  <w:comment w:id="4" w:author="" w:date="2026-10-22T09:18:34Z" w:initials="">
     <w:p>
       <w:r>
         <w:t>HTML: &lt;meta name="keyword" content="location"&gt;</w:t>
       </w:r>
     </w:p>
   </w:comment>
-  <w:comment w:id="5" w:author="" w:date="2026-10-22T09:06:46Z" w:initials="">
+  <w:comment w:id="5" w:author="" w:date="2026-10-22T09:18:34Z" w:initials="">
     <w:p>
       <w:r>
         <w:t>HTML: &lt;meta name="keyword" content="802.15.4"&gt;</w:t>
       </w:r>
     </w:p>
   </w:comment>
-  <w:comment w:id="6" w:author="" w:date="2026-10-22T09:06:46Z" w:initials="">
+  <w:comment w:id="6" w:author="" w:date="2026-10-22T09:18:34Z" w:initials="">
     <w:p>
       <w:r>
         <w:t>HTML: &lt;meta name="keyword" content="CBOR"&gt;</w:t>

</xml_diff>

<commit_message>
Draft: carry the RF cul-de-sac mitigations through the document
- 15.3: the forwarding pseudocode now has the loop table (digest over
  non-mutable fields, count, next hops used), escape onto a neighbor
  outside the loop, the Hop Limit check, and the void step (face
  routing or forwarding error to the previous hop). It covers
  downward traffic; upward follows the hop-count gradient.
- 15.7: new open issue, routing voids (recovery mode, threshold and
  table size, forwarding-error form, radio model).
- 17.1: the recommended void handlers include loop detection and
  escape.
- 18.4: clearance item for loop detection and escape; each element is
  published, the combination is unsearched (add CPC H04W40/20).
- Security Considerations: forwarding integrity (false cells, replay
  against the loop table, table exhaustion; bound the table, expire
  entries, fall back to the Hop Limit).
</commit_message>
<xml_diff>
--- a/draft/draft-hanley-rsdggs-01.docx
+++ b/draft/draft-hanley-rsdggs-01.docx
@@ -38786,7 +38786,19 @@
       </w:pPr>
       <w:r>
         <w:rPr/>
-        <w:t>Forwarding algorithm:</w:t>
+        <w:t>Forwarding algorithm (downward traffic; upward traffic follows</w:t>
+      </w:r>
+    </w:p>
+    <w:p>
+      <w:pPr>
+        <w:pStyle w:val="PreformattedText"/>
+        <w:bidi w:val="0"/>
+        <w:jc w:val="left"/>
+        <w:rPr/>
+      </w:pPr>
+      <w:r>
+        <w:rPr/>
+        <w:t>the hop-count gradient toward the border router):</w:t>
       </w:r>
     </w:p>
     <w:p>
@@ -38958,7 +38970,7 @@
       </w:r>
       <w:r>
         <w:rPr/>
-        <w:t>For each candidate next hop N in neighbor table:</w:t>
+        <w:t>digest(P):</w:t>
       </w:r>
     </w:p>
     <w:p>
@@ -38974,7 +38986,157 @@
       </w:r>
       <w:r>
         <w:rPr/>
-        <w:t>if progress(G_next(N), G_self, G_dest):</w:t>
+        <w:t>hash over the non-mutable fields of packet P</w:t>
+      </w:r>
+    </w:p>
+    <w:p>
+      <w:pPr>
+        <w:pStyle w:val="PreformattedText"/>
+        <w:bidi w:val="0"/>
+        <w:jc w:val="left"/>
+        <w:rPr/>
+      </w:pPr>
+      <w:r>
+        <w:rPr/>
+        <w:t xml:space="preserve">    </w:t>
+      </w:r>
+      <w:r>
+        <w:rPr/>
+        <w:t>(Hop Limit and other per-hop fields excluded)</w:t>
+      </w:r>
+    </w:p>
+    <w:p>
+      <w:pPr>
+        <w:pStyle w:val="PreformattedText"/>
+        <w:bidi w:val="0"/>
+        <w:jc w:val="left"/>
+        <w:rPr/>
+      </w:pPr>
+      <w:r>
+        <w:rPr/>
+      </w:r>
+    </w:p>
+    <w:p>
+      <w:pPr>
+        <w:pStyle w:val="PreformattedText"/>
+        <w:bidi w:val="0"/>
+        <w:jc w:val="left"/>
+        <w:rPr/>
+      </w:pPr>
+      <w:r>
+        <w:rPr/>
+        <w:t xml:space="preserve">  </w:t>
+      </w:r>
+      <w:r>
+        <w:rPr/>
+        <w:t>seen[d]: loop table, entry = (count, next hops used);</w:t>
+      </w:r>
+    </w:p>
+    <w:p>
+      <w:pPr>
+        <w:pStyle w:val="PreformattedText"/>
+        <w:bidi w:val="0"/>
+        <w:jc w:val="left"/>
+        <w:rPr/>
+      </w:pPr>
+      <w:r>
+        <w:rPr/>
+        <w:t xml:space="preserve">    </w:t>
+      </w:r>
+      <w:r>
+        <w:rPr/>
+        <w:t>entries expire after the maximum packet lifetime</w:t>
+      </w:r>
+    </w:p>
+    <w:p>
+      <w:pPr>
+        <w:pStyle w:val="PreformattedText"/>
+        <w:bidi w:val="0"/>
+        <w:jc w:val="left"/>
+        <w:rPr/>
+      </w:pPr>
+      <w:r>
+        <w:rPr/>
+      </w:r>
+    </w:p>
+    <w:p>
+      <w:pPr>
+        <w:pStyle w:val="PreformattedText"/>
+        <w:bidi w:val="0"/>
+        <w:jc w:val="left"/>
+        <w:rPr/>
+      </w:pPr>
+      <w:r>
+        <w:rPr/>
+        <w:t xml:space="preserve">  </w:t>
+      </w:r>
+      <w:r>
+        <w:rPr/>
+        <w:t>On receiving packet P (link-layer duplicates already removed):</w:t>
+      </w:r>
+    </w:p>
+    <w:p>
+      <w:pPr>
+        <w:pStyle w:val="PreformattedText"/>
+        <w:bidi w:val="0"/>
+        <w:jc w:val="left"/>
+        <w:rPr/>
+      </w:pPr>
+      <w:r>
+        <w:rPr/>
+        <w:t xml:space="preserve">    </w:t>
+      </w:r>
+      <w:r>
+        <w:rPr/>
+        <w:t>decrement P.hop_limit; drop P if it reaches 0</w:t>
+      </w:r>
+    </w:p>
+    <w:p>
+      <w:pPr>
+        <w:pStyle w:val="PreformattedText"/>
+        <w:bidi w:val="0"/>
+        <w:jc w:val="left"/>
+        <w:rPr/>
+      </w:pPr>
+      <w:r>
+        <w:rPr/>
+        <w:t xml:space="preserve">    </w:t>
+      </w:r>
+      <w:r>
+        <w:rPr/>
+        <w:t>e = seen[digest(P)]</w:t>
+      </w:r>
+    </w:p>
+    <w:p>
+      <w:pPr>
+        <w:pStyle w:val="PreformattedText"/>
+        <w:bidi w:val="0"/>
+        <w:jc w:val="left"/>
+        <w:rPr/>
+      </w:pPr>
+      <w:r>
+        <w:rPr/>
+        <w:t xml:space="preserve">    </w:t>
+      </w:r>
+      <w:r>
+        <w:rPr/>
+        <w:t>e.count = e.count + 1</w:t>
+      </w:r>
+    </w:p>
+    <w:p>
+      <w:pPr>
+        <w:pStyle w:val="PreformattedText"/>
+        <w:bidi w:val="0"/>
+        <w:jc w:val="left"/>
+        <w:rPr/>
+      </w:pPr>
+      <w:r>
+        <w:rPr/>
+        <w:t xml:space="preserve">    </w:t>
+      </w:r>
+      <w:r>
+        <w:rPr/>
+        <w:t>if e.count &gt; LOOP_THRESHOLD:     // small constant</w:t>
       </w:r>
     </w:p>
     <w:p>
@@ -38990,34 +39152,194 @@
       </w:r>
       <w:r>
         <w:rPr/>
-        <w:t>forward to N   // N is geographically closer to destination</w:t>
-      </w:r>
-    </w:p>
-    <w:p>
-      <w:pPr>
-        <w:pStyle w:val="PreformattedText"/>
-        <w:bidi w:val="0"/>
-        <w:jc w:val="left"/>
-        <w:rPr/>
-      </w:pPr>
-      <w:r>
-        <w:rPr/>
-      </w:r>
-    </w:p>
-    <w:p>
-      <w:pPr>
-        <w:pStyle w:val="PreformattedText"/>
-        <w:bidi w:val="0"/>
-        <w:jc w:val="left"/>
-        <w:rPr/>
-      </w:pPr>
-      <w:r>
-        <w:rPr/>
-        <w:t xml:space="preserve">  </w:t>
-      </w:r>
-      <w:r>
-        <w:rPr/>
-        <w:t>If no progress possible:</w:t>
+        <w:t>exclude = e.used               // P is in a loop: escape it</w:t>
+      </w:r>
+    </w:p>
+    <w:p>
+      <w:pPr>
+        <w:pStyle w:val="PreformattedText"/>
+        <w:bidi w:val="0"/>
+        <w:jc w:val="left"/>
+        <w:rPr/>
+      </w:pPr>
+      <w:r>
+        <w:rPr/>
+        <w:t xml:space="preserve">    </w:t>
+      </w:r>
+      <w:r>
+        <w:rPr/>
+        <w:t>else:</w:t>
+      </w:r>
+    </w:p>
+    <w:p>
+      <w:pPr>
+        <w:pStyle w:val="PreformattedText"/>
+        <w:bidi w:val="0"/>
+        <w:jc w:val="left"/>
+        <w:rPr/>
+      </w:pPr>
+      <w:r>
+        <w:rPr/>
+        <w:t xml:space="preserve">      </w:t>
+      </w:r>
+      <w:r>
+        <w:rPr/>
+        <w:t>exclude = {}</w:t>
+      </w:r>
+    </w:p>
+    <w:p>
+      <w:pPr>
+        <w:pStyle w:val="PreformattedText"/>
+        <w:bidi w:val="0"/>
+        <w:jc w:val="left"/>
+        <w:rPr/>
+      </w:pPr>
+      <w:r>
+        <w:rPr/>
+      </w:r>
+    </w:p>
+    <w:p>
+      <w:pPr>
+        <w:pStyle w:val="PreformattedText"/>
+        <w:bidi w:val="0"/>
+        <w:jc w:val="left"/>
+        <w:rPr/>
+      </w:pPr>
+      <w:r>
+        <w:rPr/>
+        <w:t xml:space="preserve">    </w:t>
+      </w:r>
+      <w:r>
+        <w:rPr/>
+        <w:t>candidates = { N in neighbor table, N not in exclude :</w:t>
+      </w:r>
+    </w:p>
+    <w:p>
+      <w:pPr>
+        <w:pStyle w:val="PreformattedText"/>
+        <w:bidi w:val="0"/>
+        <w:jc w:val="left"/>
+        <w:rPr/>
+      </w:pPr>
+      <w:r>
+        <w:rPr/>
+        <w:t xml:space="preserve">                   </w:t>
+      </w:r>
+      <w:r>
+        <w:rPr/>
+        <w:t>progress(G_next(N), G_self, G_dest) }</w:t>
+      </w:r>
+    </w:p>
+    <w:p>
+      <w:pPr>
+        <w:pStyle w:val="PreformattedText"/>
+        <w:bidi w:val="0"/>
+        <w:jc w:val="left"/>
+        <w:rPr/>
+      </w:pPr>
+      <w:r>
+        <w:rPr/>
+        <w:t xml:space="preserve">    </w:t>
+      </w:r>
+      <w:r>
+        <w:rPr/>
+        <w:t>if candidates is not empty:</w:t>
+      </w:r>
+    </w:p>
+    <w:p>
+      <w:pPr>
+        <w:pStyle w:val="PreformattedText"/>
+        <w:bidi w:val="0"/>
+        <w:jc w:val="left"/>
+        <w:rPr/>
+      </w:pPr>
+      <w:r>
+        <w:rPr/>
+        <w:t xml:space="preserve">      </w:t>
+      </w:r>
+      <w:r>
+        <w:rPr/>
+        <w:t>N = candidate with the longest</w:t>
+      </w:r>
+    </w:p>
+    <w:p>
+      <w:pPr>
+        <w:pStyle w:val="PreformattedText"/>
+        <w:bidi w:val="0"/>
+        <w:jc w:val="left"/>
+        <w:rPr/>
+      </w:pPr>
+      <w:r>
+        <w:rPr/>
+        <w:t xml:space="preserve">          </w:t>
+      </w:r>
+      <w:r>
+        <w:rPr/>
+        <w:t>common_prefix_len(G_next(N), G_dest)</w:t>
+      </w:r>
+    </w:p>
+    <w:p>
+      <w:pPr>
+        <w:pStyle w:val="PreformattedText"/>
+        <w:bidi w:val="0"/>
+        <w:jc w:val="left"/>
+        <w:rPr/>
+      </w:pPr>
+      <w:r>
+        <w:rPr/>
+        <w:t xml:space="preserve">      </w:t>
+      </w:r>
+      <w:r>
+        <w:rPr/>
+        <w:t>add N to e.used; forward P to N</w:t>
+      </w:r>
+    </w:p>
+    <w:p>
+      <w:pPr>
+        <w:pStyle w:val="PreformattedText"/>
+        <w:bidi w:val="0"/>
+        <w:jc w:val="left"/>
+        <w:rPr/>
+      </w:pPr>
+      <w:r>
+        <w:rPr/>
+        <w:t xml:space="preserve">    </w:t>
+      </w:r>
+      <w:r>
+        <w:rPr/>
+        <w:t>else:</w:t>
+      </w:r>
+    </w:p>
+    <w:p>
+      <w:pPr>
+        <w:pStyle w:val="PreformattedText"/>
+        <w:bidi w:val="0"/>
+        <w:jc w:val="left"/>
+        <w:rPr/>
+      </w:pPr>
+      <w:r>
+        <w:rPr/>
+        <w:t xml:space="preserve">      </w:t>
+      </w:r>
+      <w:r>
+        <w:rPr/>
+        <w:t>void: enter face routing (perimeter mode), or</w:t>
+      </w:r>
+    </w:p>
+    <w:p>
+      <w:pPr>
+        <w:pStyle w:val="PreformattedText"/>
+        <w:bidi w:val="0"/>
+        <w:jc w:val="left"/>
+        <w:rPr/>
+      </w:pPr>
+      <w:r>
+        <w:rPr/>
+        <w:t xml:space="preserve">      </w:t>
+      </w:r>
+      <w:r>
+        <w:rPr/>
+        <w:t>return P to the previous hop with a forwarding error</w:t>
       </w:r>
     </w:p>
     <w:p>
@@ -39030,11 +39352,11 @@
       </w:pPr>
       <w:r>
         <w:rPr/>
-        <w:t xml:space="preserve">    </w:t>
-      </w:r>
-      <w:r>
-        <w:rPr/>
-        <w:t>invoke void handling (perimeter routing or buffer-and-wait)</w:t>
+        <w:t xml:space="preserve">      </w:t>
+      </w:r>
+      <w:r>
+        <w:rPr/>
+        <w:t>so that it resends through another neighbor</w:t>
       </w:r>
     </w:p>
     <w:p>
@@ -39107,7 +39429,7 @@
       </w:hyperlink>
       <w:r>
         <w:rPr/>
-        <w:t>] and similar protocols, but operates on the RSDGGS index structure directly rather than on Euclidean or great-circle distance. The computational cost at each hop is a bitwise XOR and leading-zero count -- operations available as single instructions on all target architectures including constrained microcontrollers. When no neighbor makes progress, the forwarder is at a routing void and switches to a recovery mode (</w:t>
+        <w:t xml:space="preserve">] and similar protocols, but operates on the RSDGGS index structure directly rather than on Euclidean or great-circle distance. The computational cost at each hop is a bitwise XOR and leading-zero count -- operations available as single instructions on all target architectures including constrained microcontrollers. When no neighbor makes progress, the forwarder is at a routing void and switches to a recovery mode. The loop table, the escape from a detected loop and the recovery mode are described in </w:t>
       </w:r>
       <w:hyperlink w:anchor="s-routing-voids">
         <w:r>
@@ -39119,7 +39441,7 @@
       </w:hyperlink>
       <w:r>
         <w:rPr/>
-        <w:t>).</w:t>
+        <w:t>.</w:t>
       </w:r>
     </w:p>
     <w:p>
@@ -40323,12 +40645,48 @@
           <w:tab w:val="left" w:pos="709" w:leader="none"/>
         </w:tabs>
         <w:bidi w:val="0"/>
+        <w:spacing w:before="0" w:after="0"/>
         <w:ind w:hanging="283" w:left="709" w:right="0"/>
         <w:jc w:val="left"/>
         <w:rPr/>
       </w:pPr>
       <w:bookmarkStart w:id="734" w:name="section-15.7-2.5"/>
       <w:bookmarkEnd w:id="734"/>
+      <w:r>
+        <w:rPr/>
+        <w:t>Routing voids. Geographic forwarding needs the recovery mode, the loop-detection threshold and table size, the form of the forwarding error returned to the previous hop, and the radio model it assumes to be specified (</w:t>
+      </w:r>
+      <w:hyperlink w:anchor="s-routing-voids">
+        <w:r>
+          <w:rPr>
+            <w:rStyle w:val="Hyperlink"/>
+          </w:rPr>
+          <w:t>Section 15.4</w:t>
+        </w:r>
+      </w:hyperlink>
+      <w:r>
+        <w:rPr/>
+        <w:t xml:space="preserve">). </w:t>
+      </w:r>
+    </w:p>
+    <w:p>
+      <w:pPr>
+        <w:pStyle w:val="BodyText"/>
+        <w:numPr>
+          <w:ilvl w:val="0"/>
+          <w:numId w:val="10"/>
+        </w:numPr>
+        <w:tabs>
+          <w:tab w:val="clear" w:pos="709"/>
+          <w:tab w:val="left" w:pos="709" w:leader="none"/>
+        </w:tabs>
+        <w:bidi w:val="0"/>
+        <w:ind w:hanging="283" w:left="709" w:right="0"/>
+        <w:jc w:val="left"/>
+        <w:rPr/>
+      </w:pPr>
+      <w:bookmarkStart w:id="735" w:name="section-15.7-2.6"/>
+      <w:bookmarkEnd w:id="735"/>
       <w:r>
         <w:rPr/>
         <w:t>Header overhead. Geographic IIDs cannot be compressed from link-layer addresses (</w:t>
@@ -40366,8 +40724,8 @@
         <w:rPr/>
       </w:pPr>
       <w:hyperlink w:anchor="section-16">
-        <w:bookmarkStart w:id="735" w:name="name-relationship-to-prior-geogr"/>
-        <w:bookmarkEnd w:id="735"/>
+        <w:bookmarkStart w:id="736" w:name="name-relationship-to-prior-geogr"/>
+        <w:bookmarkEnd w:id="736"/>
         <w:r>
           <w:rPr>
             <w:rStyle w:val="Hyperlink"/>
@@ -40396,8 +40754,8 @@
         <w:jc w:val="left"/>
         <w:rPr/>
       </w:pPr>
-      <w:bookmarkStart w:id="736" w:name="section-16-1"/>
-      <w:bookmarkEnd w:id="736"/>
+      <w:bookmarkStart w:id="737" w:name="section-16-1"/>
+      <w:bookmarkEnd w:id="737"/>
       <w:r>
         <w:rPr/>
         <w:t>Several IETF documents address geographic location representation, conveyance, and routing. This section compares each to RSDGGS, identifying the gaps that RSDGGS addresses and the areas where these prior works remain authoritative and complementary.</w:t>
@@ -40411,8 +40769,8 @@
         <w:jc w:val="left"/>
         <w:rPr/>
       </w:pPr>
-      <w:bookmarkStart w:id="737" w:name="section-16-2"/>
-      <w:bookmarkEnd w:id="737"/>
+      <w:bookmarkStart w:id="738" w:name="section-16-2"/>
+      <w:bookmarkEnd w:id="738"/>
       <w:r>
         <w:rPr/>
         <w:t>The fundamental distinction between RSDGGS and all prior work is axis of design: the existing RFCs treat geographic location as a property to be conveyed alongside an application or network protocol, using coordinate systems (WGS-84 latitude/longitude) designed for human-readable precision. RSDGGS treats geographic location as a self-describing, hierarchical index whose structure directly encodes regulatory jurisdiction, enables address-arithmetic routing, and is optimized for constrained IoT devices operating without floating-point arithmetic or external infrastructure.</w:t>
@@ -40438,8 +40796,8 @@
         <w:rPr/>
       </w:pPr>
       <w:hyperlink w:anchor="section-16.1">
-        <w:bookmarkStart w:id="738" w:name="name-rfc-2009-gps-based-addressi"/>
-        <w:bookmarkEnd w:id="738"/>
+        <w:bookmarkStart w:id="739" w:name="name-rfc-2009-gps-based-addressi"/>
+        <w:bookmarkEnd w:id="739"/>
         <w:r>
           <w:rPr>
             <w:rStyle w:val="Hyperlink"/>
@@ -40468,8 +40826,8 @@
         <w:jc w:val="left"/>
         <w:rPr/>
       </w:pPr>
-      <w:bookmarkStart w:id="739" w:name="section-16.1-1"/>
-      <w:bookmarkEnd w:id="739"/>
+      <w:bookmarkStart w:id="740" w:name="section-16.1-1"/>
+      <w:bookmarkEnd w:id="740"/>
       <w:r>
         <w:rPr/>
         <w:t>RFC 2009 [</w:t>
@@ -40507,8 +40865,8 @@
         <w:rPr/>
       </w:pPr>
       <w:hyperlink w:anchor="section-16.1.1">
-        <w:bookmarkStart w:id="740" w:name="name-rfc-2009-technical-approach"/>
-        <w:bookmarkEnd w:id="740"/>
+        <w:bookmarkStart w:id="741" w:name="name-rfc-2009-technical-approach"/>
+        <w:bookmarkEnd w:id="741"/>
         <w:r>
           <w:rPr>
             <w:rStyle w:val="Hyperlink"/>
@@ -40537,8 +40895,8 @@
         <w:jc w:val="left"/>
         <w:rPr/>
       </w:pPr>
-      <w:bookmarkStart w:id="741" w:name="section-16.1.1-1"/>
-      <w:bookmarkEnd w:id="741"/>
+      <w:bookmarkStart w:id="742" w:name="section-16.1.1-1"/>
+      <w:bookmarkEnd w:id="742"/>
       <w:r>
         <w:rPr/>
         <w:t>RFC 2009 proposes extending IP routing to support geographic destination addressing using GPS coordinates. The core concept is the Geographic Service Area: each router is assigned a bounding polygon defined in GPS coordinates (latitude/longitude pairs) representing the geographic region it serves. A new protocol, IGPSMP (Internet GPS Management Protocol), allows routers to exchange service area descriptions using six message types: set-service-area, confirm-service-area, geographic-service-area-query, service-area-report, and related management primitives.</w:t>
@@ -40552,8 +40910,8 @@
         <w:jc w:val="left"/>
         <w:rPr/>
       </w:pPr>
-      <w:bookmarkStart w:id="742" w:name="section-16.1.1-2"/>
-      <w:bookmarkEnd w:id="742"/>
+      <w:bookmarkStart w:id="743" w:name="section-16.1.1-2"/>
+      <w:bookmarkEnd w:id="743"/>
       <w:r>
         <w:rPr/>
         <w:t xml:space="preserve">For indoor environments where GPS is unavailable, RFC 2009 proposes weak radio beacons that broadcast a GPS address, allowing mobile devices to adopt the beacon's address as their own. This is structurally analogous to the peer-assisted discovery mechanism defined in </w:t>
@@ -40579,8 +40937,8 @@
         <w:jc w:val="left"/>
         <w:rPr/>
       </w:pPr>
-      <w:bookmarkStart w:id="743" w:name="section-16.1.1-3"/>
-      <w:bookmarkEnd w:id="743"/>
+      <w:bookmarkStart w:id="744" w:name="section-16.1.1-3"/>
+      <w:bookmarkEnd w:id="744"/>
       <w:r>
         <w:rPr/>
         <w:t>RFC 2009 also proposes a DNS-based application-layer solution, adding a geographic first-level domain with hierarchical sub-domains for states, counties, and polygons of interest. Routing to a geographic address involves translating the destination polygon into a sequence of router hops based on IGPSMP service area tables.</w:t>
@@ -40606,8 +40964,8 @@
         <w:rPr/>
       </w:pPr>
       <w:hyperlink w:anchor="section-16.1.2">
-        <w:bookmarkStart w:id="744" w:name="name-gaps-addressed-by-rsdggs"/>
-        <w:bookmarkEnd w:id="744"/>
+        <w:bookmarkStart w:id="745" w:name="name-gaps-addressed-by-rsdggs"/>
+        <w:bookmarkEnd w:id="745"/>
         <w:r>
           <w:rPr>
             <w:rStyle w:val="Hyperlink"/>
@@ -40800,8 +41158,8 @@
         <w:jc w:val="left"/>
         <w:rPr/>
       </w:pPr>
-      <w:bookmarkStart w:id="745" w:name="section-16.1.2-2"/>
-      <w:bookmarkEnd w:id="745"/>
+      <w:bookmarkStart w:id="746" w:name="section-16.1.2-2"/>
+      <w:bookmarkEnd w:id="746"/>
       <w:r>
         <w:rPr/>
         <w:t>RFC 2009's polygon-based service areas require floating-point computation for containment tests and polygon intersection, making them unsuitable for the Cortex-M0 class devices that constitute the majority of 802.15.4 IoT deployments. The IGPSMP protocol requires routers to maintain geographic routing tables that grow with network size, whereas RSDGGS geographic addressing enables stateless forwarding decisions from address arithmetic alone.</w:t>
@@ -40815,8 +41173,8 @@
         <w:jc w:val="left"/>
         <w:rPr/>
       </w:pPr>
-      <w:bookmarkStart w:id="746" w:name="section-16.1.2-3"/>
-      <w:bookmarkEnd w:id="746"/>
+      <w:bookmarkStart w:id="747" w:name="section-16.1.2-3"/>
+      <w:bookmarkEnd w:id="747"/>
       <w:r>
         <w:rPr/>
         <w:t>RFC 2009 does not address regulatory spectrum management, band availability, or the use of geographic addressing to encode regulatory jurisdiction. RSDGGS is the first specification to treat these as primary design goals of a geographic addressing system.</w:t>
@@ -40842,8 +41200,8 @@
         <w:rPr/>
       </w:pPr>
       <w:hyperlink w:anchor="section-16.2">
-        <w:bookmarkStart w:id="747" w:name="name-rfc-5870-the-geo-uri-scheme"/>
-        <w:bookmarkEnd w:id="747"/>
+        <w:bookmarkStart w:id="748" w:name="name-rfc-5870-the-geo-uri-scheme"/>
+        <w:bookmarkEnd w:id="748"/>
         <w:r>
           <w:rPr>
             <w:rStyle w:val="Hyperlink"/>
@@ -40872,8 +41230,8 @@
         <w:jc w:val="left"/>
         <w:rPr/>
       </w:pPr>
-      <w:bookmarkStart w:id="748" w:name="section-16.2-1"/>
-      <w:bookmarkEnd w:id="748"/>
+      <w:bookmarkStart w:id="749" w:name="section-16.2-1"/>
+      <w:bookmarkEnd w:id="749"/>
       <w:r>
         <w:rPr/>
         <w:t>RFC 5870 [</w:t>
@@ -40911,8 +41269,8 @@
         <w:rPr/>
       </w:pPr>
       <w:hyperlink w:anchor="section-16.2.1">
-        <w:bookmarkStart w:id="749" w:name="name-rfc-5870-technical-approach"/>
-        <w:bookmarkEnd w:id="749"/>
+        <w:bookmarkStart w:id="750" w:name="name-rfc-5870-technical-approach"/>
+        <w:bookmarkEnd w:id="750"/>
         <w:r>
           <w:rPr>
             <w:rStyle w:val="Hyperlink"/>
@@ -40941,8 +41299,8 @@
         <w:jc w:val="left"/>
         <w:rPr/>
       </w:pPr>
-      <w:bookmarkStart w:id="750" w:name="section-16.2.1-1"/>
-      <w:bookmarkEnd w:id="750"/>
+      <w:bookmarkStart w:id="751" w:name="section-16.2.1-1"/>
+      <w:bookmarkEnd w:id="751"/>
       <w:r>
         <w:rPr/>
         <w:t>A 'geo' URI encodes a point location in WGS-84 (default) or an alternative CRS using the syntax geo:lat,lon[,alt][;crs=...][;u=uncertainty]. The coordinate values are decimal degrees (latitude and longitude) with optional altitude in meters. An optional uncertainty parameter u= specifies the radius of the location in meters. The number of decimal digits in the coordinate values MUST NOT be interpreted as an indication of accuracy; uncertainty is carried only in the explicit u= parameter.</w:t>
@@ -40956,8 +41314,8 @@
         <w:jc w:val="left"/>
         <w:rPr/>
       </w:pPr>
-      <w:bookmarkStart w:id="751" w:name="section-16.2.1-2"/>
-      <w:bookmarkEnd w:id="751"/>
+      <w:bookmarkStart w:id="752" w:name="section-16.2.1-2"/>
+      <w:bookmarkEnd w:id="752"/>
       <w:r>
         <w:rPr/>
         <w:t>The scheme is CRS-agnostic: while WGS-84 is the default, alternative coordinate reference systems may be specified using the crs= parameter. The scheme is protocol-independent and may appear in any context supporting arbitrary URIs.</w:t>
@@ -40983,8 +41341,8 @@
         <w:rPr/>
       </w:pPr>
       <w:hyperlink w:anchor="section-16.2.2">
-        <w:bookmarkStart w:id="752" w:name="name-gaps-addressed-by-rsdggs-2"/>
-        <w:bookmarkEnd w:id="752"/>
+        <w:bookmarkStart w:id="753" w:name="name-gaps-addressed-by-rsdggs-2"/>
+        <w:bookmarkEnd w:id="753"/>
         <w:r>
           <w:rPr>
             <w:rStyle w:val="Hyperlink"/>
@@ -41177,8 +41535,8 @@
         <w:jc w:val="left"/>
         <w:rPr/>
       </w:pPr>
-      <w:bookmarkStart w:id="753" w:name="section-16.2.2-2"/>
-      <w:bookmarkEnd w:id="753"/>
+      <w:bookmarkStart w:id="754" w:name="section-16.2.2-2"/>
+      <w:bookmarkEnd w:id="754"/>
       <w:r>
         <w:rPr/>
         <w:t>RFC 5870 explicitly states that the number of decimal digits in coordinate values MUST NOT be interpreted as an indication of accuracy. RSDGGS takes the opposite position: the number of bytes in the index IS the precision indicator, by design. This makes the RSDGGS encoding self-describing in a way that 'geo' URIs are not.</w:t>
@@ -41192,8 +41550,8 @@
         <w:jc w:val="left"/>
         <w:rPr/>
       </w:pPr>
-      <w:bookmarkStart w:id="754" w:name="section-16.2.2-3"/>
-      <w:bookmarkEnd w:id="754"/>
+      <w:bookmarkStart w:id="755" w:name="section-16.2.2-3"/>
+      <w:bookmarkEnd w:id="755"/>
       <w:r>
         <w:rPr/>
         <w:t>The 'geo' URI text encoding (typically 20-30 bytes for a full coordinate) is impractical for 802.15.4 MAC frames and CBOR-encoded IoT messages where wire efficiency is critical. The RSDGGS 1-8 byte binary encoding is 4-30 times more compact for equivalent precision.</w:t>
@@ -41207,8 +41565,8 @@
         <w:jc w:val="left"/>
         <w:rPr/>
       </w:pPr>
-      <w:bookmarkStart w:id="755" w:name="section-16.2.2-4"/>
-      <w:bookmarkEnd w:id="755"/>
+      <w:bookmarkStart w:id="756" w:name="section-16.2.2-4"/>
+      <w:bookmarkEnd w:id="756"/>
       <w:r>
         <w:rPr/>
         <w:t>RSDGGS MAY expose a 'geo' URI mapping for interoperability: an RSDGGS cell center can be expressed as a 'geo' URI with the u= parameter set to the cell radius. This mapping is lossy (the 'geo' URI does not encode the cell boundary shape) but suitable for human-readable display and web interoperability contexts. Implementations SHOULD provide this mapping for diagnostic and display purposes.</w:t>
@@ -41234,8 +41592,8 @@
         <w:rPr/>
       </w:pPr>
       <w:hyperlink w:anchor="section-16.3">
-        <w:bookmarkStart w:id="756" w:name="name-rfc-6442-location-conveyanc"/>
-        <w:bookmarkEnd w:id="756"/>
+        <w:bookmarkStart w:id="757" w:name="name-rfc-6442-location-conveyanc"/>
+        <w:bookmarkEnd w:id="757"/>
         <w:r>
           <w:rPr>
             <w:rStyle w:val="Hyperlink"/>
@@ -41264,8 +41622,8 @@
         <w:jc w:val="left"/>
         <w:rPr/>
       </w:pPr>
-      <w:bookmarkStart w:id="757" w:name="section-16.3-1"/>
-      <w:bookmarkEnd w:id="757"/>
+      <w:bookmarkStart w:id="758" w:name="section-16.3-1"/>
+      <w:bookmarkEnd w:id="758"/>
       <w:r>
         <w:rPr/>
         <w:t>RFC 6442 [</w:t>
@@ -41303,8 +41661,8 @@
         <w:rPr/>
       </w:pPr>
       <w:hyperlink w:anchor="section-16.3.1">
-        <w:bookmarkStart w:id="758" w:name="name-rfc-6442-technical-approach"/>
-        <w:bookmarkEnd w:id="758"/>
+        <w:bookmarkStart w:id="759" w:name="name-rfc-6442-technical-approach"/>
+        <w:bookmarkEnd w:id="759"/>
         <w:r>
           <w:rPr>
             <w:rStyle w:val="Hyperlink"/>
@@ -41333,8 +41691,8 @@
         <w:jc w:val="left"/>
         <w:rPr/>
       </w:pPr>
-      <w:bookmarkStart w:id="759" w:name="section-16.3.1-1"/>
-      <w:bookmarkEnd w:id="759"/>
+      <w:bookmarkStart w:id="760" w:name="section-16.3.1-1"/>
+      <w:bookmarkEnd w:id="760"/>
       <w:r>
         <w:rPr/>
         <w:t>RFC 6442 introduces a Geolocation SIP header field that carries either a location-by-value (a PIDF-LO object embedded in the SIP message body) or a location-by-reference (a URI from which a PIDF-LO can be retrieved, typically via HTTP or SIP SUBSCRIBE/NOTIFY). A new 424 (Bad Location Information) SIP response code is defined for cases where the location cannot be processed by the recipient.</w:t>
@@ -41348,8 +41706,8 @@
         <w:jc w:val="left"/>
         <w:rPr/>
       </w:pPr>
-      <w:bookmarkStart w:id="760" w:name="section-16.3.1-2"/>
-      <w:bookmarkEnd w:id="760"/>
+      <w:bookmarkStart w:id="761" w:name="section-16.3.1-2"/>
+      <w:bookmarkEnd w:id="761"/>
       <w:r>
         <w:rPr/>
         <w:t>PIDF-LO is an XML format carrying WGS-84 coordinates (point, circle, ellipse, polygon, or civic address). It includes uncertainty representation, confidence levels, and method-of-determination metadata (GPS, manual, cell-tower, etc.). SIP intermediaries are prohibited from modifying or deleting location data in transit. User consent is required before a UAC may include location in a SIP request.</w:t>
@@ -41375,8 +41733,8 @@
         <w:rPr/>
       </w:pPr>
       <w:hyperlink w:anchor="section-16.3.2">
-        <w:bookmarkStart w:id="761" w:name="name-gaps-addressed-by-rsdggs-3"/>
-        <w:bookmarkEnd w:id="761"/>
+        <w:bookmarkStart w:id="762" w:name="name-gaps-addressed-by-rsdggs-3"/>
+        <w:bookmarkEnd w:id="762"/>
         <w:r>
           <w:rPr>
             <w:rStyle w:val="Hyperlink"/>
@@ -41569,8 +41927,8 @@
         <w:jc w:val="left"/>
         <w:rPr/>
       </w:pPr>
-      <w:bookmarkStart w:id="762" w:name="section-16.3.2-2"/>
-      <w:bookmarkEnd w:id="762"/>
+      <w:bookmarkStart w:id="763" w:name="section-16.3.2-2"/>
+      <w:bookmarkEnd w:id="763"/>
       <w:r>
         <w:rPr/>
         <w:t>RFC 6442's PIDF-LO XML representation is orders of magnitude larger than RSDGGS and requires XML parsing infrastructure wholly impractical on constrained IoT devices. The consent model defined in RFC 6442, requiring user authorization before location disclosure, addresses a real privacy concern. RSDGGS addresses the same concern through the truncation model: devices share only the resolution necessary for the purpose, with no infrastructure required to enforce the policy.</w:t>
@@ -41584,8 +41942,8 @@
         <w:jc w:val="left"/>
         <w:rPr/>
       </w:pPr>
-      <w:bookmarkStart w:id="763" w:name="section-16.3.2-3"/>
-      <w:bookmarkEnd w:id="763"/>
+      <w:bookmarkStart w:id="764" w:name="section-16.3.2-3"/>
+      <w:bookmarkEnd w:id="764"/>
       <w:r>
         <w:rPr/>
         <w:t>RFC 6442's Geolocation-Routing header enables SIP routing based on location. This is a routing hint at the application layer, not an address-arithmetic property of the network address itself. RSDGGS geographic IPv6 addressing (</w:t>
@@ -41611,8 +41969,8 @@
         <w:jc w:val="left"/>
         <w:rPr/>
       </w:pPr>
-      <w:bookmarkStart w:id="764" w:name="section-16.3.2-4"/>
-      <w:bookmarkEnd w:id="764"/>
+      <w:bookmarkStart w:id="765" w:name="section-16.3.2-4"/>
+      <w:bookmarkEnd w:id="765"/>
       <w:r>
         <w:rPr/>
         <w:t>The two specifications are complementary: a SIP-capable IoT gateway MAY translate an RSDGGS cell to a PIDF-LO for interfaces toward SIP-based emergency services infrastructure, and vice versa. The translation is defined by the cell-center-to-lat/lon mapping with uncertainty equal to the cell radius.</w:t>
@@ -41638,8 +41996,8 @@
         <w:rPr/>
       </w:pPr>
       <w:hyperlink w:anchor="section-16.4">
-        <w:bookmarkStart w:id="765" w:name="name-rfc-9179-a-yang-grouping-fo"/>
-        <w:bookmarkEnd w:id="765"/>
+        <w:bookmarkStart w:id="766" w:name="name-rfc-9179-a-yang-grouping-fo"/>
+        <w:bookmarkEnd w:id="766"/>
         <w:r>
           <w:rPr>
             <w:rStyle w:val="Hyperlink"/>
@@ -41668,8 +42026,8 @@
         <w:jc w:val="left"/>
         <w:rPr/>
       </w:pPr>
-      <w:bookmarkStart w:id="766" w:name="section-16.4-1"/>
-      <w:bookmarkEnd w:id="766"/>
+      <w:bookmarkStart w:id="767" w:name="section-16.4-1"/>
+      <w:bookmarkEnd w:id="767"/>
       <w:r>
         <w:rPr/>
         <w:t>RFC 9179 [</w:t>
@@ -41707,8 +42065,8 @@
         <w:rPr/>
       </w:pPr>
       <w:hyperlink w:anchor="section-16.4.1">
-        <w:bookmarkStart w:id="767" w:name="name-rfc-9179-technical-approach"/>
-        <w:bookmarkEnd w:id="767"/>
+        <w:bookmarkStart w:id="768" w:name="name-rfc-9179-technical-approach"/>
+        <w:bookmarkEnd w:id="768"/>
         <w:r>
           <w:rPr>
             <w:rStyle w:val="Hyperlink"/>
@@ -41737,8 +42095,8 @@
         <w:jc w:val="left"/>
         <w:rPr/>
       </w:pPr>
-      <w:bookmarkStart w:id="768" w:name="section-16.4.1-1"/>
-      <w:bookmarkEnd w:id="768"/>
+      <w:bookmarkStart w:id="769" w:name="section-16.4.1-1"/>
+      <w:bookmarkEnd w:id="769"/>
       <w:r>
         <w:rPr/>
         <w:t>The geo-location YANG grouping includes: a reference-frame specifying the astronomical body and geodetic datum (defaulting to WGS-84 Earth); a location choice between ellipsoidal coordinates (latitude as decimal64 with 16 fraction-digits, longitude as decimal64 with 16 fraction-digits, optional height in meters) or Cartesian coordinates (x, y, z in meters); a velocity vector (v-north, v-east, v-up in meters per second with 12 fraction-digits); and timestamp and valid-until fields. Coordinate accuracy is carried as a separate decimal64 field in meters.</w:t>
@@ -41752,8 +42110,8 @@
         <w:jc w:val="left"/>
         <w:rPr/>
       </w:pPr>
-      <w:bookmarkStart w:id="769" w:name="section-16.4.1-2"/>
-      <w:bookmarkEnd w:id="769"/>
+      <w:bookmarkStart w:id="770" w:name="section-16.4.1-2"/>
+      <w:bookmarkEnd w:id="770"/>
       <w:r>
         <w:rPr/>
         <w:t>The design is notable for its explicit support for non-Earth astronomical bodies (Mars, the Moon, etc.) through the reference-frame mechanism, and for velocity as a first-class field. It is intended as a reusable module embedded in other YANG models, not as a standalone protocol.</w:t>
@@ -41779,8 +42137,8 @@
         <w:rPr/>
       </w:pPr>
       <w:hyperlink w:anchor="section-16.4.2">
-        <w:bookmarkStart w:id="770" w:name="name-gaps-addressed-by-rsdggs-4"/>
-        <w:bookmarkEnd w:id="770"/>
+        <w:bookmarkStart w:id="771" w:name="name-gaps-addressed-by-rsdggs-4"/>
+        <w:bookmarkEnd w:id="771"/>
         <w:r>
           <w:rPr>
             <w:rStyle w:val="Hyperlink"/>
@@ -41973,8 +42331,8 @@
         <w:jc w:val="left"/>
         <w:rPr/>
       </w:pPr>
-      <w:bookmarkStart w:id="771" w:name="section-16.4.2-2"/>
-      <w:bookmarkEnd w:id="771"/>
+      <w:bookmarkStart w:id="772" w:name="section-16.4.2-2"/>
+      <w:bookmarkEnd w:id="772"/>
       <w:r>
         <w:rPr/>
         <w:t>RFC 9179's decimal64 latitude and longitude fields (16 fraction-digits) provide sub-nanometer theoretical precision, far exceeding GPS capability. RSDGGS at 8 bytes provides 6 cm precision, which matches or exceeds operational GPS accuracy for IoT applications. The YANG encoding overhead (XML or JSON field names plus decimal values) is typically 60-100 bytes per location fix versus 1-8 bytes for RSDGGS.</w:t>
@@ -41988,8 +42346,8 @@
         <w:jc w:val="left"/>
         <w:rPr/>
       </w:pPr>
-      <w:bookmarkStart w:id="772" w:name="section-16.4.2-3"/>
-      <w:bookmarkEnd w:id="772"/>
+      <w:bookmarkStart w:id="773" w:name="section-16.4.2-3"/>
+      <w:bookmarkEnd w:id="773"/>
       <w:r>
         <w:rPr/>
         <w:t>RFC 9179 does not define a hierarchical structure for location data and provides no support for location-based routing. The RSDGGS cell index has no analog in the RFC 9179 model. An RSDGGS extension to the RFC 9179 grouping is a potential future work item, adding an optional rsdggs-cell leaf of type binary with length constraint 1..8 to the geo-location grouping, enabling network elements to carry RSDGGS regulatory context alongside their WGS-84 coordinates in YANG data models.</w:t>
@@ -42015,8 +42373,8 @@
         <w:rPr/>
       </w:pPr>
       <w:hyperlink w:anchor="section-16.5">
-        <w:bookmarkStart w:id="773" w:name="name-rfc-9632-finding-and-using-"/>
-        <w:bookmarkEnd w:id="773"/>
+        <w:bookmarkStart w:id="774" w:name="name-rfc-9632-finding-and-using-"/>
+        <w:bookmarkEnd w:id="774"/>
         <w:r>
           <w:rPr>
             <w:rStyle w:val="Hyperlink"/>
@@ -42045,8 +42403,8 @@
         <w:jc w:val="left"/>
         <w:rPr/>
       </w:pPr>
-      <w:bookmarkStart w:id="774" w:name="section-16.5-1"/>
-      <w:bookmarkEnd w:id="774"/>
+      <w:bookmarkStart w:id="775" w:name="section-16.5-1"/>
+      <w:bookmarkEnd w:id="775"/>
       <w:r>
         <w:rPr/>
         <w:t>RFC 9632 [</w:t>
@@ -42084,8 +42442,8 @@
         <w:rPr/>
       </w:pPr>
       <w:hyperlink w:anchor="section-16.5.1">
-        <w:bookmarkStart w:id="775" w:name="name-rfc-9632-technical-approach"/>
-        <w:bookmarkEnd w:id="775"/>
+        <w:bookmarkStart w:id="776" w:name="name-rfc-9632-technical-approach"/>
+        <w:bookmarkEnd w:id="776"/>
         <w:r>
           <w:rPr>
             <w:rStyle w:val="Hyperlink"/>
@@ -42114,8 +42472,8 @@
         <w:jc w:val="left"/>
         <w:rPr/>
       </w:pPr>
-      <w:bookmarkStart w:id="776" w:name="section-16.5.1-1"/>
-      <w:bookmarkEnd w:id="776"/>
+      <w:bookmarkStart w:id="777" w:name="section-16.5.1-1"/>
+      <w:bookmarkEnd w:id="777"/>
       <w:r>
         <w:rPr/>
         <w:t>A geofeed file is a CSV document published at a stable HTTPS URL, containing rows of the form: IP-prefix, country-code, region-code, city-name, postal-code (deprecated). The file maps IP address prefixes to political-administrative geographic designators (ISO 3166-1 country codes, ISO 3166-2 region codes). Discovery is via a geofeed: attribute in the RPSL inetnum: object for the relevant address range. Authentication uses RPKI Resource Certificates with CMS signatures; a new EE certificate is generated for each file version.</w:t>
@@ -42129,8 +42487,8 @@
         <w:jc w:val="left"/>
         <w:rPr/>
       </w:pPr>
-      <w:bookmarkStart w:id="777" w:name="section-16.5.1-2"/>
-      <w:bookmarkEnd w:id="777"/>
+      <w:bookmarkStart w:id="778" w:name="section-16.5.1-2"/>
+      <w:bookmarkEnd w:id="778"/>
       <w:r>
         <w:rPr/>
         <w:t>Geofeed granularity is at the IP prefix level: a /24 prefix may be mapped to a city, a /16 to a country. The most specific inetnum: object with a geofeed reference governs, and geofeed data may have finer granularity than the inetnum: block itself. The format intentionally omits precise coordinate data: the mapping is to political-administrative units, not WGS-84 coordinates.</w:t>
@@ -42156,8 +42514,8 @@
         <w:rPr/>
       </w:pPr>
       <w:hyperlink w:anchor="section-16.5.2">
-        <w:bookmarkStart w:id="778" w:name="name-gaps-addressed-by-rsdggs-5"/>
-        <w:bookmarkEnd w:id="778"/>
+        <w:bookmarkStart w:id="779" w:name="name-gaps-addressed-by-rsdggs-5"/>
+        <w:bookmarkEnd w:id="779"/>
         <w:r>
           <w:rPr>
             <w:rStyle w:val="Hyperlink"/>
@@ -42350,8 +42708,8 @@
         <w:jc w:val="left"/>
         <w:rPr/>
       </w:pPr>
-      <w:bookmarkStart w:id="779" w:name="section-16.5.2-2"/>
-      <w:bookmarkEnd w:id="779"/>
+      <w:bookmarkStart w:id="780" w:name="section-16.5.2-2"/>
+      <w:bookmarkEnd w:id="780"/>
       <w:r>
         <w:rPr/>
         <w:t>RFC 9632 and RSDGGS address fundamentally different layers of the same problem. RFC 9632 maps IP address blocks -- which are administratively assigned and may not correspond to the physical location of the device using them -- to geographic designators, for the purpose of correcting commercial geolocation database errors. RSDGGS encodes the physical location of an IoT device directly in a binary index that travels with every message the device sends, for the purpose of regulatory compliance determination at the MAC layer.</w:t>
@@ -42365,8 +42723,8 @@
         <w:jc w:val="left"/>
         <w:rPr/>
       </w:pPr>
-      <w:bookmarkStart w:id="780" w:name="section-16.5.2-3"/>
-      <w:bookmarkEnd w:id="780"/>
+      <w:bookmarkStart w:id="781" w:name="section-16.5.2-3"/>
+      <w:bookmarkEnd w:id="781"/>
       <w:r>
         <w:rPr/>
         <w:t>A meaningful integration point exists: RSDGGS-IPv6 geographic addresses (</w:t>
@@ -42404,8 +42762,8 @@
         <w:rPr/>
       </w:pPr>
       <w:hyperlink w:anchor="section-16.6">
-        <w:bookmarkStart w:id="781" w:name="name-rfc-8805-a-format-for-self-"/>
-        <w:bookmarkEnd w:id="781"/>
+        <w:bookmarkStart w:id="782" w:name="name-rfc-8805-a-format-for-self-"/>
+        <w:bookmarkEnd w:id="782"/>
         <w:r>
           <w:rPr>
             <w:rStyle w:val="Hyperlink"/>
@@ -42434,8 +42792,8 @@
         <w:jc w:val="left"/>
         <w:rPr/>
       </w:pPr>
-      <w:bookmarkStart w:id="782" w:name="section-16.6-1"/>
-      <w:bookmarkEnd w:id="782"/>
+      <w:bookmarkStart w:id="783" w:name="section-16.6-1"/>
+      <w:bookmarkEnd w:id="783"/>
       <w:r>
         <w:rPr/>
         <w:t>RFC 8805 [</w:t>
@@ -42473,8 +42831,8 @@
         <w:rPr/>
       </w:pPr>
       <w:hyperlink w:anchor="section-16.6.1">
-        <w:bookmarkStart w:id="783" w:name="name-rfc-8805-technical-approach"/>
-        <w:bookmarkEnd w:id="783"/>
+        <w:bookmarkStart w:id="784" w:name="name-rfc-8805-technical-approach"/>
+        <w:bookmarkEnd w:id="784"/>
         <w:r>
           <w:rPr>
             <w:rStyle w:val="Hyperlink"/>
@@ -42503,8 +42861,8 @@
         <w:jc w:val="left"/>
         <w:rPr/>
       </w:pPr>
-      <w:bookmarkStart w:id="784" w:name="section-16.6.1-1"/>
-      <w:bookmarkEnd w:id="784"/>
+      <w:bookmarkStart w:id="785" w:name="section-16.6.1-1"/>
+      <w:bookmarkEnd w:id="785"/>
       <w:r>
         <w:rPr/>
         <w:t>A geofeed file is a UTF-8 CSV text file published at a stable HTTPS URL. Each non-comment line has the form: ip_prefix, alpha2code, region, city, postal_code. The IP prefix field is required; all others are optional. The format intentionally only allows coarse-level location -- political-administrative designators (ISO 3166-1 country code, ISO 3166-2 region code, city name) rather than precise coordinates. Postal code is included for backward compatibility but its use is deprecated. The file is self-published by the IP address holder and consumed by geolocation data pipeline operators on a polling schedule.</w:t>
@@ -42518,8 +42876,8 @@
         <w:jc w:val="left"/>
         <w:rPr/>
       </w:pPr>
-      <w:bookmarkStart w:id="785" w:name="section-16.6.1-2"/>
-      <w:bookmarkEnd w:id="785"/>
+      <w:bookmarkStart w:id="786" w:name="section-16.6.1-2"/>
+      <w:bookmarkEnd w:id="786"/>
       <w:r>
         <w:rPr/>
         <w:t>RFC 8805 is the predecessor to RFC 9632 and directly defines the data format that RFC 9632 provides discovery mechanisms for. The two documents form a coupled pair: RFC 8805 is the format specification; RFC 9632 is the discovery and authentication specification.</w:t>
@@ -42545,8 +42903,8 @@
         <w:rPr/>
       </w:pPr>
       <w:hyperlink w:anchor="section-16.6.2">
-        <w:bookmarkStart w:id="786" w:name="name-gaps-addressed-by-rsdggs-6"/>
-        <w:bookmarkEnd w:id="786"/>
+        <w:bookmarkStart w:id="787" w:name="name-gaps-addressed-by-rsdggs-6"/>
+        <w:bookmarkEnd w:id="787"/>
         <w:r>
           <w:rPr>
             <w:rStyle w:val="Hyperlink"/>
@@ -42727,8 +43085,8 @@
         <w:jc w:val="left"/>
         <w:rPr/>
       </w:pPr>
-      <w:bookmarkStart w:id="787" w:name="section-16.6.2-2"/>
-      <w:bookmarkEnd w:id="787"/>
+      <w:bookmarkStart w:id="788" w:name="section-16.6.2-2"/>
+      <w:bookmarkEnd w:id="788"/>
       <w:r>
         <w:rPr/>
         <w:t xml:space="preserve">RFC 8805 and RSDGGS share the property of being self-published: an IP address holder publishes a geofeed file asserting the location of their prefix, and an IoT device encodes its RSDGGS cell asserting its own location. The trust models differ significantly: geofeed authenticity in RFC 8805 relies on RPKI (via RFC 9632) binding the file to the address holder's certificate; RSDGGS cell authenticity in peer-assisted scenarios relies on the MAC-layer STS authentication defined in </w:t>
@@ -42766,8 +43124,8 @@
         <w:jc w:val="left"/>
         <w:rPr/>
       </w:pPr>
-      <w:bookmarkStart w:id="788" w:name="section-16.6.2-3"/>
-      <w:bookmarkEnd w:id="788"/>
+      <w:bookmarkStart w:id="789" w:name="section-16.6.2-3"/>
+      <w:bookmarkEnd w:id="789"/>
       <w:r>
         <w:rPr/>
         <w:t xml:space="preserve">As noted in </w:t>
@@ -42805,8 +43163,8 @@
         <w:rPr/>
       </w:pPr>
       <w:hyperlink w:anchor="section-16.7">
-        <w:bookmarkStart w:id="789" w:name="name-rfc-5808-requirements-for-a"/>
-        <w:bookmarkEnd w:id="789"/>
+        <w:bookmarkStart w:id="790" w:name="name-rfc-5808-requirements-for-a"/>
+        <w:bookmarkEnd w:id="790"/>
         <w:r>
           <w:rPr>
             <w:rStyle w:val="Hyperlink"/>
@@ -42835,8 +43193,8 @@
         <w:jc w:val="left"/>
         <w:rPr/>
       </w:pPr>
-      <w:bookmarkStart w:id="790" w:name="section-16.7-1"/>
-      <w:bookmarkEnd w:id="790"/>
+      <w:bookmarkStart w:id="791" w:name="section-16.7-1"/>
+      <w:bookmarkEnd w:id="791"/>
       <w:r>
         <w:rPr/>
         <w:t>RFC 5808 [</w:t>
@@ -42874,8 +43232,8 @@
         <w:rPr/>
       </w:pPr>
       <w:hyperlink w:anchor="section-16.7.1">
-        <w:bookmarkStart w:id="791" w:name="name-rfc-5808-technical-approach"/>
-        <w:bookmarkEnd w:id="791"/>
+        <w:bookmarkStart w:id="792" w:name="name-rfc-5808-technical-approach"/>
+        <w:bookmarkEnd w:id="792"/>
         <w:r>
           <w:rPr>
             <w:rStyle w:val="Hyperlink"/>
@@ -42904,8 +43262,8 @@
         <w:jc w:val="left"/>
         <w:rPr/>
       </w:pPr>
-      <w:bookmarkStart w:id="792" w:name="section-16.7.1-1"/>
-      <w:bookmarkEnd w:id="792"/>
+      <w:bookmarkStart w:id="793" w:name="section-16.7.1-1"/>
+      <w:bookmarkEnd w:id="793"/>
       <w:r>
         <w:rPr/>
         <w:t>RFC 5808 defines the LbyR lifecycle as comprising four stages: Location URI Creation (at a Location Information Server, LIS); Location URI Distribution (via a Location Configuration Protocol, LCP, from LIS to Target); Location URI Conveyance (from Target to Location Recipient via a signaling protocol such as SIP); and Location URI Dereferencing (Location Recipient resolves the URI to obtain a PIDF-LO). The dereference protocol must support URI-form location references, must authenticate both client and server, and must return a well-formed PIDF-LO document.</w:t>
@@ -42919,8 +43277,8 @@
         <w:jc w:val="left"/>
         <w:rPr/>
       </w:pPr>
-      <w:bookmarkStart w:id="793" w:name="section-16.7.1-2"/>
-      <w:bookmarkEnd w:id="793"/>
+      <w:bookmarkStart w:id="794" w:name="section-16.7.1-2"/>
+      <w:bookmarkEnd w:id="794"/>
       <w:r>
         <w:rPr/>
         <w:t>The motivation for LbyR is that in mobile networks it is not efficient for an end host to periodically query a LIS for up-to-date location. Instead, the LIS holds the current location and the Target carries only a URI reference, which can be dereferenced by authorized recipients to obtain the current location at the time of dereference.</w:t>
@@ -42946,8 +43304,8 @@
         <w:rPr/>
       </w:pPr>
       <w:hyperlink w:anchor="section-16.7.2">
-        <w:bookmarkStart w:id="794" w:name="name-gaps-addressed-by-rsdggs-7"/>
-        <w:bookmarkEnd w:id="794"/>
+        <w:bookmarkStart w:id="795" w:name="name-gaps-addressed-by-rsdggs-7"/>
+        <w:bookmarkEnd w:id="795"/>
         <w:r>
           <w:rPr>
             <w:rStyle w:val="Hyperlink"/>
@@ -43128,8 +43486,8 @@
         <w:jc w:val="left"/>
         <w:rPr/>
       </w:pPr>
-      <w:bookmarkStart w:id="795" w:name="section-16.7.2-2"/>
-      <w:bookmarkEnd w:id="795"/>
+      <w:bookmarkStart w:id="796" w:name="section-16.7.2-2"/>
+      <w:bookmarkEnd w:id="796"/>
       <w:r>
         <w:rPr/>
         <w:t>The LbyR architecture requires persistent network connectivity to a Location Information Server for location dereferencing. This is fundamentally incompatible with the operational model of 802.15.4 IoT devices, which may operate in disconnected or intermittently connected environments, cannot carry TCP/TLS stacks required for HTTPS dereferencing, and must determine regulatory context before establishing any network connection at all.</w:t>
@@ -43143,8 +43501,8 @@
         <w:jc w:val="left"/>
         <w:rPr/>
       </w:pPr>
-      <w:bookmarkStart w:id="796" w:name="section-16.7.2-3"/>
-      <w:bookmarkEnd w:id="796"/>
+      <w:bookmarkStart w:id="797" w:name="section-16.7.2-3"/>
+      <w:bookmarkEnd w:id="797"/>
       <w:r>
         <w:rPr/>
         <w:t>RSDGGS takes the Location-by-Value position for IoT: the location index is carried directly in the MAC frame or IPv6 address. The RSDGGS cooperative localization mechanism (</w:t>
@@ -43182,8 +43540,8 @@
         <w:rPr/>
       </w:pPr>
       <w:hyperlink w:anchor="section-16.8">
-        <w:bookmarkStart w:id="797" w:name="name-rfc-5491-geopriv-pidf-lo-us"/>
-        <w:bookmarkEnd w:id="797"/>
+        <w:bookmarkStart w:id="798" w:name="name-rfc-5491-geopriv-pidf-lo-us"/>
+        <w:bookmarkEnd w:id="798"/>
         <w:r>
           <w:rPr>
             <w:rStyle w:val="Hyperlink"/>
@@ -43212,8 +43570,8 @@
         <w:jc w:val="left"/>
         <w:rPr/>
       </w:pPr>
-      <w:bookmarkStart w:id="798" w:name="section-16.8-1"/>
-      <w:bookmarkEnd w:id="798"/>
+      <w:bookmarkStart w:id="799" w:name="section-16.8-1"/>
+      <w:bookmarkEnd w:id="799"/>
       <w:r>
         <w:rPr/>
         <w:t>RFC 5491 [</w:t>
@@ -43251,8 +43609,8 @@
         <w:rPr/>
       </w:pPr>
       <w:hyperlink w:anchor="section-16.8.1">
-        <w:bookmarkStart w:id="799" w:name="name-rfc-5491-technical-approach"/>
-        <w:bookmarkEnd w:id="799"/>
+        <w:bookmarkStart w:id="800" w:name="name-rfc-5491-technical-approach"/>
+        <w:bookmarkEnd w:id="800"/>
         <w:r>
           <w:rPr>
             <w:rStyle w:val="Hyperlink"/>
@@ -43281,8 +43639,8 @@
         <w:jc w:val="left"/>
         <w:rPr/>
       </w:pPr>
-      <w:bookmarkStart w:id="800" w:name="section-16.8.1-1"/>
-      <w:bookmarkEnd w:id="800"/>
+      <w:bookmarkStart w:id="801" w:name="section-16.8.1-1"/>
+      <w:bookmarkEnd w:id="801"/>
       <w:r>
         <w:rPr/>
         <w:t>RFC 5491 defines seven rules for constructing PIDF-LO documents. The key rules relevant to RSDGGS comparison are: Rule 4 specifies that providing more than one location chunk in a single location-info element should be avoided; Rules 5 and 6 govern when compound location is permitted, requiring that multiple chunks come from the same source at the same time by the same determination method; Rule 7 requires that coarse location be provided before fine location in compound representations.</w:t>
@@ -43296,8 +43654,8 @@
         <w:jc w:val="left"/>
         <w:rPr/>
       </w:pPr>
-      <w:bookmarkStart w:id="801" w:name="section-16.8.1-2"/>
-      <w:bookmarkEnd w:id="801"/>
+      <w:bookmarkStart w:id="802" w:name="section-16.8.1-2"/>
+      <w:bookmarkEnd w:id="802"/>
       <w:r>
         <w:rPr/>
         <w:t>RFC 5491 defines two location representation types within PIDF-LO: geodetic location (WGS-84 coordinates, GML geometry shapes including Point, Circle, Ellipse, ArcBand, Polygon) and civic location (structured address: country, administrative regions A1-A6, street, floor, room). The GML subset defined for geodetic location requires mandatory implementation for location-based routing applications.</w:t>
@@ -43323,8 +43681,8 @@
         <w:rPr/>
       </w:pPr>
       <w:hyperlink w:anchor="section-16.8.2">
-        <w:bookmarkStart w:id="802" w:name="name-gaps-addressed-by-rsdggs-8"/>
-        <w:bookmarkEnd w:id="802"/>
+        <w:bookmarkStart w:id="803" w:name="name-gaps-addressed-by-rsdggs-8"/>
+        <w:bookmarkEnd w:id="803"/>
         <w:r>
           <w:rPr>
             <w:rStyle w:val="Hyperlink"/>
@@ -43517,8 +43875,8 @@
         <w:jc w:val="left"/>
         <w:rPr/>
       </w:pPr>
-      <w:bookmarkStart w:id="803" w:name="section-16.8.2-2"/>
-      <w:bookmarkEnd w:id="803"/>
+      <w:bookmarkStart w:id="804" w:name="section-16.8.2-2"/>
+      <w:bookmarkEnd w:id="804"/>
       <w:r>
         <w:rPr/>
         <w:t>RFC 5491's Rule 7 -- coarse location MUST precede fine location in compound PIDF-LO -- is structurally expressed in RSDGGS by the bit layout itself: Byte 0 (coarsest) precedes Byte 7 (finest), and truncation from the right always yields the coarser representation. RSDGGS embodies Rule 7 as an invariant property of the encoding rather than an application-layer behavioral requirement.</w:t>
@@ -43532,8 +43890,8 @@
         <w:jc w:val="left"/>
         <w:rPr/>
       </w:pPr>
-      <w:bookmarkStart w:id="804" w:name="section-16.8.2-3"/>
-      <w:bookmarkEnd w:id="804"/>
+      <w:bookmarkStart w:id="805" w:name="section-16.8.2-3"/>
+      <w:bookmarkEnd w:id="805"/>
       <w:r>
         <w:rPr/>
         <w:t>RFC 5491 supports civic location (floor number, room identifier) as a compound element alongside geodetic coordinates. RSDGGS does not encode civic location. For indoor deployments requiring floor-level regulatory distinction (which is uncommon for ISM band rules but relevant for UWB power limits in some jurisdictions), a civic layer MAY be carried as a separate CBOR field alongside the RSDGGS cell, using the PIDF-LO civic format or a simplified representation.</w:t>
@@ -43559,8 +43917,8 @@
         <w:rPr/>
       </w:pPr>
       <w:hyperlink w:anchor="section-16.9">
-        <w:bookmarkStart w:id="805" w:name="name-rfc-6280-an-architecture-fo"/>
-        <w:bookmarkEnd w:id="805"/>
+        <w:bookmarkStart w:id="806" w:name="name-rfc-6280-an-architecture-fo"/>
+        <w:bookmarkEnd w:id="806"/>
         <w:r>
           <w:rPr>
             <w:rStyle w:val="Hyperlink"/>
@@ -43589,8 +43947,8 @@
         <w:jc w:val="left"/>
         <w:rPr/>
       </w:pPr>
-      <w:bookmarkStart w:id="806" w:name="section-16.9-1"/>
-      <w:bookmarkEnd w:id="806"/>
+      <w:bookmarkStart w:id="807" w:name="section-16.9-1"/>
+      <w:bookmarkEnd w:id="807"/>
       <w:r>
         <w:rPr/>
         <w:t>RFC 6280 [</w:t>
@@ -43628,8 +43986,8 @@
         <w:rPr/>
       </w:pPr>
       <w:hyperlink w:anchor="section-16.9.1">
-        <w:bookmarkStart w:id="807" w:name="name-rfc-6280-technical-approach"/>
-        <w:bookmarkEnd w:id="807"/>
+        <w:bookmarkStart w:id="808" w:name="name-rfc-6280-technical-approach"/>
+        <w:bookmarkEnd w:id="808"/>
         <w:r>
           <w:rPr>
             <w:rStyle w:val="Hyperlink"/>
@@ -43658,8 +44016,8 @@
         <w:jc w:val="left"/>
         <w:rPr/>
       </w:pPr>
-      <w:bookmarkStart w:id="808" w:name="section-16.9.1-1"/>
-      <w:bookmarkEnd w:id="808"/>
+      <w:bookmarkStart w:id="809" w:name="section-16.9.1-1"/>
+      <w:bookmarkEnd w:id="809"/>
       <w:r>
         <w:rPr/>
         <w:t>The central component of the GEOPRIV architecture is the Location Object (LO), which binds location information to user-specified privacy rules. The architecture defines five roles: Location Generator (LG), which produces raw location measurements; Location Server (LS), which stores location objects and enforces privacy rules; Rule Maker (RM), which is the user or device owner who specifies privacy preferences; Target, the entity whose location is being described; and Location Recipient (LR), which consumes location information.</w:t>
@@ -43673,8 +44031,8 @@
         <w:jc w:val="left"/>
         <w:rPr/>
       </w:pPr>
-      <w:bookmarkStart w:id="809" w:name="section-16.9.1-2"/>
-      <w:bookmarkEnd w:id="809"/>
+      <w:bookmarkStart w:id="810" w:name="section-16.9.1-2"/>
+      <w:bookmarkEnd w:id="810"/>
       <w:r>
         <w:rPr/>
         <w:t>A central feature of the GEOPRIV architecture is that location information is always bound to privacy rules. These rules govern who may receive the location, how precisely, and under what conditions. The privacy protections rely on recipients honoring the rules they receive alongside the location data; RFC 6280 acknowledges that technical enforcement is inherently limited and relies on legal and contractual mechanisms for compliance assurance.</w:t>
@@ -43700,8 +44058,8 @@
         <w:rPr/>
       </w:pPr>
       <w:hyperlink w:anchor="section-16.9.2">
-        <w:bookmarkStart w:id="810" w:name="name-gaps-addressed-by-rsdggs-9"/>
-        <w:bookmarkEnd w:id="810"/>
+        <w:bookmarkStart w:id="811" w:name="name-gaps-addressed-by-rsdggs-9"/>
+        <w:bookmarkEnd w:id="811"/>
         <w:r>
           <w:rPr>
             <w:rStyle w:val="Hyperlink"/>
@@ -43894,8 +44252,8 @@
         <w:jc w:val="left"/>
         <w:rPr/>
       </w:pPr>
-      <w:bookmarkStart w:id="811" w:name="section-16.9.2-2"/>
-      <w:bookmarkEnd w:id="811"/>
+      <w:bookmarkStart w:id="812" w:name="section-16.9.2-2"/>
+      <w:bookmarkEnd w:id="812"/>
       <w:r>
         <w:rPr/>
         <w:t>The GEOPRIV architecture's privacy model requires that the Rule Maker express privacy preferences, that the Location Server enforce them, and that Location Recipients honor them. This three-party trust model requires persistent infrastructure that is unavailable to constrained IoT devices operating in disconnected environments.</w:t>
@@ -43909,8 +44267,8 @@
         <w:jc w:val="left"/>
         <w:rPr/>
       </w:pPr>
-      <w:bookmarkStart w:id="812" w:name="section-16.9.2-3"/>
-      <w:bookmarkEnd w:id="812"/>
+      <w:bookmarkStart w:id="813" w:name="section-16.9.2-3"/>
+      <w:bookmarkEnd w:id="813"/>
       <w:r>
         <w:rPr/>
         <w:t>RSDGGS replaces the GEOPRIV rule-based privacy model with structural privacy: a device that shares a 3-byte RSDGGS cell is physically incapable of disclosing more than country-level location, regardless of recipient behavior. No rules, servers, or trust relationships are required to enforce this property. The privacy level is determined by the sender's choice of index length, not by the recipient's compliance with transmitted rules.</w:t>
@@ -43924,8 +44282,8 @@
         <w:jc w:val="left"/>
         <w:rPr/>
       </w:pPr>
-      <w:bookmarkStart w:id="813" w:name="section-16.9.2-4"/>
-      <w:bookmarkEnd w:id="813"/>
+      <w:bookmarkStart w:id="814" w:name="section-16.9.2-4"/>
+      <w:bookmarkEnd w:id="814"/>
       <w:r>
         <w:rPr/>
         <w:t>This structural approach is both stronger (cannot be violated by a non-compliant recipient) and weaker (cannot express nuanced rules like 'share with spouse but not employer') than the GEOPRIV model. For ISM regulatory compliance, where the only required disclosure is 'am I in ITU Region 2?', the structural model is entirely sufficient. RSDGGS implementations that require nuanced privacy rules for non-regulatory purposes MAY layer a RFC 6772 geolocation policy document alongside the RSDGGS cell in application-layer CBOR messages.</w:t>
@@ -43951,8 +44309,8 @@
         <w:rPr/>
       </w:pPr>
       <w:hyperlink w:anchor="section-16.10">
-        <w:bookmarkStart w:id="814" w:name="name-rfc-6772-geolocation-policy"/>
-        <w:bookmarkEnd w:id="814"/>
+        <w:bookmarkStart w:id="815" w:name="name-rfc-6772-geolocation-policy"/>
+        <w:bookmarkEnd w:id="815"/>
         <w:r>
           <w:rPr>
             <w:rStyle w:val="Hyperlink"/>
@@ -43981,8 +44339,8 @@
         <w:jc w:val="left"/>
         <w:rPr/>
       </w:pPr>
-      <w:bookmarkStart w:id="815" w:name="section-16.10-1"/>
-      <w:bookmarkEnd w:id="815"/>
+      <w:bookmarkStart w:id="816" w:name="section-16.10-1"/>
+      <w:bookmarkEnd w:id="816"/>
       <w:r>
         <w:rPr/>
         <w:t>RFC 6772 [</w:t>
@@ -44020,8 +44378,8 @@
         <w:rPr/>
       </w:pPr>
       <w:hyperlink w:anchor="section-16.10.1">
-        <w:bookmarkStart w:id="816" w:name="name-rfc-6772-technical-approach"/>
-        <w:bookmarkEnd w:id="816"/>
+        <w:bookmarkStart w:id="817" w:name="name-rfc-6772-technical-approach"/>
+        <w:bookmarkEnd w:id="817"/>
         <w:r>
           <w:rPr>
             <w:rStyle w:val="Hyperlink"/>
@@ -44050,8 +44408,8 @@
         <w:jc w:val="left"/>
         <w:rPr/>
       </w:pPr>
-      <w:bookmarkStart w:id="817" w:name="section-16.10.1-1"/>
-      <w:bookmarkEnd w:id="817"/>
+      <w:bookmarkStart w:id="818" w:name="section-16.10.1-1"/>
+      <w:bookmarkEnd w:id="818"/>
       <w:r>
         <w:rPr/>
         <w:t>A geolocation authorization document is an XML document with MIME type application/auth-policy+xml, using the namespace urn:ietf:params:xml:ns:geolocation-policy. Documents are structured as sets of rules, each containing a condition, an action, and a transformation component. Conditions may include identity-based conditions (who is requesting) and location-based conditions (where the target is). Transformations specify how the location information should be modified before delivery -- for example, reducing precision by replacing a precise geodetic coordinate with a less precise one, or replacing geodetic coordinates with a civic address.</w:t>
@@ -44065,8 +44423,8 @@
         <w:jc w:val="left"/>
         <w:rPr/>
       </w:pPr>
-      <w:bookmarkStart w:id="818" w:name="section-16.10.1-2"/>
-      <w:bookmarkEnd w:id="818"/>
+      <w:bookmarkStart w:id="819" w:name="section-16.10.1-2"/>
+      <w:bookmarkEnd w:id="819"/>
       <w:r>
         <w:rPr/>
         <w:t>Documents are stored and managed using XCAP (XML Configuration Access Protocol, RFC 4825) at a Location Server or Presence Server. The Rule Maker uses XCAP to create, modify, and delete authorization policies. Location-based conditions allow policies such as 'when I am at work, share my location with my employer at city-level precision; when I am at home, share with family at room-level precision.'</w:t>
@@ -44092,8 +44450,8 @@
         <w:rPr/>
       </w:pPr>
       <w:hyperlink w:anchor="section-16.10.2">
-        <w:bookmarkStart w:id="819" w:name="name-gaps-addressed-by-rsdggs-10"/>
-        <w:bookmarkEnd w:id="819"/>
+        <w:bookmarkStart w:id="820" w:name="name-gaps-addressed-by-rsdggs-10"/>
+        <w:bookmarkEnd w:id="820"/>
         <w:r>
           <w:rPr>
             <w:rStyle w:val="Hyperlink"/>
@@ -44286,8 +44644,8 @@
         <w:jc w:val="left"/>
         <w:rPr/>
       </w:pPr>
-      <w:bookmarkStart w:id="820" w:name="section-16.10.2-2"/>
-      <w:bookmarkEnd w:id="820"/>
+      <w:bookmarkStart w:id="821" w:name="section-16.10.2-2"/>
+      <w:bookmarkEnd w:id="821"/>
       <w:r>
         <w:rPr/>
         <w:t>RFC 6772's location obfuscation mechanism -- reducing precision in the transformation element of a policy rule -- is conceptually identical to RSDGGS truncation, but implemented through a server-side XML transformation rather than a structural property of the encoding. The RFC 6772 approach requires a Location Server to apply the transformation rule; the RSDGGS approach requires the transmitting device to select an index length. The RSDGGS approach is implementable on a 32-byte RAM microcontroller with no server dependency.</w:t>
@@ -44301,8 +44659,8 @@
         <w:jc w:val="left"/>
         <w:rPr/>
       </w:pPr>
-      <w:bookmarkStart w:id="821" w:name="section-16.10.2-3"/>
-      <w:bookmarkEnd w:id="821"/>
+      <w:bookmarkStart w:id="822" w:name="section-16.10.2-3"/>
+      <w:bookmarkEnd w:id="822"/>
       <w:r>
         <w:rPr/>
         <w:t>RFC 6772's location-based conditions -- rules that apply differently depending on where the Target is -- have a direct analogy in RSDGGS: the RSL (Resolution Sufficiency Level) table defines location-dependent disclosure requirements for regulatory purposes. A device in Face 2 (North America) needs to disclose only 1 byte to establish 902 MHz legality; a device in Face 3 (East Asia) needs 3 bytes to distinguish Japan from China. The RSDGGS RSL table is a regulatory-specific, infrastructure-free analog to RFC 6772's location-based policy conditions.</w:t>
@@ -44316,8 +44674,8 @@
         <w:jc w:val="left"/>
         <w:rPr/>
       </w:pPr>
-      <w:bookmarkStart w:id="822" w:name="section-16.10.2-4"/>
-      <w:bookmarkEnd w:id="822"/>
+      <w:bookmarkStart w:id="823" w:name="section-16.10.2-4"/>
+      <w:bookmarkEnd w:id="823"/>
       <w:r>
         <w:rPr/>
         <w:t>The two mechanisms are composable for deployments requiring both regulatory compliance and user privacy management: RSDGGS provides the minimum regulatory disclosure at the MAC layer; a separate RFC 6772 geolocation policy governs higher-precision disclosure for application-layer services requiring richer location context.</w:t>
@@ -44343,8 +44701,8 @@
         <w:rPr/>
       </w:pPr>
       <w:hyperlink w:anchor="section-16.11">
-        <w:bookmarkStart w:id="823" w:name="name-gap-analysis-summary"/>
-        <w:bookmarkEnd w:id="823"/>
+        <w:bookmarkStart w:id="824" w:name="name-gap-analysis-summary"/>
+        <w:bookmarkEnd w:id="824"/>
         <w:r>
           <w:rPr>
             <w:rStyle w:val="Hyperlink"/>
@@ -44373,8 +44731,8 @@
         <w:jc w:val="left"/>
         <w:rPr/>
       </w:pPr>
-      <w:bookmarkStart w:id="824" w:name="section-16.11-1"/>
-      <w:bookmarkEnd w:id="824"/>
+      <w:bookmarkStart w:id="825" w:name="section-16.11-1"/>
+      <w:bookmarkEnd w:id="825"/>
       <w:r>
         <w:rPr/>
         <w:t>The following table summarizes the key gaps across all ten reviewed specifications and the RSDGGS response to each. Each entry corresponds to the detailed comparison in the preceding subsections (16.1 through 16.10):</w:t>
@@ -44409,9 +44767,9 @@
           <w:szCs w:val="4"/>
         </w:rPr>
       </w:r>
-      <w:bookmarkStart w:id="825" w:name="table-18"/>
       <w:bookmarkStart w:id="826" w:name="table-18"/>
-      <w:bookmarkEnd w:id="826"/>
+      <w:bookmarkStart w:id="827" w:name="table-18"/>
+      <w:bookmarkEnd w:id="827"/>
     </w:p>
     <w:p>
       <w:pPr>
@@ -45226,8 +45584,8 @@
         <w:jc w:val="left"/>
         <w:rPr/>
       </w:pPr>
-      <w:bookmarkStart w:id="827" w:name="section-16.11-3"/>
-      <w:bookmarkEnd w:id="827"/>
+      <w:bookmarkStart w:id="828" w:name="section-16.11-3"/>
+      <w:bookmarkEnd w:id="828"/>
       <w:r>
         <w:rPr/>
         <w:t>RSDGGS does not supersede any of the five referenced specifications. Each addresses a distinct protocol layer or use case for which it remains the appropriate standard. RSDGGS fills the gap at the intersection of geographic addressing, regulatory compliance encoding, constrained IoT communication, and MAC-layer integration -- a combination not addressed by any prior IETF work.</w:t>
@@ -45241,8 +45599,8 @@
         <w:jc w:val="left"/>
         <w:rPr/>
       </w:pPr>
-      <w:bookmarkStart w:id="828" w:name="section-16.11-4"/>
-      <w:bookmarkEnd w:id="828"/>
+      <w:bookmarkStart w:id="829" w:name="section-16.11-4"/>
+      <w:bookmarkEnd w:id="829"/>
       <w:r>
         <w:rPr/>
         <w:t>Implementations are encouraged to support translation between RSDGGS cells and the formats defined in RFC 5870 ('geo' URI) and RFC 9179 (YANG grouping) for interoperability with infrastructure-side systems. The RSDGGS cell center coordinates provide the lat/lon values for these translations; the cell radius provides the uncertainty parameter.</w:t>
@@ -45268,8 +45626,8 @@
         <w:rPr/>
       </w:pPr>
       <w:hyperlink w:anchor="section-17">
-        <w:bookmarkStart w:id="829" w:name="name-backward-citations-relevant"/>
-        <w:bookmarkEnd w:id="829"/>
+        <w:bookmarkStart w:id="830" w:name="name-backward-citations-relevant"/>
+        <w:bookmarkEnd w:id="830"/>
         <w:r>
           <w:rPr>
             <w:rStyle w:val="Hyperlink"/>
@@ -45298,8 +45656,8 @@
         <w:jc w:val="left"/>
         <w:rPr/>
       </w:pPr>
-      <w:bookmarkStart w:id="830" w:name="section-17-1"/>
-      <w:bookmarkEnd w:id="830"/>
+      <w:bookmarkStart w:id="831" w:name="section-17-1"/>
+      <w:bookmarkEnd w:id="831"/>
       <w:r>
         <w:rPr/>
         <w:t xml:space="preserve">Each patent and RFC examined in </w:t>
@@ -45337,8 +45695,8 @@
         <w:rPr/>
       </w:pPr>
       <w:hyperlink w:anchor="section-17.1">
-        <w:bookmarkStart w:id="831" w:name="name-gpsr-greedy-perimeter-state"/>
-        <w:bookmarkEnd w:id="831"/>
+        <w:bookmarkStart w:id="832" w:name="name-gpsr-greedy-perimeter-state"/>
+        <w:bookmarkEnd w:id="832"/>
         <w:r>
           <w:rPr>
             <w:rStyle w:val="Hyperlink"/>
@@ -45367,8 +45725,8 @@
         <w:jc w:val="left"/>
         <w:rPr/>
       </w:pPr>
-      <w:bookmarkStart w:id="832" w:name="section-17.1-1"/>
-      <w:bookmarkEnd w:id="832"/>
+      <w:bookmarkStart w:id="833" w:name="section-17.1-1"/>
+      <w:bookmarkEnd w:id="833"/>
       <w:r>
         <w:rPr/>
         <w:t>Karp, B. and H.T. Kung, 'GPSR: Greedy Perimeter Stateless Routing for Wireless Networks', MobiCom 2000. Cited as primary prior art in US 10,812,365 (geohyperbolic routing patent).</w:t>
@@ -45382,8 +45740,8 @@
         <w:jc w:val="left"/>
         <w:rPr/>
       </w:pPr>
-      <w:bookmarkStart w:id="833" w:name="section-17.1-2"/>
-      <w:bookmarkEnd w:id="833"/>
+      <w:bookmarkStart w:id="834" w:name="section-17.1-2"/>
+      <w:bookmarkEnd w:id="834"/>
       <w:r>
         <w:rPr/>
         <w:t xml:space="preserve">Relevance to RSDGGS: GPSR is the canonical geographic greedy forwarding algorithm for wireless networks. It defines two components: greedy forwarding (advance toward destination by geographic distance) and perimeter routing (traverse face of a planar graph when greedy forwarding is stuck at a void). RSDGGS </w:t>
@@ -45422,7 +45780,19 @@
       </w:hyperlink>
       <w:r>
         <w:rPr/>
-        <w:t>] on real radio links, or AODV-RPL (RFC 9854) route discovery are the recommended candidates.</w:t>
+        <w:t xml:space="preserve">] on real radio links, or AODV-RPL (RFC 9854) route discovery are the recommended candidates, in each case with the data-path loop detection and escape of </w:t>
+      </w:r>
+      <w:hyperlink w:anchor="s-routing-voids">
+        <w:r>
+          <w:rPr>
+            <w:rStyle w:val="Hyperlink"/>
+          </w:rPr>
+          <w:t>Section 15.4</w:t>
+        </w:r>
+      </w:hyperlink>
+      <w:r>
+        <w:rPr/>
+        <w:t>.</w:t>
       </w:r>
     </w:p>
     <w:p>
@@ -45445,8 +45815,8 @@
         <w:rPr/>
       </w:pPr>
       <w:hyperlink w:anchor="section-17.2">
-        <w:bookmarkStart w:id="834" w:name="name-ieee-80211d-country-informa"/>
-        <w:bookmarkEnd w:id="834"/>
+        <w:bookmarkStart w:id="835" w:name="name-ieee-80211d-country-informa"/>
+        <w:bookmarkEnd w:id="835"/>
         <w:r>
           <w:rPr>
             <w:rStyle w:val="Hyperlink"/>
@@ -45475,8 +45845,8 @@
         <w:jc w:val="left"/>
         <w:rPr/>
       </w:pPr>
-      <w:bookmarkStart w:id="835" w:name="section-17.2-1"/>
-      <w:bookmarkEnd w:id="835"/>
+      <w:bookmarkStart w:id="836" w:name="section-17.2-1"/>
+      <w:bookmarkEnd w:id="836"/>
       <w:r>
         <w:rPr/>
         <w:t>IEEE 802.11d-2001, 'Amendment: Specifications for Operation in Additional Regulatory Domains'. Surfaced through the wireless regulatory compliance patent family (US 10,306,400, US 9,654,965).</w:t>
@@ -45490,8 +45860,8 @@
         <w:jc w:val="left"/>
         <w:rPr/>
       </w:pPr>
-      <w:bookmarkStart w:id="836" w:name="section-17.2-2"/>
-      <w:bookmarkEnd w:id="836"/>
+      <w:bookmarkStart w:id="837" w:name="section-17.2-2"/>
+      <w:bookmarkEnd w:id="837"/>
       <w:r>
         <w:rPr/>
         <w:t xml:space="preserve">Relevance to RSDGGS: IEEE 802.11d defines country information elements (Country IE) in Wi-Fi beacon frames. Each Country IE contains a 3-character country string and per-channel maximum transmit power tables. This is the direct 802.11 predecessor of the RSDGGS 802.15.4 Location Sub-IE defined in </w:t>
@@ -45529,8 +45899,8 @@
         <w:rPr/>
       </w:pPr>
       <w:hyperlink w:anchor="section-17.3">
-        <w:bookmarkStart w:id="837" w:name="name-ieee-80211h-dfs-and-tpc-fro"/>
-        <w:bookmarkEnd w:id="837"/>
+        <w:bookmarkStart w:id="838" w:name="name-ieee-80211h-dfs-and-tpc-fro"/>
+        <w:bookmarkEnd w:id="838"/>
         <w:r>
           <w:rPr>
             <w:rStyle w:val="Hyperlink"/>
@@ -45559,8 +45929,8 @@
         <w:jc w:val="left"/>
         <w:rPr/>
       </w:pPr>
-      <w:bookmarkStart w:id="838" w:name="section-17.3-1"/>
-      <w:bookmarkEnd w:id="838"/>
+      <w:bookmarkStart w:id="839" w:name="section-17.3-1"/>
+      <w:bookmarkEnd w:id="839"/>
       <w:r>
         <w:rPr/>
         <w:t>IEEE 802.11h-2003, 'Spectrum and Transmit Power Management Extensions'. Also surfaced through the wireless regulatory compliance patent family.</w:t>
@@ -45574,8 +45944,8 @@
         <w:jc w:val="left"/>
         <w:rPr/>
       </w:pPr>
-      <w:bookmarkStart w:id="839" w:name="section-17.3-2"/>
-      <w:bookmarkEnd w:id="839"/>
+      <w:bookmarkStart w:id="840" w:name="section-17.3-2"/>
+      <w:bookmarkEnd w:id="840"/>
       <w:r>
         <w:rPr/>
         <w:t xml:space="preserve">Relevance to RSDGGS: IEEE 802.11h defines Dynamic Frequency Selection (DFS) for radar avoidance and Transmit Power Control (TPC) for regulatory compliance in the 5 GHz band. TPC specifically defines a negotiated reduction of transmit power between stations based on measured path loss, with the goal of keeping transmit power at the minimum needed for link quality. This is the direct 802.11 predecessor of RSDGGS </w:t>
@@ -45613,8 +45983,8 @@
         <w:rPr/>
       </w:pPr>
       <w:hyperlink w:anchor="section-17.4">
-        <w:bookmarkStart w:id="840" w:name="name-rfc-3693-geopriv-requiremen"/>
-        <w:bookmarkEnd w:id="840"/>
+        <w:bookmarkStart w:id="841" w:name="name-rfc-3693-geopriv-requiremen"/>
+        <w:bookmarkEnd w:id="841"/>
         <w:r>
           <w:rPr>
             <w:rStyle w:val="Hyperlink"/>
@@ -45643,8 +46013,8 @@
         <w:jc w:val="left"/>
         <w:rPr/>
       </w:pPr>
-      <w:bookmarkStart w:id="841" w:name="section-17.4-1"/>
-      <w:bookmarkEnd w:id="841"/>
+      <w:bookmarkStart w:id="842" w:name="section-17.4-1"/>
+      <w:bookmarkEnd w:id="842"/>
       <w:r>
         <w:rPr/>
         <w:t>Cuellar, J., Morris, J., Mulligan, D., Peterson, J., and J. Polk, 'Geopriv Requirements', RFC 3693, February 2004. Cited as the foundational requirements document by both RFC 6442 and RFC 6280.</w:t>
@@ -45658,8 +46028,8 @@
         <w:jc w:val="left"/>
         <w:rPr/>
       </w:pPr>
-      <w:bookmarkStart w:id="842" w:name="section-17.4-2"/>
-      <w:bookmarkEnd w:id="842"/>
+      <w:bookmarkStart w:id="843" w:name="section-17.4-2"/>
+      <w:bookmarkEnd w:id="843"/>
       <w:r>
         <w:rPr/>
         <w:t>Relevance to RSDGGS: RFC 3693 defines the concept of a 'using protocol': any protocol that transmits or acts on location information must satisfy GEOPRIV's authorization, integrity, and privacy requirements. RSDGGS's 802.15.4 MAC bootstrap (</w:t>
@@ -45721,8 +46091,8 @@
         <w:rPr/>
       </w:pPr>
       <w:hyperlink w:anchor="section-17.5">
-        <w:bookmarkStart w:id="843" w:name="name-rfc-3825-dhcp-geodetic-loca"/>
-        <w:bookmarkEnd w:id="843"/>
+        <w:bookmarkStart w:id="844" w:name="name-rfc-3825-dhcp-geodetic-loca"/>
+        <w:bookmarkEnd w:id="844"/>
         <w:r>
           <w:rPr>
             <w:rStyle w:val="Hyperlink"/>
@@ -45751,8 +46121,8 @@
         <w:jc w:val="left"/>
         <w:rPr/>
       </w:pPr>
-      <w:bookmarkStart w:id="844" w:name="section-17.5-1"/>
-      <w:bookmarkEnd w:id="844"/>
+      <w:bookmarkStart w:id="845" w:name="section-17.5-1"/>
+      <w:bookmarkEnd w:id="845"/>
       <w:r>
         <w:rPr/>
         <w:t>Polk, J., Schnizlein, J., and M. Linsner, 'Dynamic Host Configuration Protocol Option for Coordinate-based Location Configuration Information', RFC 3825, July 2004. Cited as a location provisioning mechanism in RFC 5870 and RFC 5808.</w:t>
@@ -45766,8 +46136,8 @@
         <w:jc w:val="left"/>
         <w:rPr/>
       </w:pPr>
-      <w:bookmarkStart w:id="845" w:name="section-17.5-2"/>
-      <w:bookmarkEnd w:id="845"/>
+      <w:bookmarkStart w:id="846" w:name="section-17.5-2"/>
+      <w:bookmarkEnd w:id="846"/>
       <w:r>
         <w:rPr/>
         <w:t>Relevance and limitation: RFC 3825 defines a DHCP option carrying WGS-84 latitude and longitude for device location provisioning. A DHCPv6 analog carrying an RSDGGS cell index would provide a convenient provisioning path for fixed-infrastructure deployments where DHCP already runs. However, RFC 3825 and any DHCPv6 RSDGGS extension are explicitly excluded from serving as a required provisioning mechanism by design goal G8.</w:t>
@@ -45781,8 +46151,8 @@
         <w:jc w:val="left"/>
         <w:rPr/>
       </w:pPr>
-      <w:bookmarkStart w:id="846" w:name="section-17.5-3"/>
-      <w:bookmarkEnd w:id="846"/>
+      <w:bookmarkStart w:id="847" w:name="section-17.5-3"/>
+      <w:bookmarkEnd w:id="847"/>
       <w:r>
         <w:rPr/>
         <w:t>The reason is structural: DHCP is a client-server protocol with a centralized server as a single point of failure. If the DHCPv6 server is unavailable -- due to server failure, network partition, or initial bootstrap before any infrastructure is established -- onboarding devices cannot acquire their regulatory configuration. This violates G8's requirement for complete independence from any centralized server. IPv6 Stateless Address Autoconfiguration (SLAAC, RFC 4862) and Neighbor Discovery (RFC 4861) demonstrate the correct architectural model: a device derives its IPv6 address from its MAC address and the subnet prefix advertised by neighboring routers, with no server dependency. RSDGGS follows the same model: a device derives its regulatory cell from the RSDGGS cells of neighboring devices (</w:t>
@@ -45808,8 +46178,8 @@
         <w:jc w:val="left"/>
         <w:rPr/>
       </w:pPr>
-      <w:bookmarkStart w:id="847" w:name="section-17.5-4"/>
-      <w:bookmarkEnd w:id="847"/>
+      <w:bookmarkStart w:id="848" w:name="section-17.5-4"/>
+      <w:bookmarkEnd w:id="848"/>
       <w:r>
         <w:rPr/>
         <w:t xml:space="preserve">RFC 3825 / DHCPv6 RSDGGS options MAY be implemented as optional accelerators in managed infrastructure deployments where the DHCP server is always available before devices are deployed. They MUST NOT be implemented as the sole or primary regulatory provisioning path. Any RSDGGS implementation that supports DHCPv6 provisioning MUST also implement the peer-assisted bootstrap of </w:t>
@@ -45847,8 +46217,8 @@
         <w:rPr/>
       </w:pPr>
       <w:hyperlink w:anchor="section-17.6">
-        <w:bookmarkStart w:id="848" w:name="name-rfc-4632-cidr-classless-int"/>
-        <w:bookmarkEnd w:id="848"/>
+        <w:bookmarkStart w:id="849" w:name="name-rfc-4632-cidr-classless-int"/>
+        <w:bookmarkEnd w:id="849"/>
         <w:r>
           <w:rPr>
             <w:rStyle w:val="Hyperlink"/>
@@ -45877,8 +46247,8 @@
         <w:jc w:val="left"/>
         <w:rPr/>
       </w:pPr>
-      <w:bookmarkStart w:id="849" w:name="section-17.6-1"/>
-      <w:bookmarkEnd w:id="849"/>
+      <w:bookmarkStart w:id="850" w:name="section-17.6-1"/>
+      <w:bookmarkEnd w:id="850"/>
       <w:r>
         <w:rPr/>
         <w:t>Fuller, V. and T. Li, 'Classless Inter-domain Routing (CIDR): The Internet Address Assignment and Aggregation Plan', BCP 122, RFC 4632, August 2006. Cited as background in RFC 9632's geofeed discovery context.</w:t>
@@ -45892,8 +46262,8 @@
         <w:jc w:val="left"/>
         <w:rPr/>
       </w:pPr>
-      <w:bookmarkStart w:id="850" w:name="section-17.6-2"/>
-      <w:bookmarkEnd w:id="850"/>
+      <w:bookmarkStart w:id="851" w:name="section-17.6-2"/>
+      <w:bookmarkEnd w:id="851"/>
       <w:r>
         <w:rPr/>
         <w:t>Relevance to RSDGGS: CIDR defines prefix-based aggregation of IPv4 address space into routing hierarchies, where a /16 prefix aggregates 65,536 /32 host addresses into a single routing entry. RSDGGS-IPv6 geographic addressing (</w:t>
@@ -45943,8 +46313,8 @@
         <w:rPr/>
       </w:pPr>
       <w:hyperlink w:anchor="section-17.7">
-        <w:bookmarkStart w:id="851" w:name="name-rfc-6269-issues-with-ip-add"/>
-        <w:bookmarkEnd w:id="851"/>
+        <w:bookmarkStart w:id="852" w:name="name-rfc-6269-issues-with-ip-add"/>
+        <w:bookmarkEnd w:id="852"/>
         <w:r>
           <w:rPr>
             <w:rStyle w:val="Hyperlink"/>
@@ -45973,8 +46343,8 @@
         <w:jc w:val="left"/>
         <w:rPr/>
       </w:pPr>
-      <w:bookmarkStart w:id="852" w:name="section-17.7-1"/>
-      <w:bookmarkEnd w:id="852"/>
+      <w:bookmarkStart w:id="853" w:name="section-17.7-1"/>
+      <w:bookmarkEnd w:id="853"/>
       <w:r>
         <w:rPr/>
         <w:t>Ford, M., Boucadair, M., Durand, A., Levis, P., and P. Roberts, 'Issues with IP Address Sharing', RFC 6269, June 2011. Cited in RFC 9632's introduction as motivation for geofeed.</w:t>
@@ -45988,8 +46358,8 @@
         <w:jc w:val="left"/>
         <w:rPr/>
       </w:pPr>
-      <w:bookmarkStart w:id="853" w:name="section-17.7-2"/>
-      <w:bookmarkEnd w:id="853"/>
+      <w:bookmarkStart w:id="854" w:name="section-17.7-2"/>
+      <w:bookmarkEnd w:id="854"/>
       <w:r>
         <w:rPr/>
         <w:t xml:space="preserve">Relevance to RSDGGS: RFC 6269 documents the problem that commercial IP geolocation databases are unreliable when IP addresses are shared (NAT, CGN, mobile carrier address pools) because a shared address maps to many physical locations. RFC 9632 geofeed was designed as a partial solution -- operators can publish authoritative location for their IP prefix. RSDGGS-IPv6 geographic addressing solves this problem categorically for devices using RSDGGS addresses: the lower 64 bits of the IPv6 address encode the device's geographic cell, making location-by-address exact by construction rather than inferred. This should be noted in </w:t>
@@ -46027,8 +46397,8 @@
         <w:rPr/>
       </w:pPr>
       <w:hyperlink w:anchor="section-17.8">
-        <w:bookmarkStart w:id="854" w:name="name-geocast-geographic-addressi"/>
-        <w:bookmarkEnd w:id="854"/>
+        <w:bookmarkStart w:id="855" w:name="name-geocast-geographic-addressi"/>
+        <w:bookmarkEnd w:id="855"/>
         <w:r>
           <w:rPr>
             <w:rStyle w:val="Hyperlink"/>
@@ -46057,8 +46427,8 @@
         <w:jc w:val="left"/>
         <w:rPr/>
       </w:pPr>
-      <w:bookmarkStart w:id="855" w:name="section-17.8-1"/>
-      <w:bookmarkEnd w:id="855"/>
+      <w:bookmarkStart w:id="856" w:name="section-17.8-1"/>
+      <w:bookmarkEnd w:id="856"/>
       <w:r>
         <w:rPr/>
         <w:t>Navas, J.C. and T. Imielinski, 'GeoCast: Geographic Addressing and Routing', MobiCom 1997. Cited in RFC 2009 as the companion paper describing geographic multicast.</w:t>
@@ -46072,8 +46442,8 @@
         <w:jc w:val="left"/>
         <w:rPr/>
       </w:pPr>
-      <w:bookmarkStart w:id="856" w:name="section-17.8-2"/>
-      <w:bookmarkEnd w:id="856"/>
+      <w:bookmarkStart w:id="857" w:name="section-17.8-2"/>
+      <w:bookmarkEnd w:id="857"/>
       <w:r>
         <w:rPr/>
         <w:t xml:space="preserve">Relevance to RSDGGS: GeoCast defines geographic multicast: delivering a packet to all nodes currently within a specified geographic polygon. RSDGGS-IPv6 prefix aggregation enables a direct implementation of GeoCast: a packet addressed to a /72 RSDGGS-IPv6 prefix is a GeoCast to all devices in a single ITU Region; a packet addressed to a /88 prefix is a GeoCast to a country-scale cell. This is lossless GeoCast -- the cell boundary is exact, not approximated by a polygon. GeoCast should be cited as an informative reference in </w:t>
@@ -46111,8 +46481,8 @@
         <w:rPr/>
       </w:pPr>
       <w:hyperlink w:anchor="section-17.9">
-        <w:bookmarkStart w:id="857" w:name="name-summary-of-newly-identified"/>
-        <w:bookmarkEnd w:id="857"/>
+        <w:bookmarkStart w:id="858" w:name="name-summary-of-newly-identified"/>
+        <w:bookmarkEnd w:id="858"/>
         <w:r>
           <w:rPr>
             <w:rStyle w:val="Hyperlink"/>
@@ -46141,8 +46511,8 @@
         <w:jc w:val="left"/>
         <w:rPr/>
       </w:pPr>
-      <w:bookmarkStart w:id="858" w:name="section-17.9-1"/>
-      <w:bookmarkEnd w:id="858"/>
+      <w:bookmarkStart w:id="859" w:name="section-17.9-1"/>
+      <w:bookmarkEnd w:id="859"/>
       <w:r>
         <w:rPr/>
         <w:t>The following references, surfaced from the backward citation chains of documents already examined, should be added to the references of this draft (</w:t>
@@ -46201,9 +46571,9 @@
           <w:szCs w:val="4"/>
         </w:rPr>
       </w:r>
-      <w:bookmarkStart w:id="859" w:name="table-19"/>
       <w:bookmarkStart w:id="860" w:name="table-19"/>
-      <w:bookmarkEnd w:id="860"/>
+      <w:bookmarkStart w:id="861" w:name="table-19"/>
+      <w:bookmarkEnd w:id="861"/>
     </w:p>
     <w:p>
       <w:pPr>
@@ -47345,8 +47715,8 @@
         <w:jc w:val="left"/>
         <w:rPr/>
       </w:pPr>
-      <w:bookmarkStart w:id="861" w:name="section-17.9-3"/>
-      <w:bookmarkEnd w:id="861"/>
+      <w:bookmarkStart w:id="862" w:name="section-17.9-3"/>
+      <w:bookmarkEnd w:id="862"/>
       <w:r>
         <w:rPr/>
         <w:t xml:space="preserve">Of these, RFC 3825 with its DHCP single-point-of-failure limitation, IEEE 802.11d as the direct predecessor of the RSDGGS 802.15.4 Sub-IE, and RFC 4862/4861 as the SLAAC/ND model that G8 follows are the highest-priority additions. The GPSR void-handling gap, the most significant technical limitation of the forwarding outline, is documented in </w:t>
@@ -47384,8 +47754,8 @@
         <w:rPr/>
       </w:pPr>
       <w:hyperlink w:anchor="section-18">
-        <w:bookmarkStart w:id="862" w:name="name-freedom-to-operate-and-prio"/>
-        <w:bookmarkEnd w:id="862"/>
+        <w:bookmarkStart w:id="863" w:name="name-freedom-to-operate-and-prio"/>
+        <w:bookmarkEnd w:id="863"/>
         <w:r>
           <w:rPr>
             <w:rStyle w:val="Hyperlink"/>
@@ -47414,8 +47784,8 @@
         <w:jc w:val="left"/>
         <w:rPr/>
       </w:pPr>
-      <w:bookmarkStart w:id="863" w:name="section-18-1"/>
-      <w:bookmarkEnd w:id="863"/>
+      <w:bookmarkStart w:id="864" w:name="section-18-1"/>
+      <w:bookmarkEnd w:id="864"/>
       <w:r>
         <w:rPr/>
         <w:t>This section provides a comprehensive analysis of all patents and RFC standards examined during the development of RSDGGS. For each, it identifies the technical relationship to RSDGGS, evaluates freedom to operate, and identifies any improvement opportunity that the prior work suggests for RSDGGS. Improvement opportunities are RSDGGS-applicable enhancements that are either enabled by, or would have been blocked by, the referenced work. All patent analyses are informational only and do not constitute legal advice.</w:t>
@@ -47441,8 +47811,8 @@
         <w:rPr/>
       </w:pPr>
       <w:hyperlink w:anchor="section-18.1">
-        <w:bookmarkStart w:id="864" w:name="name-expired-patents-public-doma"/>
-        <w:bookmarkEnd w:id="864"/>
+        <w:bookmarkStart w:id="865" w:name="name-expired-patents-public-doma"/>
+        <w:bookmarkEnd w:id="865"/>
         <w:r>
           <w:rPr>
             <w:rStyle w:val="Hyperlink"/>
@@ -47471,8 +47841,8 @@
         <w:jc w:val="left"/>
         <w:rPr/>
       </w:pPr>
-      <w:bookmarkStart w:id="865" w:name="section-18.1-1"/>
-      <w:bookmarkEnd w:id="865"/>
+      <w:bookmarkStart w:id="866" w:name="section-18.1-1"/>
+      <w:bookmarkEnd w:id="866"/>
       <w:r>
         <w:rPr/>
         <w:t>The following patents are expired, and the following published application was abandoned without being granted, so no one holds enforceable rights in them. Their full technical disclosures are public. They constitute prior art against any third-party attempt to patent the techniques they disclose, and RSDGGS implementations may freely use these techniques without license.</w:t>
@@ -47498,8 +47868,8 @@
         <w:rPr/>
       </w:pPr>
       <w:hyperlink w:anchor="section-18.1.1">
-        <w:bookmarkStart w:id="866" w:name="name-us-patent-4939726-metricom-"/>
-        <w:bookmarkEnd w:id="866"/>
+        <w:bookmarkStart w:id="867" w:name="name-us-patent-4939726-metricom-"/>
+        <w:bookmarkEnd w:id="867"/>
         <w:r>
           <w:rPr>
             <w:rStyle w:val="Hyperlink"/>
@@ -47528,8 +47898,8 @@
         <w:jc w:val="left"/>
         <w:rPr/>
       </w:pPr>
-      <w:bookmarkStart w:id="867" w:name="section-18.1.1-1"/>
-      <w:bookmarkEnd w:id="867"/>
+      <w:bookmarkStart w:id="868" w:name="section-18.1.1-1"/>
+      <w:bookmarkEnd w:id="868"/>
       <w:r>
         <w:rPr/>
         <w:t>Title: Method for Routing Packets in a Packet Communication Network. Inventors: Flammer, Kalkwarf. Assignee: Metricom, Inc. (later Proxim Wireless Corp.). Filed 1989, granted July 3, 1990, expired 2007. Companion patent US 5,115,433 (Baran, Flammer, Kalkwarf -- Metricom, 1992) is also expired.</w:t>
@@ -47782,8 +48152,8 @@
         <w:jc w:val="left"/>
         <w:rPr/>
       </w:pPr>
-      <w:bookmarkStart w:id="868" w:name="section-18.1.1-3"/>
-      <w:bookmarkEnd w:id="868"/>
+      <w:bookmarkStart w:id="869" w:name="section-18.1.1-3"/>
+      <w:bookmarkEnd w:id="869"/>
       <w:r>
         <w:rPr/>
         <w:t xml:space="preserve">RSDGGS improvement opportunity -- Link Quality Weighted Forwarding: US 4,939,726 Claim 3 and US 5,115,433 define a link quality (LQ) factor incorporating distance, power, retry history, throughput, and delay. RSDGGS </w:t>
@@ -47809,8 +48179,8 @@
         <w:jc w:val="left"/>
         <w:rPr/>
       </w:pPr>
-      <w:bookmarkStart w:id="869" w:name="section-18.1.1-4"/>
-      <w:bookmarkEnd w:id="869"/>
+      <w:bookmarkStart w:id="870" w:name="section-18.1.1-4"/>
+      <w:bookmarkEnd w:id="870"/>
       <w:r>
         <w:rPr/>
         <w:t>RSDGGS improvement opportunity -- Loop and Dead-End Mitigation: US 5,115,433 also bounds the life of every packet with a one-octet field that each repeater decrements, records dead-end neighbors in the local table so they stop being chosen, and, when no forward progress is possible, has the previous node resend through another neighbor or returns the packet to its source for rerouting. These mitigations are freely implementable and complement face routing for RSDGGS forwarding (</w:t>
@@ -47848,8 +48218,8 @@
         <w:rPr/>
       </w:pPr>
       <w:hyperlink w:anchor="section-18.1.2">
-        <w:bookmarkStart w:id="870" w:name="name-us-application-2010-0002700"/>
-        <w:bookmarkEnd w:id="870"/>
+        <w:bookmarkStart w:id="871" w:name="name-us-application-2010-0002700"/>
+        <w:bookmarkEnd w:id="871"/>
         <w:r>
           <w:rPr>
             <w:rStyle w:val="Hyperlink"/>
@@ -47878,8 +48248,8 @@
         <w:jc w:val="left"/>
         <w:rPr/>
       </w:pPr>
-      <w:bookmarkStart w:id="871" w:name="section-18.1.2-1"/>
-      <w:bookmarkEnd w:id="871"/>
+      <w:bookmarkStart w:id="872" w:name="section-18.1.2-1"/>
+      <w:bookmarkEnd w:id="872"/>
       <w:r>
         <w:rPr/>
         <w:t>Title: Methods and Systems for Network Packet Routing Using Embedded Geographic Routing Information. Inventor: Charles Robert Simpson, Jr. Applicant: Cellnet Innovations, Inc. (later Landis+Gyr Innovations, Inc.). Filed July 2, 2008, published January 7, 2010; PCT counterpart WO 2010/002782. Abandoned for failure to respond to an Office action, 2011. Never granted.</w:t>
@@ -48132,8 +48502,8 @@
         <w:jc w:val="left"/>
         <w:rPr/>
       </w:pPr>
-      <w:bookmarkStart w:id="872" w:name="section-18.1.2-3"/>
-      <w:bookmarkEnd w:id="872"/>
+      <w:bookmarkStart w:id="873" w:name="section-18.1.2-3"/>
+      <w:bookmarkEnd w:id="873"/>
       <w:r>
         <w:rPr/>
         <w:t>Relevance to RSDGGS: This is the closest prior art found to RSDGGS geographic IPv6 addressing (</w:t>
@@ -48183,8 +48553,8 @@
         <w:rPr/>
       </w:pPr>
       <w:hyperlink w:anchor="section-18.1.3">
-        <w:bookmarkStart w:id="873" w:name="name-us-patent-6982966-status-un"/>
-        <w:bookmarkEnd w:id="873"/>
+        <w:bookmarkStart w:id="874" w:name="name-us-patent-6982966-status-un"/>
+        <w:bookmarkEnd w:id="874"/>
         <w:r>
           <w:rPr>
             <w:rStyle w:val="Hyperlink"/>
@@ -48213,8 +48583,8 @@
         <w:jc w:val="left"/>
         <w:rPr/>
       </w:pPr>
-      <w:bookmarkStart w:id="874" w:name="section-18.1.3-1"/>
-      <w:bookmarkEnd w:id="874"/>
+      <w:bookmarkStart w:id="875" w:name="section-18.1.3-1"/>
+      <w:bookmarkEnd w:id="875"/>
       <w:r>
         <w:rPr/>
         <w:t>This number was not definitively identified in patent database searches. If this patent was cited in relation to geographic routing or MANET protocols, the Metricom prior art (4,939,726 and 5,115,433, both expired 2007 and 2009 respectively) predates any 2006-era geographic routing patent by 15+ years and establishes the core concepts as public domain. Independent verification at the USPTO patent database (https://patents.uspto.gov) is still recommended.</w:t>
@@ -48240,8 +48610,8 @@
         <w:rPr/>
       </w:pPr>
       <w:hyperlink w:anchor="section-18.2">
-        <w:bookmarkStart w:id="875" w:name="name-active-patents-detailed-ana"/>
-        <w:bookmarkEnd w:id="875"/>
+        <w:bookmarkStart w:id="876" w:name="name-active-patents-detailed-ana"/>
+        <w:bookmarkEnd w:id="876"/>
         <w:r>
           <w:rPr>
             <w:rStyle w:val="Hyperlink"/>
@@ -48282,8 +48652,8 @@
         <w:rPr/>
       </w:pPr>
       <w:hyperlink w:anchor="section-18.2.1">
-        <w:bookmarkStart w:id="876" w:name="name-us-patent-10306400-applicat"/>
-        <w:bookmarkEnd w:id="876"/>
+        <w:bookmarkStart w:id="877" w:name="name-us-patent-10306400-applicat"/>
+        <w:bookmarkEnd w:id="877"/>
         <w:r>
           <w:rPr>
             <w:rStyle w:val="Hyperlink"/>
@@ -48312,8 +48682,8 @@
         <w:jc w:val="left"/>
         <w:rPr/>
       </w:pPr>
-      <w:bookmarkStart w:id="877" w:name="section-18.2.1-1"/>
-      <w:bookmarkEnd w:id="877"/>
+      <w:bookmarkStart w:id="878" w:name="section-18.2.1-1"/>
+      <w:bookmarkEnd w:id="878"/>
       <w:r>
         <w:rPr/>
         <w:t>Title: Systems and Methods for Enforcing Wireless Regulatory Compliance. Assignee not publicly confirmed from application number alone; the issued patent US 10,306,400 covers a thermostat and home network device context. Filed as US Application 20140162692 approximately 2013-2014. The issued patent family includes related grants US 9,794,738 and US 9,654,965. Active.</w:t>
@@ -48566,8 +48936,8 @@
         <w:jc w:val="left"/>
         <w:rPr/>
       </w:pPr>
-      <w:bookmarkStart w:id="878" w:name="section-18.2.1-3"/>
-      <w:bookmarkEnd w:id="878"/>
+      <w:bookmarkStart w:id="879" w:name="section-18.2.1-3"/>
+      <w:bookmarkEnd w:id="879"/>
       <w:r>
         <w:rPr/>
         <w:t>RSDGGS freedom to operate: RSDGGS does not use power line frequency as a location verification mechanism. The core novelty of this patent family is the AC frequency verification step, which is absent from RSDGGS entirely. RSDGGS derives location from: pre-provisioned cell index (</w:t>
@@ -48617,8 +48987,8 @@
         <w:jc w:val="left"/>
         <w:rPr/>
       </w:pPr>
-      <w:bookmarkStart w:id="879" w:name="section-18.2.1-4"/>
-      <w:bookmarkEnd w:id="879"/>
+      <w:bookmarkStart w:id="880" w:name="section-18.2.1-4"/>
+      <w:bookmarkEnd w:id="880"/>
       <w:r>
         <w:rPr/>
         <w:t xml:space="preserve">RSDGGS improvement opportunity -- Lookup Table Architecture: US 9,654,965 explicitly discloses the architecture of a location-to-regulations lookup table stored locally on the device, optionally small enough to fit in embedded memory, potentially updated from network. This is directly analogous to the RSDGGS regulatory database architecture defined in </w:t>
@@ -48656,8 +49026,8 @@
         <w:rPr/>
       </w:pPr>
       <w:hyperlink w:anchor="section-18.2.2">
-        <w:bookmarkStart w:id="880" w:name="name-us-patent-10812365-geohyper"/>
-        <w:bookmarkEnd w:id="880"/>
+        <w:bookmarkStart w:id="881" w:name="name-us-patent-10812365-geohyper"/>
+        <w:bookmarkEnd w:id="881"/>
         <w:r>
           <w:rPr>
             <w:rStyle w:val="Hyperlink"/>
@@ -48686,8 +49056,8 @@
         <w:jc w:val="left"/>
         <w:rPr/>
       </w:pPr>
-      <w:bookmarkStart w:id="881" w:name="section-18.2.2-1"/>
-      <w:bookmarkEnd w:id="881"/>
+      <w:bookmarkStart w:id="882" w:name="section-18.2.2-1"/>
+      <w:bookmarkEnd w:id="882"/>
       <w:r>
         <w:rPr/>
         <w:t>Title: Geohyperbolic Routing and Addressing Schemes for Networks. Inventors: Dmitri Krioukov, Ivan Voitalov. Assignee: Northeastern University, Boston. Filed November 16, 2017. Granted October 20, 2020. Active, expires December 25, 2037.</w:t>
@@ -49020,8 +49390,8 @@
         <w:jc w:val="left"/>
         <w:rPr/>
       </w:pPr>
-      <w:bookmarkStart w:id="882" w:name="section-18.2.2-3"/>
-      <w:bookmarkEnd w:id="882"/>
+      <w:bookmarkStart w:id="883" w:name="section-18.2.2-3"/>
+      <w:bookmarkEnd w:id="883"/>
       <w:r>
         <w:rPr/>
         <w:t>RSDGGS improvement opportunity -- None applicable: The geohyperbolic model is specifically optimized for large-scale Internet backbone topology reproduction, using population-density centrality to reproduce power-law degree distributions. RSDGGS targets constrained 802.15.4 IoT mesh networks with no backbone topology requirements and no population-density data available at compile time on embedded devices. The mathematical approaches are incompatible at a fundamental level: hyperbolic geometry requires floating-point (r, theta, phi) arithmetic, whereas RSDGGS's design goal G4 requires no-FPU integer arithmetic. No improvement opportunity from this patent is applicable to RSDGGS.</w:t>
@@ -49035,8 +49405,8 @@
         <w:jc w:val="left"/>
         <w:rPr/>
       </w:pPr>
-      <w:bookmarkStart w:id="883" w:name="section-18.2.2-4"/>
-      <w:bookmarkEnd w:id="883"/>
+      <w:bookmarkStart w:id="884" w:name="section-18.2.2-4"/>
+      <w:bookmarkEnd w:id="884"/>
       <w:r>
         <w:rPr/>
         <w:t>Backward citations of interest: US 10,812,365 cites US 8,284,788 (Krioukov et al., hyperbolic network embedding, 2012) as a predecessor. The academic paper by Krioukov et al. 'Hyperbolic Geometry of Complex Networks' (Physical Review E, 2010) is the underlying research. Both establish that hyperbolic geometry for Internet-scale routing is a well-developed research area distinct from RSDGGS's approach.</w:t>
@@ -49062,8 +49432,8 @@
         <w:rPr/>
       </w:pPr>
       <w:hyperlink w:anchor="section-18.2.3">
-        <w:bookmarkStart w:id="884" w:name="name-us-patent-11652742-ghost-ro"/>
-        <w:bookmarkEnd w:id="884"/>
+        <w:bookmarkStart w:id="885" w:name="name-us-patent-11652742-ghost-ro"/>
+        <w:bookmarkEnd w:id="885"/>
         <w:r>
           <w:rPr>
             <w:rStyle w:val="Hyperlink"/>
@@ -49092,8 +49462,8 @@
         <w:jc w:val="left"/>
         <w:rPr/>
       </w:pPr>
-      <w:bookmarkStart w:id="885" w:name="section-18.2.3-1"/>
-      <w:bookmarkEnd w:id="885"/>
+      <w:bookmarkStart w:id="886" w:name="section-18.2.3-1"/>
+      <w:bookmarkEnd w:id="886"/>
       <w:r>
         <w:rPr/>
         <w:t>Title: Ghost Routing. Assignee: Microsoft Technology Licensing LLC. Inventors: Padhye, Jayaraman, Bai, Singh, Beckett, et al. Filed October 16, 2020. Granted May 16, 2023. Active, expires January 1, 2041.</w:t>
@@ -49378,8 +49748,8 @@
         <w:jc w:val="left"/>
         <w:rPr/>
       </w:pPr>
-      <w:bookmarkStart w:id="886" w:name="section-18.2.3-3"/>
-      <w:bookmarkEnd w:id="886"/>
+      <w:bookmarkStart w:id="887" w:name="section-18.2.3-3"/>
+      <w:bookmarkEnd w:id="887"/>
       <w:r>
         <w:rPr/>
         <w:t>RSDGGS improvement opportunity -- None: Ghost routing addresses verification of network configuration changes in cloud datacenter switching infrastructure. It has no technical concepts, no claim elements, and no CPC classifications that overlap with RSDGGS. The name superficially resembles geographic routing but the technical subject matter is entirely unrelated. No improvement opportunity exists.</w:t>
@@ -49405,8 +49775,8 @@
         <w:rPr/>
       </w:pPr>
       <w:hyperlink w:anchor="section-18.2.4">
-        <w:bookmarkStart w:id="887" w:name="name-cn101923801b-method-for-gen"/>
-        <w:bookmarkEnd w:id="887"/>
+        <w:bookmarkStart w:id="888" w:name="name-cn101923801b-method-for-gen"/>
+        <w:bookmarkEnd w:id="888"/>
         <w:r>
           <w:rPr>
             <w:rStyle w:val="Hyperlink"/>
@@ -49435,8 +49805,8 @@
         <w:jc w:val="left"/>
         <w:rPr/>
       </w:pPr>
-      <w:bookmarkStart w:id="888" w:name="section-18.2.4-1"/>
-      <w:bookmarkEnd w:id="888"/>
+      <w:bookmarkStart w:id="889" w:name="section-18.2.4-1"/>
+      <w:bookmarkEnd w:id="889"/>
       <w:r>
         <w:rPr/>
         <w:t>Assignee: Wuhan University (WHU), Wuhan, China. Inventors: Hu Peng, Li Yunxiang, Zhu Fuli. Application number: CN2009100626550A. Filing and priority date: 10 June 2009. Grant date: 29 February 2012. Jurisdiction: China only (no PCT application, no US, EP, or other national-phase equivalents identified). Legal status: Expired -- Fee Related. Anticipated statutory expiration: 10 June 2029 (20-year term from filing). Actual status: lapsed prior to statutory expiration due to non-payment of annual maintenance fees.</w:t>
@@ -49721,8 +50091,8 @@
         <w:jc w:val="left"/>
         <w:rPr/>
       </w:pPr>
-      <w:bookmarkStart w:id="889" w:name="section-18.2.4-3"/>
-      <w:bookmarkEnd w:id="889"/>
+      <w:bookmarkStart w:id="890" w:name="section-18.2.4-3"/>
+      <w:bookmarkEnd w:id="890"/>
       <w:r>
         <w:rPr/>
         <w:t>The method disclosed in CN101923801B describes a cartographic rendering pipeline for producing physical dodecahedron map products. The claimed method orients the dodecahedron so that one vertex coincides with the Earth's geographic North Pole and the antipodal vertex with the South Pole, selects a user-defined region of interest to determine each face's central meridian, applies a gnomonic projection per face to transform geographic vector data, clips the result to each pentagonal boundary, and outputs twelve pentagonal paper maps for assembly into a physical dodecahedron. The implementation is explicitly tied to ArcGIS and ESRI Shapefile data formats as the required geographic data pipeline.</w:t>
@@ -50262,8 +50632,8 @@
         <w:jc w:val="left"/>
         <w:rPr/>
       </w:pPr>
-      <w:bookmarkStart w:id="890" w:name="section-18.2.4-5"/>
-      <w:bookmarkEnd w:id="890"/>
+      <w:bookmarkStart w:id="891" w:name="section-18.2.4-5"/>
+      <w:bookmarkEnd w:id="891"/>
       <w:r>
         <w:rPr/>
         <w:t>Freedom to operate conclusion: CN101923801B presents no freedom-to-operate concern for RSDGGS on three independent grounds, each sufficient alone. First, the patent is expired due to fee non-payment and its claims are in the public domain -- no enforcement is possible regardless of claim scope. Second, the patent is China-jurisdiction only with no international equivalents, so even if active it could not be enforced in the United States, European Union, Japan, or any other IETF-process jurisdiction. Third, no claim element of CN101923801B reads on RSDGGS: the patent covers a cartographic rendering pipeline for producing visual map products from geographic vector data using ArcGIS tooling, whereas RSDGGS is a binary integer encoding scheme for IoT device regulatory context with no map output, no GIS pipeline, and no physical artifact. The shared concept of using a dodecahedron as an Earth reference surface is established prior art predating CN101923801B by decades, with the gnomonic polyhedral map projection appearing in academic cartography literature since at least the 1940s (Fuller, 1944, US Patent 2,393,676, expired 1963) and in peer-reviewed cartographic literature through the 1990s.</w:t>
@@ -50277,8 +50647,8 @@
         <w:jc w:val="left"/>
         <w:rPr/>
       </w:pPr>
-      <w:bookmarkStart w:id="891" w:name="section-18.2.4-6"/>
-      <w:bookmarkEnd w:id="891"/>
+      <w:bookmarkStart w:id="892" w:name="section-18.2.4-6"/>
+      <w:bookmarkEnd w:id="892"/>
       <w:r>
         <w:rPr/>
         <w:t>Prior art note: CN101923801B itself acknowledges that dodecahedron map projection is a known concept by framing its contribution as 'breaking through the limitation that the previous projection surface is a plane and a developable surface.' The gnomonic projection of the Earth onto a regular dodecahedron is explicitly not novel to CN101923801B -- the claimed novelty is the specific ArcGIS-based rendering workflow and the face-by-face data extraction pipeline. RSDGGS's use of the dodecahedron as a hierarchical geographic index is therefore independently supported by prior art that predates CN101923801B, in addition to the non-infringement analysis above.</w:t>
@@ -50304,8 +50674,8 @@
         <w:rPr/>
       </w:pPr>
       <w:hyperlink w:anchor="section-18.3">
-        <w:bookmarkStart w:id="892" w:name="name-rfc-citation-improvement-op"/>
-        <w:bookmarkEnd w:id="892"/>
+        <w:bookmarkStart w:id="893" w:name="name-rfc-citation-improvement-op"/>
+        <w:bookmarkEnd w:id="893"/>
         <w:r>
           <w:rPr>
             <w:rStyle w:val="Hyperlink"/>
@@ -50334,8 +50704,8 @@
         <w:jc w:val="left"/>
         <w:rPr/>
       </w:pPr>
-      <w:bookmarkStart w:id="893" w:name="section-18.3-1"/>
-      <w:bookmarkEnd w:id="893"/>
+      <w:bookmarkStart w:id="894" w:name="section-18.3-1"/>
+      <w:bookmarkEnd w:id="894"/>
       <w:r>
         <w:rPr/>
         <w:t xml:space="preserve">The following analysis reviews each RFC cited in </w:t>
@@ -50397,8 +50767,8 @@
         <w:rPr/>
       </w:pPr>
       <w:hyperlink w:anchor="section-18.3.1">
-        <w:bookmarkStart w:id="894" w:name="name-rfc-2009-gps-based-addressin"/>
-        <w:bookmarkEnd w:id="894"/>
+        <w:bookmarkStart w:id="895" w:name="name-rfc-2009-gps-based-addressin"/>
+        <w:bookmarkEnd w:id="895"/>
         <w:r>
           <w:rPr>
             <w:rStyle w:val="Hyperlink"/>
@@ -50427,8 +50797,8 @@
         <w:jc w:val="left"/>
         <w:rPr/>
       </w:pPr>
-      <w:bookmarkStart w:id="895" w:name="section-18.3.1-1"/>
-      <w:bookmarkEnd w:id="895"/>
+      <w:bookmarkStart w:id="896" w:name="section-18.3.1-1"/>
+      <w:bookmarkEnd w:id="896"/>
       <w:r>
         <w:rPr/>
         <w:t xml:space="preserve">Improvement opportunity -- Weak beacon concept: RFC 2009 Section 5.2 defines 'weak radio beacons' that broadcast a GPS address enabling indoor devices without GPS to adopt the beacon's address. This is structurally identical to RSDGGS </w:t>
@@ -50466,8 +50836,8 @@
         <w:jc w:val="left"/>
         <w:rPr/>
       </w:pPr>
-      <w:bookmarkStart w:id="896" w:name="section-18.3.1-2"/>
-      <w:bookmarkEnd w:id="896"/>
+      <w:bookmarkStart w:id="897" w:name="section-18.3.1-2"/>
+      <w:bookmarkEnd w:id="897"/>
       <w:r>
         <w:rPr/>
         <w:t>Improvement opportunity -- IGPSMP protocol gap: RFC 2009 proposes IGPSMP (Internet GPS Management Protocol) for router-to-router geographic service area exchange, with a polygon boundary representation. RSDGGS explicitly avoids polygon boundaries in favor of cell prefix hierarchy. Noting that RSDGGS's approach eliminates IGPSMP entirely (routing decisions from address arithmetic, no management protocol needed) more precisely characterizes RSDGGS's architectural simplification relative to RFC 2009.</w:t>
@@ -50493,8 +50863,8 @@
         <w:rPr/>
       </w:pPr>
       <w:hyperlink w:anchor="section-18.3.2">
-        <w:bookmarkStart w:id="897" w:name="name-rfc-5870-geo-uri-scheme-201"/>
-        <w:bookmarkEnd w:id="897"/>
+        <w:bookmarkStart w:id="898" w:name="name-rfc-5870-geo-uri-scheme-201"/>
+        <w:bookmarkEnd w:id="898"/>
         <w:r>
           <w:rPr>
             <w:rStyle w:val="Hyperlink"/>
@@ -50523,8 +50893,8 @@
         <w:jc w:val="left"/>
         <w:rPr/>
       </w:pPr>
-      <w:bookmarkStart w:id="898" w:name="section-18.3.2-1"/>
-      <w:bookmarkEnd w:id="898"/>
+      <w:bookmarkStart w:id="899" w:name="section-18.3.2-1"/>
+      <w:bookmarkEnd w:id="899"/>
       <w:r>
         <w:rPr/>
         <w:t xml:space="preserve">Improvement opportunity -- Uncertainty parameter alignment: RFC 5870 Section 3.4 defines the u= parameter as the uncertainty radius in meters, explicitly stating that it represents the uncertainty of the location rather than a desired precision. RSDGGS's truncation model produces cells with a defined radius (cell diameter / 2), which is conceptually equivalent to u= but is structural rather than declared. The RSDGGS-to-geo-URI translation proposed in </w:t>
@@ -50550,8 +50920,8 @@
         <w:jc w:val="left"/>
         <w:rPr/>
       </w:pPr>
-      <w:bookmarkStart w:id="899" w:name="section-18.3.2-2"/>
-      <w:bookmarkEnd w:id="899"/>
+      <w:bookmarkStart w:id="900" w:name="section-18.3.2-2"/>
+      <w:bookmarkEnd w:id="900"/>
       <w:r>
         <w:rPr/>
         <w:t>Improvement opportunity -- CRS extensibility: RFC 5870 Section 3.5 defines a crs= parameter for alternative coordinate reference systems (default WGS-84). A future RSDGGS-aware geo URI extension could define crs=rsdggs as a CRS identifier, with the URI carrying the RSDGGS cell hex string as the coordinate value. This would enable geo URI interoperability for RSDGGS cell references in web and messaging contexts without loss of the RSDGGS hierarchical structure. This is a concrete future work item.</w:t>
@@ -50577,8 +50947,8 @@
         <w:rPr/>
       </w:pPr>
       <w:hyperlink w:anchor="section-18.3.3">
-        <w:bookmarkStart w:id="900" w:name="name-rfc-6442-location-conveyance"/>
-        <w:bookmarkEnd w:id="900"/>
+        <w:bookmarkStart w:id="901" w:name="name-rfc-6442-location-conveyance"/>
+        <w:bookmarkEnd w:id="901"/>
         <w:r>
           <w:rPr>
             <w:rStyle w:val="Hyperlink"/>
@@ -50607,8 +50977,8 @@
         <w:jc w:val="left"/>
         <w:rPr/>
       </w:pPr>
-      <w:bookmarkStart w:id="901" w:name="section-18.3.3-1"/>
-      <w:bookmarkEnd w:id="901"/>
+      <w:bookmarkStart w:id="902" w:name="section-18.3.3-1"/>
+      <w:bookmarkEnd w:id="902"/>
       <w:r>
         <w:rPr/>
         <w:t>Improvement opportunity -- 424 error code applicability: RFC 6442 Section 6 defines the 424 (Bad Location Information) SIP response code for cases where location cannot be processed. For RSDGGS-SIP integration (a gateway translating RSDGGS cells to PIDF-LO for emergency services), this error code should be returned when the RSDGGS cell's resolution is insufficient for the requested service (e.g., a 1-byte cell when the SIP application requires country-level precision). Defining an RSDGGS-specific error sub-code for 'insufficient cell resolution' would improve SIP gateway interoperability.</w:t>
@@ -50622,8 +50992,8 @@
         <w:jc w:val="left"/>
         <w:rPr/>
       </w:pPr>
-      <w:bookmarkStart w:id="902" w:name="section-18.3.3-2"/>
-      <w:bookmarkEnd w:id="902"/>
+      <w:bookmarkStart w:id="903" w:name="section-18.3.3-2"/>
+      <w:bookmarkEnd w:id="903"/>
       <w:r>
         <w:rPr/>
         <w:t>Improvement opportunity -- Geolocation-Routing header: RFC 6442 Section 8 defines a Geolocation-Routing SIP header that can be set to 'yes' to indicate that the location should influence routing. RSDGGS geographic IPv6 addresses (</w:t>
@@ -50661,8 +51031,8 @@
         <w:rPr/>
       </w:pPr>
       <w:hyperlink w:anchor="section-18.3.4">
-        <w:bookmarkStart w:id="903" w:name="name-rfc-9179-yang-grouping-for-"/>
-        <w:bookmarkEnd w:id="903"/>
+        <w:bookmarkStart w:id="904" w:name="name-rfc-9179-yang-grouping-for-"/>
+        <w:bookmarkEnd w:id="904"/>
         <w:r>
           <w:rPr>
             <w:rStyle w:val="Hyperlink"/>
@@ -50691,8 +51061,8 @@
         <w:jc w:val="left"/>
         <w:rPr/>
       </w:pPr>
-      <w:bookmarkStart w:id="904" w:name="section-18.3.4-1"/>
-      <w:bookmarkEnd w:id="904"/>
+      <w:bookmarkStart w:id="905" w:name="section-18.3.4-1"/>
+      <w:bookmarkEnd w:id="905"/>
       <w:r>
         <w:rPr/>
         <w:t xml:space="preserve">Improvement opportunity -- Velocity field: RFC 9179 Section 5 defines velocity as a first-class field in the geo-location grouping: v-north, v-east, and v-up in meters/second with 12 fraction-digits precision. RSDGGS </w:t>
@@ -50730,8 +51100,8 @@
         <w:jc w:val="left"/>
         <w:rPr/>
       </w:pPr>
-      <w:bookmarkStart w:id="905" w:name="section-18.3.4-2"/>
-      <w:bookmarkEnd w:id="905"/>
+      <w:bookmarkStart w:id="906" w:name="section-18.3.4-2"/>
+      <w:bookmarkEnd w:id="906"/>
       <w:r>
         <w:rPr/>
         <w:t xml:space="preserve">Improvement opportunity -- Altitude encoding: RFC 9179 defines height above WGS-84 ellipsoid in meters as a decimal64 field. RSDGGS </w:t>
@@ -50769,8 +51139,8 @@
         <w:rPr/>
       </w:pPr>
       <w:hyperlink w:anchor="section-18.3.5">
-        <w:bookmarkStart w:id="906" w:name="name-rfc-9632-rfc-8805-geofeed-d"/>
-        <w:bookmarkEnd w:id="906"/>
+        <w:bookmarkStart w:id="907" w:name="name-rfc-9632-rfc-8805-geofeed-d"/>
+        <w:bookmarkEnd w:id="907"/>
         <w:r>
           <w:rPr>
             <w:rStyle w:val="Hyperlink"/>
@@ -50799,8 +51169,8 @@
         <w:jc w:val="left"/>
         <w:rPr/>
       </w:pPr>
-      <w:bookmarkStart w:id="907" w:name="section-18.3.5-1"/>
-      <w:bookmarkEnd w:id="907"/>
+      <w:bookmarkStart w:id="908" w:name="section-18.3.5-1"/>
+      <w:bookmarkEnd w:id="908"/>
       <w:r>
         <w:rPr/>
         <w:t xml:space="preserve">Improvement opportunity -- RSDGGS-IPv6 geofeed compliance: RFC 8805 Section 2.1 defines the geofeed CSV format with fields: ip_prefix, alpha2code, region, city, postal_code. RFC 9632 Section 4 defines how geofeed files are discovered via RPSL inetnum objects. RSDGGS-IPv6 addresses are inherently geofeed-compatible, as noted in </w:t>
@@ -50838,8 +51208,8 @@
         <w:rPr/>
       </w:pPr>
       <w:hyperlink w:anchor="section-18.3.6">
-        <w:bookmarkStart w:id="908" w:name="name-rfc-5808-location-by-refere"/>
-        <w:bookmarkEnd w:id="908"/>
+        <w:bookmarkStart w:id="909" w:name="name-rfc-5808-location-by-refere"/>
+        <w:bookmarkEnd w:id="909"/>
         <w:r>
           <w:rPr>
             <w:rStyle w:val="Hyperlink"/>
@@ -50868,8 +51238,8 @@
         <w:jc w:val="left"/>
         <w:rPr/>
       </w:pPr>
-      <w:bookmarkStart w:id="909" w:name="section-18.3.6-1"/>
-      <w:bookmarkEnd w:id="909"/>
+      <w:bookmarkStart w:id="910" w:name="section-18.3.6-1"/>
+      <w:bookmarkEnd w:id="910"/>
       <w:r>
         <w:rPr/>
         <w:t>Improvement opportunity -- Dereference latency requirement: RFC 5808 Section 4.3 requires that a location URI dereference return the current location at the time of dereference, not the location at the time the URI was created. This requirement is irrelevant to RSDGGS LbyV (Location-by-Value) encoding, but it highlights a gap: RSDGGS does not define a staleness indicator for the cell index. A device that provisioned its cell at manufacturing time (</w:t>
@@ -50907,8 +51277,8 @@
         <w:rPr/>
       </w:pPr>
       <w:hyperlink w:anchor="section-18.3.7">
-        <w:bookmarkStart w:id="910" w:name="name-rfc-5491-pidf-lo-usage-2009"/>
-        <w:bookmarkEnd w:id="910"/>
+        <w:bookmarkStart w:id="911" w:name="name-rfc-5491-pidf-lo-usage-2009"/>
+        <w:bookmarkEnd w:id="911"/>
         <w:r>
           <w:rPr>
             <w:rStyle w:val="Hyperlink"/>
@@ -50937,8 +51307,8 @@
         <w:jc w:val="left"/>
         <w:rPr/>
       </w:pPr>
-      <w:bookmarkStart w:id="911" w:name="section-18.3.7-1"/>
-      <w:bookmarkEnd w:id="911"/>
+      <w:bookmarkStart w:id="912" w:name="section-18.3.7-1"/>
+      <w:bookmarkEnd w:id="912"/>
       <w:r>
         <w:rPr/>
         <w:t>Improvement opportunity -- Confidence level encoding: RFC 5491 Section 5.5 defines a confidence attribute in PIDF-LO location shapes, expressing the probability (as a percentage) that the described region contains the true location. RSDGGS implicitly expresses 100% confidence that the true location is within the stated cell (by construction of the encoding: the cell is computed from the true coordinate, so it always contains that coordinate). However, for RSDGGS cells derived from peer-assisted localization (</w:t>
@@ -50988,8 +51358,8 @@
         <w:rPr/>
       </w:pPr>
       <w:hyperlink w:anchor="section-18.3.8">
-        <w:bookmarkStart w:id="912" w:name="name-rfc-6280-geopriv-architectu"/>
-        <w:bookmarkEnd w:id="912"/>
+        <w:bookmarkStart w:id="913" w:name="name-rfc-6280-geopriv-architectu"/>
+        <w:bookmarkEnd w:id="913"/>
         <w:r>
           <w:rPr>
             <w:rStyle w:val="Hyperlink"/>
@@ -51018,8 +51388,8 @@
         <w:jc w:val="left"/>
         <w:rPr/>
       </w:pPr>
-      <w:bookmarkStart w:id="913" w:name="section-18.3.8-1"/>
-      <w:bookmarkEnd w:id="913"/>
+      <w:bookmarkStart w:id="914" w:name="section-18.3.8-1"/>
+      <w:bookmarkEnd w:id="914"/>
       <w:r>
         <w:rPr/>
         <w:t>Improvement opportunity -- Rule Maker analog: RFC 6280 Section 5 defines the Rule Maker role: the entity (typically the device owner) who specifies what location information may be disclosed to whom. RSDGGS's structural privacy model (byte truncation) does not support rule-based disclosure. For deployments where different recipients should receive different resolution (e.g., a regulatory compliance server receives 3 bytes, a fleet tracking application receives 7 bytes), an application-layer resolution selection mechanism is needed. Defining a CBOR map structure that carries multiple truncated cells at different resolutions, labeled by intended recipient type, would provide a RSDGGS-native analog to RFC 6280's Rule Maker mechanism without requiring XCAP or a Location Server.</w:t>
@@ -51045,8 +51415,8 @@
         <w:rPr/>
       </w:pPr>
       <w:hyperlink w:anchor="section-18.3.9">
-        <w:bookmarkStart w:id="914" w:name="name-rfc-6772-geolocation-policy-"/>
-        <w:bookmarkEnd w:id="914"/>
+        <w:bookmarkStart w:id="915" w:name="name-rfc-6772-geolocation-policy-"/>
+        <w:bookmarkEnd w:id="915"/>
         <w:r>
           <w:rPr>
             <w:rStyle w:val="Hyperlink"/>
@@ -51075,8 +51445,8 @@
         <w:jc w:val="left"/>
         <w:rPr/>
       </w:pPr>
-      <w:bookmarkStart w:id="915" w:name="section-18.3.9-1"/>
-      <w:bookmarkEnd w:id="915"/>
+      <w:bookmarkStart w:id="916" w:name="section-18.3.9-1"/>
+      <w:bookmarkEnd w:id="916"/>
       <w:r>
         <w:rPr/>
         <w:t xml:space="preserve">Improvement opportunity -- Location-based condition analog: RFC 6772 Section 8 defines location-based conditions in policy rules: rules that apply only when the Target is within a specified geographic region. RSDGGS's RSL (Resolution Sufficiency Level) table in </w:t>
@@ -51126,8 +51496,8 @@
         <w:rPr/>
       </w:pPr>
       <w:hyperlink w:anchor="section-18.4">
-        <w:bookmarkStart w:id="916" w:name="name-summary-of-improvement-oppo"/>
-        <w:bookmarkEnd w:id="916"/>
+        <w:bookmarkStart w:id="917" w:name="name-summary-of-improvement-oppo"/>
+        <w:bookmarkEnd w:id="917"/>
         <w:r>
           <w:rPr>
             <w:rStyle w:val="Hyperlink"/>
@@ -51156,8 +51526,8 @@
         <w:jc w:val="left"/>
         <w:rPr/>
       </w:pPr>
-      <w:bookmarkStart w:id="917" w:name="section-18.4-1"/>
-      <w:bookmarkEnd w:id="917"/>
+      <w:bookmarkStart w:id="918" w:name="section-18.4-1"/>
+      <w:bookmarkEnd w:id="918"/>
       <w:r>
         <w:rPr/>
         <w:t>The following table consolidates all actionable improvement opportunities identified from the cited patents and RFCs, categorized by implementation priority.</w:t>
@@ -51192,9 +51562,9 @@
           <w:szCs w:val="4"/>
         </w:rPr>
       </w:r>
-      <w:bookmarkStart w:id="918" w:name="table-20"/>
       <w:bookmarkStart w:id="919" w:name="table-20"/>
-      <w:bookmarkEnd w:id="919"/>
+      <w:bookmarkStart w:id="920" w:name="table-20"/>
+      <w:bookmarkEnd w:id="920"/>
     </w:p>
     <w:p>
       <w:pPr>
@@ -52597,8 +52967,8 @@
         <w:jc w:val="left"/>
         <w:rPr/>
       </w:pPr>
-      <w:bookmarkStart w:id="920" w:name="section-18.4-3"/>
-      <w:bookmarkEnd w:id="920"/>
+      <w:bookmarkStart w:id="921" w:name="section-18.4-3"/>
+      <w:bookmarkEnd w:id="921"/>
       <w:r>
         <w:rPr/>
         <w:t>The highest-priority improvements -- link quality weighted forwarding, RSDGGS-IPv6 geofeed profile, and the staleness field -- represent concrete enhancements to the core specification that should be incorporated in a later revision of this document. The medium-priority items are suitable for informational notes or future work statements in this document. The low-priority items are candidates for companion specifications or implementation guidance documents.</w:t>
@@ -52624,8 +52994,8 @@
         <w:rPr/>
       </w:pPr>
       <w:hyperlink w:anchor="section-18.5">
-        <w:bookmarkStart w:id="921" w:name="name-recommended-clearance-actio"/>
-        <w:bookmarkEnd w:id="921"/>
+        <w:bookmarkStart w:id="922" w:name="name-recommended-clearance-actio"/>
+        <w:bookmarkEnd w:id="922"/>
         <w:r>
           <w:rPr>
             <w:rStyle w:val="Hyperlink"/>
@@ -52654,8 +53024,8 @@
         <w:jc w:val="left"/>
         <w:rPr/>
       </w:pPr>
-      <w:bookmarkStart w:id="922" w:name="section-18.5-1"/>
-      <w:bookmarkEnd w:id="922"/>
+      <w:bookmarkStart w:id="923" w:name="section-18.5-1"/>
+      <w:bookmarkEnd w:id="923"/>
       <w:r>
         <w:rPr/>
         <w:t>Prior to commercial deployment or patent prosecution based on RSDGGS, the following actions are recommended:</w:t>
@@ -52678,10 +53048,10 @@
         <w:jc w:val="left"/>
         <w:rPr/>
       </w:pPr>
-      <w:bookmarkStart w:id="923" w:name="section-18.5-2"/>
-      <w:bookmarkStart w:id="924" w:name="section-18.5-2.1"/>
-      <w:bookmarkEnd w:id="923"/>
+      <w:bookmarkStart w:id="924" w:name="section-18.5-2"/>
+      <w:bookmarkStart w:id="925" w:name="section-18.5-2.1"/>
       <w:bookmarkEnd w:id="924"/>
+      <w:bookmarkEnd w:id="925"/>
       <w:r>
         <w:rPr/>
         <w:t xml:space="preserve">US 10,812,365 (Northeastern/Krioukov, active until 2037): No infringement risk identified. The hyperbolic geometry, radial centrality, and population-density zone ranking in every claim are completely absent from RSDGGS. No action required beyond documenting the technical distinction in any patent prosecution filings. </w:t>
@@ -52704,8 +53074,8 @@
         <w:jc w:val="left"/>
         <w:rPr/>
       </w:pPr>
-      <w:bookmarkStart w:id="925" w:name="section-18.5-2.2"/>
-      <w:bookmarkEnd w:id="925"/>
+      <w:bookmarkStart w:id="926" w:name="section-18.5-2.2"/>
+      <w:bookmarkEnd w:id="926"/>
       <w:r>
         <w:rPr/>
         <w:t xml:space="preserve">US 11,652,742 (Microsoft, active until 2041): No infringement risk. Ghost routing is a cloud datacenter network verification technique with zero overlap with RSDGGS. No action required. </w:t>
@@ -52728,8 +53098,8 @@
         <w:jc w:val="left"/>
         <w:rPr/>
       </w:pPr>
-      <w:bookmarkStart w:id="926" w:name="section-18.5-2.3"/>
-      <w:bookmarkEnd w:id="926"/>
+      <w:bookmarkStart w:id="927" w:name="section-18.5-2.3"/>
+      <w:bookmarkEnd w:id="927"/>
       <w:r>
         <w:rPr/>
         <w:t xml:space="preserve">US 10,306,400 / application family (active until ~2035): No infringement risk from current RSDGGS specification. RSDGGS MUST NOT add AC power line frequency as a location verification mechanism. Any patent prosecution should distinguish the lookup table architecture using RFC 2009 (1996) as prior art predating US 9,654,965. </w:t>
@@ -52752,8 +53122,8 @@
         <w:jc w:val="left"/>
         <w:rPr/>
       </w:pPr>
-      <w:bookmarkStart w:id="927" w:name="section-18.5-2.4"/>
-      <w:bookmarkEnd w:id="927"/>
+      <w:bookmarkStart w:id="928" w:name="section-18.5-2.4"/>
+      <w:bookmarkEnd w:id="928"/>
       <w:r>
         <w:rPr/>
         <w:t xml:space="preserve">US 4,939,726 and US 5,115,433 (both expired): Freely implementable. The link quality weighted forwarding enhancement described in </w:t>
@@ -52800,11 +53170,35 @@
         <w:jc w:val="left"/>
         <w:rPr/>
       </w:pPr>
-      <w:bookmarkStart w:id="928" w:name="section-18.5-2.5"/>
-      <w:bookmarkEnd w:id="928"/>
-      <w:r>
-        <w:rPr/>
-        <w:t xml:space="preserve">US Application 2010/0002700 (Cellnet, abandoned 2011): No rights in force. Cite it as prior art for geographic routing information carried in network addresses in any patent prosecution based on RSDGGS geographic IPv6 addressing. </w:t>
+      <w:bookmarkStart w:id="929" w:name="section-18.5-2.5"/>
+      <w:bookmarkEnd w:id="929"/>
+      <w:r>
+        <w:rPr/>
+        <w:t>Loop detection and escape for geographic forwarding (</w:t>
+      </w:r>
+      <w:hyperlink w:anchor="s-routing-voids">
+        <w:r>
+          <w:rPr>
+            <w:rStyle w:val="Hyperlink"/>
+          </w:rPr>
+          <w:t>Section 15.4</w:t>
+        </w:r>
+      </w:hyperlink>
+      <w:r>
+        <w:rPr/>
+        <w:t>): each element is published in RFC 6550, RFC 6553 and RFC 6621, in Hengartner et al. [</w:t>
+      </w:r>
+      <w:hyperlink w:anchor="LOOPS">
+        <w:r>
+          <w:rPr>
+            <w:rStyle w:val="Hyperlink"/>
+          </w:rPr>
+          <w:t>LOOPS</w:t>
+        </w:r>
+      </w:hyperlink>
+      <w:r>
+        <w:rPr/>
+        <w:t xml:space="preserve">], or in expired US 5,115,433. Their combination in downward geographic forwarding has not been searched for active patents; the CPC search below should add class H04W40/20 (route selection based on geographic position) for it. </w:t>
       </w:r>
     </w:p>
     <w:p>
@@ -52824,11 +53218,11 @@
         <w:jc w:val="left"/>
         <w:rPr/>
       </w:pPr>
-      <w:bookmarkStart w:id="929" w:name="section-18.5-2.6"/>
-      <w:bookmarkEnd w:id="929"/>
-      <w:r>
-        <w:rPr/>
-        <w:t xml:space="preserve">Search CPC class H04W16/14 (channel plan based on geography) and H04B1/3827 (ISM band operation) for active patents not identified here. This search should be conducted by patent counsel before commercial deployment. </w:t>
+      <w:bookmarkStart w:id="930" w:name="section-18.5-2.6"/>
+      <w:bookmarkEnd w:id="930"/>
+      <w:r>
+        <w:rPr/>
+        <w:t xml:space="preserve">US Application 2010/0002700 (Cellnet, abandoned 2011): No rights in force. Cite it as prior art for geographic routing information carried in network addresses in any patent prosecution based on RSDGGS geographic IPv6 addressing. </w:t>
       </w:r>
     </w:p>
     <w:p>
@@ -52848,11 +53242,11 @@
         <w:jc w:val="left"/>
         <w:rPr/>
       </w:pPr>
-      <w:bookmarkStart w:id="930" w:name="section-18.5-2.7"/>
-      <w:bookmarkEnd w:id="930"/>
-      <w:r>
-        <w:rPr/>
-        <w:t xml:space="preserve">Search for continuation patents based on US Application 2014/0162692 beyond the identified US 10,306,400, US 9,794,738, and US 9,654,965. The application family may have additional continuations with broader claims. </w:t>
+      <w:bookmarkStart w:id="931" w:name="section-18.5-2.7"/>
+      <w:bookmarkEnd w:id="931"/>
+      <w:r>
+        <w:rPr/>
+        <w:t xml:space="preserve">Search CPC class H04W16/14 (channel plan based on geography) and H04B1/3827 (ISM band operation) for active patents not identified here. This search should be conducted by patent counsel before commercial deployment. </w:t>
       </w:r>
     </w:p>
     <w:p>
@@ -52872,11 +53266,11 @@
         <w:jc w:val="left"/>
         <w:rPr/>
       </w:pPr>
-      <w:bookmarkStart w:id="931" w:name="section-18.5-2.8"/>
-      <w:bookmarkEnd w:id="931"/>
-      <w:r>
-        <w:rPr/>
-        <w:t xml:space="preserve">For the RSDGGS-IPv6 geofeed profile (improvement opportunity from RFC 9632 / 8805): verify that no active patent covers the specific combination of hierarchical geographic grid prefix as an IP geofeed CSV entry. This combination appears novel but has not been searched. </w:t>
+      <w:bookmarkStart w:id="932" w:name="section-18.5-2.8"/>
+      <w:bookmarkEnd w:id="932"/>
+      <w:r>
+        <w:rPr/>
+        <w:t xml:space="preserve">Search for continuation patents based on US Application 2014/0162692 beyond the identified US 10,306,400, US 9,794,738, and US 9,654,965. The application family may have additional continuations with broader claims. </w:t>
       </w:r>
     </w:p>
     <w:p>
@@ -52891,12 +53285,36 @@
           <w:tab w:val="left" w:pos="709" w:leader="none"/>
         </w:tabs>
         <w:bidi w:val="0"/>
+        <w:spacing w:before="0" w:after="0"/>
         <w:ind w:hanging="283" w:left="709" w:right="0"/>
         <w:jc w:val="left"/>
         <w:rPr/>
       </w:pPr>
-      <w:bookmarkStart w:id="932" w:name="section-18.5-2.9"/>
-      <w:bookmarkEnd w:id="932"/>
+      <w:bookmarkStart w:id="933" w:name="section-18.5-2.9"/>
+      <w:bookmarkEnd w:id="933"/>
+      <w:r>
+        <w:rPr/>
+        <w:t xml:space="preserve">For the RSDGGS-IPv6 geofeed profile (improvement opportunity from RFC 9632 / 8805): verify that no active patent covers the specific combination of hierarchical geographic grid prefix as an IP geofeed CSV entry. This combination appears novel but has not been searched. </w:t>
+      </w:r>
+    </w:p>
+    <w:p>
+      <w:pPr>
+        <w:pStyle w:val="BodyText"/>
+        <w:numPr>
+          <w:ilvl w:val="0"/>
+          <w:numId w:val="11"/>
+        </w:numPr>
+        <w:tabs>
+          <w:tab w:val="clear" w:pos="709"/>
+          <w:tab w:val="left" w:pos="709" w:leader="none"/>
+        </w:tabs>
+        <w:bidi w:val="0"/>
+        <w:ind w:hanging="283" w:left="709" w:right="0"/>
+        <w:jc w:val="left"/>
+        <w:rPr/>
+      </w:pPr>
+      <w:bookmarkStart w:id="934" w:name="section-18.5-2.10"/>
+      <w:bookmarkEnd w:id="934"/>
       <w:r>
         <w:rPr/>
         <w:t xml:space="preserve">Posting draft-hanley-rsdggs-00 as an Internet-Draft on 20 October 2026 made the subject matter it discloses, including the improvement opportunities listed in </w:t>
@@ -52934,8 +53352,8 @@
         <w:rPr/>
       </w:pPr>
       <w:hyperlink w:anchor="section-19">
-        <w:bookmarkStart w:id="933" w:name="name-reference-implementation-ru"/>
-        <w:bookmarkEnd w:id="933"/>
+        <w:bookmarkStart w:id="935" w:name="name-reference-implementation-ru"/>
+        <w:bookmarkEnd w:id="935"/>
         <w:r>
           <w:rPr>
             <w:rStyle w:val="Hyperlink"/>
@@ -52964,8 +53382,8 @@
         <w:jc w:val="left"/>
         <w:rPr/>
       </w:pPr>
-      <w:bookmarkStart w:id="934" w:name="section-19-1"/>
-      <w:bookmarkEnd w:id="934"/>
+      <w:bookmarkStart w:id="936" w:name="section-19-1"/>
+      <w:bookmarkEnd w:id="936"/>
       <w:r>
         <w:rPr/>
         <w:t>This section provides a complete reference implementation of the RSDGGS encoder in Rust pseudocode. The implementation is structured as a no_std, no_alloc crate suitable for deployment on constrained 802.15.4 devices. All algorithms are expressed in terms that map directly to the mathematical definitions in the preceding sections. Floating-point arithmetic (f64) is used for the encode path; a fixed-point variant suitable for devices without FPU is noted where applicable.</w:t>
@@ -52979,8 +53397,8 @@
         <w:jc w:val="left"/>
         <w:rPr/>
       </w:pPr>
-      <w:bookmarkStart w:id="935" w:name="section-19-2"/>
-      <w:bookmarkEnd w:id="935"/>
+      <w:bookmarkStart w:id="937" w:name="section-19-2"/>
+      <w:bookmarkEnd w:id="937"/>
       <w:r>
         <w:rPr/>
         <w:t xml:space="preserve">This is pseudocode intended to specify behavior precisely. A production implementation would require additional error handling, const evaluation of intermediate values, and platform-specific optimizations. The worked example in </w:t>
@@ -53018,8 +53436,8 @@
         <w:rPr/>
       </w:pPr>
       <w:hyperlink w:anchor="section-19.1">
-        <w:bookmarkStart w:id="936" w:name="name-crate-structure-and-types"/>
-        <w:bookmarkEnd w:id="936"/>
+        <w:bookmarkStart w:id="938" w:name="name-crate-structure-and-types"/>
+        <w:bookmarkEnd w:id="938"/>
         <w:r>
           <w:rPr>
             <w:rStyle w:val="Hyperlink"/>
@@ -53534,8 +53952,8 @@
         <w:rPr/>
       </w:pPr>
       <w:hyperlink w:anchor="section-19.2">
-        <w:bookmarkStart w:id="937" w:name="name-compile-time-constants"/>
-        <w:bookmarkEnd w:id="937"/>
+        <w:bookmarkStart w:id="939" w:name="name-compile-time-constants"/>
+        <w:bookmarkEnd w:id="939"/>
         <w:r>
           <w:rPr>
             <w:rStyle w:val="Hyperlink"/>
@@ -53564,8 +53982,8 @@
         <w:jc w:val="left"/>
         <w:rPr/>
       </w:pPr>
-      <w:bookmarkStart w:id="938" w:name="section-19.2-1"/>
-      <w:bookmarkEnd w:id="938"/>
+      <w:bookmarkStart w:id="940" w:name="section-19.2-1"/>
+      <w:bookmarkEnd w:id="940"/>
       <w:r>
         <w:rPr/>
         <w:t xml:space="preserve">The twelve face center unit vectors and the sixty pentagon vertex unit vectors are precomputed constants derived from the dodecahedron orientation procedure defined in </w:t>
@@ -55876,8 +56294,8 @@
         <w:rPr/>
       </w:pPr>
       <w:hyperlink w:anchor="section-19.3">
-        <w:bookmarkStart w:id="939" w:name="name-coordinate-conversion-primi"/>
-        <w:bookmarkEnd w:id="939"/>
+        <w:bookmarkStart w:id="941" w:name="name-coordinate-conversion-primi"/>
+        <w:bookmarkEnd w:id="941"/>
         <w:r>
           <w:rPr>
             <w:rStyle w:val="Hyperlink"/>
@@ -56751,8 +57169,8 @@
         <w:rPr/>
       </w:pPr>
       <w:hyperlink w:anchor="section-19.4">
-        <w:bookmarkStart w:id="940" w:name="name-face-assignment-2"/>
-        <w:bookmarkEnd w:id="940"/>
+        <w:bookmarkStart w:id="942" w:name="name-face-assignment-2"/>
+        <w:bookmarkEnd w:id="942"/>
         <w:r>
           <w:rPr>
             <w:rStyle w:val="Hyperlink"/>
@@ -56781,8 +57199,8 @@
         <w:jc w:val="left"/>
         <w:rPr/>
       </w:pPr>
-      <w:bookmarkStart w:id="941" w:name="section-19.4-1"/>
-      <w:bookmarkEnd w:id="941"/>
+      <w:bookmarkStart w:id="943" w:name="section-19.4-1"/>
+      <w:bookmarkEnd w:id="943"/>
       <w:r>
         <w:rPr/>
         <w:t>Face assignment uses a nearest-face-center lookup via dot product. The face whose center unit vector has the maximum dot product with the query point is the face containing the point. This is equivalent to finding the face whose center is closest in angular distance, and requires no table lookup or coordinate transformation beyond the initial Cartesian conversion.</w:t>
@@ -57170,8 +57588,8 @@
         <w:rPr/>
       </w:pPr>
       <w:hyperlink w:anchor="section-19.5">
-        <w:bookmarkStart w:id="942" w:name="name-pentagon-sector-assignment"/>
-        <w:bookmarkEnd w:id="942"/>
+        <w:bookmarkStart w:id="944" w:name="name-pentagon-sector-assignment"/>
+        <w:bookmarkEnd w:id="944"/>
         <w:r>
           <w:rPr>
             <w:rStyle w:val="Hyperlink"/>
@@ -57200,8 +57618,8 @@
         <w:jc w:val="left"/>
         <w:rPr/>
       </w:pPr>
-      <w:bookmarkStart w:id="943" w:name="section-19.5-1"/>
-      <w:bookmarkEnd w:id="943"/>
+      <w:bookmarkStart w:id="945" w:name="section-19.5-1"/>
+      <w:bookmarkEnd w:id="945"/>
       <w:r>
         <w:rPr/>
         <w:t>Each face is divided into 5 golden gnomon triangular sectors by connecting the face center to each of the 5 pentagon vertices. The pentagon vertices are the centroids of the 5 icosahedron triangles surrounding the face's corresponding icosahedron vertex. These vertices are precomputed as constants for each face.</w:t>
@@ -57215,8 +57633,8 @@
         <w:jc w:val="left"/>
         <w:rPr/>
       </w:pPr>
-      <w:bookmarkStart w:id="944" w:name="section-19.5-2"/>
-      <w:bookmarkEnd w:id="944"/>
+      <w:bookmarkStart w:id="946" w:name="section-19.5-2"/>
+      <w:bookmarkEnd w:id="946"/>
       <w:r>
         <w:rPr/>
         <w:t>For the reference implementation, the pentagon vertices are derived from the icosahedron face topology at compile time. The sector is found by testing the query point against each of the 5 spherical triangles (face_center, pv[i], pv[(i+1)%5]).</w:t>
@@ -57820,8 +58238,8 @@
         <w:rPr/>
       </w:pPr>
       <w:hyperlink w:anchor="section-19.6">
-        <w:bookmarkStart w:id="945" w:name="name-recursive-subdivision-2"/>
-        <w:bookmarkEnd w:id="945"/>
+        <w:bookmarkStart w:id="947" w:name="name-recursive-subdivision-2"/>
+        <w:bookmarkEnd w:id="947"/>
         <w:r>
           <w:rPr>
             <w:rStyle w:val="Hyperlink"/>
@@ -57850,8 +58268,8 @@
         <w:jc w:val="left"/>
         <w:rPr/>
       </w:pPr>
-      <w:bookmarkStart w:id="946" w:name="section-19.6-1"/>
-      <w:bookmarkEnd w:id="946"/>
+      <w:bookmarkStart w:id="948" w:name="section-19.6-1"/>
+      <w:bookmarkEnd w:id="948"/>
       <w:r>
         <w:rPr/>
         <w:t>Given the face and sector, the query point is recursively assigned to child triangles. At each level the triangle is split into 4 children by connecting the midpoints of all three sides. The child containing the point is identified by the spherical containment test and its 2-bit index is recorded.</w:t>
@@ -57865,8 +58283,8 @@
         <w:jc w:val="left"/>
         <w:rPr/>
       </w:pPr>
-      <w:bookmarkStart w:id="947" w:name="section-19.6-2"/>
-      <w:bookmarkEnd w:id="947"/>
+      <w:bookmarkStart w:id="949" w:name="section-19.6-2"/>
+      <w:bookmarkEnd w:id="949"/>
       <w:r>
         <w:rPr/>
         <w:t>The tangent-frame projection used in the reference encoder (projecting onto the north/east tangent plane at the face center) is replaced here by exact spherical triangle subdivision. The spherical midpoint function is used to compute child vertices exactly on the sphere, eliminating distortion accumulation across subdivision levels.</w:t>
@@ -58815,8 +59233,8 @@
         <w:rPr/>
       </w:pPr>
       <w:hyperlink w:anchor="section-19.7">
-        <w:bookmarkStart w:id="948" w:name="name-top-level-encode-function"/>
-        <w:bookmarkEnd w:id="948"/>
+        <w:bookmarkStart w:id="950" w:name="name-top-level-encode-function"/>
+        <w:bookmarkEnd w:id="950"/>
         <w:r>
           <w:rPr>
             <w:rStyle w:val="Hyperlink"/>
@@ -58845,8 +59263,8 @@
         <w:jc w:val="left"/>
         <w:rPr/>
       </w:pPr>
-      <w:bookmarkStart w:id="949" w:name="section-19.7-1"/>
-      <w:bookmarkEnd w:id="949"/>
+      <w:bookmarkStart w:id="951" w:name="section-19.7-1"/>
+      <w:bookmarkEnd w:id="951"/>
       <w:r>
         <w:rPr/>
         <w:t>The encode function takes a WGS-84 coordinate and a desired length in bytes (1 to 8) and returns a populated RsdggsCell. The length parameter controls the resolution: 1 byte encodes face only; byte 1 carries the 4-bit sector and 2 subdivision levels, and each additional byte adds 4 subdivision levels (2 bits per level).</w:t>
@@ -59704,8 +60122,8 @@
         <w:rPr/>
       </w:pPr>
       <w:hyperlink w:anchor="section-19.8">
-        <w:bookmarkStart w:id="950" w:name="name-decode-function"/>
-        <w:bookmarkEnd w:id="950"/>
+        <w:bookmarkStart w:id="952" w:name="name-decode-function"/>
+        <w:bookmarkEnd w:id="952"/>
         <w:r>
           <w:rPr>
             <w:rStyle w:val="Hyperlink"/>
@@ -59734,8 +60152,8 @@
         <w:jc w:val="left"/>
         <w:rPr/>
       </w:pPr>
-      <w:bookmarkStart w:id="951" w:name="section-19.8-1"/>
-      <w:bookmarkEnd w:id="951"/>
+      <w:bookmarkStart w:id="953" w:name="section-19.8-1"/>
+      <w:bookmarkEnd w:id="953"/>
       <w:r>
         <w:rPr/>
         <w:t>The decode function extracts the face, sector, and subdivision level sequence from a populated RsdggsCell. It does not reconstruct the precise geographic coordinate -- it returns the cell information sufficient for regulatory database lookup. Geographic coordinate recovery (computing the cell center) is a separate operation not required for regulatory compliance.</w:t>
@@ -60389,8 +60807,8 @@
         <w:rPr/>
       </w:pPr>
       <w:hyperlink w:anchor="section-19.9">
-        <w:bookmarkStart w:id="952" w:name="name-boundary-proximity-helper"/>
-        <w:bookmarkEnd w:id="952"/>
+        <w:bookmarkStart w:id="954" w:name="name-boundary-proximity-helper"/>
+        <w:bookmarkEnd w:id="954"/>
         <w:r>
           <w:rPr>
             <w:rStyle w:val="Hyperlink"/>
@@ -60419,8 +60837,8 @@
         <w:jc w:val="left"/>
         <w:rPr/>
       </w:pPr>
-      <w:bookmarkStart w:id="953" w:name="section-19.9-1"/>
-      <w:bookmarkEnd w:id="953"/>
+      <w:bookmarkStart w:id="955" w:name="section-19.9-1"/>
+      <w:bookmarkEnd w:id="955"/>
       <w:r>
         <w:rPr/>
         <w:t xml:space="preserve">The boundary proximity function B(cell, band) from </w:t>
@@ -61138,8 +61556,8 @@
         <w:rPr/>
       </w:pPr>
       <w:hyperlink w:anchor="section-19.10">
-        <w:bookmarkStart w:id="954" w:name="name-worked-example"/>
-        <w:bookmarkEnd w:id="954"/>
+        <w:bookmarkStart w:id="956" w:name="name-worked-example"/>
+        <w:bookmarkEnd w:id="956"/>
         <w:r>
           <w:rPr>
             <w:rStyle w:val="Hyperlink"/>
@@ -61168,8 +61586,8 @@
         <w:jc w:val="left"/>
         <w:rPr/>
       </w:pPr>
-      <w:bookmarkStart w:id="955" w:name="section-19.10-1"/>
-      <w:bookmarkEnd w:id="955"/>
+      <w:bookmarkStart w:id="957" w:name="section-19.10-1"/>
+      <w:bookmarkEnd w:id="957"/>
       <w:r>
         <w:rPr/>
         <w:t>The following verification vector is derived from the reference implementation. Implementations MUST produce identical byte values for this input to be considered conformant.</w:t>
@@ -61713,8 +62131,8 @@
         <w:jc w:val="left"/>
         <w:rPr/>
       </w:pPr>
-      <w:bookmarkStart w:id="956" w:name="section-19.10-3"/>
-      <w:bookmarkEnd w:id="956"/>
+      <w:bookmarkStart w:id="958" w:name="section-19.10-3"/>
+      <w:bookmarkEnd w:id="958"/>
       <w:r>
         <w:rPr/>
         <w:t xml:space="preserve">The worked example demonstrates the encode path from floating-point coordinate to structured byte sequence. The face-0x02 byte is the ITU Region 2 determination made at single-byte resolution. Truncating to 1 byte is sufficient for ISM band availability determination anywhere in North America, as specified in </w:t>
@@ -61740,8 +62158,8 @@
         <w:jc w:val="left"/>
         <w:rPr/>
       </w:pPr>
-      <w:bookmarkStart w:id="957" w:name="section-19.10-4"/>
-      <w:bookmarkEnd w:id="957"/>
+      <w:bookmarkStart w:id="959" w:name="section-19.10-4"/>
+      <w:bookmarkEnd w:id="959"/>
       <w:r>
         <w:rPr/>
         <w:t>The note on Tokyo illustrates that face assignment is driven by geometry: a jurisdiction near a face boundary can span two faces. The regulatory database is the authoritative source for rule set assignment; the face index is a lookup key, and its two low-order bits give the ITU Region of the face's principal population, not an encoding of administrative boundaries.</w:t>
@@ -61767,8 +62185,8 @@
         <w:rPr/>
       </w:pPr>
       <w:hyperlink w:anchor="section-20">
-        <w:bookmarkStart w:id="958" w:name="name-security-considerations"/>
-        <w:bookmarkEnd w:id="958"/>
+        <w:bookmarkStart w:id="960" w:name="name-security-considerations"/>
+        <w:bookmarkEnd w:id="960"/>
         <w:r>
           <w:rPr>
             <w:rStyle w:val="Hyperlink"/>
@@ -61797,8 +62215,8 @@
         <w:jc w:val="left"/>
         <w:rPr/>
       </w:pPr>
-      <w:bookmarkStart w:id="959" w:name="section-20-1"/>
-      <w:bookmarkEnd w:id="959"/>
+      <w:bookmarkStart w:id="961" w:name="section-20-1"/>
+      <w:bookmarkEnd w:id="961"/>
       <w:r>
         <w:rPr/>
         <w:t>RSDGGS indexes are location-bearing data. Implementers must consider the following security properties:</w:t>
@@ -61812,8 +62230,8 @@
         <w:jc w:val="left"/>
         <w:rPr/>
       </w:pPr>
-      <w:bookmarkStart w:id="960" w:name="section-20-2"/>
-      <w:bookmarkEnd w:id="960"/>
+      <w:bookmarkStart w:id="962" w:name="section-20-2"/>
+      <w:bookmarkEnd w:id="962"/>
       <w:r>
         <w:rPr/>
         <w:t xml:space="preserve">Location Privacy: The variable-length encoding provides a natural privacy gradient. Implementations SHOULD share the minimum resolution necessary for the intended purpose. For regulatory validation purposes, 1 to 3 octets is typically sufficient and reveals no more than country-level location. Full 8-octet indexes SHOULD be treated as sensitive location data. </w:t>
@@ -61839,8 +62257,8 @@
         <w:jc w:val="left"/>
         <w:rPr/>
       </w:pPr>
-      <w:bookmarkStart w:id="961" w:name="section-20-3"/>
-      <w:bookmarkEnd w:id="961"/>
+      <w:bookmarkStart w:id="963" w:name="section-20-3"/>
+      <w:bookmarkEnd w:id="963"/>
       <w:r>
         <w:rPr/>
         <w:t xml:space="preserve">Beacon Authenticity: The peer-assisted discovery mechanism defined in </w:t>
@@ -61866,8 +62284,47 @@
         <w:jc w:val="left"/>
         <w:rPr/>
       </w:pPr>
-      <w:bookmarkStart w:id="962" w:name="section-20-4"/>
-      <w:bookmarkEnd w:id="962"/>
+      <w:bookmarkStart w:id="964" w:name="section-20-4"/>
+      <w:bookmarkEnd w:id="964"/>
+      <w:r>
+        <w:rPr/>
+        <w:t>Forwarding Integrity: Geographic forwarding (</w:t>
+      </w:r>
+      <w:hyperlink w:anchor="s-geographic-greedy-forwarding">
+        <w:r>
+          <w:rPr>
+            <w:rStyle w:val="Hyperlink"/>
+          </w:rPr>
+          <w:t>Section 15.3</w:t>
+        </w:r>
+      </w:hyperlink>
+      <w:r>
+        <w:rPr/>
+        <w:t xml:space="preserve">) trusts the cells neighbors advertise. A node that advertises a false cell can attract traffic for that area and drop or misdirect it, as a false beacon can in peer-assisted discovery. The loop table of </w:t>
+      </w:r>
+      <w:hyperlink w:anchor="s-routing-voids">
+        <w:r>
+          <w:rPr>
+            <w:rStyle w:val="Hyperlink"/>
+          </w:rPr>
+          <w:t>Section 15.4</w:t>
+        </w:r>
+      </w:hyperlink>
+      <w:r>
+        <w:rPr/>
+        <w:t xml:space="preserve"> can be attacked too: replaying a packet makes it look trapped and diverts it from its best next hop, and a flood of distinct packets can exhaust the table. Implementations SHOULD bound the table, expire entries after the maximum packet lifetime, and, when the table is full, rely on the Hop Limit rather than discard packets they cannot record. Link-layer security (IEEE 802.15.4 frame security) limits these attacks to nodes holding network keys.</w:t>
+      </w:r>
+    </w:p>
+    <w:p>
+      <w:pPr>
+        <w:pStyle w:val="BodyText"/>
+        <w:bidi w:val="0"/>
+        <w:ind w:hanging="0" w:left="0" w:right="0"/>
+        <w:jc w:val="left"/>
+        <w:rPr/>
+      </w:pPr>
+      <w:bookmarkStart w:id="965" w:name="section-20-5"/>
+      <w:bookmarkEnd w:id="965"/>
       <w:r>
         <w:rPr/>
         <w:t>Database Integrity: The regulatory database is a critical dependency. Database updates SHOULD be authenticated using code-signing mechanisms. Implementations SHOULD validate database integrity at boot using a stored hash.</w:t>
@@ -61881,8 +62338,8 @@
         <w:jc w:val="left"/>
         <w:rPr/>
       </w:pPr>
-      <w:bookmarkStart w:id="963" w:name="section-20-5"/>
-      <w:bookmarkEnd w:id="963"/>
+      <w:bookmarkStart w:id="966" w:name="section-20-6"/>
+      <w:bookmarkEnd w:id="966"/>
       <w:r>
         <w:rPr/>
         <w:t>Regulatory Compliance: RSDGGS is an informational tool to assist devices in determining applicable regulatory parameters. It does not constitute a formal regulatory authorization. Operators remain responsible for ensuring their devices comply with applicable regulations in their jurisdiction of deployment, independent of the RSDGGS-derived rule set.</w:t>
@@ -61896,8 +62353,8 @@
         <w:jc w:val="left"/>
         <w:rPr/>
       </w:pPr>
-      <w:bookmarkStart w:id="964" w:name="section-20-6"/>
-      <w:bookmarkEnd w:id="964"/>
+      <w:bookmarkStart w:id="967" w:name="section-20-7"/>
+      <w:bookmarkEnd w:id="967"/>
       <w:r>
         <w:rPr/>
         <w:t xml:space="preserve">Database Currency: The regulatory database is a snapshot of regulations as of its compilation date. Spectrum regulations change through national legislation, WRC decisions, and bilateral coordination agreements. Implementations MUST NOT treat an embedded database as permanently authoritative. Deployments in jurisdictions undergoing active regulatory change are at elevated risk of non-compliance if database updates are unavailable. See </w:t>
@@ -61923,8 +62380,8 @@
         <w:jc w:val="left"/>
         <w:rPr/>
       </w:pPr>
-      <w:bookmarkStart w:id="965" w:name="section-20-7"/>
-      <w:bookmarkEnd w:id="965"/>
+      <w:bookmarkStart w:id="968" w:name="section-20-8"/>
+      <w:bookmarkEnd w:id="968"/>
       <w:r>
         <w:rPr/>
         <w:t>Legacy and Long-Lived Devices: Devices deployed for extended operational lifetimes, common in industrial IoT and infrastructure monitoring, face growing risk of regulatory non-compliance as their embedded databases age. Operators of long-lived deployments SHOULD establish a database maintenance program and SHOULD prefer implementations that support authenticated over-the-air database updates. Devices that cannot receive updates SHOULD be audited against current regulations at intervals appropriate to the regulatory environment of the deployment region.</w:t>
@@ -61938,8 +62395,8 @@
         <w:jc w:val="left"/>
         <w:rPr/>
       </w:pPr>
-      <w:bookmarkStart w:id="966" w:name="section-20-8"/>
-      <w:bookmarkEnd w:id="966"/>
+      <w:bookmarkStart w:id="969" w:name="section-20-9"/>
+      <w:bookmarkEnd w:id="969"/>
       <w:r>
         <w:rPr/>
         <w:t xml:space="preserve">Storage-Constrained Devices: Highly constrained devices that cannot store a complete regulatory database for all RSDGGS faces MUST implement a defined failure mode for cells with no database entry: either refuse transmission, adopt the most restrictive rule set available, or escalate to a trusted peer for regulatory context via the bootstrap mechanism in </w:t>
@@ -61977,8 +62434,8 @@
         <w:rPr/>
       </w:pPr>
       <w:hyperlink w:anchor="section-21">
-        <w:bookmarkStart w:id="967" w:name="name-iana-considerations"/>
-        <w:bookmarkEnd w:id="967"/>
+        <w:bookmarkStart w:id="970" w:name="name-iana-considerations"/>
+        <w:bookmarkEnd w:id="970"/>
         <w:r>
           <w:rPr>
             <w:rStyle w:val="Hyperlink"/>
@@ -62007,8 +62464,8 @@
         <w:jc w:val="left"/>
         <w:rPr/>
       </w:pPr>
-      <w:bookmarkStart w:id="968" w:name="section-21-1"/>
-      <w:bookmarkEnd w:id="968"/>
+      <w:bookmarkStart w:id="971" w:name="section-21-1"/>
+      <w:bookmarkEnd w:id="971"/>
       <w:r>
         <w:rPr/>
         <w:t>This document requests registration of a CBOR tag for the RSDGGS cell type in the CBOR Tags registry. The requested tag value is in the first-come-first-served range. The tag is used to identify a CBOR byte string as an RSDGGS cell index as defined in this document.</w:t>
@@ -62022,8 +62479,8 @@
         <w:jc w:val="left"/>
         <w:rPr/>
       </w:pPr>
-      <w:bookmarkStart w:id="969" w:name="section-21-2"/>
-      <w:bookmarkEnd w:id="969"/>
+      <w:bookmarkStart w:id="972" w:name="section-21-2"/>
+      <w:bookmarkEnd w:id="972"/>
       <w:r>
         <w:rPr/>
         <w:t>This document requests no IPv6 address allocation (</w:t>
@@ -62082,9 +62539,9 @@
           <w:szCs w:val="4"/>
         </w:rPr>
       </w:r>
-      <w:bookmarkStart w:id="970" w:name="table-21"/>
-      <w:bookmarkStart w:id="971" w:name="table-21"/>
-      <w:bookmarkEnd w:id="971"/>
+      <w:bookmarkStart w:id="973" w:name="table-21"/>
+      <w:bookmarkStart w:id="974" w:name="table-21"/>
+      <w:bookmarkEnd w:id="974"/>
     </w:p>
     <w:p>
       <w:pPr>
@@ -62399,8 +62856,8 @@
         <w:rPr/>
       </w:pPr>
       <w:hyperlink w:anchor="section-22">
-        <w:bookmarkStart w:id="972" w:name="name-normative-references"/>
-        <w:bookmarkEnd w:id="972"/>
+        <w:bookmarkStart w:id="975" w:name="name-normative-references"/>
+        <w:bookmarkEnd w:id="975"/>
         <w:r>
           <w:rPr>
             <w:rStyle w:val="Hyperlink"/>
@@ -62429,8 +62886,8 @@
         <w:jc w:val="left"/>
         <w:rPr/>
       </w:pPr>
-      <w:bookmarkStart w:id="973" w:name="RFC2119"/>
-      <w:bookmarkEnd w:id="973"/>
+      <w:bookmarkStart w:id="976" w:name="RFC2119"/>
+      <w:bookmarkEnd w:id="976"/>
       <w:r>
         <w:rPr/>
         <w:t xml:space="preserve">[RFC2119] </w:t>
@@ -62468,8 +62925,8 @@
         <w:jc w:val="left"/>
         <w:rPr/>
       </w:pPr>
-      <w:bookmarkStart w:id="974" w:name="RFC8174"/>
-      <w:bookmarkEnd w:id="974"/>
+      <w:bookmarkStart w:id="977" w:name="RFC8174"/>
+      <w:bookmarkEnd w:id="977"/>
       <w:r>
         <w:rPr/>
         <w:t xml:space="preserve">[RFC8174] </w:t>
@@ -62507,8 +62964,8 @@
         <w:jc w:val="left"/>
         <w:rPr/>
       </w:pPr>
-      <w:bookmarkStart w:id="975" w:name="RFC8949"/>
-      <w:bookmarkEnd w:id="975"/>
+      <w:bookmarkStart w:id="978" w:name="RFC8949"/>
+      <w:bookmarkEnd w:id="978"/>
       <w:r>
         <w:rPr/>
         <w:t xml:space="preserve">[RFC8949] </w:t>
@@ -62546,8 +63003,8 @@
         <w:jc w:val="left"/>
         <w:rPr/>
       </w:pPr>
-      <w:bookmarkStart w:id="976" w:name="RFC8610"/>
-      <w:bookmarkEnd w:id="976"/>
+      <w:bookmarkStart w:id="979" w:name="RFC8610"/>
+      <w:bookmarkEnd w:id="979"/>
       <w:r>
         <w:rPr/>
         <w:t xml:space="preserve">[RFC8610] </w:t>
@@ -62598,8 +63055,8 @@
         <w:rPr/>
       </w:pPr>
       <w:hyperlink w:anchor="section-23">
-        <w:bookmarkStart w:id="977" w:name="name-informative-references"/>
-        <w:bookmarkEnd w:id="977"/>
+        <w:bookmarkStart w:id="980" w:name="name-informative-references"/>
+        <w:bookmarkEnd w:id="980"/>
         <w:r>
           <w:rPr>
             <w:rStyle w:val="Hyperlink"/>
@@ -62628,8 +63085,8 @@
         <w:jc w:val="left"/>
         <w:rPr/>
       </w:pPr>
-      <w:bookmarkStart w:id="978" w:name="H3"/>
-      <w:bookmarkEnd w:id="978"/>
+      <w:bookmarkStart w:id="981" w:name="H3"/>
+      <w:bookmarkEnd w:id="981"/>
       <w:r>
         <w:rPr/>
         <w:t xml:space="preserve">[H3] </w:t>
@@ -62655,8 +63112,8 @@
         <w:jc w:val="left"/>
         <w:rPr/>
       </w:pPr>
-      <w:bookmarkStart w:id="979" w:name="ITU-RR"/>
-      <w:bookmarkEnd w:id="979"/>
+      <w:bookmarkStart w:id="982" w:name="ITU-RR"/>
+      <w:bookmarkEnd w:id="982"/>
       <w:r>
         <w:rPr/>
         <w:t xml:space="preserve">[ITU-RR] </w:t>
@@ -62682,8 +63139,8 @@
         <w:jc w:val="left"/>
         <w:rPr/>
       </w:pPr>
-      <w:bookmarkStart w:id="980" w:name="RFC5491"/>
-      <w:bookmarkEnd w:id="980"/>
+      <w:bookmarkStart w:id="983" w:name="RFC5491"/>
+      <w:bookmarkEnd w:id="983"/>
       <w:r>
         <w:rPr/>
         <w:t xml:space="preserve">[RFC5491] </w:t>
@@ -62721,8 +63178,8 @@
         <w:jc w:val="left"/>
         <w:rPr/>
       </w:pPr>
-      <w:bookmarkStart w:id="981" w:name="RFC5808"/>
-      <w:bookmarkEnd w:id="981"/>
+      <w:bookmarkStart w:id="984" w:name="RFC5808"/>
+      <w:bookmarkEnd w:id="984"/>
       <w:r>
         <w:rPr/>
         <w:t xml:space="preserve">[RFC5808] </w:t>
@@ -62760,8 +63217,8 @@
         <w:jc w:val="left"/>
         <w:rPr/>
       </w:pPr>
-      <w:bookmarkStart w:id="982" w:name="RFC6280"/>
-      <w:bookmarkEnd w:id="982"/>
+      <w:bookmarkStart w:id="985" w:name="RFC6280"/>
+      <w:bookmarkEnd w:id="985"/>
       <w:r>
         <w:rPr/>
         <w:t xml:space="preserve">[RFC6280] </w:t>
@@ -62799,8 +63256,8 @@
         <w:jc w:val="left"/>
         <w:rPr/>
       </w:pPr>
-      <w:bookmarkStart w:id="983" w:name="RFC6772"/>
-      <w:bookmarkEnd w:id="983"/>
+      <w:bookmarkStart w:id="986" w:name="RFC6772"/>
+      <w:bookmarkEnd w:id="986"/>
       <w:r>
         <w:rPr/>
         <w:t xml:space="preserve">[RFC6772] </w:t>
@@ -62838,8 +63295,8 @@
         <w:jc w:val="left"/>
         <w:rPr/>
       </w:pPr>
-      <w:bookmarkStart w:id="984" w:name="RFC8805"/>
-      <w:bookmarkEnd w:id="984"/>
+      <w:bookmarkStart w:id="987" w:name="RFC8805"/>
+      <w:bookmarkEnd w:id="987"/>
       <w:r>
         <w:rPr/>
         <w:t xml:space="preserve">[RFC8805] </w:t>
@@ -62877,8 +63334,8 @@
         <w:jc w:val="left"/>
         <w:rPr/>
       </w:pPr>
-      <w:bookmarkStart w:id="985" w:name="RFC2009"/>
-      <w:bookmarkEnd w:id="985"/>
+      <w:bookmarkStart w:id="988" w:name="RFC2009"/>
+      <w:bookmarkEnd w:id="988"/>
       <w:r>
         <w:rPr/>
         <w:t xml:space="preserve">[RFC2009] </w:t>
@@ -62916,8 +63373,8 @@
         <w:jc w:val="left"/>
         <w:rPr/>
       </w:pPr>
-      <w:bookmarkStart w:id="986" w:name="RFC5870"/>
-      <w:bookmarkEnd w:id="986"/>
+      <w:bookmarkStart w:id="989" w:name="RFC5870"/>
+      <w:bookmarkEnd w:id="989"/>
       <w:r>
         <w:rPr/>
         <w:t xml:space="preserve">[RFC5870] </w:t>
@@ -62955,8 +63412,8 @@
         <w:jc w:val="left"/>
         <w:rPr/>
       </w:pPr>
-      <w:bookmarkStart w:id="987" w:name="RFC6442"/>
-      <w:bookmarkEnd w:id="987"/>
+      <w:bookmarkStart w:id="990" w:name="RFC6442"/>
+      <w:bookmarkEnd w:id="990"/>
       <w:r>
         <w:rPr/>
         <w:t xml:space="preserve">[RFC6442] </w:t>
@@ -62994,8 +63451,8 @@
         <w:jc w:val="left"/>
         <w:rPr/>
       </w:pPr>
-      <w:bookmarkStart w:id="988" w:name="RFC9179"/>
-      <w:bookmarkEnd w:id="988"/>
+      <w:bookmarkStart w:id="991" w:name="RFC9179"/>
+      <w:bookmarkEnd w:id="991"/>
       <w:r>
         <w:rPr/>
         <w:t xml:space="preserve">[RFC9179] </w:t>
@@ -63033,8 +63490,8 @@
         <w:jc w:val="left"/>
         <w:rPr/>
       </w:pPr>
-      <w:bookmarkStart w:id="989" w:name="RFC9632"/>
-      <w:bookmarkEnd w:id="989"/>
+      <w:bookmarkStart w:id="992" w:name="RFC9632"/>
+      <w:bookmarkEnd w:id="992"/>
       <w:r>
         <w:rPr/>
         <w:t xml:space="preserve">[RFC9632] </w:t>
@@ -63072,8 +63529,8 @@
         <w:jc w:val="left"/>
         <w:rPr/>
       </w:pPr>
-      <w:bookmarkStart w:id="990" w:name="ETSI-220"/>
-      <w:bookmarkEnd w:id="990"/>
+      <w:bookmarkStart w:id="993" w:name="ETSI-220"/>
+      <w:bookmarkEnd w:id="993"/>
       <w:r>
         <w:rPr/>
         <w:t xml:space="preserve">[ETSI-220] </w:t>
@@ -63099,8 +63556,8 @@
         <w:jc w:val="left"/>
         <w:rPr/>
       </w:pPr>
-      <w:bookmarkStart w:id="991" w:name="FCC-15"/>
-      <w:bookmarkEnd w:id="991"/>
+      <w:bookmarkStart w:id="994" w:name="FCC-15"/>
+      <w:bookmarkEnd w:id="994"/>
       <w:r>
         <w:rPr/>
         <w:t xml:space="preserve">[FCC-15] </w:t>
@@ -63126,8 +63583,8 @@
         <w:jc w:val="left"/>
         <w:rPr/>
       </w:pPr>
-      <w:bookmarkStart w:id="992" w:name="ARIB-T108"/>
-      <w:bookmarkEnd w:id="992"/>
+      <w:bookmarkStart w:id="995" w:name="ARIB-T108"/>
+      <w:bookmarkEnd w:id="995"/>
       <w:r>
         <w:rPr/>
         <w:t xml:space="preserve">[ARIB-T108] </w:t>
@@ -63153,8 +63610,8 @@
         <w:jc w:val="left"/>
         <w:rPr/>
       </w:pPr>
-      <w:bookmarkStart w:id="993" w:name="GFG"/>
-      <w:bookmarkEnd w:id="993"/>
+      <w:bookmarkStart w:id="996" w:name="GFG"/>
+      <w:bookmarkEnd w:id="996"/>
       <w:r>
         <w:rPr/>
         <w:t xml:space="preserve">[GFG] </w:t>
@@ -63192,8 +63649,8 @@
         <w:jc w:val="left"/>
         <w:rPr/>
       </w:pPr>
-      <w:bookmarkStart w:id="994" w:name="CLDP"/>
-      <w:bookmarkEnd w:id="994"/>
+      <w:bookmarkStart w:id="997" w:name="CLDP"/>
+      <w:bookmarkEnd w:id="997"/>
       <w:r>
         <w:rPr/>
         <w:t xml:space="preserve">[CLDP] </w:t>
@@ -63219,8 +63676,8 @@
         <w:jc w:val="left"/>
         <w:rPr/>
       </w:pPr>
-      <w:bookmarkStart w:id="995" w:name="GPSR"/>
-      <w:bookmarkEnd w:id="995"/>
+      <w:bookmarkStart w:id="998" w:name="GPSR"/>
+      <w:bookmarkEnd w:id="998"/>
       <w:r>
         <w:rPr/>
         <w:t xml:space="preserve">[GPSR] </w:t>
@@ -63246,8 +63703,8 @@
         <w:jc w:val="left"/>
         <w:rPr/>
       </w:pPr>
-      <w:bookmarkStart w:id="996" w:name="IEEE802154a"/>
-      <w:bookmarkEnd w:id="996"/>
+      <w:bookmarkStart w:id="999" w:name="IEEE802154a"/>
+      <w:bookmarkEnd w:id="999"/>
       <w:r>
         <w:rPr/>
         <w:t xml:space="preserve">[IEEE802154a] </w:t>
@@ -63273,8 +63730,8 @@
         <w:jc w:val="left"/>
         <w:rPr/>
       </w:pPr>
-      <w:bookmarkStart w:id="997" w:name="IEEE802154z"/>
-      <w:bookmarkEnd w:id="997"/>
+      <w:bookmarkStart w:id="1000" w:name="IEEE802154z"/>
+      <w:bookmarkEnd w:id="1000"/>
       <w:r>
         <w:rPr/>
         <w:t xml:space="preserve">[IEEE802154z] </w:t>
@@ -63300,8 +63757,8 @@
         <w:jc w:val="left"/>
         <w:rPr/>
       </w:pPr>
-      <w:bookmarkStart w:id="998" w:name="OLC"/>
-      <w:bookmarkEnd w:id="998"/>
+      <w:bookmarkStart w:id="1001" w:name="OLC"/>
+      <w:bookmarkEnd w:id="1001"/>
       <w:r>
         <w:rPr/>
         <w:t xml:space="preserve">[OLC] </w:t>
@@ -63327,8 +63784,8 @@
         <w:jc w:val="left"/>
         <w:rPr/>
       </w:pPr>
-      <w:bookmarkStart w:id="999" w:name="RFC6890"/>
-      <w:bookmarkEnd w:id="999"/>
+      <w:bookmarkStart w:id="1002" w:name="RFC6890"/>
+      <w:bookmarkEnd w:id="1002"/>
       <w:r>
         <w:rPr/>
         <w:t xml:space="preserve">[RFC6890] </w:t>
@@ -63366,8 +63823,8 @@
         <w:jc w:val="left"/>
         <w:rPr/>
       </w:pPr>
-      <w:bookmarkStart w:id="1000" w:name="S2"/>
-      <w:bookmarkEnd w:id="1000"/>
+      <w:bookmarkStart w:id="1003" w:name="S2"/>
+      <w:bookmarkEnd w:id="1003"/>
       <w:r>
         <w:rPr/>
         <w:t xml:space="preserve">[S2] </w:t>
@@ -63393,8 +63850,8 @@
         <w:jc w:val="left"/>
         <w:rPr/>
       </w:pPr>
-      <w:bookmarkStart w:id="1001" w:name="RFC8628"/>
-      <w:bookmarkEnd w:id="1001"/>
+      <w:bookmarkStart w:id="1004" w:name="RFC8628"/>
+      <w:bookmarkEnd w:id="1004"/>
       <w:r>
         <w:rPr/>
         <w:t xml:space="preserve">[RFC8628] </w:t>
@@ -63432,8 +63889,8 @@
         <w:jc w:val="left"/>
         <w:rPr/>
       </w:pPr>
-      <w:bookmarkStart w:id="1002" w:name="RFC3849"/>
-      <w:bookmarkEnd w:id="1002"/>
+      <w:bookmarkStart w:id="1005" w:name="RFC3849"/>
+      <w:bookmarkEnd w:id="1005"/>
       <w:r>
         <w:rPr/>
         <w:t xml:space="preserve">[RFC3849] </w:t>
@@ -63471,8 +63928,8 @@
         <w:jc w:val="left"/>
         <w:rPr/>
       </w:pPr>
-      <w:bookmarkStart w:id="1003" w:name="RFC4291"/>
-      <w:bookmarkEnd w:id="1003"/>
+      <w:bookmarkStart w:id="1006" w:name="RFC4291"/>
+      <w:bookmarkEnd w:id="1006"/>
       <w:r>
         <w:rPr/>
         <w:t xml:space="preserve">[RFC4291] </w:t>
@@ -63510,8 +63967,8 @@
         <w:jc w:val="left"/>
         <w:rPr/>
       </w:pPr>
-      <w:bookmarkStart w:id="1004" w:name="RFC4862"/>
-      <w:bookmarkEnd w:id="1004"/>
+      <w:bookmarkStart w:id="1007" w:name="RFC4862"/>
+      <w:bookmarkEnd w:id="1007"/>
       <w:r>
         <w:rPr/>
         <w:t xml:space="preserve">[RFC4862] </w:t>
@@ -63549,8 +64006,8 @@
         <w:jc w:val="left"/>
         <w:rPr/>
       </w:pPr>
-      <w:bookmarkStart w:id="1005" w:name="RFC4944"/>
-      <w:bookmarkEnd w:id="1005"/>
+      <w:bookmarkStart w:id="1008" w:name="RFC4944"/>
+      <w:bookmarkEnd w:id="1008"/>
       <w:r>
         <w:rPr/>
         <w:t xml:space="preserve">[RFC4944] </w:t>
@@ -63588,8 +64045,8 @@
         <w:jc w:val="left"/>
         <w:rPr/>
       </w:pPr>
-      <w:bookmarkStart w:id="1006" w:name="RFC6282"/>
-      <w:bookmarkEnd w:id="1006"/>
+      <w:bookmarkStart w:id="1009" w:name="RFC6282"/>
+      <w:bookmarkEnd w:id="1009"/>
       <w:r>
         <w:rPr/>
         <w:t xml:space="preserve">[RFC6282] </w:t>
@@ -63627,8 +64084,8 @@
         <w:jc w:val="left"/>
         <w:rPr/>
       </w:pPr>
-      <w:bookmarkStart w:id="1007" w:name="RFC6550"/>
-      <w:bookmarkEnd w:id="1007"/>
+      <w:bookmarkStart w:id="1010" w:name="RFC6550"/>
+      <w:bookmarkEnd w:id="1010"/>
       <w:r>
         <w:rPr/>
         <w:t xml:space="preserve">[RFC6550] </w:t>
@@ -63666,8 +64123,8 @@
         <w:jc w:val="left"/>
         <w:rPr/>
       </w:pPr>
-      <w:bookmarkStart w:id="1008" w:name="RFC6775"/>
-      <w:bookmarkEnd w:id="1008"/>
+      <w:bookmarkStart w:id="1011" w:name="RFC6775"/>
+      <w:bookmarkEnd w:id="1011"/>
       <w:r>
         <w:rPr/>
         <w:t xml:space="preserve">[RFC6775] </w:t>
@@ -63705,8 +64162,8 @@
         <w:jc w:val="left"/>
         <w:rPr/>
       </w:pPr>
-      <w:bookmarkStart w:id="1009" w:name="RFC7217"/>
-      <w:bookmarkEnd w:id="1009"/>
+      <w:bookmarkStart w:id="1012" w:name="RFC7217"/>
+      <w:bookmarkEnd w:id="1012"/>
       <w:r>
         <w:rPr/>
         <w:t xml:space="preserve">[RFC7217] </w:t>
@@ -63744,8 +64201,8 @@
         <w:jc w:val="left"/>
         <w:rPr/>
       </w:pPr>
-      <w:bookmarkStart w:id="1010" w:name="RFC7721"/>
-      <w:bookmarkEnd w:id="1010"/>
+      <w:bookmarkStart w:id="1013" w:name="RFC7721"/>
+      <w:bookmarkEnd w:id="1013"/>
       <w:r>
         <w:rPr/>
         <w:t xml:space="preserve">[RFC7721] </w:t>
@@ -63783,8 +64240,8 @@
         <w:jc w:val="left"/>
         <w:rPr/>
       </w:pPr>
-      <w:bookmarkStart w:id="1011" w:name="RFC8064"/>
-      <w:bookmarkEnd w:id="1011"/>
+      <w:bookmarkStart w:id="1014" w:name="RFC8064"/>
+      <w:bookmarkEnd w:id="1014"/>
       <w:r>
         <w:rPr/>
         <w:t xml:space="preserve">[RFC8064] </w:t>
@@ -63822,8 +64279,8 @@
         <w:jc w:val="left"/>
         <w:rPr/>
       </w:pPr>
-      <w:bookmarkStart w:id="1012" w:name="RFC6552"/>
-      <w:bookmarkEnd w:id="1012"/>
+      <w:bookmarkStart w:id="1015" w:name="RFC6552"/>
+      <w:bookmarkEnd w:id="1015"/>
       <w:r>
         <w:rPr/>
         <w:t xml:space="preserve">[RFC6552] </w:t>
@@ -63861,8 +64318,8 @@
         <w:jc w:val="left"/>
         <w:rPr/>
       </w:pPr>
-      <w:bookmarkStart w:id="1013" w:name="RFC6553"/>
-      <w:bookmarkEnd w:id="1013"/>
+      <w:bookmarkStart w:id="1016" w:name="RFC6553"/>
+      <w:bookmarkEnd w:id="1016"/>
       <w:r>
         <w:rPr/>
         <w:t xml:space="preserve">[RFC6553] </w:t>
@@ -63900,8 +64357,8 @@
         <w:jc w:val="left"/>
         <w:rPr/>
       </w:pPr>
-      <w:bookmarkStart w:id="1014" w:name="RFC6621"/>
-      <w:bookmarkEnd w:id="1014"/>
+      <w:bookmarkStart w:id="1017" w:name="RFC6621"/>
+      <w:bookmarkEnd w:id="1017"/>
       <w:r>
         <w:rPr/>
         <w:t xml:space="preserve">[RFC6621] </w:t>
@@ -63939,8 +64396,8 @@
         <w:jc w:val="left"/>
         <w:rPr/>
       </w:pPr>
-      <w:bookmarkStart w:id="1015" w:name="LOOPS"/>
-      <w:bookmarkEnd w:id="1015"/>
+      <w:bookmarkStart w:id="1018" w:name="LOOPS"/>
+      <w:bookmarkEnd w:id="1018"/>
       <w:r>
         <w:rPr/>
         <w:t xml:space="preserve">[LOOPS] </w:t>
@@ -63978,8 +64435,8 @@
         <w:jc w:val="left"/>
         <w:rPr/>
       </w:pPr>
-      <w:bookmarkStart w:id="1016" w:name="RFC8200"/>
-      <w:bookmarkEnd w:id="1016"/>
+      <w:bookmarkStart w:id="1019" w:name="RFC8200"/>
+      <w:bookmarkEnd w:id="1019"/>
       <w:r>
         <w:rPr/>
         <w:t xml:space="preserve">[RFC8200] </w:t>
@@ -64017,8 +64474,8 @@
         <w:jc w:val="left"/>
         <w:rPr/>
       </w:pPr>
-      <w:bookmarkStart w:id="1017" w:name="RFC8126"/>
-      <w:bookmarkEnd w:id="1017"/>
+      <w:bookmarkStart w:id="1020" w:name="RFC8126"/>
+      <w:bookmarkEnd w:id="1020"/>
       <w:r>
         <w:rPr/>
         <w:t xml:space="preserve">[RFC8126] </w:t>
@@ -64056,8 +64513,8 @@
         <w:jc w:val="left"/>
         <w:rPr/>
       </w:pPr>
-      <w:bookmarkStart w:id="1018" w:name="RFC8505"/>
-      <w:bookmarkEnd w:id="1018"/>
+      <w:bookmarkStart w:id="1021" w:name="RFC8505"/>
+      <w:bookmarkEnd w:id="1021"/>
       <w:r>
         <w:rPr/>
         <w:t xml:space="preserve">[RFC8505] </w:t>
@@ -64108,8 +64565,8 @@
         <w:rPr/>
       </w:pPr>
       <w:hyperlink w:anchor="name-authors-address">
-        <w:bookmarkStart w:id="1019" w:name="name-authors-address"/>
-        <w:bookmarkEnd w:id="1019"/>
+        <w:bookmarkStart w:id="1022" w:name="name-authors-address"/>
+        <w:bookmarkEnd w:id="1022"/>
         <w:r>
           <w:rPr>
             <w:rStyle w:val="Hyperlink"/>
@@ -64183,49 +64640,49 @@
 
 <file path=word/comments.xml><?xml version="1.0" encoding="utf-8"?>
 <w:comments xmlns:o="urn:schemas-microsoft-com:office:office" xmlns:r="http://schemas.openxmlformats.org/officeDocument/2006/relationships" xmlns:v="urn:schemas-microsoft-com:vml" xmlns:w="http://schemas.openxmlformats.org/wordprocessingml/2006/main" xmlns:w10="urn:schemas-microsoft-com:office:word" xmlns:wp="http://schemas.openxmlformats.org/drawingml/2006/wordprocessingDrawing" xmlns:wps="http://schemas.microsoft.com/office/word/2010/wordprocessingShape" xmlns:wpg="http://schemas.microsoft.com/office/word/2010/wordprocessingGroup" xmlns:mc="http://schemas.openxmlformats.org/markup-compatibility/2006" xmlns:wp14="http://schemas.microsoft.com/office/word/2010/wordprocessingDrawing" xmlns:w14="http://schemas.microsoft.com/office/word/2010/wordml" xmlns:w15="http://schemas.microsoft.com/office/word/2012/wordml" mc:Ignorable="w14 wp14 w15">
-  <w:comment w:id="0" w:author="" w:date="2026-10-22T09:18:34Z" w:initials="">
+  <w:comment w:id="0" w:author="" w:date="2026-10-22T09:42:12Z" w:initials="">
     <w:p>
       <w:r>
         <w:t>HTML: &lt;meta name="keyword" content="spectrum"&gt;</w:t>
       </w:r>
     </w:p>
   </w:comment>
-  <w:comment w:id="1" w:author="" w:date="2026-10-22T09:18:34Z" w:initials="">
+  <w:comment w:id="1" w:author="" w:date="2026-10-22T09:42:12Z" w:initials="">
     <w:p>
       <w:r>
         <w:t>HTML: &lt;meta name="keyword" content="regulatory"&gt;</w:t>
       </w:r>
     </w:p>
   </w:comment>
-  <w:comment w:id="2" w:author="" w:date="2026-10-22T09:18:34Z" w:initials="">
+  <w:comment w:id="2" w:author="" w:date="2026-10-22T09:42:12Z" w:initials="">
     <w:p>
       <w:r>
         <w:t>HTML: &lt;meta name="keyword" content="dodecahedron"&gt;</w:t>
       </w:r>
     </w:p>
   </w:comment>
-  <w:comment w:id="3" w:author="" w:date="2026-10-22T09:18:34Z" w:initials="">
+  <w:comment w:id="3" w:author="" w:date="2026-10-22T09:42:12Z" w:initials="">
     <w:p>
       <w:r>
         <w:t>HTML: &lt;meta name="keyword" content="ISM"&gt;</w:t>
       </w:r>
     </w:p>
   </w:comment>
-  <w:comment w:id="4" w:author="" w:date="2026-10-22T09:18:34Z" w:initials="">
+  <w:comment w:id="4" w:author="" w:date="2026-10-22T09:42:12Z" w:initials="">
     <w:p>
       <w:r>
         <w:t>HTML: &lt;meta name="keyword" content="location"&gt;</w:t>
       </w:r>
     </w:p>
   </w:comment>
-  <w:comment w:id="5" w:author="" w:date="2026-10-22T09:18:34Z" w:initials="">
+  <w:comment w:id="5" w:author="" w:date="2026-10-22T09:42:12Z" w:initials="">
     <w:p>
       <w:r>
         <w:t>HTML: &lt;meta name="keyword" content="802.15.4"&gt;</w:t>
       </w:r>
     </w:p>
   </w:comment>
-  <w:comment w:id="6" w:author="" w:date="2026-10-22T09:18:34Z" w:initials="">
+  <w:comment w:id="6" w:author="" w:date="2026-10-22T09:42:12Z" w:initials="">
     <w:p>
       <w:r>
         <w:t>HTML: &lt;meta name="keyword" content="CBOR"&gt;</w:t>

</xml_diff>